<commit_message>
feat(site): publish evidence map companion
</commit_message>
<xml_diff>
--- a/field-guide/book/From-Question-to-Evidence.docx
+++ b/field-guide/book/From-Question-to-Evidence.docx
@@ -374,7 +374,7 @@
     </w:p>
     <w:bookmarkEnd w:id="16"/>
     <w:bookmarkEnd w:id="17"/>
-    <w:bookmarkStart w:id="30" w:name="the-evidence-map"/>
+    <w:bookmarkStart w:id="35" w:name="the-evidence-map"/>
     <w:p>
       <w:pPr>
         <w:pStyle w:val="Heading1"/>
@@ -445,7 +445,7 @@
       </w:r>
     </w:p>
     <w:bookmarkEnd w:id="21"/>
-    <w:bookmarkStart w:id="22" w:name="the-seven-stages"/>
+    <w:bookmarkStart w:id="27" w:name="the-seven-stages"/>
     <w:p>
       <w:pPr>
         <w:pStyle w:val="Heading2"/>
@@ -478,8 +478,97 @@
         <w:t xml:space="preserve">The map therefore preserves versions. The question recorded on the first day does not disappear when the question changes. The source inventory does not overwrite a mistaken expectation. A rejected AI suggestion remains in the audit log with the reason for rejection. These records show how the project learned.</w:t>
       </w:r>
     </w:p>
-    <w:bookmarkEnd w:id="22"/>
-    <w:bookmarkStart w:id="27" w:name="the-worked-example"/>
+    <w:bookmarkStart w:id="26" w:name="seven-stage-pathway"/>
+    <w:p>
+      <w:pPr>
+        <w:pStyle w:val="Heading3"/>
+      </w:pPr>
+      <w:r>
+        <w:t xml:space="preserve">3.2.1 Seven-stage pathway</w:t>
+      </w:r>
+    </w:p>
+    <w:tbl>
+      <w:tblPr>
+        <w:tblStyle w:val="Table"/>
+        <w:tblW w:type="pct" w:w="5000"/>
+        <w:tblLayout w:type="fixed"/>
+        <w:tblLook w:firstRow="0" w:lastRow="0" w:firstColumn="0" w:lastColumn="0" w:noHBand="0" w:noVBand="0" w:val="0000"/>
+      </w:tblPr>
+      <w:tblGrid>
+        <w:gridCol w:w="7920"/>
+      </w:tblGrid>
+      <w:tr>
+        <w:tc>
+          <w:tcPr/>
+          <w:bookmarkStart w:id="25" w:name="fig-evidence-map-pathway"/>
+          <w:p>
+            <w:pPr>
+              <w:pStyle w:val="Compact"/>
+              <w:jc w:val="center"/>
+            </w:pPr>
+            <w:r>
+              <w:drawing>
+                <wp:inline>
+                  <wp:extent cx="5334000" cy="2286000"/>
+                  <wp:effectExtent b="0" l="0" r="0" t="0"/>
+                  <wp:docPr descr="" title="" id="23" name="Picture"/>
+                  <a:graphic>
+                    <a:graphicData uri="http://schemas.openxmlformats.org/drawingml/2006/picture">
+                      <pic:pic>
+                        <pic:nvPicPr>
+                          <pic:cNvPr descr="content/../assets/evidence-map-pathway.png" id="24" name="Picture"/>
+                          <pic:cNvPicPr>
+                            <a:picLocks noChangeArrowheads="1" noChangeAspect="1"/>
+                          </pic:cNvPicPr>
+                        </pic:nvPicPr>
+                        <pic:blipFill>
+                          <a:blip r:embed="rId22"/>
+                          <a:stretch>
+                            <a:fillRect/>
+                          </a:stretch>
+                        </pic:blipFill>
+                        <pic:spPr bwMode="auto">
+                          <a:xfrm>
+                            <a:off x="0" y="0"/>
+                            <a:ext cx="5334000" cy="2286000"/>
+                          </a:xfrm>
+                          <a:prstGeom prst="rect">
+                            <a:avLst/>
+                          </a:prstGeom>
+                          <a:noFill/>
+                          <a:ln w="9525">
+                            <a:noFill/>
+                            <a:headEnd/>
+                            <a:tailEnd/>
+                          </a:ln>
+                        </pic:spPr>
+                      </pic:pic>
+                    </a:graphicData>
+                  </a:graphic>
+                </wp:inline>
+              </w:drawing>
+            </w:r>
+          </w:p>
+          <w:p>
+            <w:pPr>
+              <w:jc w:val="center"/>
+            </w:pPr>
+            <w:pPr>
+              <w:jc w:val="left"/>
+              <w:spacing w:before="200"/>
+              <w:pStyle w:val="ImageCaption"/>
+            </w:pPr>
+            <w:r>
+              <w:t xml:space="preserve">Figure 3.1: The evidence map develops through seven ordered but revisable stages. Discoveries can reopen an earlier decision.</w:t>
+            </w:r>
+          </w:p>
+          <w:bookmarkEnd w:id="25"/>
+        </w:tc>
+      </w:tr>
+    </w:tbl>
+    <w:bookmarkEnd w:id="26"/>
+    <w:bookmarkEnd w:id="27"/>
+    <w:bookmarkStart w:id="32" w:name="the-worked-example"/>
     <w:p>
       <w:pPr>
         <w:pStyle w:val="Heading2"/>
@@ -515,7 +604,7 @@
         <w:rPr>
           <w:rStyle w:val="FootnoteReference"/>
         </w:rPr>
-        <w:footnoteReference w:id="23"/>
+        <w:footnoteReference w:id="28"/>
       </w:r>
       <w:r>
         <w:t xml:space="preserve"> </w:t>
@@ -527,7 +616,7 @@
         <w:rPr>
           <w:rStyle w:val="FootnoteReference"/>
         </w:rPr>
-        <w:footnoteReference w:id="25"/>
+        <w:footnoteReference w:id="30"/>
       </w:r>
       <w:r>
         <w:t xml:space="preserve"> </w:t>
@@ -544,8 +633,8 @@
         <w:t xml:space="preserve">This is the pattern. Evidence reaches the researcher through institutions.</w:t>
       </w:r>
     </w:p>
-    <w:bookmarkEnd w:id="27"/>
-    <w:bookmarkStart w:id="28" w:name="what-the-map-contains"/>
+    <w:bookmarkEnd w:id="32"/>
+    <w:bookmarkStart w:id="33" w:name="what-the-map-contains"/>
     <w:p>
       <w:pPr>
         <w:pStyle w:val="Heading2"/>
@@ -586,8 +675,8 @@
         <w:t xml:space="preserve">A stopping rule is not a declaration that nothing else exists. It is an argument that the present corpus can support the next analytical task.</w:t>
       </w:r>
     </w:p>
-    <w:bookmarkEnd w:id="28"/>
-    <w:bookmarkStart w:id="29" w:name="the-role-of-ai"/>
+    <w:bookmarkEnd w:id="33"/>
+    <w:bookmarkStart w:id="34" w:name="the-role-of-ai"/>
     <w:p>
       <w:pPr>
         <w:pStyle w:val="Heading2"/>
@@ -620,9 +709,9 @@
         <w:t xml:space="preserve">The guide records every accepted suggestion and every consequential rejection. This is not a clerical burden. It is evidence of judgment.</w:t>
       </w:r>
     </w:p>
-    <w:bookmarkEnd w:id="29"/>
-    <w:bookmarkEnd w:id="30"/>
-    <w:bookmarkStart w:id="39" w:name="stage-1-frame-the-question"/>
+    <w:bookmarkEnd w:id="34"/>
+    <w:bookmarkEnd w:id="35"/>
+    <w:bookmarkStart w:id="44" w:name="stage-1-frame-the-question"/>
     <w:p>
       <w:pPr>
         <w:pStyle w:val="Heading1"/>
@@ -631,7 +720,7 @@
         <w:t xml:space="preserve">4. Stage 1: Frame the Question</w:t>
       </w:r>
     </w:p>
-    <w:bookmarkStart w:id="31" w:name="orientation"/>
+    <w:bookmarkStart w:id="36" w:name="orientation"/>
     <w:p>
       <w:pPr>
         <w:pStyle w:val="Heading2"/>
@@ -664,8 +753,8 @@
         <w:t xml:space="preserve">Framing sets an intellectual limit, not an ethical clearance. Deciding what to collect does not decide whether collection is permitted. Some source families cannot be gathered at all without ethics approval, informed consent, or a data agreement, and those permissions govern whether the work may begin, not only how it proceeds. This guide defers the mechanics of collection to a later module, but the researcher should confirm the ethical preconditions before the search starts.</w:t>
       </w:r>
     </w:p>
-    <w:bookmarkEnd w:id="31"/>
-    <w:bookmarkStart w:id="32" w:name="learn"/>
+    <w:bookmarkEnd w:id="36"/>
+    <w:bookmarkStart w:id="37" w:name="learn"/>
     <w:p>
       <w:pPr>
         <w:pStyle w:val="Heading2"/>
@@ -706,8 +795,8 @@
         <w:t xml:space="preserve">The frame includes exclusions. Exclusion is not dismissal. A study of policy formation may set aside implementation because the causal question concerns agenda access. A study of public memory may exclude private recollection that never entered a public forum. A source can be valuable and remain outside the present question.</w:t>
       </w:r>
     </w:p>
-    <w:bookmarkEnd w:id="32"/>
-    <w:bookmarkStart w:id="33" w:name="worked-example"/>
+    <w:bookmarkEnd w:id="37"/>
+    <w:bookmarkStart w:id="38" w:name="worked-example"/>
     <w:p>
       <w:pPr>
         <w:pStyle w:val="Heading2"/>
@@ -740,8 +829,8 @@
         <w:t xml:space="preserve">The frame records a second decision. The module will examine the process through which events become records. It will not estimate a corrected global trend. That task requires data access, calibration choices, and a separate analytical design.</w:t>
       </w:r>
     </w:p>
-    <w:bookmarkEnd w:id="33"/>
-    <w:bookmarkStart w:id="34" w:name="try-it"/>
+    <w:bookmarkEnd w:id="38"/>
+    <w:bookmarkStart w:id="39" w:name="try-it"/>
     <w:p>
       <w:pPr>
         <w:pStyle w:val="Heading2"/>
@@ -774,8 +863,8 @@
         <w:t xml:space="preserve">Save the result as this stage’s artifact, described under Save the Artifact below.</w:t>
       </w:r>
     </w:p>
-    <w:bookmarkEnd w:id="34"/>
-    <w:bookmarkStart w:id="35" w:name="guided-ai-workflow"/>
+    <w:bookmarkEnd w:id="39"/>
+    <w:bookmarkStart w:id="40" w:name="guided-ai-workflow"/>
     <w:p>
       <w:pPr>
         <w:pStyle w:val="Heading2"/>
@@ -866,8 +955,8 @@
         <w:t xml:space="preserve">Do not ask the model to choose the “best” question. Review each suggestion against the purpose of the study.</w:t>
       </w:r>
     </w:p>
-    <w:bookmarkEnd w:id="35"/>
-    <w:bookmarkStart w:id="36" w:name="integrity-checkpoint"/>
+    <w:bookmarkEnd w:id="40"/>
+    <w:bookmarkStart w:id="41" w:name="integrity-checkpoint"/>
     <w:p>
       <w:pPr>
         <w:pStyle w:val="Heading2"/>
@@ -934,8 +1023,8 @@
         <w:t xml:space="preserve">the researcher’s normative commitments are distinguished from the evidence a descriptive or causal claim requires.</w:t>
       </w:r>
     </w:p>
-    <w:bookmarkEnd w:id="36"/>
-    <w:bookmarkStart w:id="37" w:name="save-the-artifact"/>
+    <w:bookmarkEnd w:id="41"/>
+    <w:bookmarkStart w:id="42" w:name="save-the-artifact"/>
     <w:p>
       <w:pPr>
         <w:pStyle w:val="Heading2"/>
@@ -964,8 +1053,8 @@
         <w:t xml:space="preserve">. Required fields are the question, purpose, unit of inquiry, boundaries along the five dimensions, exclusions, assumptions, and the evidence that would count as an answer. Date it. Link it to the project log and the later evidence map. The version number matters because later collection decisions will make sense only in relation to the question that guided them at the time. Later revisions create a new version rather than erase the first.</w:t>
       </w:r>
     </w:p>
-    <w:bookmarkEnd w:id="37"/>
-    <w:bookmarkStart w:id="38" w:name="advanced-practice"/>
+    <w:bookmarkEnd w:id="42"/>
+    <w:bookmarkStart w:id="43" w:name="advanced-practice"/>
     <w:p>
       <w:pPr>
         <w:pStyle w:val="Heading2"/>
@@ -982,9 +1071,9 @@
         <w:t xml:space="preserve">Some questions should remain open longer than this procedure implies. Ethnographic research may develop its focus through entry into a field. Archival discoveries may shift the relevant period or actor. Participatory research may require the community to redefine the problem. In these cases, framing is an explicit record of the current agreement, not a contract imposed on future evidence.</w:t>
       </w:r>
     </w:p>
-    <w:bookmarkEnd w:id="38"/>
-    <w:bookmarkEnd w:id="39"/>
-    <w:bookmarkStart w:id="49" w:name="stage-2-decompose-the-question"/>
+    <w:bookmarkEnd w:id="43"/>
+    <w:bookmarkEnd w:id="44"/>
+    <w:bookmarkStart w:id="54" w:name="stage-2-decompose-the-question"/>
     <w:p>
       <w:pPr>
         <w:pStyle w:val="Heading1"/>
@@ -993,7 +1082,7 @@
         <w:t xml:space="preserve">5. Stage 2: Decompose the Question</w:t>
       </w:r>
     </w:p>
-    <w:bookmarkStart w:id="40" w:name="orientation-1"/>
+    <w:bookmarkStart w:id="45" w:name="orientation-1"/>
     <w:p>
       <w:pPr>
         <w:pStyle w:val="Heading2"/>
@@ -1010,8 +1099,8 @@
         <w:t xml:space="preserve">A well-framed question can still hide several inquiries inside one sentence. Each noun may contain a dispute. Each verb may imply a mechanism. Each boundary may conceal variation. Decomposition makes those parts visible before the search engine makes its own choices for the researcher.</w:t>
       </w:r>
     </w:p>
-    <w:bookmarkEnd w:id="40"/>
-    <w:bookmarkStart w:id="41" w:name="learn-1"/>
+    <w:bookmarkEnd w:id="45"/>
+    <w:bookmarkStart w:id="46" w:name="learn-1"/>
     <w:p>
       <w:pPr>
         <w:pStyle w:val="Heading2"/>
@@ -1052,8 +1141,8 @@
         <w:t xml:space="preserve">Decomposition works through a grid. Rows represent dimensions of the question. Columns record working definitions, synonyms, actor language, likely evidence, rivals, and exclusions. The cells need not be filled before searching. Empty cells are useful. They show where the project is reasoning from habit rather than evidence.</w:t>
       </w:r>
     </w:p>
-    <w:bookmarkEnd w:id="41"/>
-    <w:bookmarkStart w:id="43" w:name="worked-example-1"/>
+    <w:bookmarkEnd w:id="46"/>
+    <w:bookmarkStart w:id="48" w:name="worked-example-1"/>
     <w:p>
       <w:pPr>
         <w:pStyle w:val="Heading2"/>
@@ -1089,7 +1178,7 @@
         <w:rPr>
           <w:rStyle w:val="FootnoteReference"/>
         </w:rPr>
-        <w:footnoteReference w:id="42"/>
+        <w:footnoteReference w:id="47"/>
       </w:r>
       <w:r>
         <w:t xml:space="preserve"> </w:t>
@@ -1360,8 +1449,8 @@
         <w:t xml:space="preserve">The empty cells would matter as much as the filled ones.</w:t>
       </w:r>
     </w:p>
-    <w:bookmarkEnd w:id="43"/>
-    <w:bookmarkStart w:id="44" w:name="try-it-1"/>
+    <w:bookmarkEnd w:id="48"/>
+    <w:bookmarkStart w:id="49" w:name="try-it-1"/>
     <w:p>
       <w:pPr>
         <w:pStyle w:val="Heading2"/>
@@ -1394,8 +1483,8 @@
         <w:t xml:space="preserve">The exercise is complete when each important term has a research use rather than a dictionary definition. The grid should tell the researcher where a term would appear, who would use it, and what could make its apparent presence misleading.</w:t>
       </w:r>
     </w:p>
-    <w:bookmarkEnd w:id="44"/>
-    <w:bookmarkStart w:id="45" w:name="guided-ai-workflow-1"/>
+    <w:bookmarkEnd w:id="49"/>
+    <w:bookmarkStart w:id="50" w:name="guided-ai-workflow-1"/>
     <w:p>
       <w:pPr>
         <w:pStyle w:val="Heading2"/>
@@ -1486,8 +1575,8 @@
         <w:t xml:space="preserve">Run a second prompt that assigns the model an adversarial task: identify dimensions omitted by the first decomposition. A third prompt can ask how the decomposition might differ from the standpoint of an actor poorly represented in official records.</w:t>
       </w:r>
     </w:p>
-    <w:bookmarkEnd w:id="45"/>
-    <w:bookmarkStart w:id="46" w:name="integrity-checkpoint-1"/>
+    <w:bookmarkEnd w:id="50"/>
+    <w:bookmarkStart w:id="51" w:name="integrity-checkpoint-1"/>
     <w:p>
       <w:pPr>
         <w:pStyle w:val="Heading2"/>
@@ -1554,8 +1643,8 @@
         <w:t xml:space="preserve">every translated term keeps its original expression and the reason for the English gloss.</w:t>
       </w:r>
     </w:p>
-    <w:bookmarkEnd w:id="46"/>
-    <w:bookmarkStart w:id="47" w:name="save-the-artifact-1"/>
+    <w:bookmarkEnd w:id="51"/>
+    <w:bookmarkStart w:id="52" w:name="save-the-artifact-1"/>
     <w:p>
       <w:pPr>
         <w:pStyle w:val="Heading2"/>
@@ -1584,8 +1673,8 @@
         <w:t xml:space="preserve">. Give each row a stable identifier. Required columns are dimension, working definition, synonyms, actor language, likely evidence, rival explanations, and exclusions. These identifiers will connect later search terms, source families, and evidence records to the dimension they serve.</w:t>
       </w:r>
     </w:p>
-    <w:bookmarkEnd w:id="47"/>
-    <w:bookmarkStart w:id="48" w:name="advanced-practice-1"/>
+    <w:bookmarkEnd w:id="52"/>
+    <w:bookmarkStart w:id="53" w:name="advanced-practice-1"/>
     <w:p>
       <w:pPr>
         <w:pStyle w:val="Heading2"/>
@@ -1602,9 +1691,9 @@
         <w:t xml:space="preserve">Team projects should decompose the question independently before reconciling their grids. Early agreement can conceal shared assumptions. Independent drafts expose differences in training, language, and field knowledge. The reconciliation record should preserve disagreements that affect collection, even when the team adopts one operational definition.</w:t>
       </w:r>
     </w:p>
-    <w:bookmarkEnd w:id="48"/>
-    <w:bookmarkEnd w:id="49"/>
-    <w:bookmarkStart w:id="59" w:name="stage-3-map-source-families"/>
+    <w:bookmarkEnd w:id="53"/>
+    <w:bookmarkEnd w:id="54"/>
+    <w:bookmarkStart w:id="64" w:name="stage-3-map-source-families"/>
     <w:p>
       <w:pPr>
         <w:pStyle w:val="Heading1"/>
@@ -1613,7 +1702,7 @@
         <w:t xml:space="preserve">6. Stage 3: Map Source Families</w:t>
       </w:r>
     </w:p>
-    <w:bookmarkStart w:id="50" w:name="orientation-2"/>
+    <w:bookmarkStart w:id="55" w:name="orientation-2"/>
     <w:p>
       <w:pPr>
         <w:pStyle w:val="Heading2"/>
@@ -1638,8 +1727,8 @@
         <w:t xml:space="preserve">Source-family mapping asks a prior question: who could have observed, recorded, preserved, or later reconstructed each part of the inquiry?</w:t>
       </w:r>
     </w:p>
-    <w:bookmarkEnd w:id="50"/>
-    <w:bookmarkStart w:id="51" w:name="learn-2"/>
+    <w:bookmarkEnd w:id="55"/>
+    <w:bookmarkStart w:id="56" w:name="learn-2"/>
     <w:p>
       <w:pPr>
         <w:pStyle w:val="Heading2"/>
@@ -1680,8 +1769,8 @@
         <w:t xml:space="preserve">Mapping should include sources that challenge the project’s institutional center. Official records preserve the state well because the state creates records at scale. Marginalized actors may appear through legal proceedings, advocacy collections, private papers, community media, or testimony assembled after the event. Their relative scarcity is not evidence of lesser importance.</w:t>
       </w:r>
     </w:p>
-    <w:bookmarkEnd w:id="51"/>
-    <w:bookmarkStart w:id="53" w:name="worked-example-2"/>
+    <w:bookmarkEnd w:id="56"/>
+    <w:bookmarkStart w:id="58" w:name="worked-example-2"/>
     <w:p>
       <w:pPr>
         <w:pStyle w:val="Heading2"/>
@@ -1717,7 +1806,7 @@
         <w:rPr>
           <w:rStyle w:val="FootnoteReference"/>
         </w:rPr>
-        <w:footnoteReference w:id="52"/>
+        <w:footnoteReference w:id="57"/>
       </w:r>
       <w:r>
         <w:t xml:space="preserve"> </w:t>
@@ -1726,8 +1815,8 @@
         <w:t xml:space="preserve">That transparency permits a researcher to map the system as a source family rather than treat each row as an unmediated event.</w:t>
       </w:r>
     </w:p>
-    <w:bookmarkEnd w:id="53"/>
-    <w:bookmarkStart w:id="54" w:name="try-it-2"/>
+    <w:bookmarkEnd w:id="58"/>
+    <w:bookmarkStart w:id="59" w:name="try-it-2"/>
     <w:p>
       <w:pPr>
         <w:pStyle w:val="Heading2"/>
@@ -1752,8 +1841,8 @@
         <w:t xml:space="preserve">For each family, record five judgments in prose: what it can observe, why it creates records, who is absent, how records survive, and how access could distort the sample. Repeat the exercise until every important row has more than one plausible evidentiary route or an explicit explanation for why only one exists.</w:t>
       </w:r>
     </w:p>
-    <w:bookmarkEnd w:id="54"/>
-    <w:bookmarkStart w:id="55" w:name="guided-ai-workflow-2"/>
+    <w:bookmarkEnd w:id="59"/>
+    <w:bookmarkStart w:id="60" w:name="guided-ai-workflow-2"/>
     <w:p>
       <w:pPr>
         <w:pStyle w:val="Heading2"/>
@@ -1836,8 +1925,8 @@
         <w:t xml:space="preserve">Log candidate families accepted and rejected, the verification source, and the model and date. Keep fabricated suggestions as rejected rather than deleting them from the audit trail.</w:t>
       </w:r>
     </w:p>
-    <w:bookmarkEnd w:id="55"/>
-    <w:bookmarkStart w:id="56" w:name="integrity-checkpoint-2"/>
+    <w:bookmarkEnd w:id="60"/>
+    <w:bookmarkStart w:id="61" w:name="integrity-checkpoint-2"/>
     <w:p>
       <w:pPr>
         <w:pStyle w:val="Heading2"/>
@@ -1904,8 +1993,8 @@
         <w:t xml:space="preserve">each family’s access status and governing conditions are noted.</w:t>
       </w:r>
     </w:p>
-    <w:bookmarkEnd w:id="56"/>
-    <w:bookmarkStart w:id="57" w:name="save-the-artifact-2"/>
+    <w:bookmarkEnd w:id="61"/>
+    <w:bookmarkStart w:id="62" w:name="save-the-artifact-2"/>
     <w:p>
       <w:pPr>
         <w:pStyle w:val="Heading2"/>
@@ -1937,8 +2026,8 @@
         <w:t xml:space="preserve">with one row per family and links to the concept identifiers it may serve. Required fields are family, producing institution, repository, access status, language, temporal coverage, likely dependence on other families, and known silences.</w:t>
       </w:r>
     </w:p>
-    <w:bookmarkEnd w:id="57"/>
-    <w:bookmarkStart w:id="58" w:name="advanced-practice-2"/>
+    <w:bookmarkEnd w:id="62"/>
+    <w:bookmarkStart w:id="63" w:name="advanced-practice-2"/>
     <w:p>
       <w:pPr>
         <w:pStyle w:val="Heading2"/>
@@ -1955,9 +2044,9 @@
         <w:t xml:space="preserve">Source families can change over time. A newspaper’s ownership, a ministry’s filing system, or a database’s collection vendor may shift within the study period. Treat a family as stable only after checking the institutions that produced it. Where the process changed, create separate records for each phase and mark the transition as part of the evidence.</w:t>
       </w:r>
     </w:p>
-    <w:bookmarkEnd w:id="58"/>
-    <w:bookmarkEnd w:id="59"/>
-    <w:bookmarkStart w:id="69" w:name="stage-4-search-iteratively"/>
+    <w:bookmarkEnd w:id="63"/>
+    <w:bookmarkEnd w:id="64"/>
+    <w:bookmarkStart w:id="74" w:name="stage-4-search-iteratively"/>
     <w:p>
       <w:pPr>
         <w:pStyle w:val="Heading1"/>
@@ -1966,7 +2055,7 @@
         <w:t xml:space="preserve">7. Stage 4: Search Iteratively</w:t>
       </w:r>
     </w:p>
-    <w:bookmarkStart w:id="60" w:name="orientation-3"/>
+    <w:bookmarkStart w:id="65" w:name="orientation-3"/>
     <w:p>
       <w:pPr>
         <w:pStyle w:val="Heading2"/>
@@ -1983,8 +2072,8 @@
         <w:t xml:space="preserve">A search is not a box into which a finished question is typed. It is a sequence of encounters with the vocabulary and organization of a field. The first results teach the researcher how other actors named the subject. Those names alter the next search.</w:t>
       </w:r>
     </w:p>
-    <w:bookmarkEnd w:id="60"/>
-    <w:bookmarkStart w:id="62" w:name="learn-3"/>
+    <w:bookmarkEnd w:id="65"/>
+    <w:bookmarkStart w:id="67" w:name="learn-3"/>
     <w:p>
       <w:pPr>
         <w:pStyle w:val="Heading2"/>
@@ -2028,7 +2117,7 @@
         <w:rPr>
           <w:rStyle w:val="FootnoteReference"/>
         </w:rPr>
-        <w:footnoteReference w:id="61"/>
+        <w:footnoteReference w:id="66"/>
       </w:r>
       <w:r>
         <w:t xml:space="preserve"> </w:t>
@@ -2037,8 +2126,8 @@
         <w:t xml:space="preserve">Qualitative projects can adapt this discipline without claiming that every search can be reproduced exactly.</w:t>
       </w:r>
     </w:p>
-    <w:bookmarkEnd w:id="62"/>
-    <w:bookmarkStart w:id="63" w:name="worked-example-3"/>
+    <w:bookmarkEnd w:id="67"/>
+    <w:bookmarkStart w:id="68" w:name="worked-example-3"/>
     <w:p>
       <w:pPr>
         <w:pStyle w:val="Heading2"/>
@@ -2325,8 +2414,8 @@
         <w:t xml:space="preserve">Each row records whether a result independently documents an event or derives from the database.</w:t>
       </w:r>
     </w:p>
-    <w:bookmarkEnd w:id="63"/>
-    <w:bookmarkStart w:id="64" w:name="try-it-3"/>
+    <w:bookmarkEnd w:id="68"/>
+    <w:bookmarkStart w:id="69" w:name="try-it-3"/>
     <w:p>
       <w:pPr>
         <w:pStyle w:val="Heading2"/>
@@ -2343,8 +2432,8 @@
         <w:t xml:space="preserve">Run three short cycles for one source family. The first uses the researcher’s terms. The second uses language found in the first results. The third uses the vocabulary of an actor with a different institutional position. Write a short decision note after each cycle. Each note states one of four choices, with a reason: continue, revise the terms, follow a lead, or stop using the route.</w:t>
       </w:r>
     </w:p>
-    <w:bookmarkEnd w:id="64"/>
-    <w:bookmarkStart w:id="65" w:name="guided-ai-workflow-3"/>
+    <w:bookmarkEnd w:id="69"/>
+    <w:bookmarkStart w:id="70" w:name="guided-ai-workflow-3"/>
     <w:p>
       <w:pPr>
         <w:pStyle w:val="Heading2"/>
@@ -2427,8 +2516,8 @@
         <w:t xml:space="preserve">Log terms that entered or left the query set, the query effect, and the model and date.</w:t>
       </w:r>
     </w:p>
-    <w:bookmarkEnd w:id="65"/>
-    <w:bookmarkStart w:id="66" w:name="integrity-checkpoint-3"/>
+    <w:bookmarkEnd w:id="70"/>
+    <w:bookmarkStart w:id="71" w:name="integrity-checkpoint-3"/>
     <w:p>
       <w:pPr>
         <w:pStyle w:val="Heading2"/>
@@ -2495,8 +2584,8 @@
         <w:t xml:space="preserve">personal data or allegations found in passing are set aside, not folded into the corpus without review.</w:t>
       </w:r>
     </w:p>
-    <w:bookmarkEnd w:id="66"/>
-    <w:bookmarkStart w:id="67" w:name="save-the-artifact-3"/>
+    <w:bookmarkEnd w:id="71"/>
+    <w:bookmarkStart w:id="72" w:name="save-the-artifact-3"/>
     <w:p>
       <w:pPr>
         <w:pStyle w:val="Heading2"/>
@@ -2525,8 +2614,8 @@
         <w:t xml:space="preserve">. Required fields for each cycle are date, system, purpose, exact terms, filters, result count when meaningful, records retained, new vocabulary, and next decision. Preserve exports when licensing permits.</w:t>
       </w:r>
     </w:p>
-    <w:bookmarkEnd w:id="67"/>
-    <w:bookmarkStart w:id="68" w:name="advanced-practice-3"/>
+    <w:bookmarkEnd w:id="72"/>
+    <w:bookmarkStart w:id="73" w:name="advanced-practice-3"/>
     <w:p>
       <w:pPr>
         <w:pStyle w:val="Heading2"/>
@@ -2543,9 +2632,9 @@
         <w:t xml:space="preserve">Search ranking changes. Personalized systems may return different results to different users. Researchers working in teams should compare selected queries across accounts, locations, languages, and systems when ranking itself could shape the corpus.</w:t>
       </w:r>
     </w:p>
-    <w:bookmarkEnd w:id="68"/>
-    <w:bookmarkEnd w:id="69"/>
-    <w:bookmarkStart w:id="80" w:name="stage-5-evaluate-evidence"/>
+    <w:bookmarkEnd w:id="73"/>
+    <w:bookmarkEnd w:id="74"/>
+    <w:bookmarkStart w:id="85" w:name="stage-5-evaluate-evidence"/>
     <w:p>
       <w:pPr>
         <w:pStyle w:val="Heading1"/>
@@ -2554,7 +2643,7 @@
         <w:t xml:space="preserve">8. Stage 5: Evaluate Evidence</w:t>
       </w:r>
     </w:p>
-    <w:bookmarkStart w:id="70" w:name="orientation-4"/>
+    <w:bookmarkStart w:id="75" w:name="orientation-4"/>
     <w:p>
       <w:pPr>
         <w:pStyle w:val="Heading2"/>
@@ -2571,8 +2660,8 @@
         <w:t xml:space="preserve">Collection answers “What did we find?” Evaluation asks “What can this record support?” The two questions should not collapse into one. A source can be relevant and unreliable for a specific claim. It can be accurate and still unrepresentative. It can be biased and indispensable.</w:t>
       </w:r>
     </w:p>
-    <w:bookmarkEnd w:id="70"/>
-    <w:bookmarkStart w:id="71" w:name="learn-4"/>
+    <w:bookmarkEnd w:id="75"/>
+    <w:bookmarkStart w:id="76" w:name="learn-4"/>
     <w:p>
       <w:pPr>
         <w:pStyle w:val="Heading2"/>
@@ -2605,8 +2694,8 @@
         <w:t xml:space="preserve">These judgments should remain separate. Combining them into one quality score hides the reason a source matters.</w:t>
       </w:r>
     </w:p>
-    <w:bookmarkEnd w:id="71"/>
-    <w:bookmarkStart w:id="74" w:name="worked-example-4"/>
+    <w:bookmarkEnd w:id="76"/>
+    <w:bookmarkStart w:id="79" w:name="worked-example-4"/>
     <w:p>
       <w:pPr>
         <w:pStyle w:val="Heading2"/>
@@ -2626,7 +2715,7 @@
         <w:rPr>
           <w:rStyle w:val="FootnoteReference"/>
         </w:rPr>
-        <w:footnoteReference w:id="72"/>
+        <w:footnoteReference w:id="77"/>
       </w:r>
       <w:r>
         <w:t xml:space="preserve"> </w:t>
@@ -2646,7 +2735,7 @@
         <w:rPr>
           <w:rStyle w:val="FootnoteReference"/>
         </w:rPr>
-        <w:footnoteReference w:id="73"/>
+        <w:footnoteReference w:id="78"/>
       </w:r>
       <w:r>
         <w:t xml:space="preserve"> </w:t>
@@ -2878,8 +2967,8 @@
         <w:t xml:space="preserve">The entry keeps the judgments separate rather than collapsing them into one score.</w:t>
       </w:r>
     </w:p>
-    <w:bookmarkEnd w:id="74"/>
-    <w:bookmarkStart w:id="75" w:name="try-it-4"/>
+    <w:bookmarkEnd w:id="79"/>
+    <w:bookmarkStart w:id="80" w:name="try-it-4"/>
     <w:p>
       <w:pPr>
         <w:pStyle w:val="Heading2"/>
@@ -2896,8 +2985,8 @@
         <w:t xml:space="preserve">Select one source that appears strong and one that appears weak. Write what each can establish, what it cannot establish, and which other source family could test it. Then identify whether the two sources depend on the same originating report.</w:t>
       </w:r>
     </w:p>
-    <w:bookmarkEnd w:id="75"/>
-    <w:bookmarkStart w:id="76" w:name="guided-ai-workflow-4"/>
+    <w:bookmarkEnd w:id="80"/>
+    <w:bookmarkStart w:id="81" w:name="guided-ai-workflow-4"/>
     <w:p>
       <w:pPr>
         <w:pStyle w:val="Heading2"/>
@@ -2980,8 +3069,8 @@
         <w:t xml:space="preserve">Log which questions changed the evaluation, and the model and date.</w:t>
       </w:r>
     </w:p>
-    <w:bookmarkEnd w:id="76"/>
-    <w:bookmarkStart w:id="77" w:name="integrity-checkpoint-4"/>
+    <w:bookmarkEnd w:id="81"/>
+    <w:bookmarkStart w:id="82" w:name="integrity-checkpoint-4"/>
     <w:p>
       <w:pPr>
         <w:pStyle w:val="Heading2"/>
@@ -3048,8 +3137,8 @@
         <w:t xml:space="preserve">the seven judgments are not collapsed into a single quality score.</w:t>
       </w:r>
     </w:p>
-    <w:bookmarkEnd w:id="77"/>
-    <w:bookmarkStart w:id="78" w:name="save-the-artifact-4"/>
+    <w:bookmarkEnd w:id="82"/>
+    <w:bookmarkStart w:id="83" w:name="save-the-artifact-4"/>
     <w:p>
       <w:pPr>
         <w:pStyle w:val="Heading2"/>
@@ -3081,8 +3170,8 @@
         <w:t xml:space="preserve">with one entry per record or coherent collection. Required fields are the seven judgments (relevance, proximity, provenance, authority, dependence, representation, preservation risk), plus links to the source-family inventory, the search cycle, the relevant concept, and any restriction on use.</w:t>
       </w:r>
     </w:p>
-    <w:bookmarkEnd w:id="78"/>
-    <w:bookmarkStart w:id="79" w:name="advanced-practice-4"/>
+    <w:bookmarkEnd w:id="83"/>
+    <w:bookmarkStart w:id="84" w:name="advanced-practice-4"/>
     <w:p>
       <w:pPr>
         <w:pStyle w:val="Heading2"/>
@@ -3099,9 +3188,9 @@
         <w:t xml:space="preserve">Teams should calibrate judgments through difficult examples rather than pursue artificial agreement on every record. Preserve reasoned disagreement when it affects interpretation. Consensus can erase uncertainty that belongs in the final analysis.</w:t>
       </w:r>
     </w:p>
-    <w:bookmarkEnd w:id="79"/>
-    <w:bookmarkEnd w:id="80"/>
-    <w:bookmarkStart w:id="94" w:name="stage-6-test-coverage"/>
+    <w:bookmarkEnd w:id="84"/>
+    <w:bookmarkEnd w:id="85"/>
+    <w:bookmarkStart w:id="99" w:name="stage-6-test-coverage"/>
     <w:p>
       <w:pPr>
         <w:pStyle w:val="Heading1"/>
@@ -3110,7 +3199,7 @@
         <w:t xml:space="preserve">9. Stage 6: Test Coverage</w:t>
       </w:r>
     </w:p>
-    <w:bookmarkStart w:id="81" w:name="orientation-5"/>
+    <w:bookmarkStart w:id="86" w:name="orientation-5"/>
     <w:p>
       <w:pPr>
         <w:pStyle w:val="Heading2"/>
@@ -3127,8 +3216,8 @@
         <w:t xml:space="preserve">Researchers stop collecting for many reasons. A deadline arrives. Access closes. New searches repeat old results. The corpus seems sufficient. These reasons should not be disguised as one claim that the evidence is complete.</w:t>
       </w:r>
     </w:p>
-    <w:bookmarkEnd w:id="81"/>
-    <w:bookmarkStart w:id="87" w:name="learn-5"/>
+    <w:bookmarkEnd w:id="86"/>
+    <w:bookmarkStart w:id="92" w:name="learn-5"/>
     <w:p>
       <w:pPr>
         <w:pStyle w:val="Heading2"/>
@@ -3156,7 +3245,7 @@
         <w:rPr>
           <w:rStyle w:val="FootnoteReference"/>
         </w:rPr>
-        <w:footnoteReference w:id="82"/>
+        <w:footnoteReference w:id="87"/>
       </w:r>
       <w:r>
         <w:t xml:space="preserve"> </w:t>
@@ -3168,7 +3257,7 @@
         <w:rPr>
           <w:rStyle w:val="FootnoteReference"/>
         </w:rPr>
-        <w:footnoteReference w:id="85"/>
+        <w:footnoteReference w:id="90"/>
       </w:r>
       <w:r>
         <w:t xml:space="preserve"> </w:t>
@@ -3185,8 +3274,8 @@
         <w:t xml:space="preserve">Track information yield. A search cycle has high yield when it adds a new source family, changes a definition, reveals a rival explanation, fills an important gap, or alters the interpretation of existing evidence. Yield declines when new records repeat known information from the same underlying sources.</w:t>
       </w:r>
     </w:p>
-    <w:bookmarkEnd w:id="87"/>
-    <w:bookmarkStart w:id="88" w:name="worked-example-5"/>
+    <w:bookmarkEnd w:id="92"/>
+    <w:bookmarkStart w:id="93" w:name="worked-example-5"/>
     <w:p>
       <w:pPr>
         <w:pStyle w:val="Heading2"/>
@@ -3420,8 +3509,8 @@
         <w:t xml:space="preserve">Thousands of records can leave whole rows empty. A dependent cell repeats a source already counted elsewhere.</w:t>
       </w:r>
     </w:p>
-    <w:bookmarkEnd w:id="88"/>
-    <w:bookmarkStart w:id="89" w:name="try-it-5"/>
+    <w:bookmarkEnd w:id="93"/>
+    <w:bookmarkStart w:id="94" w:name="try-it-5"/>
     <w:p>
       <w:pPr>
         <w:pStyle w:val="Heading2"/>
@@ -3438,8 +3527,8 @@
         <w:t xml:space="preserve">Mark each evidence-map cell as empty, thin, adequate for the present claim, contradictory, or inaccessible. Write one sentence defending every “adequate” judgment. Then rank the unresolved cells by their likely effect on the argument.</w:t>
       </w:r>
     </w:p>
-    <w:bookmarkEnd w:id="89"/>
-    <w:bookmarkStart w:id="90" w:name="guided-ai-workflow-5"/>
+    <w:bookmarkEnd w:id="94"/>
+    <w:bookmarkStart w:id="95" w:name="guided-ai-workflow-5"/>
     <w:p>
       <w:pPr>
         <w:pStyle w:val="Heading2"/>
@@ -3530,8 +3619,8 @@
         <w:t xml:space="preserve">The model sees the summary supplied to it, not the evidence, unless the tool has retrieval access. When the map cannot be summarized without exposing protected material, run this stage without the model.</w:t>
       </w:r>
     </w:p>
-    <w:bookmarkEnd w:id="90"/>
-    <w:bookmarkStart w:id="91" w:name="integrity-checkpoint-5"/>
+    <w:bookmarkEnd w:id="95"/>
+    <w:bookmarkStart w:id="96" w:name="integrity-checkpoint-5"/>
     <w:p>
       <w:pPr>
         <w:pStyle w:val="Heading2"/>
@@ -3598,8 +3687,8 @@
         <w:t xml:space="preserve">no protected gap is filled to improve apparent coverage.</w:t>
       </w:r>
     </w:p>
-    <w:bookmarkEnd w:id="91"/>
-    <w:bookmarkStart w:id="92" w:name="save-the-artifact-5"/>
+    <w:bookmarkEnd w:id="96"/>
+    <w:bookmarkStart w:id="97" w:name="save-the-artifact-5"/>
     <w:p>
       <w:pPr>
         <w:pStyle w:val="Heading2"/>
@@ -3628,8 +3717,8 @@
         <w:t xml:space="preserve">. Required fields are the cell (dimension and source family), status (empty, thin, adequate, dependent, contradictory, or inaccessible), priority, consequence, proposed action, access constraint, and decision date. A later researcher should be able to distinguish an overlooked gap from a known limit.</w:t>
       </w:r>
     </w:p>
-    <w:bookmarkEnd w:id="92"/>
-    <w:bookmarkStart w:id="93" w:name="advanced-practice-5"/>
+    <w:bookmarkEnd w:id="97"/>
+    <w:bookmarkStart w:id="98" w:name="advanced-practice-5"/>
     <w:p>
       <w:pPr>
         <w:pStyle w:val="Heading2"/>
@@ -3646,9 +3735,9 @@
         <w:t xml:space="preserve">Contradiction is not a defect to eliminate. It may reveal distinct institutional views, temporal change, strategic deception, or differences in measurement. The map should preserve disagreement until the analysis explains why it exists.</w:t>
       </w:r>
     </w:p>
-    <w:bookmarkEnd w:id="93"/>
-    <w:bookmarkEnd w:id="94"/>
-    <w:bookmarkStart w:id="103" w:name="stage-7-produce-the-evidence-map"/>
+    <w:bookmarkEnd w:id="98"/>
+    <w:bookmarkEnd w:id="99"/>
+    <w:bookmarkStart w:id="108" w:name="stage-7-produce-the-evidence-map"/>
     <w:p>
       <w:pPr>
         <w:pStyle w:val="Heading1"/>
@@ -3657,7 +3746,7 @@
         <w:t xml:space="preserve">10. Stage 7: Produce the Evidence Map</w:t>
       </w:r>
     </w:p>
-    <w:bookmarkStart w:id="95" w:name="orientation-6"/>
+    <w:bookmarkStart w:id="100" w:name="orientation-6"/>
     <w:p>
       <w:pPr>
         <w:pStyle w:val="Heading2"/>
@@ -3674,8 +3763,8 @@
         <w:t xml:space="preserve">The final stage does not end research. It converts collection from accumulation into a reasoned plan. The map now shows what the project asks, what evidence bears on it, where the corpus is weak, and what further work is worth its cost.</w:t>
       </w:r>
     </w:p>
-    <w:bookmarkEnd w:id="95"/>
-    <w:bookmarkStart w:id="96" w:name="learn-6"/>
+    <w:bookmarkEnd w:id="100"/>
+    <w:bookmarkStart w:id="101" w:name="learn-6"/>
     <w:p>
       <w:pPr>
         <w:pStyle w:val="Heading2"/>
@@ -3708,8 +3797,8 @@
         <w:t xml:space="preserve">The stopping rule states when active collection ends for the present phase. It should refer to coverage of important dimensions, diversity of source families, declining information yield, treatment of rivals and negative cases, unresolved contradictions, and practical or ethical constraints. It should also state what new evidence would reopen collection.</w:t>
       </w:r>
     </w:p>
-    <w:bookmarkEnd w:id="96"/>
-    <w:bookmarkStart w:id="97" w:name="worked-example-6"/>
+    <w:bookmarkEnd w:id="101"/>
+    <w:bookmarkStart w:id="102" w:name="worked-example-6"/>
     <w:p>
       <w:pPr>
         <w:pStyle w:val="Heading2"/>
@@ -3734,8 +3823,8 @@
         <w:t xml:space="preserve">The stopping rule might close active collection after the main methodological periods are documented, competing classification systems are represented, important transformations are traced, and new searches yield only dependent repetition. It would reopen if a new codebook, originating archive, or independent event series became available.</w:t>
       </w:r>
     </w:p>
-    <w:bookmarkEnd w:id="97"/>
-    <w:bookmarkStart w:id="98" w:name="try-it-6"/>
+    <w:bookmarkEnd w:id="102"/>
+    <w:bookmarkStart w:id="103" w:name="try-it-6"/>
     <w:p>
       <w:pPr>
         <w:pStyle w:val="Heading2"/>
@@ -3752,8 +3841,8 @@
         <w:t xml:space="preserve">Write the strongest claim the present corpus can support. Write the strongest claim it cannot support. Then draft the stopping rule in one paragraph that names both evidence and limits.</w:t>
       </w:r>
     </w:p>
-    <w:bookmarkEnd w:id="98"/>
-    <w:bookmarkStart w:id="99" w:name="guided-ai-workflow-6"/>
+    <w:bookmarkEnd w:id="103"/>
+    <w:bookmarkStart w:id="104" w:name="guided-ai-workflow-6"/>
     <w:p>
       <w:pPr>
         <w:pStyle w:val="Heading2"/>
@@ -3836,8 +3925,8 @@
         <w:t xml:space="preserve">Log which objections changed the stopping rule, and the model and date.</w:t>
       </w:r>
     </w:p>
-    <w:bookmarkEnd w:id="99"/>
-    <w:bookmarkStart w:id="100" w:name="integrity-checkpoint-6"/>
+    <w:bookmarkEnd w:id="104"/>
+    <w:bookmarkStart w:id="105" w:name="integrity-checkpoint-6"/>
     <w:p>
       <w:pPr>
         <w:pStyle w:val="Heading2"/>
@@ -3904,8 +3993,8 @@
         <w:t xml:space="preserve">a deadline or access limit is stated as itself, not as sufficiency.</w:t>
       </w:r>
     </w:p>
-    <w:bookmarkEnd w:id="100"/>
-    <w:bookmarkStart w:id="101" w:name="save-the-artifact-6"/>
+    <w:bookmarkEnd w:id="105"/>
+    <w:bookmarkStart w:id="106" w:name="save-the-artifact-6"/>
     <w:p>
       <w:pPr>
         <w:pStyle w:val="Heading2"/>
@@ -3934,8 +4023,8 @@
         <w:t xml:space="preserve">, a dated release that links the six prior artifacts rather than flattening them: the question frame, concept grid, source-family inventory, search log, evidence register, and gap analysis, together with the collection plan and stopping rule. Preserve editable working files and a stable review copy. Link the release to the question version it answers.</w:t>
       </w:r>
     </w:p>
-    <w:bookmarkEnd w:id="101"/>
-    <w:bookmarkStart w:id="102" w:name="advanced-practice-6"/>
+    <w:bookmarkEnd w:id="106"/>
+    <w:bookmarkStart w:id="107" w:name="advanced-practice-6"/>
     <w:p>
       <w:pPr>
         <w:pStyle w:val="Heading2"/>
@@ -3952,9 +4041,9 @@
         <w:t xml:space="preserve">In team projects, the map becomes an instrument of governance. It assigns responsibility, records disagreements, and makes handoffs possible. The map should not become a surveillance device for counting activity. Its unit is a research decision, not an hour worked.</w:t>
       </w:r>
     </w:p>
-    <w:bookmarkEnd w:id="102"/>
-    <w:bookmarkEnd w:id="103"/>
-    <w:bookmarkStart w:id="115" w:name="literature-as-evidence"/>
+    <w:bookmarkEnd w:id="107"/>
+    <w:bookmarkEnd w:id="108"/>
+    <w:bookmarkStart w:id="120" w:name="literature-as-evidence"/>
     <w:p>
       <w:pPr>
         <w:pStyle w:val="Heading1"/>
@@ -3963,7 +4052,7 @@
         <w:t xml:space="preserve">11. Literature as Evidence</w:t>
       </w:r>
     </w:p>
-    <w:bookmarkStart w:id="107" w:name="the-review-problem"/>
+    <w:bookmarkStart w:id="112" w:name="the-review-problem"/>
     <w:p>
       <w:pPr>
         <w:pStyle w:val="Heading2"/>
@@ -3983,7 +4072,7 @@
         <w:rPr>
           <w:rStyle w:val="FootnoteReference"/>
         </w:rPr>
-        <w:footnoteReference w:id="104"/>
+        <w:footnoteReference w:id="109"/>
       </w:r>
       <w:r>
         <w:t xml:space="preserve"> </w:t>
@@ -4032,8 +4121,8 @@
         <w:t xml:space="preserve">The aim is not suspicion for its own sake. It is to make the relation between a review and its claims inspectable.</w:t>
       </w:r>
     </w:p>
-    <w:bookmarkEnd w:id="107"/>
-    <w:bookmarkStart w:id="108" w:name="from-evidence-map-to-literature-corpus"/>
+    <w:bookmarkEnd w:id="112"/>
+    <w:bookmarkStart w:id="113" w:name="from-evidence-map-to-literature-corpus"/>
     <w:p>
       <w:pPr>
         <w:pStyle w:val="Heading2"/>
@@ -4186,8 +4275,8 @@
         <w:t xml:space="preserve">These objects overlap but are not interchangeable. The protocol and search log explain how the corpus was assembled; the matrix and memo show how it became an account of the field.</w:t>
       </w:r>
     </w:p>
-    <w:bookmarkEnd w:id="108"/>
-    <w:bookmarkStart w:id="111" w:name="the-six-stages"/>
+    <w:bookmarkEnd w:id="113"/>
+    <w:bookmarkStart w:id="116" w:name="the-six-stages"/>
     <w:p>
       <w:pPr>
         <w:pStyle w:val="Heading2"/>
@@ -4207,7 +4296,7 @@
         <w:rPr>
           <w:rStyle w:val="FootnoteReference"/>
         </w:rPr>
-        <w:footnoteReference w:id="109"/>
+        <w:footnoteReference w:id="114"/>
       </w:r>
       <w:r>
         <w:t xml:space="preserve"> </w:t>
@@ -4264,8 +4353,8 @@
         <w:t xml:space="preserve">The sequence is recursive. New vocabulary, a shared citation lineage, or an empty matrix cell can reopen an earlier stage. Preserve earlier versions because they show how the review learned.</w:t>
       </w:r>
     </w:p>
-    <w:bookmarkEnd w:id="111"/>
-    <w:bookmarkStart w:id="112" w:name="two-worked-examples"/>
+    <w:bookmarkEnd w:id="116"/>
+    <w:bookmarkStart w:id="117" w:name="two-worked-examples"/>
     <w:p>
       <w:pPr>
         <w:pStyle w:val="Heading2"/>
@@ -4290,8 +4379,8 @@
         <w:t xml:space="preserve">The secondary example follows a researcher studying how a municipal housing agency changed its treatment of informal settlements between the 1970s and the 1990s. The relevant scholarship is dispersed across urban history, public administration, planning, law, and local-language publications. Terminology changes across the period: the people, places, and administrative practices are not described consistently. Digitization is uneven. The example shows why absence from a database is not evidence of absence from scholarship, and why a review can become narrower than its question without the researcher noticing.</w:t>
       </w:r>
     </w:p>
-    <w:bookmarkEnd w:id="112"/>
-    <w:bookmarkStart w:id="113" w:name="the-artifact-chain"/>
+    <w:bookmarkEnd w:id="117"/>
+    <w:bookmarkStart w:id="118" w:name="the-artifact-chain"/>
     <w:p>
       <w:pPr>
         <w:pStyle w:val="Heading2"/>
@@ -4316,8 +4405,8 @@
         <w:t xml:space="preserve">Stable identifiers connect concepts, searches, sources, claims, and synthesis cells. They prevent the prose from becoming detached from the record that produced it.</w:t>
       </w:r>
     </w:p>
-    <w:bookmarkEnd w:id="113"/>
-    <w:bookmarkStart w:id="114" w:name="the-role-of-ai-1"/>
+    <w:bookmarkEnd w:id="118"/>
+    <w:bookmarkStart w:id="119" w:name="the-role-of-ai-1"/>
     <w:p>
       <w:pPr>
         <w:pStyle w:val="Heading2"/>
@@ -4350,9 +4439,9 @@
         <w:t xml:space="preserve">The audit log records consequential assistance rather than every keystroke. Document AI actions that could change the corpus or the claims drawn from it.</w:t>
       </w:r>
     </w:p>
-    <w:bookmarkEnd w:id="114"/>
-    <w:bookmarkEnd w:id="115"/>
-    <w:bookmarkStart w:id="125" w:name="stage-1-define-the-review"/>
+    <w:bookmarkEnd w:id="119"/>
+    <w:bookmarkEnd w:id="120"/>
+    <w:bookmarkStart w:id="130" w:name="stage-1-define-the-review"/>
     <w:p>
       <w:pPr>
         <w:pStyle w:val="Heading1"/>
@@ -4361,7 +4450,7 @@
         <w:t xml:space="preserve">12. Stage 1: Define the Review</w:t>
       </w:r>
     </w:p>
-    <w:bookmarkStart w:id="116" w:name="orientation-7"/>
+    <w:bookmarkStart w:id="121" w:name="orientation-7"/>
     <w:p>
       <w:pPr>
         <w:pStyle w:val="Heading2"/>
@@ -4386,8 +4475,8 @@
         <w:t xml:space="preserve">Define the review before searching. The definition is provisional, just as the research question is provisional, but it should state what the review must enable the researcher to do. It converts reading from an aspiration into an inquiry.</w:t>
       </w:r>
     </w:p>
-    <w:bookmarkEnd w:id="116"/>
-    <w:bookmarkStart w:id="118" w:name="learn-7"/>
+    <w:bookmarkEnd w:id="121"/>
+    <w:bookmarkStart w:id="123" w:name="learn-7"/>
     <w:p>
       <w:pPr>
         <w:pStyle w:val="Heading2"/>
@@ -4407,7 +4496,7 @@
         <w:rPr>
           <w:rStyle w:val="FootnoteReference"/>
         </w:rPr>
-        <w:footnoteReference w:id="117"/>
+        <w:footnoteReference w:id="122"/>
       </w:r>
       <w:r>
         <w:t xml:space="preserve"> </w:t>
@@ -4544,8 +4633,8 @@
         <w:t xml:space="preserve">State the anticipated product, audience, deadline, collaborators, and threshold for full-text reading. A dissertation section and a review article require different depth. The protocol makes later changes visible.</w:t>
       </w:r>
     </w:p>
-    <w:bookmarkEnd w:id="118"/>
-    <w:bookmarkStart w:id="119" w:name="worked-example-7"/>
+    <w:bookmarkEnd w:id="123"/>
+    <w:bookmarkStart w:id="124" w:name="worked-example-7"/>
     <w:p>
       <w:pPr>
         <w:pStyle w:val="Heading2"/>
@@ -4578,8 +4667,8 @@
         <w:t xml:space="preserve">Both protocols record language and access constraints and assign reopening triggers.</w:t>
       </w:r>
     </w:p>
-    <w:bookmarkEnd w:id="119"/>
-    <w:bookmarkStart w:id="120" w:name="try-it-7"/>
+    <w:bookmarkEnd w:id="124"/>
+    <w:bookmarkStart w:id="125" w:name="try-it-7"/>
     <w:p>
       <w:pPr>
         <w:pStyle w:val="Heading2"/>
@@ -4707,8 +4796,8 @@
         <w:t xml:space="preserve">The exercise is complete when another researcher can apply the inclusion logic to three sample publications and explain their decisions. Agreement is not required. If the protocol cannot support a reasoned disagreement, it remains too vague.</w:t>
       </w:r>
     </w:p>
-    <w:bookmarkEnd w:id="120"/>
-    <w:bookmarkStart w:id="121" w:name="guided-ai-workflow-7"/>
+    <w:bookmarkEnd w:id="125"/>
+    <w:bookmarkStart w:id="126" w:name="guided-ai-workflow-7"/>
     <w:p>
       <w:pPr>
         <w:pStyle w:val="Heading2"/>
@@ -4799,8 +4888,8 @@
         <w:t xml:space="preserve">A useful prompt ends with a required table: assumption; why it matters; possible revision; effect on evidence required; verification action. The structure makes proposals easier to inspect. Do not ask the model to select the “best” protocol. That choice depends on the project’s intellectual commitments and constraints.</w:t>
       </w:r>
     </w:p>
-    <w:bookmarkEnd w:id="121"/>
-    <w:bookmarkStart w:id="122" w:name="integrity-checkpoint-7"/>
+    <w:bookmarkEnd w:id="126"/>
+    <w:bookmarkStart w:id="127" w:name="integrity-checkpoint-7"/>
     <w:p>
       <w:pPr>
         <w:pStyle w:val="Heading2"/>
@@ -4833,8 +4922,8 @@
         <w:t xml:space="preserve">Copyright and access deserve separate attention. A paywall is not evidence of low relevance. An illegally obtained copy does not become safe to redistribute because it supports open scholarship. Record access barriers and seek lawful routes through libraries, authors, repositories, or interlibrary services.</w:t>
       </w:r>
     </w:p>
-    <w:bookmarkEnd w:id="122"/>
-    <w:bookmarkStart w:id="123" w:name="save-the-artifact-7"/>
+    <w:bookmarkEnd w:id="127"/>
+    <w:bookmarkStart w:id="128" w:name="save-the-artifact-7"/>
     <w:p>
       <w:pPr>
         <w:pStyle w:val="Heading2"/>
@@ -4871,8 +4960,8 @@
         <w:t xml:space="preserve">Link the protocol to the evidence map and project log. When it changes, create version 0.2 and add a short change note. Do not overwrite the reasoning that governed earlier searches.</w:t>
       </w:r>
     </w:p>
-    <w:bookmarkEnd w:id="123"/>
-    <w:bookmarkStart w:id="124" w:name="advanced-practice-7"/>
+    <w:bookmarkEnd w:id="128"/>
+    <w:bookmarkStart w:id="129" w:name="advanced-practice-7"/>
     <w:p>
       <w:pPr>
         <w:pStyle w:val="Heading2"/>
@@ -4897,9 +4986,9 @@
         <w:t xml:space="preserve">Team reviews should calibrate inclusion rules on a shared small set before scaling. Living reviews also require monitoring routes, maintenance ownership, and conditions for a new synthesis.</w:t>
       </w:r>
     </w:p>
-    <w:bookmarkEnd w:id="124"/>
-    <w:bookmarkEnd w:id="125"/>
-    <w:bookmarkStart w:id="135" w:name="stage-2-map-concepts-and-vocabulary"/>
+    <w:bookmarkEnd w:id="129"/>
+    <w:bookmarkEnd w:id="130"/>
+    <w:bookmarkStart w:id="140" w:name="stage-2-map-concepts-and-vocabulary"/>
     <w:p>
       <w:pPr>
         <w:pStyle w:val="Heading1"/>
@@ -4908,7 +4997,7 @@
         <w:t xml:space="preserve">13. Stage 2: Map Concepts and Vocabulary</w:t>
       </w:r>
     </w:p>
-    <w:bookmarkStart w:id="126" w:name="orientation-8"/>
+    <w:bookmarkStart w:id="131" w:name="orientation-8"/>
     <w:p>
       <w:pPr>
         <w:pStyle w:val="Heading2"/>
@@ -4933,8 +5022,8 @@
         <w:t xml:space="preserve">The concept-and-vocabulary map turns this problem into an explicit research task. It links what the researcher means to the terms that different authors, institutions, periods, and systems may use.</w:t>
       </w:r>
     </w:p>
-    <w:bookmarkEnd w:id="126"/>
-    <w:bookmarkStart w:id="128" w:name="learn-8"/>
+    <w:bookmarkEnd w:id="131"/>
+    <w:bookmarkStart w:id="133" w:name="learn-8"/>
     <w:p>
       <w:pPr>
         <w:pStyle w:val="Heading2"/>
@@ -4954,7 +5043,7 @@
         <w:rPr>
           <w:rStyle w:val="FootnoteReference"/>
         </w:rPr>
-        <w:footnoteReference w:id="127"/>
+        <w:footnoteReference w:id="132"/>
       </w:r>
       <w:r>
         <w:t xml:space="preserve"> </w:t>
@@ -5216,8 +5305,8 @@
         <w:t xml:space="preserve">broadens retrieval but does not make them conceptually identical.</w:t>
       </w:r>
     </w:p>
-    <w:bookmarkEnd w:id="128"/>
-    <w:bookmarkStart w:id="129" w:name="worked-example-8"/>
+    <w:bookmarkEnd w:id="133"/>
+    <w:bookmarkStart w:id="134" w:name="worked-example-8"/>
     <w:p>
       <w:pPr>
         <w:pStyle w:val="Heading2"/>
@@ -5452,8 +5541,8 @@
         <w:t xml:space="preserve">In the municipal case, agency names and settlement labels change across periods and actors. The map connects terms to period, actor, language, and evidentiary risk so historical vocabulary can support retrieval without becoming the researcher’s unmarked description.</w:t>
       </w:r>
     </w:p>
-    <w:bookmarkEnd w:id="129"/>
-    <w:bookmarkStart w:id="130" w:name="try-it-8"/>
+    <w:bookmarkEnd w:id="134"/>
+    <w:bookmarkStart w:id="135" w:name="try-it-8"/>
     <w:p>
       <w:pPr>
         <w:pStyle w:val="Heading2"/>
@@ -5530,8 +5619,8 @@
         <w:t xml:space="preserve">Run the queries in one appropriate system. Sample the results rather than collecting everything. Record which kinds of work each query reveals, which irrelevant literatures appear, and which new terms deserve another cycle. Revise the map, retaining the earlier version.</w:t>
       </w:r>
     </w:p>
-    <w:bookmarkEnd w:id="130"/>
-    <w:bookmarkStart w:id="131" w:name="guided-ai-workflow-8"/>
+    <w:bookmarkEnd w:id="135"/>
+    <w:bookmarkStart w:id="136" w:name="guided-ai-workflow-8"/>
     <w:p>
       <w:pPr>
         <w:pStyle w:val="Heading2"/>
@@ -5630,8 +5719,8 @@
         <w:t xml:space="preserve">A second pass can ask for terms associated with a neighboring discipline or affected community. Treat the output as a coverage challenge, never as a substitute for scholarship or testimony from that community.</w:t>
       </w:r>
     </w:p>
-    <w:bookmarkEnd w:id="131"/>
-    <w:bookmarkStart w:id="132" w:name="integrity-checkpoint-8"/>
+    <w:bookmarkEnd w:id="136"/>
+    <w:bookmarkStart w:id="137" w:name="integrity-checkpoint-8"/>
     <w:p>
       <w:pPr>
         <w:pStyle w:val="Heading2"/>
@@ -5664,8 +5753,8 @@
         <w:t xml:space="preserve">Do not optimize only for recall. Adding every imaginable synonym can produce a corpus so noisy that selection becomes opaque. Each term needs a relation to the concept and a reason for inclusion. Exclusion terms require equal care: removing a word to reduce noise may also remove a relevant minority usage.</w:t>
       </w:r>
     </w:p>
-    <w:bookmarkEnd w:id="132"/>
-    <w:bookmarkStart w:id="133" w:name="save-the-artifact-8"/>
+    <w:bookmarkEnd w:id="137"/>
+    <w:bookmarkStart w:id="138" w:name="save-the-artifact-8"/>
     <w:p>
       <w:pPr>
         <w:pStyle w:val="Heading2"/>
@@ -5702,8 +5791,8 @@
         <w:t xml:space="preserve">Link every consequential query in the search log to the relevant term IDs. When a term changes the corpus, preserve the map version that preceded the change. The provenance of the term matters: a candidate proposed by a model and verified in an archival thesaurus has a different history from a subject heading copied from a database.</w:t>
       </w:r>
     </w:p>
-    <w:bookmarkEnd w:id="133"/>
-    <w:bookmarkStart w:id="134" w:name="advanced-practice-8"/>
+    <w:bookmarkEnd w:id="138"/>
+    <w:bookmarkStart w:id="139" w:name="advanced-practice-8"/>
     <w:p>
       <w:pPr>
         <w:pStyle w:val="Heading2"/>
@@ -5728,9 +5817,9 @@
         <w:t xml:space="preserve">Multilingual teams should calibrate concepts, not only translate queries, and record non-equivalence as a finding. Stable IDs and explicit relations usually suffice; formalize the map only for a real downstream task.</w:t>
       </w:r>
     </w:p>
-    <w:bookmarkEnd w:id="134"/>
-    <w:bookmarkEnd w:id="135"/>
-    <w:bookmarkStart w:id="148" w:name="stage-3-discover-through-multiple-routes"/>
+    <w:bookmarkEnd w:id="139"/>
+    <w:bookmarkEnd w:id="140"/>
+    <w:bookmarkStart w:id="153" w:name="stage-3-discover-through-multiple-routes"/>
     <w:p>
       <w:pPr>
         <w:pStyle w:val="Heading1"/>
@@ -5739,7 +5828,7 @@
         <w:t xml:space="preserve">14. Stage 3: Discover Through Multiple Routes</w:t>
       </w:r>
     </w:p>
-    <w:bookmarkStart w:id="136" w:name="orientation-9"/>
+    <w:bookmarkStart w:id="141" w:name="orientation-9"/>
     <w:p>
       <w:pPr>
         <w:pStyle w:val="Heading2"/>
@@ -5764,8 +5853,8 @@
         <w:t xml:space="preserve">Discovery becomes more defensible when routes are combined and recorded. The aim is not to search everywhere. It is to understand how each route selects and to use complementary routes for the review’s purpose.</w:t>
       </w:r>
     </w:p>
-    <w:bookmarkEnd w:id="136"/>
-    <w:bookmarkStart w:id="141" w:name="learn-9"/>
+    <w:bookmarkEnd w:id="141"/>
+    <w:bookmarkStart w:id="146" w:name="learn-9"/>
     <w:p>
       <w:pPr>
         <w:pStyle w:val="Heading2"/>
@@ -5833,7 +5922,7 @@
         <w:rPr>
           <w:rStyle w:val="FootnoteReference"/>
         </w:rPr>
-        <w:footnoteReference w:id="137"/>
+        <w:footnoteReference w:id="142"/>
       </w:r>
       <w:r>
         <w:t xml:space="preserve"> </w:t>
@@ -5949,7 +6038,7 @@
         <w:rPr>
           <w:rStyle w:val="FootnoteReference"/>
         </w:rPr>
-        <w:footnoteReference w:id="139"/>
+        <w:footnoteReference w:id="144"/>
       </w:r>
       <w:r>
         <w:t xml:space="preserve"> </w:t>
@@ -5966,8 +6055,8 @@
         <w:t xml:space="preserve">Deduplicate at the work level while linking preprint, conference, accepted, and published versions. Do not count manifestations as independent evidence.</w:t>
       </w:r>
     </w:p>
-    <w:bookmarkEnd w:id="141"/>
-    <w:bookmarkStart w:id="142" w:name="worked-example-9"/>
+    <w:bookmarkEnd w:id="146"/>
+    <w:bookmarkStart w:id="147" w:name="worked-example-9"/>
     <w:p>
       <w:pPr>
         <w:pStyle w:val="Heading2"/>
@@ -6086,8 +6175,8 @@
         <w:t xml:space="preserve">For the municipal agency, backward chaining reveals a former agency name; a local catalogue then uncovers dissertations and reports, while legal journals reveal a tenure vocabulary absent from planning queries. Each route corrects another’s selection mechanism.</w:t>
       </w:r>
     </w:p>
-    <w:bookmarkEnd w:id="142"/>
-    <w:bookmarkStart w:id="143" w:name="try-it-9"/>
+    <w:bookmarkEnd w:id="147"/>
+    <w:bookmarkStart w:id="148" w:name="try-it-9"/>
     <w:p>
       <w:pPr>
         <w:pStyle w:val="Heading2"/>
@@ -6164,8 +6253,8 @@
         <w:t xml:space="preserve">At the end, identify where routes converged and where the search depends on a single index or citation lineage. Mark that area as a coverage risk for Stage 6.</w:t>
       </w:r>
     </w:p>
-    <w:bookmarkEnd w:id="143"/>
-    <w:bookmarkStart w:id="144" w:name="guided-ai-workflow-9"/>
+    <w:bookmarkEnd w:id="148"/>
+    <w:bookmarkStart w:id="149" w:name="guided-ai-workflow-9"/>
     <w:p>
       <w:pPr>
         <w:pStyle w:val="Heading2"/>
@@ -6280,8 +6369,8 @@
         <w:t xml:space="preserve">When a model does propose citations, quarantine them in a candidate table. Nothing enters the bibliography or source register until it resolves to an authentic record and has been screened against the protocol. Fluency does not lower the verification threshold.</w:t>
       </w:r>
     </w:p>
-    <w:bookmarkEnd w:id="144"/>
-    <w:bookmarkStart w:id="145" w:name="integrity-checkpoint-9"/>
+    <w:bookmarkEnd w:id="149"/>
+    <w:bookmarkStart w:id="150" w:name="integrity-checkpoint-9"/>
     <w:p>
       <w:pPr>
         <w:pStyle w:val="Heading2"/>
@@ -6322,8 +6411,8 @@
         <w:t xml:space="preserve">Automated bulk retrieval may violate platform terms or overload services. Follow access rules, rate limits, and copyright restrictions. The fact that a script can download material does not establish permission to do so or to redistribute it.</w:t>
       </w:r>
     </w:p>
-    <w:bookmarkEnd w:id="145"/>
-    <w:bookmarkStart w:id="146" w:name="save-the-artifact-9"/>
+    <w:bookmarkEnd w:id="150"/>
+    <w:bookmarkStart w:id="151" w:name="save-the-artifact-9"/>
     <w:p>
       <w:pPr>
         <w:pStyle w:val="Heading2"/>
@@ -6368,8 +6457,8 @@
         <w:t xml:space="preserve">Export or save search histories when systems permit, but keep the human-readable log. Platform exports can become unreadable when subscriptions or interfaces change.</w:t>
       </w:r>
     </w:p>
-    <w:bookmarkEnd w:id="146"/>
-    <w:bookmarkStart w:id="147" w:name="advanced-practice-9"/>
+    <w:bookmarkEnd w:id="151"/>
+    <w:bookmarkStart w:id="152" w:name="advanced-practice-9"/>
     <w:p>
       <w:pPr>
         <w:pStyle w:val="Heading2"/>
@@ -6394,9 +6483,9 @@
         <w:t xml:space="preserve">Research librarians can improve recall and documentation. Record who designed and checked each strategy. Living reviews should separate the multi-route baseline from monitoring and version both.</w:t>
       </w:r>
     </w:p>
-    <w:bookmarkEnd w:id="147"/>
-    <w:bookmarkEnd w:id="148"/>
-    <w:bookmarkStart w:id="157" w:name="stage-4-evaluate-sources-and-claims"/>
+    <w:bookmarkEnd w:id="152"/>
+    <w:bookmarkEnd w:id="153"/>
+    <w:bookmarkStart w:id="162" w:name="stage-4-evaluate-sources-and-claims"/>
     <w:p>
       <w:pPr>
         <w:pStyle w:val="Heading1"/>
@@ -6405,7 +6494,7 @@
         <w:t xml:space="preserve">15. Stage 4: Evaluate Sources and Claims</w:t>
       </w:r>
     </w:p>
-    <w:bookmarkStart w:id="149" w:name="orientation-10"/>
+    <w:bookmarkStart w:id="154" w:name="orientation-10"/>
     <w:p>
       <w:pPr>
         <w:pStyle w:val="Heading2"/>
@@ -6430,8 +6519,8 @@
         <w:t xml:space="preserve">The purpose is not to assign every publication a universal score. It is to decide what work a source can responsibly perform in this review.</w:t>
       </w:r>
     </w:p>
-    <w:bookmarkEnd w:id="149"/>
-    <w:bookmarkStart w:id="150" w:name="learn-10"/>
+    <w:bookmarkEnd w:id="154"/>
+    <w:bookmarkStart w:id="155" w:name="learn-10"/>
     <w:p>
       <w:pPr>
         <w:pStyle w:val="Heading2"/>
@@ -6601,8 +6690,8 @@
         <w:t xml:space="preserve">Metrics enter only after these judgments. They vary by field, age, language, document type, and index. Influence and validity are different variables.</w:t>
       </w:r>
     </w:p>
-    <w:bookmarkEnd w:id="150"/>
-    <w:bookmarkStart w:id="151" w:name="worked-example-10"/>
+    <w:bookmarkEnd w:id="155"/>
+    <w:bookmarkStart w:id="156" w:name="worked-example-10"/>
     <w:p>
       <w:pPr>
         <w:pStyle w:val="Heading2"/>
@@ -6635,8 +6724,8 @@
         <w:t xml:space="preserve">Now suppose several later studies cite the empirical pattern. We inspect whether they reproduce the analysis, apply it to another dataset, or cite the result as settled background. The source register marks shared dependence. Agreement in prose does not automatically become independent corroboration.</w:t>
       </w:r>
     </w:p>
-    <w:bookmarkEnd w:id="151"/>
-    <w:bookmarkStart w:id="152" w:name="try-it-10"/>
+    <w:bookmarkEnd w:id="156"/>
+    <w:bookmarkStart w:id="157" w:name="try-it-10"/>
     <w:p>
       <w:pPr>
         <w:pStyle w:val="Heading2"/>
@@ -6741,8 +6830,8 @@
         <w:t xml:space="preserve">Trace one repeated proposition back a citation step and read the cited passage. Record qualification loss, miscitation, or common dependence.</w:t>
       </w:r>
     </w:p>
-    <w:bookmarkEnd w:id="152"/>
-    <w:bookmarkStart w:id="153" w:name="guided-ai-workflow-10"/>
+    <w:bookmarkEnd w:id="157"/>
+    <w:bookmarkStart w:id="158" w:name="guided-ai-workflow-10"/>
     <w:p>
       <w:pPr>
         <w:pStyle w:val="Heading2"/>
@@ -6841,8 +6930,8 @@
         <w:t xml:space="preserve">Do not ask a model to evaluate a work from its title or abstract. Abstracts are selective representations designed to communicate contribution. They rarely provide enough information to judge evidence, transformations, limitations, or citation dependence.</w:t>
       </w:r>
     </w:p>
-    <w:bookmarkEnd w:id="153"/>
-    <w:bookmarkStart w:id="154" w:name="integrity-checkpoint-10"/>
+    <w:bookmarkEnd w:id="158"/>
+    <w:bookmarkStart w:id="159" w:name="integrity-checkpoint-10"/>
     <w:p>
       <w:pPr>
         <w:pStyle w:val="Heading2"/>
@@ -6883,8 +6972,8 @@
         <w:t xml:space="preserve">Avoid laundering unsupported claims through citation. If a statement matters to the synthesis, verify that the cited source supports it. If the source cannot be obtained, label the claim as second-hand or exclude it from load-bearing prose.</w:t>
       </w:r>
     </w:p>
-    <w:bookmarkEnd w:id="154"/>
-    <w:bookmarkStart w:id="155" w:name="save-the-artifact-10"/>
+    <w:bookmarkEnd w:id="159"/>
+    <w:bookmarkStart w:id="160" w:name="save-the-artifact-10"/>
     <w:p>
       <w:pPr>
         <w:pStyle w:val="Heading2"/>
@@ -6929,8 +7018,8 @@
         <w:t xml:space="preserve">Do not place long copyrighted passages in the workbook. Use short quotations only when necessary for precision and record page numbers. Keep the source file in its lawful location and link through a stable source ID.</w:t>
       </w:r>
     </w:p>
-    <w:bookmarkEnd w:id="155"/>
-    <w:bookmarkStart w:id="156" w:name="advanced-practice-10"/>
+    <w:bookmarkEnd w:id="160"/>
+    <w:bookmarkStart w:id="161" w:name="advanced-practice-10"/>
     <w:p>
       <w:pPr>
         <w:pStyle w:val="Heading2"/>
@@ -6955,9 +7044,9 @@
         <w:t xml:space="preserve">Use formal appraisal tools only when they fit the claims and design. Computational reviews should preserve seed sets, thresholds, validation samples, errors, and versions; relevance scores are system outputs, not source properties.</w:t>
       </w:r>
     </w:p>
-    <w:bookmarkEnd w:id="156"/>
-    <w:bookmarkEnd w:id="157"/>
-    <w:bookmarkStart w:id="166" w:name="stage-5-read-annotate-and-compare"/>
+    <w:bookmarkEnd w:id="161"/>
+    <w:bookmarkEnd w:id="162"/>
+    <w:bookmarkStart w:id="171" w:name="stage-5-read-annotate-and-compare"/>
     <w:p>
       <w:pPr>
         <w:pStyle w:val="Heading1"/>
@@ -6966,7 +7055,7 @@
         <w:t xml:space="preserve">16. Stage 5: Read, Annotate, and Compare</w:t>
       </w:r>
     </w:p>
-    <w:bookmarkStart w:id="158" w:name="orientation-11"/>
+    <w:bookmarkStart w:id="163" w:name="orientation-11"/>
     <w:p>
       <w:pPr>
         <w:pStyle w:val="Heading2"/>
@@ -6991,8 +7080,8 @@
         <w:t xml:space="preserve">Reading for synthesis requires two linked records: a faithful source note and a comparison structure that reorganizes information across sources. The first protects accuracy. The second enables analysis.</w:t>
       </w:r>
     </w:p>
-    <w:bookmarkEnd w:id="158"/>
-    <w:bookmarkStart w:id="159" w:name="learn-11"/>
+    <w:bookmarkEnd w:id="163"/>
+    <w:bookmarkStart w:id="164" w:name="learn-11"/>
     <w:p>
       <w:pPr>
         <w:pStyle w:val="Heading2"/>
@@ -7187,8 +7276,8 @@
         <w:t xml:space="preserve">. Ask what patterns appear across columns. Which differences follow method, period, case selection, definition, or source base? Which works appear to disagree only because they answer different questions? Which share a conclusion but rely on one lineage? Memos capture these emerging relations without pretending that the final synthesis is settled.</w:t>
       </w:r>
     </w:p>
-    <w:bookmarkEnd w:id="159"/>
-    <w:bookmarkStart w:id="160" w:name="worked-example-11"/>
+    <w:bookmarkEnd w:id="164"/>
+    <w:bookmarkStart w:id="165" w:name="worked-example-11"/>
     <w:p>
       <w:pPr>
         <w:pStyle w:val="Heading2"/>
@@ -7221,8 +7310,8 @@
         <w:t xml:space="preserve">The matrix also exposes dependence. Several works describe historical collection changes using the same documentation. Their cells receive different source IDs but the same dependence marker. The synthesis can report broad acknowledgment of the issue while avoiding the claim that multiple independent studies established it.</w:t>
       </w:r>
     </w:p>
-    <w:bookmarkEnd w:id="160"/>
-    <w:bookmarkStart w:id="161" w:name="try-it-11"/>
+    <w:bookmarkEnd w:id="165"/>
+    <w:bookmarkStart w:id="166" w:name="try-it-11"/>
     <w:p>
       <w:pPr>
         <w:pStyle w:val="Heading2"/>
@@ -7299,8 +7388,8 @@
         <w:t xml:space="preserve">Return to two publications and verify the passages on which the memos depend. Revise the matrix if the comparison overstated what an author claimed. This return is essential: abstraction increases the risk of losing qualification.</w:t>
       </w:r>
     </w:p>
-    <w:bookmarkEnd w:id="161"/>
-    <w:bookmarkStart w:id="162" w:name="guided-ai-workflow-11"/>
+    <w:bookmarkEnd w:id="166"/>
+    <w:bookmarkStart w:id="167" w:name="guided-ai-workflow-11"/>
     <w:p>
       <w:pPr>
         <w:pStyle w:val="Heading2"/>
@@ -7399,8 +7488,8 @@
         <w:t xml:space="preserve">Do not ask the model to write the final review from the matrix. The matrix is a compressed representation. It omits rhetoric, context, uncertainty, and many source details. Drafting directly from it can turn analytical shorthand into unsupported certainty.</w:t>
       </w:r>
     </w:p>
-    <w:bookmarkEnd w:id="162"/>
-    <w:bookmarkStart w:id="163" w:name="integrity-checkpoint-11"/>
+    <w:bookmarkEnd w:id="167"/>
+    <w:bookmarkStart w:id="168" w:name="integrity-checkpoint-11"/>
     <w:p>
       <w:pPr>
         <w:pStyle w:val="Heading2"/>
@@ -7441,8 +7530,8 @@
         <w:t xml:space="preserve">Accessible formats often receive deeper analysis. Record and correct that imbalance when the review purpose requires.</w:t>
       </w:r>
     </w:p>
-    <w:bookmarkEnd w:id="163"/>
-    <w:bookmarkStart w:id="164" w:name="save-the-artifact-11"/>
+    <w:bookmarkEnd w:id="168"/>
+    <w:bookmarkStart w:id="169" w:name="save-the-artifact-11"/>
     <w:p>
       <w:pPr>
         <w:pStyle w:val="Heading2"/>
@@ -7490,8 +7579,8 @@
         <w:t xml:space="preserve">When the matrix changes substantially, preserve the earlier version so the synthesis remains connected to the corpus state that produced it.</w:t>
       </w:r>
     </w:p>
-    <w:bookmarkEnd w:id="164"/>
-    <w:bookmarkStart w:id="165" w:name="advanced-practice-11"/>
+    <w:bookmarkEnd w:id="169"/>
+    <w:bookmarkStart w:id="170" w:name="advanced-practice-11"/>
     <w:p>
       <w:pPr>
         <w:pStyle w:val="Heading2"/>
@@ -7516,9 +7605,9 @@
         <w:t xml:space="preserve">Large reviews may sample for deep reading while retaining a broader screened corpus. Team projects should calibrate a shared schema while preserving minority interpretations that reveal genuine ambiguity.</w:t>
       </w:r>
     </w:p>
-    <w:bookmarkEnd w:id="165"/>
-    <w:bookmarkEnd w:id="166"/>
-    <w:bookmarkStart w:id="176" w:name="stage-6-synthesize-audit-and-stop"/>
+    <w:bookmarkEnd w:id="170"/>
+    <w:bookmarkEnd w:id="171"/>
+    <w:bookmarkStart w:id="181" w:name="stage-6-synthesize-audit-and-stop"/>
     <w:p>
       <w:pPr>
         <w:pStyle w:val="Heading1"/>
@@ -7527,7 +7616,7 @@
         <w:t xml:space="preserve">17. Stage 6: Synthesize, Audit, and Stop</w:t>
       </w:r>
     </w:p>
-    <w:bookmarkStart w:id="168" w:name="orientation-12"/>
+    <w:bookmarkStart w:id="173" w:name="orientation-12"/>
     <w:p>
       <w:pPr>
         <w:pStyle w:val="Heading2"/>
@@ -7555,7 +7644,7 @@
         <w:rPr>
           <w:rStyle w:val="FootnoteReference"/>
         </w:rPr>
-        <w:footnoteReference w:id="167"/>
+        <w:footnoteReference w:id="172"/>
       </w:r>
       <w:r>
         <w:t xml:space="preserve"> </w:t>
@@ -7564,8 +7653,8 @@
         <w:t xml:space="preserve">Synthesize what the corpus can support. Audit how the corpus was assembled and represented. State why searching and reading can stop for the present purpose.</w:t>
       </w:r>
     </w:p>
-    <w:bookmarkEnd w:id="168"/>
-    <w:bookmarkStart w:id="169" w:name="learn-12"/>
+    <w:bookmarkEnd w:id="173"/>
+    <w:bookmarkStart w:id="174" w:name="learn-12"/>
     <w:p>
       <w:pPr>
         <w:pStyle w:val="Heading2"/>
@@ -7807,8 +7896,8 @@
         <w:t xml:space="preserve">. A newly released archive, a major review, a revised dataset, an unsearched language, a credible contrary study, or a change in the research question may justify another cycle. Living scholarship requires a way to change without pretending that every page is continuously current.</w:t>
       </w:r>
     </w:p>
-    <w:bookmarkEnd w:id="169"/>
-    <w:bookmarkStart w:id="170" w:name="worked-example-12"/>
+    <w:bookmarkEnd w:id="174"/>
+    <w:bookmarkStart w:id="175" w:name="worked-example-12"/>
     <w:p>
       <w:pPr>
         <w:pStyle w:val="Heading2"/>
@@ -7857,8 +7946,8 @@
         <w:t xml:space="preserve">The stopping rule notes that searches across five routes now recover familiar conceptual and empirical patterns; key works have been verified; local-language and dissertation coverage has been attempted; and contrary accounts are represented. It also records incomplete access to older internal reports. Discovery stops for the chapter, while a newly digitized report series or evidence that another agency name was used would reopen it.</w:t>
       </w:r>
     </w:p>
-    <w:bookmarkEnd w:id="170"/>
-    <w:bookmarkStart w:id="171" w:name="try-it-12"/>
+    <w:bookmarkEnd w:id="175"/>
+    <w:bookmarkStart w:id="176" w:name="try-it-12"/>
     <w:p>
       <w:pPr>
         <w:pStyle w:val="Heading2"/>
@@ -8036,8 +8125,8 @@
         <w:t xml:space="preserve">Finally, write the stopping rule in one paragraph and a separate list of reopening triggers. Give the corpus and protocol versions to which the rule applies. Ask a colleague to identify what evidence would make the stopping decision unreasonable.</w:t>
       </w:r>
     </w:p>
-    <w:bookmarkEnd w:id="171"/>
-    <w:bookmarkStart w:id="172" w:name="guided-ai-workflow-12"/>
+    <w:bookmarkEnd w:id="176"/>
+    <w:bookmarkStart w:id="177" w:name="guided-ai-workflow-12"/>
     <w:p>
       <w:pPr>
         <w:pStyle w:val="Heading2"/>
@@ -8136,8 +8225,8 @@
         <w:t xml:space="preserve">Do not ask a model to infer field-level consensus from citation counts or snippets. Do not allow it to fill gaps with general knowledge. Require it to say “not supported by the supplied record” when the matrix lacks evidence.</w:t>
       </w:r>
     </w:p>
-    <w:bookmarkEnd w:id="172"/>
-    <w:bookmarkStart w:id="173" w:name="integrity-checkpoint-12"/>
+    <w:bookmarkEnd w:id="177"/>
+    <w:bookmarkStart w:id="178" w:name="integrity-checkpoint-12"/>
     <w:p>
       <w:pPr>
         <w:pStyle w:val="Heading2"/>
@@ -8178,8 +8267,8 @@
         <w:t xml:space="preserve">Corrections are part of a living review. Provide a version, review date, citation form, change log, and route for reporting errors. Preserve previous releases when feasible so readers can identify which account they used.</w:t>
       </w:r>
     </w:p>
-    <w:bookmarkEnd w:id="173"/>
-    <w:bookmarkStart w:id="174" w:name="save-the-artifact-12"/>
+    <w:bookmarkEnd w:id="178"/>
+    <w:bookmarkStart w:id="179" w:name="save-the-artifact-12"/>
     <w:p>
       <w:pPr>
         <w:pStyle w:val="Heading2"/>
@@ -8212,8 +8301,8 @@
         <w:t xml:space="preserve">Archive the review artifacts together, prefer open formats, and preserve only material that rights and ethics permit.</w:t>
       </w:r>
     </w:p>
-    <w:bookmarkEnd w:id="174"/>
-    <w:bookmarkStart w:id="175" w:name="advanced-practice-12"/>
+    <w:bookmarkEnd w:id="179"/>
+    <w:bookmarkStart w:id="180" w:name="advanced-practice-12"/>
     <w:p>
       <w:pPr>
         <w:pStyle w:val="Heading2"/>
@@ -8230,9 +8319,9 @@
         <w:t xml:space="preserve">Formal synthesis traditions require their own standards. Living reviews additionally require ownership, review intervals, corrections, and version rules.</w:t>
       </w:r>
     </w:p>
-    <w:bookmarkEnd w:id="175"/>
-    <w:bookmarkEnd w:id="176"/>
-    <w:bookmarkStart w:id="186" w:name="ai-and-research-integrity"/>
+    <w:bookmarkEnd w:id="180"/>
+    <w:bookmarkEnd w:id="181"/>
+    <w:bookmarkStart w:id="191" w:name="ai-and-research-integrity"/>
     <w:p>
       <w:pPr>
         <w:pStyle w:val="Heading1"/>
@@ -8241,7 +8330,7 @@
         <w:t xml:space="preserve">18. AI and Research Integrity</w:t>
       </w:r>
     </w:p>
-    <w:bookmarkStart w:id="179" w:name="a-division-of-labor"/>
+    <w:bookmarkStart w:id="184" w:name="a-division-of-labor"/>
     <w:p>
       <w:pPr>
         <w:pStyle w:val="Heading2"/>
@@ -8277,11 +8366,11 @@
         <w:rPr>
           <w:rStyle w:val="FootnoteReference"/>
         </w:rPr>
-        <w:footnoteReference w:id="177"/>
-      </w:r>
-    </w:p>
-    <w:bookmarkEnd w:id="179"/>
-    <w:bookmarkStart w:id="180" w:name="model-neutral-workflows"/>
+        <w:footnoteReference w:id="182"/>
+      </w:r>
+    </w:p>
+    <w:bookmarkEnd w:id="184"/>
+    <w:bookmarkStart w:id="185" w:name="model-neutral-workflows"/>
     <w:p>
       <w:pPr>
         <w:pStyle w:val="Heading2"/>
@@ -8322,8 +8411,8 @@
         <w:t xml:space="preserve">Model neutrality has a limit worth stating. The verification-heavy workflows in this guide assume access to a capable model, and capable models often cost money. The privacy fallback assumes a local or institutional system that many researchers do not have. Capability also varies by tool, language, and region. For these reasons the method does not depend on AI. The map, the search log, the evidence register, and the stopping rule stand on their own. A researcher without access to a frontier model loses an assistant, not the method.</w:t>
       </w:r>
     </w:p>
-    <w:bookmarkEnd w:id="180"/>
-    <w:bookmarkStart w:id="181" w:name="privacy-and-data-minimization"/>
+    <w:bookmarkEnd w:id="185"/>
+    <w:bookmarkStart w:id="186" w:name="privacy-and-data-minimization"/>
     <w:p>
       <w:pPr>
         <w:pStyle w:val="Heading2"/>
@@ -8348,8 +8437,8 @@
         <w:t xml:space="preserve">The audit log records what category of material entered the system. It need not reproduce protected content. It should record the model, date, task, input description, relevant settings, output disposition, and human reviewer.</w:t>
       </w:r>
     </w:p>
-    <w:bookmarkEnd w:id="181"/>
-    <w:bookmarkStart w:id="182" w:name="verification"/>
+    <w:bookmarkEnd w:id="186"/>
+    <w:bookmarkStart w:id="187" w:name="verification"/>
     <w:p>
       <w:pPr>
         <w:pStyle w:val="Heading2"/>
@@ -8382,8 +8471,8 @@
         <w:t xml:space="preserve">The same rule applies to summaries. A model may produce an elegant account of a document while missing a qualification that changes its meaning. Verify against the original and record which passages support the summary.</w:t>
       </w:r>
     </w:p>
-    <w:bookmarkEnd w:id="182"/>
-    <w:bookmarkStart w:id="183" w:name="bias-and-missing-perspectives"/>
+    <w:bookmarkEnd w:id="187"/>
+    <w:bookmarkStart w:id="188" w:name="bias-and-missing-perspectives"/>
     <w:p>
       <w:pPr>
         <w:pStyle w:val="Heading2"/>
@@ -8408,8 +8497,8 @@
         <w:t xml:space="preserve">Ask what position the response assumes. Ask which actors it treats as authoritative. Ask which language and region dominate its suggestions. Then use domain expertise and human consultation to correct the map.</w:t>
       </w:r>
     </w:p>
-    <w:bookmarkEnd w:id="183"/>
-    <w:bookmarkStart w:id="184" w:name="reproducibility-and-drift"/>
+    <w:bookmarkEnd w:id="188"/>
+    <w:bookmarkStart w:id="189" w:name="reproducibility-and-drift"/>
     <w:p>
       <w:pPr>
         <w:pStyle w:val="Heading2"/>
@@ -8434,8 +8523,8 @@
         <w:t xml:space="preserve">Preserve consequential outputs when terms permit. Record accepted and rejected suggestions. State when AI assistance changed the question, search vocabulary, source inventory, or stopping rule. The manuscript needs the decision trail more than it needs a transcript of every exchange.</w:t>
       </w:r>
     </w:p>
-    <w:bookmarkEnd w:id="184"/>
-    <w:bookmarkStart w:id="185" w:name="the-standard"/>
+    <w:bookmarkEnd w:id="189"/>
+    <w:bookmarkStart w:id="190" w:name="the-standard"/>
     <w:p>
       <w:pPr>
         <w:pStyle w:val="Heading2"/>
@@ -8452,9 +8541,9 @@
         <w:t xml:space="preserve">AI use is defensible when it makes judgment more visible. It fails when it hides judgment behind convenience.</w:t>
       </w:r>
     </w:p>
-    <w:bookmarkEnd w:id="185"/>
-    <w:bookmarkEnd w:id="186"/>
-    <w:bookmarkStart w:id="191" w:name="building-the-full-field-guide"/>
+    <w:bookmarkEnd w:id="190"/>
+    <w:bookmarkEnd w:id="191"/>
+    <w:bookmarkStart w:id="196" w:name="building-the-full-field-guide"/>
     <w:p>
       <w:pPr>
         <w:pStyle w:val="Heading1"/>
@@ -8463,7 +8552,7 @@
         <w:t xml:space="preserve">19. Building the Full Field Guide</w:t>
       </w:r>
     </w:p>
-    <w:bookmarkStart w:id="187" w:name="what-the-current-modules-establish"/>
+    <w:bookmarkStart w:id="192" w:name="what-the-current-modules-establish"/>
     <w:p>
       <w:pPr>
         <w:pStyle w:val="Heading2"/>
@@ -8781,8 +8870,8 @@
         <w:t xml:space="preserve">The modules also reveal what remains outside the draft. They do not collect an interview, preserve a website, prepare an archival corpus, code a document, or write the final empirical analysis. Each task requires its own decisions and artifacts.</w:t>
       </w:r>
     </w:p>
-    <w:bookmarkEnd w:id="187"/>
-    <w:bookmarkStart w:id="188" w:name="the-full-field-guide"/>
+    <w:bookmarkEnd w:id="192"/>
+    <w:bookmarkStart w:id="193" w:name="the-full-field-guide"/>
     <w:p>
       <w:pPr>
         <w:pStyle w:val="Heading2"/>
@@ -8823,8 +8912,8 @@
         <w:t xml:space="preserve">A communication module will cover manuscripts, presentations, public data, visual explanation, repositories, and long-term access. Sharing is not the final act after research. Decisions made during collection determine what can later be verified, reused, or protected.</w:t>
       </w:r>
     </w:p>
-    <w:bookmarkEnd w:id="188"/>
-    <w:bookmarkStart w:id="189" w:name="a-hebrew-edition"/>
+    <w:bookmarkEnd w:id="193"/>
+    <w:bookmarkStart w:id="194" w:name="a-hebrew-edition"/>
     <w:p>
       <w:pPr>
         <w:pStyle w:val="Heading2"/>
@@ -8841,8 +8930,8 @@
         <w:t xml:space="preserve">English remains the canonical language during the pilot. A Hebrew edition should follow after the content model and navigation stabilize. Translation will require more than sentence substitution. Search terms, institutional examples, interfaces, and right-to-left design must be adapted. Stable page identifiers will keep the two editions connected without forcing them to change at the same pace.</w:t>
       </w:r>
     </w:p>
-    <w:bookmarkEnd w:id="189"/>
-    <w:bookmarkStart w:id="190" w:name="an-invitation"/>
+    <w:bookmarkEnd w:id="194"/>
+    <w:bookmarkStart w:id="195" w:name="an-invitation"/>
     <w:p>
       <w:pPr>
         <w:pStyle w:val="Heading2"/>
@@ -8875,9 +8964,9 @@
         <w:t xml:space="preserve">The old project began with abundance. The revived project begins with limits, artifacts, and reviewable decisions. This is progress.</w:t>
       </w:r>
     </w:p>
-    <w:bookmarkEnd w:id="190"/>
-    <w:bookmarkEnd w:id="191"/>
-    <w:bookmarkStart w:id="209" w:name="references"/>
+    <w:bookmarkEnd w:id="195"/>
+    <w:bookmarkEnd w:id="196"/>
+    <w:bookmarkStart w:id="214" w:name="references"/>
     <w:p>
       <w:pPr>
         <w:pStyle w:val="Heading1"/>
@@ -8886,27 +8975,20 @@
         <w:t xml:space="preserve">20. References</w:t>
       </w:r>
     </w:p>
-    <w:bookmarkStart w:id="208" w:name="refs"/>
-    <w:bookmarkStart w:id="192" w:name="ref-autio2024genai"/>
+    <w:bookmarkStart w:id="213" w:name="refs"/>
+    <w:bookmarkStart w:id="197" w:name="ref-autio2024genai"/>
     <w:p>
       <w:pPr>
         <w:pStyle w:val="Bibliography"/>
       </w:pPr>
       <w:r>
-        <w:t xml:space="preserve">Autio, Chloe, Reva Schwartz, Jesse Dunietz, et al.</w:t>
-      </w:r>
-      <w:r>
-        <w:t xml:space="preserve"> </w:t>
-      </w:r>
-      <w:r>
-        <w:rPr>
-          <w:i/>
-          <w:iCs/>
-        </w:rPr>
-        <w:t xml:space="preserve">Artificial Intelligence Risk Management Framework: Generative Artificial Intelligence Profile</w:t>
-      </w:r>
-      <w:r>
-        <w:t xml:space="preserve">. NIST AI 600-1.</w:t>
+        <w:t xml:space="preserve">Autio, Chloe, Reva Schwartz, Jesse Dunietz, Shomik Jain, Martin Stanley, Elham Tabassi, Patrick Hall, and Kamie Roberts.</w:t>
+      </w:r>
+      <w:r>
+        <w:t xml:space="preserve"> </w:t>
+      </w:r>
+      <w:r>
+        <w:t xml:space="preserve">“Artificial Intelligence Risk Management Framework: Generative Artificial Intelligence Profile.”</w:t>
       </w:r>
       <w:r>
         <w:t xml:space="preserve"> </w:t>
@@ -8920,7 +9002,7 @@
       <w:r>
         <w:t xml:space="preserve"> </w:t>
       </w:r>
-      <w:hyperlink r:id="rId178">
+      <w:hyperlink r:id="rId183">
         <w:r>
           <w:rPr>
             <w:rStyle w:val="Hyperlink"/>
@@ -8932,8 +9014,8 @@
         <w:t xml:space="preserve">.</w:t>
       </w:r>
     </w:p>
-    <w:bookmarkEnd w:id="192"/>
-    <w:bookmarkStart w:id="193" w:name="ref-booth2016systematic"/>
+    <w:bookmarkEnd w:id="197"/>
+    <w:bookmarkStart w:id="198" w:name="ref-booth2016systematic"/>
     <w:p>
       <w:pPr>
         <w:pStyle w:val="Bibliography"/>
@@ -8952,11 +9034,11 @@
         <w:t xml:space="preserve">Systematic Approaches to a Successful Literature Review</w:t>
       </w:r>
       <w:r>
-        <w:t xml:space="preserve">. 2nd ed. SAGE Publications, 2016.</w:t>
-      </w:r>
-    </w:p>
-    <w:bookmarkEnd w:id="193"/>
-    <w:bookmarkStart w:id="194" w:name="ref-braun2021quality"/>
+        <w:t xml:space="preserve">. 2nd ed. London: SAGE Publications, 2016.</w:t>
+      </w:r>
+    </w:p>
+    <w:bookmarkEnd w:id="198"/>
+    <w:bookmarkStart w:id="199" w:name="ref-braun2021quality"/>
     <w:p>
       <w:pPr>
         <w:pStyle w:val="Bibliography"/>
@@ -8989,7 +9071,7 @@
       <w:r>
         <w:t xml:space="preserve"> </w:t>
       </w:r>
-      <w:hyperlink r:id="rId84">
+      <w:hyperlink r:id="rId89">
         <w:r>
           <w:rPr>
             <w:rStyle w:val="Hyperlink"/>
@@ -9001,8 +9083,8 @@
         <w:t xml:space="preserve">.</w:t>
       </w:r>
     </w:p>
-    <w:bookmarkEnd w:id="194"/>
-    <w:bookmarkStart w:id="195" w:name="ref-enders2011domestic"/>
+    <w:bookmarkEnd w:id="199"/>
+    <w:bookmarkStart w:id="200" w:name="ref-enders2011domestic"/>
     <w:p>
       <w:pPr>
         <w:pStyle w:val="Bibliography"/>
@@ -9035,7 +9117,7 @@
       <w:r>
         <w:t xml:space="preserve"> </w:t>
       </w:r>
-      <w:hyperlink r:id="rId26">
+      <w:hyperlink r:id="rId31">
         <w:r>
           <w:rPr>
             <w:rStyle w:val="Hyperlink"/>
@@ -9047,8 +9129,8 @@
         <w:t xml:space="preserve">.</w:t>
       </w:r>
     </w:p>
-    <w:bookmarkEnd w:id="195"/>
-    <w:bookmarkStart w:id="196" w:name="ref-gerring2012methodology"/>
+    <w:bookmarkEnd w:id="200"/>
+    <w:bookmarkStart w:id="201" w:name="ref-gerring2012methodology"/>
     <w:p>
       <w:pPr>
         <w:pStyle w:val="Bibliography"/>
@@ -9067,11 +9149,11 @@
         <w:t xml:space="preserve">Social Science Methodology: A Unified Framework</w:t>
       </w:r>
       <w:r>
-        <w:t xml:space="preserve">. 2nd ed. Cambridge University Press, 2012.</w:t>
-      </w:r>
-    </w:p>
-    <w:bookmarkEnd w:id="196"/>
-    <w:bookmarkStart w:id="197" w:name="ref-grant2009typology"/>
+        <w:t xml:space="preserve">. 2nd ed. Cambridge: Cambridge University Press, 2012.</w:t>
+      </w:r>
+    </w:p>
+    <w:bookmarkEnd w:id="201"/>
+    <w:bookmarkStart w:id="202" w:name="ref-grant2009typology"/>
     <w:p>
       <w:pPr>
         <w:pStyle w:val="Bibliography"/>
@@ -9114,7 +9196,7 @@
       <w:r>
         <w:t xml:space="preserve"> </w:t>
       </w:r>
-      <w:hyperlink r:id="rId106">
+      <w:hyperlink r:id="rId111">
         <w:r>
           <w:rPr>
             <w:rStyle w:val="Hyperlink"/>
@@ -9126,8 +9208,8 @@
         <w:t xml:space="preserve">.</w:t>
       </w:r>
     </w:p>
-    <w:bookmarkEnd w:id="197"/>
-    <w:bookmarkStart w:id="198" w:name="ref-greenhalgh2005search"/>
+    <w:bookmarkEnd w:id="202"/>
+    <w:bookmarkStart w:id="203" w:name="ref-greenhalgh2005search"/>
     <w:p>
       <w:pPr>
         <w:pStyle w:val="Bibliography"/>
@@ -9160,7 +9242,7 @@
       <w:r>
         <w:t xml:space="preserve"> </w:t>
       </w:r>
-      <w:hyperlink r:id="rId140">
+      <w:hyperlink r:id="rId145">
         <w:r>
           <w:rPr>
             <w:rStyle w:val="Hyperlink"/>
@@ -9172,8 +9254,8 @@
         <w:t xml:space="preserve">.</w:t>
       </w:r>
     </w:p>
-    <w:bookmarkEnd w:id="198"/>
-    <w:bookmarkStart w:id="199" w:name="ref-lebo2013provo"/>
+    <w:bookmarkEnd w:id="203"/>
+    <w:bookmarkStart w:id="204" w:name="ref-lebo2013provo"/>
     <w:p>
       <w:pPr>
         <w:pStyle w:val="Bibliography"/>
@@ -9185,49 +9267,31 @@
         <w:t xml:space="preserve"> </w:t>
       </w:r>
       <w:r>
-        <w:rPr>
-          <w:i/>
-          <w:iCs/>
-        </w:rPr>
+        <w:t xml:space="preserve">“</w:t>
+      </w:r>
+      <w:r>
         <w:t xml:space="preserve">PROV-O</w:t>
       </w:r>
       <w:r>
-        <w:rPr>
-          <w:i/>
-          <w:iCs/>
-        </w:rPr>
         <w:t xml:space="preserve">: The</w:t>
       </w:r>
       <w:r>
-        <w:rPr>
-          <w:i/>
-          <w:iCs/>
-        </w:rPr>
-        <w:t xml:space="preserve"> </w:t>
-      </w:r>
-      <w:r>
-        <w:rPr>
-          <w:i/>
-          <w:iCs/>
-        </w:rPr>
+        <w:t xml:space="preserve"> </w:t>
+      </w:r>
+      <w:r>
         <w:t xml:space="preserve">PROV</w:t>
       </w:r>
       <w:r>
-        <w:rPr>
-          <w:i/>
-          <w:iCs/>
-        </w:rPr>
-        <w:t xml:space="preserve"> </w:t>
-      </w:r>
-      <w:r>
-        <w:rPr>
-          <w:i/>
-          <w:iCs/>
-        </w:rPr>
-        <w:t xml:space="preserve">Ontology</w:t>
-      </w:r>
-      <w:r>
-        <w:t xml:space="preserve">. W3C Recommendation. World Wide Web Consortium, 2013.</w:t>
+        <w:t xml:space="preserve"> </w:t>
+      </w:r>
+      <w:r>
+        <w:t xml:space="preserve">Ontology.”</w:t>
+      </w:r>
+      <w:r>
+        <w:t xml:space="preserve"> </w:t>
+      </w:r>
+      <w:r>
+        <w:t xml:space="preserve">W3C Recommendation. World Wide Web Consortium, 2013.</w:t>
       </w:r>
       <w:r>
         <w:t xml:space="preserve"> </w:t>
@@ -9244,8 +9308,8 @@
         <w:t xml:space="preserve">.</w:t>
       </w:r>
     </w:p>
-    <w:bookmarkEnd w:id="199"/>
-    <w:bookmarkStart w:id="200" w:name="ref-littell2018classification"/>
+    <w:bookmarkEnd w:id="204"/>
+    <w:bookmarkStart w:id="205" w:name="ref-littell2018classification"/>
     <w:p>
       <w:pPr>
         <w:pStyle w:val="Bibliography"/>
@@ -9278,7 +9342,7 @@
       <w:r>
         <w:t xml:space="preserve"> </w:t>
       </w:r>
-      <w:hyperlink r:id="rId110">
+      <w:hyperlink r:id="rId115">
         <w:r>
           <w:rPr>
             <w:rStyle w:val="Hyperlink"/>
@@ -9290,8 +9354,8 @@
         <w:t xml:space="preserve">.</w:t>
       </w:r>
     </w:p>
-    <w:bookmarkEnd w:id="200"/>
-    <w:bookmarkStart w:id="201" w:name="ref-malterud2016information"/>
+    <w:bookmarkEnd w:id="205"/>
+    <w:bookmarkStart w:id="206" w:name="ref-malterud2016information"/>
     <w:p>
       <w:pPr>
         <w:pStyle w:val="Bibliography"/>
@@ -9324,7 +9388,7 @@
       <w:r>
         <w:t xml:space="preserve"> </w:t>
       </w:r>
-      <w:hyperlink r:id="rId86">
+      <w:hyperlink r:id="rId91">
         <w:r>
           <w:rPr>
             <w:rStyle w:val="Hyperlink"/>
@@ -9336,8 +9400,8 @@
         <w:t xml:space="preserve">.</w:t>
       </w:r>
     </w:p>
-    <w:bookmarkEnd w:id="201"/>
-    <w:bookmarkStart w:id="202" w:name="ref-start2024codebook"/>
+    <w:bookmarkEnd w:id="206"/>
+    <w:bookmarkStart w:id="207" w:name="ref-start2024codebook"/>
     <w:p>
       <w:pPr>
         <w:pStyle w:val="Bibliography"/>
@@ -9349,19 +9413,18 @@
         <w:t xml:space="preserve"> </w:t>
       </w:r>
       <w:r>
-        <w:rPr>
-          <w:i/>
-          <w:iCs/>
-        </w:rPr>
-        <w:t xml:space="preserve">Global Terrorism Database Codebook: Methodology Inclusion Criteria and Variables</w:t>
-      </w:r>
-      <w:r>
-        <w:t xml:space="preserve">. 2024.</w:t>
-      </w:r>
-      <w:r>
-        <w:t xml:space="preserve"> </w:t>
-      </w:r>
-      <w:hyperlink r:id="rId24">
+        <w:t xml:space="preserve">“Global Terrorism Database Codebook: Methodology Inclusion Criteria and Variables,”</w:t>
+      </w:r>
+      <w:r>
+        <w:t xml:space="preserve"> </w:t>
+      </w:r>
+      <w:r>
+        <w:t xml:space="preserve">2024.</w:t>
+      </w:r>
+      <w:r>
+        <w:t xml:space="preserve"> </w:t>
+      </w:r>
+      <w:hyperlink r:id="rId29">
         <w:r>
           <w:rPr>
             <w:rStyle w:val="Hyperlink"/>
@@ -9373,14 +9436,14 @@
         <w:t xml:space="preserve">.</w:t>
       </w:r>
     </w:p>
-    <w:bookmarkEnd w:id="202"/>
-    <w:bookmarkStart w:id="203" w:name="ref-page2021prisma"/>
+    <w:bookmarkEnd w:id="207"/>
+    <w:bookmarkStart w:id="208" w:name="ref-page2021prisma"/>
     <w:p>
       <w:pPr>
         <w:pStyle w:val="Bibliography"/>
       </w:pPr>
       <w:r>
-        <w:t xml:space="preserve">Page, Matthew J., Joanne E. McKenzie, Patrick M. Bossuyt, et al.</w:t>
+        <w:t xml:space="preserve">Page, Matthew J., Joanne E. McKenzie, Patrick M. Bossuyt, Isabelle Boutron, Tammy C. Hoffmann, Cynthia D. Mulrow, et al.</w:t>
       </w:r>
       <w:r>
         <w:t xml:space="preserve"> </w:t>
@@ -9419,14 +9482,14 @@
         <w:t xml:space="preserve">.</w:t>
       </w:r>
     </w:p>
-    <w:bookmarkEnd w:id="203"/>
-    <w:bookmarkStart w:id="204" w:name="ref-rethlefsen2021prismas"/>
+    <w:bookmarkEnd w:id="208"/>
+    <w:bookmarkStart w:id="209" w:name="ref-rethlefsen2021prismas"/>
     <w:p>
       <w:pPr>
         <w:pStyle w:val="Bibliography"/>
       </w:pPr>
       <w:r>
-        <w:t xml:space="preserve">Rethlefsen, Melissa L., Shona Kirtley, Siw Waffenschmidt, et al.</w:t>
+        <w:t xml:space="preserve">Rethlefsen, Melissa L., Shona Kirtley, Siw Waffenschmidt, Ana Patricia Ayala, David Moher, Matthew J. Page, and Jonathan B. Koffel.</w:t>
       </w:r>
       <w:r>
         <w:t xml:space="preserve"> </w:t>
@@ -9465,14 +9528,14 @@
         <w:t xml:space="preserve">.</w:t>
       </w:r>
     </w:p>
-    <w:bookmarkEnd w:id="204"/>
-    <w:bookmarkStart w:id="205" w:name="ref-saunders2018saturation"/>
+    <w:bookmarkEnd w:id="209"/>
+    <w:bookmarkStart w:id="210" w:name="ref-saunders2018saturation"/>
     <w:p>
       <w:pPr>
         <w:pStyle w:val="Bibliography"/>
       </w:pPr>
       <w:r>
-        <w:t xml:space="preserve">Saunders, Benjamin, Julius Sim, Tom Kingstone, et al.</w:t>
+        <w:t xml:space="preserve">Saunders, Benjamin, Julius Sim, Tom Kingstone, Shula Baker, Jackie Waterfield, Bernadette Bartlam, Heather Burroughs, and Clare Jinks.</w:t>
       </w:r>
       <w:r>
         <w:t xml:space="preserve"> </w:t>
@@ -9494,12 +9557,12 @@
         <w:t xml:space="preserve"> </w:t>
       </w:r>
       <w:r>
-        <w:t xml:space="preserve">52 (2018): 1893–907.</w:t>
-      </w:r>
-      <w:r>
-        <w:t xml:space="preserve"> </w:t>
-      </w:r>
-      <w:hyperlink r:id="rId83">
+        <w:t xml:space="preserve">52 (2018): 1893–1907.</w:t>
+      </w:r>
+      <w:r>
+        <w:t xml:space="preserve"> </w:t>
+      </w:r>
+      <w:hyperlink r:id="rId88">
         <w:r>
           <w:rPr>
             <w:rStyle w:val="Hyperlink"/>
@@ -9511,8 +9574,8 @@
         <w:t xml:space="preserve">.</w:t>
       </w:r>
     </w:p>
-    <w:bookmarkEnd w:id="205"/>
-    <w:bookmarkStart w:id="206" w:name="ref-snyder2019literature"/>
+    <w:bookmarkEnd w:id="210"/>
+    <w:bookmarkStart w:id="211" w:name="ref-snyder2019literature"/>
     <w:p>
       <w:pPr>
         <w:pStyle w:val="Bibliography"/>
@@ -9545,7 +9608,7 @@
       <w:r>
         <w:t xml:space="preserve"> </w:t>
       </w:r>
-      <w:hyperlink r:id="rId105">
+      <w:hyperlink r:id="rId110">
         <w:r>
           <w:rPr>
             <w:rStyle w:val="Hyperlink"/>
@@ -9557,8 +9620,8 @@
         <w:t xml:space="preserve">.</w:t>
       </w:r>
     </w:p>
-    <w:bookmarkEnd w:id="206"/>
-    <w:bookmarkStart w:id="207" w:name="ref-wohlin2014snowballing"/>
+    <w:bookmarkEnd w:id="211"/>
+    <w:bookmarkStart w:id="212" w:name="ref-wohlin2014snowballing"/>
     <w:p>
       <w:pPr>
         <w:pStyle w:val="Bibliography"/>
@@ -9571,6 +9634,12 @@
       </w:r>
       <w:r>
         <w:t xml:space="preserve">“Guidelines for Snowballing in Systematic Literature Studies and a Replication in Software Engineering.”</w:t>
+      </w:r>
+      <w:r>
+        <w:t xml:space="preserve"> </w:t>
+      </w:r>
+      <w:r>
+        <w:t xml:space="preserve">In</w:t>
       </w:r>
       <w:r>
         <w:t xml:space="preserve"> </w:t>
@@ -9583,12 +9652,12 @@
         <w:t xml:space="preserve">Proceedings of the 18th International Conference on Evaluation and Assessment in Software Engineering</w:t>
       </w:r>
       <w:r>
-        <w:t xml:space="preserve">, 2014, 1–10.</w:t>
-      </w:r>
-      <w:r>
-        <w:t xml:space="preserve"> </w:t>
-      </w:r>
-      <w:hyperlink r:id="rId138">
+        <w:t xml:space="preserve">, 1–10. Association for Computing Machinery, 2014.</w:t>
+      </w:r>
+      <w:r>
+        <w:t xml:space="preserve"> </w:t>
+      </w:r>
+      <w:hyperlink r:id="rId143">
         <w:r>
           <w:rPr>
             <w:rStyle w:val="Hyperlink"/>
@@ -9600,9 +9669,9 @@
         <w:t xml:space="preserve">.</w:t>
       </w:r>
     </w:p>
-    <w:bookmarkEnd w:id="207"/>
-    <w:bookmarkEnd w:id="208"/>
-    <w:bookmarkEnd w:id="209"/>
+    <w:bookmarkEnd w:id="212"/>
+    <w:bookmarkEnd w:id="213"/>
+    <w:bookmarkEnd w:id="214"/>
     <w:sectPr>
       <w:footnotePr>
         <w:numRestart w:val="eachSect"/>
@@ -9653,55 +9722,37 @@
         <w:t xml:space="preserve"> </w:t>
       </w:r>
       <w:r>
-        <w:t xml:space="preserve">Timothy Lebo et al.,</w:t>
-      </w:r>
-      <w:r>
-        <w:t xml:space="preserve"> </w:t>
-      </w:r>
-      <w:r>
-        <w:rPr>
-          <w:i/>
-          <w:iCs/>
-        </w:rPr>
+        <w:t xml:space="preserve">Timothy Lebo, Satya Sahoo, and Deborah McGuinness,</w:t>
+      </w:r>
+      <w:r>
+        <w:t xml:space="preserve"> </w:t>
+      </w:r>
+      <w:r>
+        <w:t xml:space="preserve">“</w:t>
+      </w:r>
+      <w:r>
         <w:t xml:space="preserve">PROV-O</w:t>
       </w:r>
       <w:r>
-        <w:rPr>
-          <w:i/>
-          <w:iCs/>
-        </w:rPr>
         <w:t xml:space="preserve">: The</w:t>
       </w:r>
       <w:r>
-        <w:rPr>
-          <w:i/>
-          <w:iCs/>
-        </w:rPr>
-        <w:t xml:space="preserve"> </w:t>
-      </w:r>
-      <w:r>
-        <w:rPr>
-          <w:i/>
-          <w:iCs/>
-        </w:rPr>
+        <w:t xml:space="preserve"> </w:t>
+      </w:r>
+      <w:r>
         <w:t xml:space="preserve">PROV</w:t>
       </w:r>
       <w:r>
-        <w:rPr>
-          <w:i/>
-          <w:iCs/>
-        </w:rPr>
-        <w:t xml:space="preserve"> </w:t>
-      </w:r>
-      <w:r>
-        <w:rPr>
-          <w:i/>
-          <w:iCs/>
-        </w:rPr>
-        <w:t xml:space="preserve">Ontology</w:t>
-      </w:r>
-      <w:r>
-        <w:t xml:space="preserve">, W3C Recommendation (World Wide Web Consortium, 2013),</w:t>
+        <w:t xml:space="preserve"> </w:t>
+      </w:r>
+      <w:r>
+        <w:t xml:space="preserve">Ontology,”</w:t>
+      </w:r>
+      <w:r>
+        <w:t xml:space="preserve"> </w:t>
+      </w:r>
+      <w:r>
+        <w:t xml:space="preserve">W3C Recommendation (World Wide Web Consortium, 2013),</w:t>
       </w:r>
       <w:r>
         <w:t xml:space="preserve"> </w:t>
@@ -9828,7 +9879,7 @@
       </w:r>
     </w:p>
   </w:footnote>
-  <w:footnote w:id="23">
+  <w:footnote w:id="28">
     <w:p>
       <w:pPr>
         <w:pStyle w:val="FootnoteText"/>
@@ -9855,19 +9906,18 @@
         <w:t xml:space="preserve"> </w:t>
       </w:r>
       <w:r>
-        <w:rPr>
-          <w:i/>
-          <w:iCs/>
-        </w:rPr>
-        <w:t xml:space="preserve">Global Terrorism Database Codebook: Methodology Inclusion Criteria and Variables</w:t>
-      </w:r>
-      <w:r>
-        <w:t xml:space="preserve">, 2024,</w:t>
-      </w:r>
-      <w:r>
-        <w:t xml:space="preserve"> </w:t>
-      </w:r>
-      <w:hyperlink r:id="rId24">
+        <w:t xml:space="preserve">“Global Terrorism Database Codebook: Methodology Inclusion Criteria and Variables,”</w:t>
+      </w:r>
+      <w:r>
+        <w:t xml:space="preserve"> </w:t>
+      </w:r>
+      <w:r>
+        <w:t xml:space="preserve">2024,</w:t>
+      </w:r>
+      <w:r>
+        <w:t xml:space="preserve"> </w:t>
+      </w:r>
+      <w:hyperlink r:id="rId29">
         <w:r>
           <w:rPr>
             <w:rStyle w:val="Hyperlink"/>
@@ -9880,7 +9930,7 @@
       </w:r>
     </w:p>
   </w:footnote>
-  <w:footnote w:id="25">
+  <w:footnote w:id="30">
     <w:p>
       <w:pPr>
         <w:pStyle w:val="FootnoteText"/>
@@ -9901,7 +9951,7 @@
         <w:t xml:space="preserve"> </w:t>
       </w:r>
       <w:r>
-        <w:t xml:space="preserve">Walter Enders et al.,</w:t>
+        <w:t xml:space="preserve">Walter Enders, Todd Sandler, and Khusrav Gaibulloev,</w:t>
       </w:r>
       <w:r>
         <w:t xml:space="preserve"> </w:t>
@@ -9928,7 +9978,7 @@
       <w:r>
         <w:t xml:space="preserve"> </w:t>
       </w:r>
-      <w:hyperlink r:id="rId26">
+      <w:hyperlink r:id="rId31">
         <w:r>
           <w:rPr>
             <w:rStyle w:val="Hyperlink"/>
@@ -9941,7 +9991,7 @@
       </w:r>
     </w:p>
   </w:footnote>
-  <w:footnote w:id="42">
+  <w:footnote w:id="47">
     <w:p>
       <w:pPr>
         <w:pStyle w:val="FootnoteText"/>
@@ -9962,7 +10012,137 @@
         <w:t xml:space="preserve"> </w:t>
       </w:r>
       <w:r>
-        <w:t xml:space="preserve">Enders et al.,</w:t>
+        <w:t xml:space="preserve">Enders, Sandler, and Gaibulloev</w:t>
+      </w:r>
+      <w:r>
+        <w:t xml:space="preserve">.</w:t>
+      </w:r>
+    </w:p>
+  </w:footnote>
+  <w:footnote w:id="57">
+    <w:p>
+      <w:pPr>
+        <w:pStyle w:val="FootnoteText"/>
+      </w:pPr>
+      <w:r>
+        <w:rPr>
+          <w:rStyle w:val="FootnoteReference"/>
+        </w:rPr>
+        <w:footnoteRef/>
+      </w:r>
+      <w:r>
+        <w:t xml:space="preserve"> </w:t>
+      </w:r>
+      <w:r>
+        <w:t xml:space="preserve">See</w:t>
+      </w:r>
+      <w:r>
+        <w:t xml:space="preserve"> </w:t>
+      </w:r>
+      <w:r>
+        <w:t xml:space="preserve">National Consortium for the Study of Terrorism and Responses to Terrorism,</w:t>
+      </w:r>
+      <w:r>
+        <w:t xml:space="preserve"> </w:t>
+      </w:r>
+      <w:r>
+        <w:t xml:space="preserve">“Global Terrorism Database Codebook”</w:t>
+      </w:r>
+      <w:r>
+        <w:t xml:space="preserve">.</w:t>
+      </w:r>
+    </w:p>
+  </w:footnote>
+  <w:footnote w:id="66">
+    <w:p>
+      <w:pPr>
+        <w:pStyle w:val="FootnoteText"/>
+      </w:pPr>
+      <w:r>
+        <w:rPr>
+          <w:rStyle w:val="FootnoteReference"/>
+        </w:rPr>
+        <w:footnoteRef/>
+      </w:r>
+      <w:r>
+        <w:t xml:space="preserve"> </w:t>
+      </w:r>
+      <w:r>
+        <w:t xml:space="preserve">See</w:t>
+      </w:r>
+      <w:r>
+        <w:t xml:space="preserve"> </w:t>
+      </w:r>
+      <w:r>
+        <w:t xml:space="preserve">Rethlefsen et al.,</w:t>
+      </w:r>
+      <w:r>
+        <w:t xml:space="preserve"> </w:t>
+      </w:r>
+      <w:r>
+        <w:t xml:space="preserve">“PRISMA-s”</w:t>
+      </w:r>
+      <w:r>
+        <w:t xml:space="preserve">.</w:t>
+      </w:r>
+    </w:p>
+  </w:footnote>
+  <w:footnote w:id="77">
+    <w:p>
+      <w:pPr>
+        <w:pStyle w:val="FootnoteText"/>
+      </w:pPr>
+      <w:r>
+        <w:rPr>
+          <w:rStyle w:val="FootnoteReference"/>
+        </w:rPr>
+        <w:footnoteRef/>
+      </w:r>
+      <w:r>
+        <w:t xml:space="preserve"> </w:t>
+      </w:r>
+      <w:r>
+        <w:t xml:space="preserve">See</w:t>
+      </w:r>
+      <w:r>
+        <w:t xml:space="preserve"> </w:t>
+      </w:r>
+      <w:r>
+        <w:t xml:space="preserve">National Consortium for the Study of Terrorism and Responses to Terrorism,</w:t>
+      </w:r>
+      <w:r>
+        <w:t xml:space="preserve"> </w:t>
+      </w:r>
+      <w:r>
+        <w:t xml:space="preserve">“Global Terrorism Database Codebook”</w:t>
+      </w:r>
+      <w:r>
+        <w:t xml:space="preserve">.</w:t>
+      </w:r>
+    </w:p>
+  </w:footnote>
+  <w:footnote w:id="78">
+    <w:p>
+      <w:pPr>
+        <w:pStyle w:val="FootnoteText"/>
+      </w:pPr>
+      <w:r>
+        <w:rPr>
+          <w:rStyle w:val="FootnoteReference"/>
+        </w:rPr>
+        <w:footnoteRef/>
+      </w:r>
+      <w:r>
+        <w:t xml:space="preserve"> </w:t>
+      </w:r>
+      <w:r>
+        <w:t xml:space="preserve">See</w:t>
+      </w:r>
+      <w:r>
+        <w:t xml:space="preserve"> </w:t>
+      </w:r>
+      <w:r>
+        <w:t xml:space="preserve">Enders, Sandler, and Gaibulloev,</w:t>
       </w:r>
       <w:r>
         <w:t xml:space="preserve"> </w:t>
@@ -9975,7 +10155,7 @@
       </w:r>
     </w:p>
   </w:footnote>
-  <w:footnote w:id="52">
+  <w:footnote w:id="87">
     <w:p>
       <w:pPr>
         <w:pStyle w:val="FootnoteText"/>
@@ -9996,7 +10176,13 @@
         <w:t xml:space="preserve"> </w:t>
       </w:r>
       <w:r>
-        <w:t xml:space="preserve">National Consortium for the Study of Terrorism and Responses to Terrorism,</w:t>
+        <w:t xml:space="preserve">Benjamin Saunders et al.,</w:t>
+      </w:r>
+      <w:r>
+        <w:t xml:space="preserve"> </w:t>
+      </w:r>
+      <w:r>
+        <w:t xml:space="preserve">“Saturation in Qualitative Research: Exploring Its Conceptualization and Operationalization,”</w:t>
       </w:r>
       <w:r>
         <w:t xml:space="preserve"> </w:t>
@@ -10006,168 +10192,18 @@
           <w:i/>
           <w:iCs/>
         </w:rPr>
-        <w:t xml:space="preserve">Global Terrorism Database Codebook</w:t>
-      </w:r>
-      <w:r>
-        <w:t xml:space="preserve">.</w:t>
-      </w:r>
-    </w:p>
-  </w:footnote>
-  <w:footnote w:id="61">
-    <w:p>
-      <w:pPr>
-        <w:pStyle w:val="FootnoteText"/>
-      </w:pPr>
-      <w:r>
-        <w:rPr>
-          <w:rStyle w:val="FootnoteReference"/>
-        </w:rPr>
-        <w:footnoteRef/>
-      </w:r>
-      <w:r>
-        <w:t xml:space="preserve"> </w:t>
-      </w:r>
-      <w:r>
-        <w:t xml:space="preserve">See</w:t>
-      </w:r>
-      <w:r>
-        <w:t xml:space="preserve"> </w:t>
-      </w:r>
-      <w:r>
-        <w:t xml:space="preserve">Rethlefsen et al.,</w:t>
-      </w:r>
-      <w:r>
-        <w:t xml:space="preserve"> </w:t>
-      </w:r>
-      <w:r>
-        <w:t xml:space="preserve">“PRISMA-s”</w:t>
-      </w:r>
-      <w:r>
-        <w:t xml:space="preserve">.</w:t>
-      </w:r>
-    </w:p>
-  </w:footnote>
-  <w:footnote w:id="72">
-    <w:p>
-      <w:pPr>
-        <w:pStyle w:val="FootnoteText"/>
-      </w:pPr>
-      <w:r>
-        <w:rPr>
-          <w:rStyle w:val="FootnoteReference"/>
-        </w:rPr>
-        <w:footnoteRef/>
-      </w:r>
-      <w:r>
-        <w:t xml:space="preserve"> </w:t>
-      </w:r>
-      <w:r>
-        <w:t xml:space="preserve">See</w:t>
-      </w:r>
-      <w:r>
-        <w:t xml:space="preserve"> </w:t>
-      </w:r>
-      <w:r>
-        <w:t xml:space="preserve">National Consortium for the Study of Terrorism and Responses to Terrorism,</w:t>
-      </w:r>
-      <w:r>
-        <w:t xml:space="preserve"> </w:t>
-      </w:r>
-      <w:r>
-        <w:rPr>
-          <w:i/>
-          <w:iCs/>
-        </w:rPr>
-        <w:t xml:space="preserve">Global Terrorism Database Codebook</w:t>
-      </w:r>
-      <w:r>
-        <w:t xml:space="preserve">.</w:t>
-      </w:r>
-    </w:p>
-  </w:footnote>
-  <w:footnote w:id="73">
-    <w:p>
-      <w:pPr>
-        <w:pStyle w:val="FootnoteText"/>
-      </w:pPr>
-      <w:r>
-        <w:rPr>
-          <w:rStyle w:val="FootnoteReference"/>
-        </w:rPr>
-        <w:footnoteRef/>
-      </w:r>
-      <w:r>
-        <w:t xml:space="preserve"> </w:t>
-      </w:r>
-      <w:r>
-        <w:t xml:space="preserve">See</w:t>
-      </w:r>
-      <w:r>
-        <w:t xml:space="preserve"> </w:t>
-      </w:r>
-      <w:r>
-        <w:t xml:space="preserve">Enders et al.,</w:t>
-      </w:r>
-      <w:r>
-        <w:t xml:space="preserve"> </w:t>
-      </w:r>
-      <w:r>
-        <w:t xml:space="preserve">“Domestic Versus Transnational Terrorism”</w:t>
-      </w:r>
-      <w:r>
-        <w:t xml:space="preserve">.</w:t>
-      </w:r>
-    </w:p>
-  </w:footnote>
-  <w:footnote w:id="82">
-    <w:p>
-      <w:pPr>
-        <w:pStyle w:val="FootnoteText"/>
-      </w:pPr>
-      <w:r>
-        <w:rPr>
-          <w:rStyle w:val="FootnoteReference"/>
-        </w:rPr>
-        <w:footnoteRef/>
-      </w:r>
-      <w:r>
-        <w:t xml:space="preserve"> </w:t>
-      </w:r>
-      <w:r>
-        <w:t xml:space="preserve">See</w:t>
-      </w:r>
-      <w:r>
-        <w:t xml:space="preserve"> </w:t>
-      </w:r>
-      <w:r>
-        <w:t xml:space="preserve">Benjamin Saunders et al.,</w:t>
-      </w:r>
-      <w:r>
-        <w:t xml:space="preserve"> </w:t>
-      </w:r>
-      <w:r>
-        <w:t xml:space="preserve">“Saturation in Qualitative Research: Exploring Its Conceptualization and Operationalization,”</w:t>
-      </w:r>
-      <w:r>
-        <w:t xml:space="preserve"> </w:t>
-      </w:r>
-      <w:r>
-        <w:rPr>
-          <w:i/>
-          <w:iCs/>
-        </w:rPr>
         <w:t xml:space="preserve">Quality &amp; Quantity</w:t>
       </w:r>
       <w:r>
         <w:t xml:space="preserve"> </w:t>
       </w:r>
       <w:r>
-        <w:t xml:space="preserve">52 (2018): 1893–907,</w:t>
-      </w:r>
-      <w:r>
-        <w:t xml:space="preserve"> </w:t>
-      </w:r>
-      <w:hyperlink r:id="rId83">
+        <w:t xml:space="preserve">52 (2018): 1893–1907,</w:t>
+      </w:r>
+      <w:r>
+        <w:t xml:space="preserve"> </w:t>
+      </w:r>
+      <w:hyperlink r:id="rId88">
         <w:r>
           <w:rPr>
             <w:rStyle w:val="Hyperlink"/>
@@ -10212,7 +10248,7 @@
       <w:r>
         <w:t xml:space="preserve"> </w:t>
       </w:r>
-      <w:hyperlink r:id="rId84">
+      <w:hyperlink r:id="rId89">
         <w:r>
           <w:rPr>
             <w:rStyle w:val="Hyperlink"/>
@@ -10225,7 +10261,7 @@
       </w:r>
     </w:p>
   </w:footnote>
-  <w:footnote w:id="85">
+  <w:footnote w:id="90">
     <w:p>
       <w:pPr>
         <w:pStyle w:val="FootnoteText"/>
@@ -10246,7 +10282,7 @@
         <w:t xml:space="preserve"> </w:t>
       </w:r>
       <w:r>
-        <w:t xml:space="preserve">Kirsti Malterud et al.,</w:t>
+        <w:t xml:space="preserve">Kirsti Malterud, Volkert Dirk Siersma, and Ann Dorrit Guassora,</w:t>
       </w:r>
       <w:r>
         <w:t xml:space="preserve"> </w:t>
@@ -10273,7 +10309,7 @@
       <w:r>
         <w:t xml:space="preserve"> </w:t>
       </w:r>
-      <w:hyperlink r:id="rId86">
+      <w:hyperlink r:id="rId91">
         <w:r>
           <w:rPr>
             <w:rStyle w:val="Hyperlink"/>
@@ -10286,7 +10322,7 @@
       </w:r>
     </w:p>
   </w:footnote>
-  <w:footnote w:id="104">
+  <w:footnote w:id="109">
     <w:p>
       <w:pPr>
         <w:pStyle w:val="FootnoteText"/>
@@ -10328,7 +10364,7 @@
       <w:r>
         <w:t xml:space="preserve"> </w:t>
       </w:r>
-      <w:hyperlink r:id="rId105">
+      <w:hyperlink r:id="rId110">
         <w:r>
           <w:rPr>
             <w:rStyle w:val="Hyperlink"/>
@@ -10374,7 +10410,7 @@
       <w:r>
         <w:t xml:space="preserve"> </w:t>
       </w:r>
-      <w:hyperlink r:id="rId106">
+      <w:hyperlink r:id="rId111">
         <w:r>
           <w:rPr>
             <w:rStyle w:val="Hyperlink"/>
@@ -10387,7 +10423,7 @@
       </w:r>
     </w:p>
   </w:footnote>
-  <w:footnote w:id="109">
+  <w:footnote w:id="114">
     <w:p>
       <w:pPr>
         <w:pStyle w:val="FootnoteText"/>
@@ -10429,7 +10465,7 @@
       <w:r>
         <w:t xml:space="preserve"> </w:t>
       </w:r>
-      <w:hyperlink r:id="rId110">
+      <w:hyperlink r:id="rId115">
         <w:r>
           <w:rPr>
             <w:rStyle w:val="Hyperlink"/>
@@ -10442,7 +10478,7 @@
       </w:r>
     </w:p>
   </w:footnote>
-  <w:footnote w:id="117">
+  <w:footnote w:id="122">
     <w:p>
       <w:pPr>
         <w:pStyle w:val="FootnoteText"/>
@@ -10476,7 +10512,7 @@
       </w:r>
     </w:p>
   </w:footnote>
-  <w:footnote w:id="127">
+  <w:footnote w:id="132">
     <w:p>
       <w:pPr>
         <w:pStyle w:val="FootnoteText"/>
@@ -10504,11 +10540,11 @@
         <w:t xml:space="preserve">Social Science Methodology: A Unified Framework</w:t>
       </w:r>
       <w:r>
-        <w:t xml:space="preserve">, 2nd ed. (Cambridge University Press, 2012).</w:t>
+        <w:t xml:space="preserve">, 2nd ed. (Cambridge: Cambridge University Press, 2012).</w:t>
       </w:r>
     </w:p>
   </w:footnote>
-  <w:footnote w:id="137">
+  <w:footnote w:id="142">
     <w:p>
       <w:pPr>
         <w:pStyle w:val="FootnoteText"/>
@@ -10530,6 +10566,12 @@
       </w:r>
       <w:r>
         <w:t xml:space="preserve">“Guidelines for Snowballing in Systematic Literature Studies and a Replication in Software Engineering,”</w:t>
+      </w:r>
+      <w:r>
+        <w:t xml:space="preserve"> </w:t>
+      </w:r>
+      <w:r>
+        <w:t xml:space="preserve">in</w:t>
       </w:r>
       <w:r>
         <w:t xml:space="preserve"> </w:t>
@@ -10542,12 +10584,15 @@
         <w:t xml:space="preserve">Proceedings of the 18th International Conference on Evaluation and Assessment in Software Engineering</w:t>
       </w:r>
       <w:r>
-        <w:t xml:space="preserve">, 2014, 1–10,</w:t>
-      </w:r>
-      <w:r>
-        <w:t xml:space="preserve"> </w:t>
-      </w:r>
-      <w:hyperlink r:id="rId138">
+        <w:t xml:space="preserve"> </w:t>
+      </w:r>
+      <w:r>
+        <w:t xml:space="preserve">(Association for Computing Machinery, 2014), 1–10,</w:t>
+      </w:r>
+      <w:r>
+        <w:t xml:space="preserve"> </w:t>
+      </w:r>
+      <w:hyperlink r:id="rId143">
         <w:r>
           <w:rPr>
             <w:rStyle w:val="Hyperlink"/>
@@ -10560,7 +10605,7 @@
       </w:r>
     </w:p>
   </w:footnote>
-  <w:footnote w:id="139">
+  <w:footnote w:id="144">
     <w:p>
       <w:pPr>
         <w:pStyle w:val="FootnoteText"/>
@@ -10602,7 +10647,7 @@
       <w:r>
         <w:t xml:space="preserve"> </w:t>
       </w:r>
-      <w:hyperlink r:id="rId140">
+      <w:hyperlink r:id="rId145">
         <w:r>
           <w:rPr>
             <w:rStyle w:val="Hyperlink"/>
@@ -10611,7 +10656,7 @@
         </w:r>
       </w:hyperlink>
       <w:r>
-        <w:t xml:space="preserve">; Andrew Booth et al.,</w:t>
+        <w:t xml:space="preserve">; Andrew Booth, Anthea Sutton, and Diana Papaioannou,</w:t>
       </w:r>
       <w:r>
         <w:t xml:space="preserve"> </w:t>
@@ -10624,11 +10669,11 @@
         <w:t xml:space="preserve">Systematic Approaches to a Successful Literature Review</w:t>
       </w:r>
       <w:r>
-        <w:t xml:space="preserve">, 2nd ed. (SAGE Publications, 2016).</w:t>
+        <w:t xml:space="preserve">, 2nd ed. (London: SAGE Publications, 2016).</w:t>
       </w:r>
     </w:p>
   </w:footnote>
-  <w:footnote w:id="167">
+  <w:footnote w:id="172">
     <w:p>
       <w:pPr>
         <w:pStyle w:val="FootnoteText"/>
@@ -10665,7 +10710,7 @@
       </w:r>
     </w:p>
   </w:footnote>
-  <w:footnote w:id="177">
+  <w:footnote w:id="182">
     <w:p>
       <w:pPr>
         <w:pStyle w:val="FootnoteText"/>
@@ -10692,14 +10737,13 @@
         <w:t xml:space="preserve"> </w:t>
       </w:r>
       <w:r>
-        <w:rPr>
-          <w:i/>
-          <w:iCs/>
-        </w:rPr>
-        <w:t xml:space="preserve">Artificial Intelligence Risk Management Framework: Generative Artificial Intelligence Profile</w:t>
-      </w:r>
-      <w:r>
-        <w:t xml:space="preserve">, NIST AI 600-1 (</w:t>
+        <w:t xml:space="preserve">“Artificial Intelligence Risk Management Framework: Generative Artificial Intelligence Profile”</w:t>
+      </w:r>
+      <w:r>
+        <w:t xml:space="preserve"> </w:t>
+      </w:r>
+      <w:r>
+        <w:t xml:space="preserve">(</w:t>
       </w:r>
       <w:r>
         <w:t xml:space="preserve">National Institute of Standards and Technology</w:t>
@@ -10710,7 +10754,7 @@
       <w:r>
         <w:t xml:space="preserve"> </w:t>
       </w:r>
-      <w:hyperlink r:id="rId178">
+      <w:hyperlink r:id="rId183">
         <w:r>
           <w:rPr>
             <w:rStyle w:val="Hyperlink"/>

</xml_diff>

<commit_message>
feat(site): improve field guide readability
</commit_message>
<xml_diff>
--- a/field-guide/book/From-Question-to-Evidence.docx
+++ b/field-guide/book/From-Question-to-Evidence.docx
@@ -82,15 +82,23 @@
         <w:pStyle w:val="FirstParagraph"/>
       </w:pPr>
       <w:r>
-        <w:t xml:space="preserve">About a decade ago, we began writing a book about a problem that seemed to grow each time we tried to describe it. Social scientists had gained access to more articles, documents, images, recordings, databases, and search systems than any earlier generation of researchers. Access had widened. Control had weakened. A researcher could collect thousands of files before deciding what any of them contributed to the question at hand.</w:t>
-      </w:r>
-    </w:p>
-    <w:p>
-      <w:pPr>
-        <w:pStyle w:val="BodyText"/>
-      </w:pPr>
-      <w:r>
-        <w:t xml:space="preserve">We paused the project. The problem did not pause with us. Generative artificial intelligence has since made the abundance more difficult to interpret. A model can suggest concepts, propose search terms, sort excerpts, and expose gaps within minutes. It can also invent a reference, erase a minority position, disclose protected material, or present an uncertain inference as settled fact. Speed has increased. Scholarly responsibility has not moved.</w:t>
+        <w:t xml:space="preserve">Nearly a decade ago, we began writing this book. We already had a workflow in mind. It began with the foundations of a research project: a bounded question, explicit concepts, and a record of the assumptions that shaped the inquiry. It then followed evidence through collection, structure, preservation, analysis, and a reproducible path from source to claim.</w:t>
+      </w:r>
+    </w:p>
+    <w:p>
+      <w:pPr>
+        <w:pStyle w:val="BodyText"/>
+      </w:pPr>
+      <w:r>
+        <w:t xml:space="preserve">The information environment was already expanding faster than one researcher could absorb it. Search engines, digital archives, smartphones, and cloud storage made acquisition easier, but they did not make a large and heterogeneous corpus easier to reason about. The workflow exceeded the practical capacity of the available tools. What we were missing was processing power.</w:t>
+      </w:r>
+    </w:p>
+    <w:p>
+      <w:pPr>
+        <w:pStyle w:val="BodyText"/>
+      </w:pPr>
+      <w:r>
+        <w:t xml:space="preserve">The recent arrival of large language models changed that constraint. They can propose concepts, generate search terms, compare excerpts, trace patterns, and expose gaps across a body of material in minutes. Yet power is not judgment. The same systems can invent a reference, erase a minority position, disclose protected material, or present an uncertain inference as settled fact. The method came first. Large language models now make parts of it executable at a scale we could only describe when the project began.</w:t>
       </w:r>
     </w:p>
     <w:p>
@@ -181,7 +189,7 @@
         <w:pStyle w:val="FirstParagraph"/>
       </w:pPr>
       <w:r>
-        <w:t xml:space="preserve">The original project began with a practical frustration. Researchers were being told that digital technology had democratized knowledge, and in an important sense it had. Search engines opened routes into literatures that once required proximity to a major library. Smartphones placed a camera, recorder, scanner, map, and notebook in one pocket. Cloud storage made files available across continents. Yet each gain created another decision that methods training rarely addressed.</w:t>
+        <w:t xml:space="preserve">The original project began nearly a decade ago with a practical frustration. We could see the workflow a qualitative project required, from its conceptual foundations through collection, structure, preservation, analysis, and a reproducible path from evidence to claim. But the available tools could manage only fragments of that chain. Researchers were being told that digital technology had democratized knowledge, and in an important sense it had. Search engines opened routes into literatures that once required proximity to a major library. Smartphones placed a camera, recorder, scanner, map, and notebook in one pocket. Cloud storage made files available across continents. Yet each gain created another decision that methods training rarely addressed.</w:t>
       </w:r>
     </w:p>
     <w:p>
@@ -223,7 +231,7 @@
         <w:pStyle w:val="FirstParagraph"/>
       </w:pPr>
       <w:r>
-        <w:t xml:space="preserve">Generative AI changes the scale of the problem, but not its nature. A researcher has always relied on aids to memory and classification. Indexes, catalogues, research assistants, codebooks, and bibliographies all extend individual capacity. The new systems differ in three respects. They respond in natural language. They infer patterns across large bodies of text. They produce answers whose fluency can hide the weakness of their evidentiary basis.</w:t>
+        <w:t xml:space="preserve">Large language models supply some of the processing power the original workflow lacked. They change the scale of the problem, but not its nature. A researcher has always relied on aids to memory and classification. Indexes, catalogues, research assistants, codebooks, and bibliographies all extend individual capacity. The new systems differ in three respects. They respond in natural language. They infer patterns across large bodies of text. They produce answers whose fluency can hide the weakness of their evidentiary basis.</w:t>
       </w:r>
     </w:p>
     <w:p>

</xml_diff>

<commit_message>
feat(workflow): publish AI event database chapter
</commit_message>
<xml_diff>
--- a/field-guide/book/From-Question-to-Evidence.docx
+++ b/field-guide/book/From-Question-to-Evidence.docx
@@ -130,7 +130,7 @@
         <w:pStyle w:val="BodyText"/>
       </w:pPr>
       <w:r>
-        <w:t xml:space="preserve">The full field guide follows a qualitative project from its first question to a documented corpus, an analysis, and a public claim. We are publishing it in reviewed modules so readers can use, test, and challenge each part before the first edition closes. The current revision contains two complete modules. The first follows the path from a question to an evidence map. The second carries the same logic into a literature review. A third will connect the collection plan to a responsibly assembled research corpus. Later modules will address preparation, analysis, disconfirmation, writing, sharing, and maintenance.</w:t>
+        <w:t xml:space="preserve">The full field guide follows a qualitative project from its first question to a documented corpus, an analysis, and a public claim. We are publishing it in reviewed modules so readers can use, test, and challenge each part before the first edition closes. The current revision contains two complete modules. The first follows the path from a question to an evidence map. The second carries the same logic into a literature review. A new bridge chapter shows how AI can accelerate the construction of event databases while preserving provenance, validation, and causal discipline. A third complete module will connect the collection plan to a responsibly assembled research corpus. Later modules will address preparation, analysis, disconfirmation, writing, sharing, and maintenance.</w:t>
       </w:r>
     </w:p>
     <w:p>
@@ -8329,22 +8329,1055 @@
     </w:p>
     <w:bookmarkEnd w:id="180"/>
     <w:bookmarkEnd w:id="181"/>
-    <w:bookmarkStart w:id="191" w:name="ai-and-research-integrity"/>
+    <w:bookmarkStart w:id="214" w:name="building-event-databases-with-ai"/>
     <w:p>
       <w:pPr>
         <w:pStyle w:val="Heading1"/>
       </w:pPr>
       <w:r>
-        <w:t xml:space="preserve">18. AI and Research Integrity</w:t>
-      </w:r>
-    </w:p>
-    <w:bookmarkStart w:id="184" w:name="a-division-of-labor"/>
+        <w:t xml:space="preserve">18. Building Event Databases with AI</w:t>
+      </w:r>
+    </w:p>
+    <w:bookmarkStart w:id="186" w:name="orientation-13"/>
     <w:p>
       <w:pPr>
         <w:pStyle w:val="Heading2"/>
       </w:pPr>
       <w:r>
-        <w:t xml:space="preserve">18.1 A Division of Labor</w:t>
+        <w:t xml:space="preserve">18.1 Orientation</w:t>
+      </w:r>
+    </w:p>
+    <w:p>
+      <w:pPr>
+        <w:pStyle w:val="FirstParagraph"/>
+      </w:pPr>
+      <w:r>
+        <w:t xml:space="preserve">Event databases convert dispersed accounts into comparable records. A researcher may begin with a question about protest, repression, political violence, institutional reform, migration, or disaster response. The relevant traces may appear across newspapers, archival catalogues, government reports, organizational records, and born-digital collections. Before generative AI, much of the work required repetitive searching, copying, normalization, and initial classification. These tasks consumed time that researchers needed for interpretation.</w:t>
+      </w:r>
+    </w:p>
+    <w:p>
+      <w:pPr>
+        <w:pStyle w:val="BodyText"/>
+      </w:pPr>
+      <w:r>
+        <w:t xml:space="preserve">AI changes the feasible scale of this work. A system can expand queries, search an authorized collection, extract candidate fields, compare reports, and flag records that may describe the same occurrence. It can apply a preliminary codebook to thousands of passages and identify dimensions the original codebook omitted. Studies of text annotation show that language models can perform some bounded classification tasks quickly and inexpensively. Performance, however, varies substantially across tasks and datasets, which makes local validation indispensable.</w:t>
+      </w:r>
+      <w:r>
+        <w:rPr>
+          <w:rStyle w:val="FootnoteReference"/>
+        </w:rPr>
+        <w:footnoteReference w:id="182"/>
+      </w:r>
+    </w:p>
+    <w:p>
+      <w:pPr>
+        <w:pStyle w:val="BodyText"/>
+      </w:pPr>
+      <w:r>
+        <w:t xml:space="preserve">The resulting speed creates a methodological danger. A fluent extraction can make an uncertain mention look like an observed event. Several articles can make one wire report look like independent confirmation. A model can produce a precise code for an ambiguous passage or a causal probability without defining the comparison that gives the number meaning. Faster processing does not remove these problems. It can reproduce them at scale.</w:t>
+      </w:r>
+    </w:p>
+    <w:p>
+      <w:pPr>
+        <w:pStyle w:val="BodyText"/>
+      </w:pPr>
+      <w:r>
+        <w:t xml:space="preserve">This chapter presents an auditable alternative. AI compresses clerical stages while the researcher preserves a visible chain from source to record, record to event, event to variable, and written evidence to causal inference. Every transition produces an artifact that can be reviewed, corrected, and versioned.</w:t>
+      </w:r>
+    </w:p>
+    <w:bookmarkEnd w:id="186"/>
+    <w:bookmarkStart w:id="207" w:name="learn-13"/>
+    <w:p>
+      <w:pPr>
+        <w:pStyle w:val="Heading2"/>
+      </w:pPr>
+      <w:r>
+        <w:t xml:space="preserve">18.2 Learn</w:t>
+      </w:r>
+    </w:p>
+    <w:bookmarkStart w:id="187" w:name="begin-with-the-unit-not-the-model"/>
+    <w:p>
+      <w:pPr>
+        <w:pStyle w:val="Heading3"/>
+      </w:pPr>
+      <w:r>
+        <w:t xml:space="preserve">18.2.1 Begin with the unit, not the model</w:t>
+      </w:r>
+    </w:p>
+    <w:p>
+      <w:pPr>
+        <w:pStyle w:val="FirstParagraph"/>
+      </w:pPr>
+      <w:r>
+        <w:t xml:space="preserve">An event database requires a declared unit of observation. The unit might be an attack, demonstration, arrest, policy decision, organizational founding, public statement, or interaction between named actors. Its boundary must state what counts as one event, when two reports refer to the same event, and when one report contains several events.</w:t>
+      </w:r>
+    </w:p>
+    <w:p>
+      <w:pPr>
+        <w:pStyle w:val="BodyText"/>
+      </w:pPr>
+      <w:r>
+        <w:t xml:space="preserve">Write the boundary before retrieval. Record inclusion and exclusion rules, temporal and geographic scope, actor and action definitions, and the minimum evidence required for a verified record. The first codebook should follow the research question and hypotheses. It should identify the variables needed to describe the event, evaluate rival explanations, and document the reporting process.</w:t>
+      </w:r>
+    </w:p>
+    <w:p>
+      <w:pPr>
+        <w:pStyle w:val="BodyText"/>
+      </w:pPr>
+      <w:r>
+        <w:t xml:space="preserve">This order matters because a model will readily propose whatever categories are easy to extract. Extractability is not theoretical importance. If the system defines the unit through its output, the database may record what the model recognizes instead of what the research design requires.</w:t>
+      </w:r>
+    </w:p>
+    <w:bookmarkEnd w:id="187"/>
+    <w:bookmarkStart w:id="192" w:name="build-a-source-frame"/>
+    <w:p>
+      <w:pPr>
+        <w:pStyle w:val="Heading3"/>
+      </w:pPr>
+      <w:r>
+        <w:t xml:space="preserve">18.2.2 Build a source frame</w:t>
+      </w:r>
+    </w:p>
+    <w:p>
+      <w:pPr>
+        <w:pStyle w:val="FirstParagraph"/>
+      </w:pPr>
+      <w:r>
+        <w:t xml:space="preserve">Manual newspaper searching often proceeds title by title and query by query. A digital source frame allows the researcher to define a collection before searching it. The frame records each newspaper, archive, database, date range, language, access route, known gap, and relevant restriction. Open news infrastructures can support large-scale retrieval, while library archives can expose searchable historical newspapers and catalogue records.</w:t>
+      </w:r>
+      <w:r>
+        <w:rPr>
+          <w:rStyle w:val="FootnoteReference"/>
+        </w:rPr>
+        <w:footnoteReference w:id="188"/>
+      </w:r>
+      <w:r>
+        <w:t xml:space="preserve"> </w:t>
+      </w:r>
+      <w:r>
+        <w:t xml:space="preserve">The frame should also include local and oppositional sources that a prominent aggregator may not index.</w:t>
+      </w:r>
+    </w:p>
+    <w:p>
+      <w:pPr>
+        <w:pStyle w:val="BodyText"/>
+      </w:pPr>
+      <w:r>
+        <w:t xml:space="preserve">Digitized collections are not transparent windows onto the past. Selection, survival, digitization, OCR quality, licensing, and search interfaces shape what becomes discoverable. Studies of newspaper digitization show why collection composition must be examined before researchers interpret search results as historical coverage.</w:t>
+      </w:r>
+      <w:r>
+        <w:rPr>
+          <w:rStyle w:val="FootnoteReference"/>
+        </w:rPr>
+        <w:footnoteReference w:id="190"/>
+      </w:r>
+      <w:r>
+        <w:t xml:space="preserve"> </w:t>
+      </w:r>
+      <w:r>
+        <w:t xml:space="preserve">A failed query may indicate absence, vocabulary mismatch, OCR error, unavailable dates, or a source omitted from the platform. Record which explanation remains plausible.</w:t>
+      </w:r>
+    </w:p>
+    <w:p>
+      <w:pPr>
+        <w:pStyle w:val="BodyText"/>
+      </w:pPr>
+      <w:r>
+        <w:t xml:space="preserve">AI can accelerate work inside the source frame. It can translate query concepts, generate historical names, adapt syntax across archives, and rank retrieved documents for review. A search-connected system may also query an approved interface directly. These operations remain collection procedures. The search log should preserve the source collection, query, date, filters, result count, model or script, and review decision. Access must comply with archive rules, licenses, privacy obligations, and research ethics.</w:t>
+      </w:r>
+    </w:p>
+    <w:bookmarkEnd w:id="192"/>
+    <w:bookmarkStart w:id="193" w:name="separate-discovery-from-verification"/>
+    <w:p>
+      <w:pPr>
+        <w:pStyle w:val="Heading3"/>
+      </w:pPr>
+      <w:r>
+        <w:t xml:space="preserve">18.2.3 Separate discovery from verification</w:t>
+      </w:r>
+    </w:p>
+    <w:p>
+      <w:pPr>
+        <w:pStyle w:val="FirstParagraph"/>
+      </w:pPr>
+      <w:r>
+        <w:t xml:space="preserve">The first extraction produces a</w:t>
+      </w:r>
+      <w:r>
+        <w:t xml:space="preserve"> </w:t>
+      </w:r>
+      <w:r>
+        <w:rPr>
+          <w:b/>
+          <w:bCs/>
+        </w:rPr>
+        <w:t xml:space="preserve">candidate record</w:t>
+      </w:r>
+      <w:r>
+        <w:t xml:space="preserve">, not an event. A candidate record reports that a particular source span may describe an event within scope. It should preserve the document identifier, publication date, page or URL, exact source span, retrieval route, proposed event date, actors, action, target, location, and model output. The preserved span allows a reviewer to return to the evidence without trusting the summary.</w:t>
+      </w:r>
+    </w:p>
+    <w:p>
+      <w:pPr>
+        <w:pStyle w:val="BodyText"/>
+      </w:pPr>
+      <w:r>
+        <w:t xml:space="preserve">A candidate becomes a</w:t>
+      </w:r>
+      <w:r>
+        <w:t xml:space="preserve"> </w:t>
+      </w:r>
+      <w:r>
+        <w:rPr>
+          <w:b/>
+          <w:bCs/>
+        </w:rPr>
+        <w:t xml:space="preserve">verified record</w:t>
+      </w:r>
+      <w:r>
+        <w:t xml:space="preserve"> </w:t>
+      </w:r>
+      <w:r>
+        <w:t xml:space="preserve">only after the relevant passage and metadata have been checked. Verification asks whether the source exists, whether the passage supports the proposed fields, whether uncertainty has been preserved, and whether the item satisfies the inclusion rule. The decision may be accepted, rejected, or marked unresolved. It must name the reviewer and date.</w:t>
+      </w:r>
+    </w:p>
+    <w:p>
+      <w:pPr>
+        <w:pStyle w:val="BodyText"/>
+      </w:pPr>
+      <w:r>
+        <w:t xml:space="preserve">This separation allows wide retrieval without lowering the evidentiary threshold. The system can favor recall during discovery because false positives remain outside the verified dataset. Reviewers can then favor precision when deciding what enters the database. A model should have an abstention route for passages that do not support a stable classification.</w:t>
+      </w:r>
+    </w:p>
+    <w:bookmarkEnd w:id="193"/>
+    <w:bookmarkStart w:id="196" w:name="resolve-reports-into-events"/>
+    <w:p>
+      <w:pPr>
+        <w:pStyle w:val="Heading3"/>
+      </w:pPr>
+      <w:r>
+        <w:t xml:space="preserve">18.2.4 Resolve reports into events</w:t>
+      </w:r>
+    </w:p>
+    <w:p>
+      <w:pPr>
+        <w:pStyle w:val="FirstParagraph"/>
+      </w:pPr>
+      <w:r>
+        <w:t xml:space="preserve">News collections rarely provide one document per event. The same account may be syndicated, translated, updated, quoted by another outlet, or repeated in a retrospective report. Conversely, one article may describe several occurrences. The database therefore needs an event-resolution stage between verified records and analytical events.</w:t>
+      </w:r>
+    </w:p>
+    <w:p>
+      <w:pPr>
+        <w:pStyle w:val="BodyText"/>
+      </w:pPr>
+      <w:r>
+        <w:t xml:space="preserve">AI can compare names, dates, places, actions, and source spans to generate possible matches. Event extraction research shows, however, that simple zero-shot prompting can perform poorly when reports contain ambiguity, hypothetical language, or several interacting actors.</w:t>
+      </w:r>
+      <w:r>
+        <w:rPr>
+          <w:rStyle w:val="FootnoteReference"/>
+        </w:rPr>
+        <w:footnoteReference w:id="194"/>
+      </w:r>
+      <w:r>
+        <w:t xml:space="preserve"> </w:t>
+      </w:r>
+      <w:r>
+        <w:t xml:space="preserve">A match score should therefore open a review task instead of merging records automatically.</w:t>
+      </w:r>
+    </w:p>
+    <w:p>
+      <w:pPr>
+        <w:pStyle w:val="BodyText"/>
+      </w:pPr>
+      <w:r>
+        <w:t xml:space="preserve">The</w:t>
+      </w:r>
+      <w:r>
+        <w:t xml:space="preserve"> </w:t>
+      </w:r>
+      <w:r>
+        <w:rPr>
+          <w:b/>
+          <w:bCs/>
+        </w:rPr>
+        <w:t xml:space="preserve">event resolution log</w:t>
+      </w:r>
+      <w:r>
+        <w:t xml:space="preserve"> </w:t>
+      </w:r>
+      <w:r>
+        <w:t xml:space="preserve">records every merge, split, and non-match. It links source-record identifiers to a stable event identifier and gives the rule, evidence, reviewer, and confidence category. It also records dependence. Five newspapers repeating one wire dispatch represent broad circulation, not five independent observations. Preserving that distinction prevents source abundance from becoming false corroboration.</w:t>
+      </w:r>
+    </w:p>
+    <w:bookmarkEnd w:id="196"/>
+    <w:bookmarkStart w:id="197" w:name="Xa4d8203b4f7a31b0cadf854735a5261c2c5f19b"/>
+    <w:p>
+      <w:pPr>
+        <w:pStyle w:val="Heading3"/>
+      </w:pPr>
+      <w:r>
+        <w:t xml:space="preserve">18.2.5 Let the codebook learn without moving silently</w:t>
+      </w:r>
+    </w:p>
+    <w:p>
+      <w:pPr>
+        <w:pStyle w:val="FirstParagraph"/>
+      </w:pPr>
+      <w:r>
+        <w:t xml:space="preserve">An initial codebook should express the research hypotheses, but it should not be treated as complete. Early records may reveal unanticipated actors, mechanisms, event sequences, source effects, or confounders. AI can scan verified records and propose additional variables that distinguish rival explanations or capture recurrent variation.</w:t>
+      </w:r>
+    </w:p>
+    <w:p>
+      <w:pPr>
+        <w:pStyle w:val="BodyText"/>
+      </w:pPr>
+      <w:r>
+        <w:t xml:space="preserve">Dynamic coding requires controlled change. The codebook should contain a stable core and an experimental extension layer. Core variables remain fixed during a declared release. Proposed variables enter the extension layer with a definition, rationale, allowed values, inclusion and exclusion rules, supporting examples, and an account of the hypothesis or comparison they serve. The</w:t>
+      </w:r>
+      <w:r>
+        <w:t xml:space="preserve"> </w:t>
+      </w:r>
+      <w:r>
+        <w:rPr>
+          <w:b/>
+          <w:bCs/>
+        </w:rPr>
+        <w:t xml:space="preserve">codebook version</w:t>
+      </w:r>
+      <w:r>
+        <w:t xml:space="preserve"> </w:t>
+      </w:r>
+      <w:r>
+        <w:t xml:space="preserve">must accompany every coded record.</w:t>
+      </w:r>
+    </w:p>
+    <w:p>
+      <w:pPr>
+        <w:pStyle w:val="BodyText"/>
+      </w:pPr>
+      <w:r>
+        <w:t xml:space="preserve">A proposed variable should be tested on a validation sample before promotion. Reviewers ask whether it can be observed consistently, whether it duplicates an existing field, whether it encodes an inference as a fact, and whether it reflects reporting practice instead of the event itself. If promoted, the team either recodes earlier events or records that prior values are missing by design. Silent addition would make change over time indistinguishable from a change in measurement.</w:t>
+      </w:r>
+    </w:p>
+    <w:p>
+      <w:pPr>
+        <w:pStyle w:val="BodyText"/>
+      </w:pPr>
+      <w:r>
+        <w:t xml:space="preserve">This workflow turns AI into a critic of the original design. The model may notice a missing variable, but it does not decide that the variable belongs in the database. That decision remains theoretical, empirical, and comparative.</w:t>
+      </w:r>
+    </w:p>
+    <w:bookmarkEnd w:id="197"/>
+    <w:bookmarkStart w:id="200" w:name="validate-before-scaling"/>
+    <w:p>
+      <w:pPr>
+        <w:pStyle w:val="Heading3"/>
+      </w:pPr>
+      <w:r>
+        <w:t xml:space="preserve">18.2.6 Validate before scaling</w:t>
+      </w:r>
+    </w:p>
+    <w:p>
+      <w:pPr>
+        <w:pStyle w:val="FirstParagraph"/>
+      </w:pPr>
+      <w:r>
+        <w:t xml:space="preserve">Automated coding should be evaluated against researcher-coded material drawn from the intended corpus. The validation sample should include different periods, sources, languages, common classes, rare classes, and difficult boundary cases. A temporal holdout helps expose drift. A source holdout tests whether the system has learned one outlet’s style instead of the event concept.</w:t>
+      </w:r>
+    </w:p>
+    <w:p>
+      <w:pPr>
+        <w:pStyle w:val="BodyText"/>
+      </w:pPr>
+      <w:r>
+        <w:t xml:space="preserve">Report performance by variable and class. Overall accuracy can conceal failure on rare but substantively important events. Precision, recall, and error types usually provide more useful guidance. Double-code a consequential or ambiguous subset, adjudicate disagreements, and record whether each error arose from retrieval, source quality, event resolution, the codebook, or the model. Contemporary event-data research treats this as a measurement problem, not merely a software benchmark.</w:t>
+      </w:r>
+      <w:r>
+        <w:rPr>
+          <w:rStyle w:val="FootnoteReference"/>
+        </w:rPr>
+        <w:footnoteReference w:id="198"/>
+      </w:r>
+    </w:p>
+    <w:p>
+      <w:pPr>
+        <w:pStyle w:val="BodyText"/>
+      </w:pPr>
+      <w:r>
+        <w:t xml:space="preserve">Validation has a scope. A model that performs well on English national newspapers from one decade has not been validated for local-language archives or another period. Record the tested population, prompt, model, codebook version, and decision threshold. Revalidate after a material change to any of them.</w:t>
+      </w:r>
+    </w:p>
+    <w:bookmarkEnd w:id="200"/>
+    <w:bookmarkStart w:id="206" w:name="Xbb3b6a25e4d702c2b579e02febfbdbbde948889"/>
+    <w:p>
+      <w:pPr>
+        <w:pStyle w:val="Heading3"/>
+      </w:pPr>
+      <w:r>
+        <w:t xml:space="preserve">18.2.7 Use Bayesian updating as a declared argument</w:t>
+      </w:r>
+    </w:p>
+    <w:p>
+      <w:pPr>
+        <w:pStyle w:val="FirstParagraph"/>
+      </w:pPr>
+      <w:r>
+        <w:t xml:space="preserve">Written evidence can change the relative plausibility of rival causal explanations. Bayesian reasoning makes this change explicit. Suppose (H_1) and (H_0) are rival explanations and (E) is a verified item of evidence. The update can be expressed as:</w:t>
+      </w:r>
+    </w:p>
+    <w:p>
+      <w:pPr>
+        <w:pStyle w:val="BodyText"/>
+      </w:pPr>
+      <m:oMathPara>
+        <m:oMathParaPr>
+          <m:jc m:val="center"/>
+        </m:oMathParaPr>
+        <m:oMath>
+          <m:f>
+            <m:fPr>
+              <m:type m:val="bar"/>
+            </m:fPr>
+            <m:num>
+              <m:r>
+                <m:t>P</m:t>
+              </m:r>
+              <m:r>
+                <m:rPr>
+                  <m:sty m:val="p"/>
+                </m:rPr>
+                <m:t>(</m:t>
+              </m:r>
+              <m:sSub>
+                <m:e>
+                  <m:r>
+                    <m:t>H</m:t>
+                  </m:r>
+                </m:e>
+                <m:sub>
+                  <m:r>
+                    <m:t>1</m:t>
+                  </m:r>
+                </m:sub>
+              </m:sSub>
+              <m:r>
+                <m:rPr>
+                  <m:sty m:val="p"/>
+                </m:rPr>
+                <m:t>∣</m:t>
+              </m:r>
+              <m:r>
+                <m:t>E</m:t>
+              </m:r>
+              <m:r>
+                <m:rPr>
+                  <m:sty m:val="p"/>
+                </m:rPr>
+                <m:t>)</m:t>
+              </m:r>
+            </m:num>
+            <m:den>
+              <m:r>
+                <m:t>P</m:t>
+              </m:r>
+              <m:r>
+                <m:rPr>
+                  <m:sty m:val="p"/>
+                </m:rPr>
+                <m:t>(</m:t>
+              </m:r>
+              <m:sSub>
+                <m:e>
+                  <m:r>
+                    <m:t>H</m:t>
+                  </m:r>
+                </m:e>
+                <m:sub>
+                  <m:r>
+                    <m:t>0</m:t>
+                  </m:r>
+                </m:sub>
+              </m:sSub>
+              <m:r>
+                <m:rPr>
+                  <m:sty m:val="p"/>
+                </m:rPr>
+                <m:t>∣</m:t>
+              </m:r>
+              <m:r>
+                <m:t>E</m:t>
+              </m:r>
+              <m:r>
+                <m:rPr>
+                  <m:sty m:val="p"/>
+                </m:rPr>
+                <m:t>)</m:t>
+              </m:r>
+            </m:den>
+          </m:f>
+          <m:r>
+            <m:rPr>
+              <m:sty m:val="p"/>
+            </m:rPr>
+            <m:t>=</m:t>
+          </m:r>
+          <m:f>
+            <m:fPr>
+              <m:type m:val="bar"/>
+            </m:fPr>
+            <m:num>
+              <m:r>
+                <m:t>P</m:t>
+              </m:r>
+              <m:r>
+                <m:rPr>
+                  <m:sty m:val="p"/>
+                </m:rPr>
+                <m:t>(</m:t>
+              </m:r>
+              <m:sSub>
+                <m:e>
+                  <m:r>
+                    <m:t>H</m:t>
+                  </m:r>
+                </m:e>
+                <m:sub>
+                  <m:r>
+                    <m:t>1</m:t>
+                  </m:r>
+                </m:sub>
+              </m:sSub>
+              <m:r>
+                <m:rPr>
+                  <m:sty m:val="p"/>
+                </m:rPr>
+                <m:t>)</m:t>
+              </m:r>
+            </m:num>
+            <m:den>
+              <m:r>
+                <m:t>P</m:t>
+              </m:r>
+              <m:r>
+                <m:rPr>
+                  <m:sty m:val="p"/>
+                </m:rPr>
+                <m:t>(</m:t>
+              </m:r>
+              <m:sSub>
+                <m:e>
+                  <m:r>
+                    <m:t>H</m:t>
+                  </m:r>
+                </m:e>
+                <m:sub>
+                  <m:r>
+                    <m:t>0</m:t>
+                  </m:r>
+                </m:sub>
+              </m:sSub>
+              <m:r>
+                <m:rPr>
+                  <m:sty m:val="p"/>
+                </m:rPr>
+                <m:t>)</m:t>
+              </m:r>
+            </m:den>
+          </m:f>
+          <m:r>
+            <m:rPr>
+              <m:sty m:val="p"/>
+            </m:rPr>
+            <m:t>×</m:t>
+          </m:r>
+          <m:f>
+            <m:fPr>
+              <m:type m:val="bar"/>
+            </m:fPr>
+            <m:num>
+              <m:r>
+                <m:t>P</m:t>
+              </m:r>
+              <m:r>
+                <m:rPr>
+                  <m:sty m:val="p"/>
+                </m:rPr>
+                <m:t>(</m:t>
+              </m:r>
+              <m:r>
+                <m:t>E</m:t>
+              </m:r>
+              <m:r>
+                <m:rPr>
+                  <m:sty m:val="p"/>
+                </m:rPr>
+                <m:t>∣</m:t>
+              </m:r>
+              <m:sSub>
+                <m:e>
+                  <m:r>
+                    <m:t>H</m:t>
+                  </m:r>
+                </m:e>
+                <m:sub>
+                  <m:r>
+                    <m:t>1</m:t>
+                  </m:r>
+                </m:sub>
+              </m:sSub>
+              <m:r>
+                <m:rPr>
+                  <m:sty m:val="p"/>
+                </m:rPr>
+                <m:t>)</m:t>
+              </m:r>
+            </m:num>
+            <m:den>
+              <m:r>
+                <m:t>P</m:t>
+              </m:r>
+              <m:r>
+                <m:rPr>
+                  <m:sty m:val="p"/>
+                </m:rPr>
+                <m:t>(</m:t>
+              </m:r>
+              <m:r>
+                <m:t>E</m:t>
+              </m:r>
+              <m:r>
+                <m:rPr>
+                  <m:sty m:val="p"/>
+                </m:rPr>
+                <m:t>∣</m:t>
+              </m:r>
+              <m:sSub>
+                <m:e>
+                  <m:r>
+                    <m:t>H</m:t>
+                  </m:r>
+                </m:e>
+                <m:sub>
+                  <m:r>
+                    <m:t>0</m:t>
+                  </m:r>
+                </m:sub>
+              </m:sSub>
+              <m:r>
+                <m:rPr>
+                  <m:sty m:val="p"/>
+                </m:rPr>
+                <m:t>)</m:t>
+              </m:r>
+            </m:den>
+          </m:f>
+        </m:oMath>
+      </m:oMathPara>
+    </w:p>
+    <w:p>
+      <w:pPr>
+        <w:pStyle w:val="FirstParagraph"/>
+      </w:pPr>
+      <w:r>
+        <w:t xml:space="preserve">The first ratio represents prior odds. The second is the</w:t>
+      </w:r>
+      <w:r>
+        <w:t xml:space="preserve"> </w:t>
+      </w:r>
+      <w:r>
+        <w:rPr>
+          <w:b/>
+          <w:bCs/>
+        </w:rPr>
+        <w:t xml:space="preserve">likelihood ratio</w:t>
+      </w:r>
+      <w:r>
+        <w:t xml:space="preserve">: how much more expected the evidence would be under one explanation than the other. Explicit Bayesian process tracing can discipline comparison among explanations, but priors and likelihoods are not mechanically supplied by a document.</w:t>
+      </w:r>
+      <w:r>
+        <w:rPr>
+          <w:rStyle w:val="FootnoteReference"/>
+        </w:rPr>
+        <w:footnoteReference w:id="201"/>
+      </w:r>
+    </w:p>
+    <w:p>
+      <w:pPr>
+        <w:pStyle w:val="BodyText"/>
+      </w:pPr>
+      <w:r>
+        <w:t xml:space="preserve">AI can help prepare the reasoning. It can extract passages bearing on each hypothesis, identify temporal sequence, propose rival explanations, detect duplicated evidence, and ask what each hypothesis predicts. It can calculate posterior odds from declared inputs and run a sensitivity analysis across plausible likelihood ranges.</w:t>
+      </w:r>
+    </w:p>
+    <w:p>
+      <w:pPr>
+        <w:pStyle w:val="BodyText"/>
+      </w:pPr>
+      <w:r>
+        <w:t xml:space="preserve">The researcher assigns the prior and likelihood judgments. The researcher also decides whether a report is independent, authentic, contemporaneous, and diagnostic. A percentage generated from model confidence is not a likelihood ratio. Research on confidence elicitation shows that a language model’s stated certainty requires separate calibration and cannot substitute for a causal model.</w:t>
+      </w:r>
+      <w:r>
+        <w:rPr>
+          <w:rStyle w:val="FootnoteReference"/>
+        </w:rPr>
+        <w:footnoteReference w:id="204"/>
+      </w:r>
+    </w:p>
+    <w:p>
+      <w:pPr>
+        <w:pStyle w:val="BodyText"/>
+      </w:pPr>
+      <w:r>
+        <w:t xml:space="preserve">The Bayesian evidence table should therefore record the hypothesis pair, evidence identifier, provenance, predicted observation under each hypothesis, dependence group, likelihood range, rationale, reviewer, update, and sensitivity result. The model may draft alternatives for review. It may not convert fluent interpretation into causal probability.</w:t>
+      </w:r>
+    </w:p>
+    <w:bookmarkEnd w:id="206"/>
+    <w:bookmarkEnd w:id="207"/>
+    <w:bookmarkStart w:id="208" w:name="worked-example-13"/>
+    <w:p>
+      <w:pPr>
+        <w:pStyle w:val="Heading2"/>
+      </w:pPr>
+      <w:r>
+        <w:t xml:space="preserve">18.3 Worked Example</w:t>
+      </w:r>
+    </w:p>
+    <w:p>
+      <w:pPr>
+        <w:pStyle w:val="FirstParagraph"/>
+      </w:pPr>
+      <w:r>
+        <w:t xml:space="preserve">Consider a project examining whether a campaign of coordinated attacks followed a central directive or emerged from local imitation. The source frame includes national and local newspapers, organizational statements, judicial records, and a digitized archive. Retrieval returns 8,000 documents. An AI-assisted classifier identifies 730 candidate records, while human verification accepts 412 and leaves 28 unresolved.</w:t>
+      </w:r>
+    </w:p>
+    <w:p>
+      <w:pPr>
+        <w:pStyle w:val="BodyText"/>
+      </w:pPr>
+      <w:r>
+        <w:t xml:space="preserve">The event-resolution pass finds that many accepted records repeat the same wire stories. It also finds articles that combine several incidents in one retrospective account. Reviewers link the 412 verified records to 167 resolved events. The database retains every source relationship, but analytical counts operate on event identifiers instead of article counts.</w:t>
+      </w:r>
+    </w:p>
+    <w:p>
+      <w:pPr>
+        <w:pStyle w:val="BodyText"/>
+      </w:pPr>
+      <w:r>
+        <w:t xml:space="preserve">The original codebook records date, location, actor, target, tactic, casualties, and claimed responsibility. During a pilot, the model repeatedly proposes three additional fields: prior local confrontation, evidence of tactical imitation, and evidence of communication before the event. The first two can be coded from defined written traces. The third is too inferential as phrased. The team revises it into separate observable fields for a documented meeting, a message, and an attributed statement. After a stratified validation sample, the new fields enter codebook version 1.1 and earlier events are recoded.</w:t>
+      </w:r>
+    </w:p>
+    <w:p>
+      <w:pPr>
+        <w:pStyle w:val="BodyText"/>
+      </w:pPr>
+      <w:r>
+        <w:t xml:space="preserve">For causal analysis, similar tactics across several events initially appear to favor coordination. The evidence table reveals that newspapers copied descriptions from one source and that imitation predicts similarity as well. The likelihood ratio stays close to one. An authenticated message sent before several events would be more diagnostic if its content distinguishes a directive from general encouragement. The model helps compare these implications and calculate sensitivity across researcher-assigned ranges. It does not determine which mechanism caused the campaign.</w:t>
+      </w:r>
+    </w:p>
+    <w:p>
+      <w:pPr>
+        <w:pStyle w:val="BodyText"/>
+      </w:pPr>
+      <w:r>
+        <w:t xml:space="preserve">The final database is smaller than the first extraction and stronger than a manually assembled spreadsheet. AI shortened retrieval, comparison, and preliminary coding. The audit chain preserved the difference between speed and evidence.</w:t>
+      </w:r>
+    </w:p>
+    <w:bookmarkEnd w:id="208"/>
+    <w:bookmarkStart w:id="209" w:name="try-it-13"/>
+    <w:p>
+      <w:pPr>
+        <w:pStyle w:val="Heading2"/>
+      </w:pPr>
+      <w:r>
+        <w:t xml:space="preserve">18.4 Try It</w:t>
+      </w:r>
+    </w:p>
+    <w:p>
+      <w:pPr>
+        <w:pStyle w:val="FirstParagraph"/>
+      </w:pPr>
+      <w:r>
+        <w:t xml:space="preserve">Choose a research question that could be represented as events. Write one paragraph defining the unit, the event boundary, the source frame, and the minimum evidence required for a verified record. Then create ten candidate records from a small, rights-compliant sample. Preserve a source span for every proposed field.</w:t>
+      </w:r>
+    </w:p>
+    <w:p>
+      <w:pPr>
+        <w:pStyle w:val="BodyText"/>
+      </w:pPr>
+      <w:r>
+        <w:t xml:space="preserve">Resolve the ten records into events without using automatic merges. Record one merge, split, or non-match decision for each plausible pair. Identify shared wire copy, quotation, translation, or retrospective dependence.</w:t>
+      </w:r>
+    </w:p>
+    <w:p>
+      <w:pPr>
+        <w:pStyle w:val="BodyText"/>
+      </w:pPr>
+      <w:r>
+        <w:t xml:space="preserve">Draft codebook version 0.1 from the research hypotheses. Ask an AI system to propose up to five additional variables that might distinguish rival explanations. For each proposal, require an observable definition, exclusion rule, two positive examples, one difficult boundary case, and the decision it would support. Reject at least one proposal and record why.</w:t>
+      </w:r>
+    </w:p>
+    <w:p>
+      <w:pPr>
+        <w:pStyle w:val="BodyText"/>
+      </w:pPr>
+      <w:r>
+        <w:t xml:space="preserve">Finally, select two rival hypotheses and one verified item of written evidence. State what each hypothesis predicts, assign a transparent likelihood range, and calculate the posterior odds across that range. Repeat the calculation after treating two apparently separate reports as dependent. Explain why the answer changed or remained stable.</w:t>
+      </w:r>
+    </w:p>
+    <w:bookmarkEnd w:id="209"/>
+    <w:bookmarkStart w:id="210" w:name="guided-ai-workflow-13"/>
+    <w:p>
+      <w:pPr>
+        <w:pStyle w:val="Heading2"/>
+      </w:pPr>
+      <w:r>
+        <w:t xml:space="preserve">18.5 Guided AI Workflow</w:t>
+      </w:r>
+    </w:p>
+    <w:p>
+      <w:pPr>
+        <w:pStyle w:val="FirstParagraph"/>
+      </w:pPr>
+      <w:r>
+        <w:t xml:space="preserve">Use three bounded passes. In the extraction pass, provide the event definition, codebook version, required output schema, and rights-cleared text. Require the model to return candidate records with exact source spans, uncertainty markers, and an abstention option. In the challenge pass, provide de-identified candidate records and ask for likely duplicates, boundary violations, missing variables, and rival interpretations. In the causal pass, provide only verified evidence identifiers, hypothesis predictions, and researcher-declared likelihood ranges. Ask for arithmetic and sensitivity checks, not a causal verdict.</w:t>
+      </w:r>
+    </w:p>
+    <w:p>
+      <w:pPr>
+        <w:pStyle w:val="BodyText"/>
+      </w:pPr>
+      <w:r>
+        <w:t xml:space="preserve">A usable codebook prompt is:</w:t>
+      </w:r>
+    </w:p>
+    <w:p>
+      <w:pPr>
+        <w:pStyle w:val="BlockText"/>
+      </w:pPr>
+      <w:r>
+        <w:t xml:space="preserve">Compare these verified records with codebook version 0.1. Propose no more than five additional variables that could distinguish the stated rival hypotheses. For each, provide an observable definition, allowed values, an exclusion rule, supporting record IDs, one boundary case, and the decision the variable would inform. Do not code the full corpus and do not treat an inference as an observed fact.</w:t>
+      </w:r>
+    </w:p>
+    <w:p>
+      <w:pPr>
+        <w:pStyle w:val="FirstParagraph"/>
+      </w:pPr>
+      <w:r>
+        <w:rPr>
+          <w:b/>
+          <w:bCs/>
+        </w:rPr>
+        <w:t xml:space="preserve">Permitted input:</w:t>
+      </w:r>
+      <w:r>
+        <w:t xml:space="preserve"> </w:t>
+      </w:r>
+      <w:r>
+        <w:t xml:space="preserve">Rights-cleared source text, public records, verified metadata, redacted event descriptions, declared hypotheses, codebook versions, and stable record identifiers.</w:t>
+      </w:r>
+      <w:r>
+        <w:br/>
+      </w:r>
+      <w:r>
+        <w:rPr>
+          <w:b/>
+          <w:bCs/>
+        </w:rPr>
+        <w:t xml:space="preserve">Do not provide:</w:t>
+      </w:r>
+      <w:r>
+        <w:t xml:space="preserve"> </w:t>
+      </w:r>
+      <w:r>
+        <w:t xml:space="preserve">Restricted archives, personal data, confidential allegations, protected participant material, or documents whose licenses prohibit external processing.</w:t>
+      </w:r>
+      <w:r>
+        <w:br/>
+      </w:r>
+      <w:r>
+        <w:rPr>
+          <w:b/>
+          <w:bCs/>
+        </w:rPr>
+        <w:t xml:space="preserve">Verify:</w:t>
+      </w:r>
+      <w:r>
+        <w:t xml:space="preserve"> </w:t>
+      </w:r>
+      <w:r>
+        <w:t xml:space="preserve">Check every source span, metadata field, event match, promoted variable, dependence judgment, and causal evidence assignment against the underlying record. Validate automated codes on a stratified researcher-coded sample.</w:t>
+      </w:r>
+      <w:r>
+        <w:br/>
+      </w:r>
+      <w:r>
+        <w:rPr>
+          <w:b/>
+          <w:bCs/>
+        </w:rPr>
+        <w:t xml:space="preserve">Record:</w:t>
+      </w:r>
+      <w:r>
+        <w:t xml:space="preserve"> </w:t>
+      </w:r>
+      <w:r>
+        <w:t xml:space="preserve">Save collection and query details, model and version, prompt, codebook version, candidate output, reviewer disposition, event resolution log, validation results, and accepted or rejected codebook changes.</w:t>
+      </w:r>
+    </w:p>
+    <w:p>
+      <w:pPr>
+        <w:pStyle w:val="BodyText"/>
+      </w:pPr>
+      <w:r>
+        <w:t xml:space="preserve">The model should return structured candidates, not silently edit the database. A human-controlled import step provides the boundary between proposal and record.</w:t>
+      </w:r>
+    </w:p>
+    <w:bookmarkEnd w:id="210"/>
+    <w:bookmarkStart w:id="211" w:name="integrity-checkpoint-13"/>
+    <w:p>
+      <w:pPr>
+        <w:pStyle w:val="Heading2"/>
+      </w:pPr>
+      <w:r>
+        <w:t xml:space="preserve">18.6 Integrity Checkpoint</w:t>
+      </w:r>
+    </w:p>
+    <w:p>
+      <w:pPr>
+        <w:pStyle w:val="FirstParagraph"/>
+      </w:pPr>
+      <w:r>
+        <w:t xml:space="preserve">Speed can redistribute visibility. Large searchable newspapers may dominate because they are technically accessible, while local publications, minority languages, ephemeral media, and undigitized collections disappear. Audit the source frame before interpreting the event distribution.</w:t>
+      </w:r>
+    </w:p>
+    <w:p>
+      <w:pPr>
+        <w:pStyle w:val="BodyText"/>
+      </w:pPr>
+      <w:r>
+        <w:t xml:space="preserve">Source reports can contain allegations, state narratives, strategic claims, and copied errors. Preserve attribution. Do not transform “officials alleged” into an event fact. Distinguish event variables from variables about the reporting process.</w:t>
+      </w:r>
+    </w:p>
+    <w:p>
+      <w:pPr>
+        <w:pStyle w:val="BodyText"/>
+      </w:pPr>
+      <w:r>
+        <w:t xml:space="preserve">An event database can expose people who never consented to systematic aggregation. Public availability does not remove privacy, security, or ethical risk. Minimize personal data, document the lawful and ethical basis for processing, and restrict or aggregate sensitive fields when release could cause harm.</w:t>
+      </w:r>
+    </w:p>
+    <w:p>
+      <w:pPr>
+        <w:pStyle w:val="BodyText"/>
+      </w:pPr>
+      <w:r>
+        <w:t xml:space="preserve">Dynamic coding can also produce retrospective confirmation. A variable proposed after seeing the outcome may be analytically useful, but its origin must be disclosed. Mark exploratory variables and test them against new material where possible.</w:t>
+      </w:r>
+    </w:p>
+    <w:bookmarkEnd w:id="211"/>
+    <w:bookmarkStart w:id="212" w:name="save-the-artifact-13"/>
+    <w:p>
+      <w:pPr>
+        <w:pStyle w:val="Heading2"/>
+      </w:pPr>
+      <w:r>
+        <w:t xml:space="preserve">18.7 Save the Artifact</w:t>
+      </w:r>
+    </w:p>
+    <w:p>
+      <w:pPr>
+        <w:pStyle w:val="FirstParagraph"/>
+      </w:pPr>
+      <w:r>
+        <w:t xml:space="preserve">Save six linked artifacts: the source frame and search log; the candidate record table with source spans; the verification register; the event resolution log; the versioned codebook with its change log; and the validation report. For causal work, add a Bayesian evidence table that preserves hypothesis predictions, dependence, likelihood ranges, rationales, and sensitivity results.</w:t>
+      </w:r>
+    </w:p>
+    <w:p>
+      <w:pPr>
+        <w:pStyle w:val="BodyText"/>
+      </w:pPr>
+      <w:r>
+        <w:t xml:space="preserve">Each analytical export should name the source-frame version, codebook version, model-assisted workflow version, and validation report. Preserve stable identifiers so a correction to one source record can propagate to the resolved event and every downstream analysis.</w:t>
+      </w:r>
+    </w:p>
+    <w:p>
+      <w:pPr>
+        <w:pStyle w:val="BodyText"/>
+      </w:pPr>
+      <w:r>
+        <w:t xml:space="preserve">Release only what rights, privacy, security, and ethics permit. A public methodological register can describe restricted evidence without exposing it.</w:t>
+      </w:r>
+    </w:p>
+    <w:bookmarkEnd w:id="212"/>
+    <w:bookmarkStart w:id="213" w:name="advanced-practice-13"/>
+    <w:p>
+      <w:pPr>
+        <w:pStyle w:val="Heading2"/>
+      </w:pPr>
+      <w:r>
+        <w:t xml:space="preserve">18.8 Advanced Practice</w:t>
+      </w:r>
+    </w:p>
+    <w:p>
+      <w:pPr>
+        <w:pStyle w:val="FirstParagraph"/>
+      </w:pPr>
+      <w:r>
+        <w:t xml:space="preserve">A mature pipeline separates retrieval, extraction, verification, resolution, coding, and inference into distinct operations. Each operation can be rerun without silently overwriting the preceding layer. This structure supports multilingual retrieval, active learning, model comparison, and targeted human review.</w:t>
+      </w:r>
+    </w:p>
+    <w:p>
+      <w:pPr>
+        <w:pStyle w:val="BodyText"/>
+      </w:pPr>
+      <w:r>
+        <w:t xml:space="preserve">Consider a model cascade. A low-cost system can rank documents, a stronger system can extract difficult candidates, and a researcher can adjudicate the consequential cases. Route rare classes, low-confidence outputs, conflicting source spans, and causal evidence to expert review. Measure how the routing rule changes both error and labor.</w:t>
+      </w:r>
+    </w:p>
+    <w:p>
+      <w:pPr>
+        <w:pStyle w:val="BodyText"/>
+      </w:pPr>
+      <w:r>
+        <w:t xml:space="preserve">Test model and source drift. Recode a fixed benchmark after provider updates. Sample new records by period and outlet. Compare human disagreement with model error without treating one as a substitute for the other.</w:t>
+      </w:r>
+    </w:p>
+    <w:p>
+      <w:pPr>
+        <w:pStyle w:val="BodyText"/>
+      </w:pPr>
+      <w:r>
+        <w:t xml:space="preserve">For causal inference, compare several defensible prior and likelihood specifications. Run the analysis with and without dependent reports, contested documents, and exploratory variables. The aim is not to manufacture a precise posterior. It is to show which evidence changes the argument, which assumptions carry the result, and what new observation would alter the conclusion.</w:t>
+      </w:r>
+    </w:p>
+    <w:p>
+      <w:pPr>
+        <w:pStyle w:val="BodyText"/>
+      </w:pPr>
+      <w:r>
+        <w:t xml:space="preserve">AI improves an event database when it makes the pipeline faster and the transformations more visible. It weakens the database when convenience conceals where evidence ended and inference began.</w:t>
+      </w:r>
+    </w:p>
+    <w:bookmarkEnd w:id="213"/>
+    <w:bookmarkEnd w:id="214"/>
+    <w:bookmarkStart w:id="224" w:name="ai-and-research-integrity"/>
+    <w:p>
+      <w:pPr>
+        <w:pStyle w:val="Heading1"/>
+      </w:pPr>
+      <w:r>
+        <w:t xml:space="preserve">19. AI and Research Integrity</w:t>
+      </w:r>
+    </w:p>
+    <w:bookmarkStart w:id="217" w:name="a-division-of-labor"/>
+    <w:p>
+      <w:pPr>
+        <w:pStyle w:val="Heading2"/>
+      </w:pPr>
+      <w:r>
+        <w:t xml:space="preserve">19.1 A Division of Labor</w:t>
       </w:r>
     </w:p>
     <w:p>
@@ -8374,17 +9407,17 @@
         <w:rPr>
           <w:rStyle w:val="FootnoteReference"/>
         </w:rPr>
-        <w:footnoteReference w:id="182"/>
-      </w:r>
-    </w:p>
-    <w:bookmarkEnd w:id="184"/>
-    <w:bookmarkStart w:id="185" w:name="model-neutral-workflows"/>
+        <w:footnoteReference w:id="215"/>
+      </w:r>
+    </w:p>
+    <w:bookmarkEnd w:id="217"/>
+    <w:bookmarkStart w:id="218" w:name="model-neutral-workflows"/>
     <w:p>
       <w:pPr>
         <w:pStyle w:val="Heading2"/>
       </w:pPr>
       <w:r>
-        <w:t xml:space="preserve">18.2 Model-Neutral Workflows</w:t>
+        <w:t xml:space="preserve">19.2 Model-Neutral Workflows</w:t>
       </w:r>
     </w:p>
     <w:p>
@@ -8419,14 +9452,14 @@
         <w:t xml:space="preserve">Model neutrality has a limit worth stating. The verification-heavy workflows in this guide assume access to a capable model, and capable models often cost money. The privacy fallback assumes a local or institutional system that many researchers do not have. Capability also varies by tool, language, and region. For these reasons the method does not depend on AI. The map, the search log, the evidence register, and the stopping rule stand on their own. A researcher without access to a frontier model loses an assistant, not the method.</w:t>
       </w:r>
     </w:p>
-    <w:bookmarkEnd w:id="185"/>
-    <w:bookmarkStart w:id="186" w:name="privacy-and-data-minimization"/>
+    <w:bookmarkEnd w:id="218"/>
+    <w:bookmarkStart w:id="219" w:name="privacy-and-data-minimization"/>
     <w:p>
       <w:pPr>
         <w:pStyle w:val="Heading2"/>
       </w:pPr>
       <w:r>
-        <w:t xml:space="preserve">18.3 Privacy and Data Minimization</w:t>
+        <w:t xml:space="preserve">19.3 Privacy and Data Minimization</w:t>
       </w:r>
     </w:p>
     <w:p>
@@ -8445,14 +9478,14 @@
         <w:t xml:space="preserve">The audit log records what category of material entered the system. It need not reproduce protected content. It should record the model, date, task, input description, relevant settings, output disposition, and human reviewer.</w:t>
       </w:r>
     </w:p>
-    <w:bookmarkEnd w:id="186"/>
-    <w:bookmarkStart w:id="187" w:name="verification"/>
+    <w:bookmarkEnd w:id="219"/>
+    <w:bookmarkStart w:id="220" w:name="verification"/>
     <w:p>
       <w:pPr>
         <w:pStyle w:val="Heading2"/>
       </w:pPr>
       <w:r>
-        <w:t xml:space="preserve">18.4 Verification</w:t>
+        <w:t xml:space="preserve">19.4 Verification</w:t>
       </w:r>
     </w:p>
     <w:p>
@@ -8479,14 +9512,14 @@
         <w:t xml:space="preserve">The same rule applies to summaries. A model may produce an elegant account of a document while missing a qualification that changes its meaning. Verify against the original and record which passages support the summary.</w:t>
       </w:r>
     </w:p>
-    <w:bookmarkEnd w:id="187"/>
-    <w:bookmarkStart w:id="188" w:name="bias-and-missing-perspectives"/>
+    <w:bookmarkEnd w:id="220"/>
+    <w:bookmarkStart w:id="221" w:name="bias-and-missing-perspectives"/>
     <w:p>
       <w:pPr>
         <w:pStyle w:val="Heading2"/>
       </w:pPr>
       <w:r>
-        <w:t xml:space="preserve">18.5 Bias and Missing Perspectives</w:t>
+        <w:t xml:space="preserve">19.5 Bias and Missing Perspectives</w:t>
       </w:r>
     </w:p>
     <w:p>
@@ -8505,14 +9538,14 @@
         <w:t xml:space="preserve">Ask what position the response assumes. Ask which actors it treats as authoritative. Ask which language and region dominate its suggestions. Then use domain expertise and human consultation to correct the map.</w:t>
       </w:r>
     </w:p>
-    <w:bookmarkEnd w:id="188"/>
-    <w:bookmarkStart w:id="189" w:name="reproducibility-and-drift"/>
+    <w:bookmarkEnd w:id="221"/>
+    <w:bookmarkStart w:id="222" w:name="reproducibility-and-drift"/>
     <w:p>
       <w:pPr>
         <w:pStyle w:val="Heading2"/>
       </w:pPr>
       <w:r>
-        <w:t xml:space="preserve">18.6 Reproducibility and Drift</w:t>
+        <w:t xml:space="preserve">19.6 Reproducibility and Drift</w:t>
       </w:r>
     </w:p>
     <w:p>
@@ -8531,14 +9564,14 @@
         <w:t xml:space="preserve">Preserve consequential outputs when terms permit. Record accepted and rejected suggestions. State when AI assistance changed the question, search vocabulary, source inventory, or stopping rule. The manuscript needs the decision trail more than it needs a transcript of every exchange.</w:t>
       </w:r>
     </w:p>
-    <w:bookmarkEnd w:id="189"/>
-    <w:bookmarkStart w:id="190" w:name="the-standard"/>
+    <w:bookmarkEnd w:id="222"/>
+    <w:bookmarkStart w:id="223" w:name="the-standard"/>
     <w:p>
       <w:pPr>
         <w:pStyle w:val="Heading2"/>
       </w:pPr>
       <w:r>
-        <w:t xml:space="preserve">18.7 The Standard</w:t>
+        <w:t xml:space="preserve">19.7 The Standard</w:t>
       </w:r>
     </w:p>
     <w:p>
@@ -8549,24 +9582,24 @@
         <w:t xml:space="preserve">AI use is defensible when it makes judgment more visible. It fails when it hides judgment behind convenience.</w:t>
       </w:r>
     </w:p>
-    <w:bookmarkEnd w:id="190"/>
-    <w:bookmarkEnd w:id="191"/>
-    <w:bookmarkStart w:id="196" w:name="building-the-full-field-guide"/>
+    <w:bookmarkEnd w:id="223"/>
+    <w:bookmarkEnd w:id="224"/>
+    <w:bookmarkStart w:id="229" w:name="building-the-full-field-guide"/>
     <w:p>
       <w:pPr>
         <w:pStyle w:val="Heading1"/>
       </w:pPr>
       <w:r>
-        <w:t xml:space="preserve">19. Building the Full Field Guide</w:t>
-      </w:r>
-    </w:p>
-    <w:bookmarkStart w:id="192" w:name="what-the-current-modules-establish"/>
+        <w:t xml:space="preserve">20. Building the Full Field Guide</w:t>
+      </w:r>
+    </w:p>
+    <w:bookmarkStart w:id="225" w:name="what-the-current-modules-establish"/>
     <w:p>
       <w:pPr>
         <w:pStyle w:val="Heading2"/>
       </w:pPr>
       <w:r>
-        <w:t xml:space="preserve">19.1 What the Current Modules Establish</w:t>
+        <w:t xml:space="preserve">20.1 What the Current Modules Establish</w:t>
       </w:r>
     </w:p>
     <w:p>
@@ -8875,17 +9908,17 @@
         <w:pStyle w:val="BodyText"/>
       </w:pPr>
       <w:r>
-        <w:t xml:space="preserve">The modules also reveal what remains outside the draft. They do not collect an interview, preserve a website, prepare an archival corpus, code a document, or write the final empirical analysis. Each task requires its own decisions and artifacts.</w:t>
-      </w:r>
-    </w:p>
-    <w:bookmarkEnd w:id="192"/>
-    <w:bookmarkStart w:id="193" w:name="the-full-field-guide"/>
+        <w:t xml:space="preserve">The modules also reveal what remains outside the draft. They do not collect an interview, preserve a website, prepare a full archival corpus, or write the final empirical analysis. The bridge chapter on event databases introduces document extraction, dynamic coding, validation, and explicit causal updating. Each still requires fuller treatment across source types and analytical traditions.</w:t>
+      </w:r>
+    </w:p>
+    <w:bookmarkEnd w:id="225"/>
+    <w:bookmarkStart w:id="226" w:name="the-full-field-guide"/>
     <w:p>
       <w:pPr>
         <w:pStyle w:val="Heading2"/>
       </w:pPr>
       <w:r>
-        <w:t xml:space="preserve">19.2 The Full Field Guide</w:t>
+        <w:t xml:space="preserve">20.2 The Full Field Guide</w:t>
       </w:r>
     </w:p>
     <w:p>
@@ -8901,7 +9934,7 @@
         <w:pStyle w:val="BodyText"/>
       </w:pPr>
       <w:r>
-        <w:t xml:space="preserve">A preparation module will examine transcription, OCR, translation, coding, memoing, temporal ordering, entity resolution, and the conversion of unstructured records into structured fields. The original project devoted substantial attention to this border between qualitative material and databases. We will reconstruct that contribution around transformations whose lineage remains visible.</w:t>
+        <w:t xml:space="preserve">A preparation module will extend the event-database chapter across transcription, OCR, translation, coding, memoing, temporal ordering, entity resolution, and other conversions of unstructured records into structured fields. The original project devoted substantial attention to this border between qualitative material and databases. We will reconstruct that contribution around transformations whose lineage remains visible.</w:t>
       </w:r>
     </w:p>
     <w:p>
@@ -8920,14 +9953,14 @@
         <w:t xml:space="preserve">A communication module will cover manuscripts, presentations, public data, visual explanation, repositories, and long-term access. Sharing is not the final act after research. Decisions made during collection determine what can later be verified, reused, or protected.</w:t>
       </w:r>
     </w:p>
-    <w:bookmarkEnd w:id="193"/>
-    <w:bookmarkStart w:id="194" w:name="a-hebrew-edition"/>
+    <w:bookmarkEnd w:id="226"/>
+    <w:bookmarkStart w:id="227" w:name="a-hebrew-edition"/>
     <w:p>
       <w:pPr>
         <w:pStyle w:val="Heading2"/>
       </w:pPr>
       <w:r>
-        <w:t xml:space="preserve">19.3 A Hebrew Edition</w:t>
+        <w:t xml:space="preserve">20.3 A Hebrew Edition</w:t>
       </w:r>
     </w:p>
     <w:p>
@@ -8938,14 +9971,14 @@
         <w:t xml:space="preserve">English remains the canonical language during the pilot. A Hebrew edition should follow after the content model and navigation stabilize. Translation will require more than sentence substitution. Search terms, institutional examples, interfaces, and right-to-left design must be adapted. Stable page identifiers will keep the two editions connected without forcing them to change at the same pace.</w:t>
       </w:r>
     </w:p>
-    <w:bookmarkEnd w:id="194"/>
-    <w:bookmarkStart w:id="195" w:name="an-invitation"/>
+    <w:bookmarkEnd w:id="227"/>
+    <w:bookmarkStart w:id="228" w:name="an-invitation"/>
     <w:p>
       <w:pPr>
         <w:pStyle w:val="Heading2"/>
       </w:pPr>
       <w:r>
-        <w:t xml:space="preserve">19.4 An Invitation</w:t>
+        <w:t xml:space="preserve">20.4 An Invitation</w:t>
       </w:r>
     </w:p>
     <w:p>
@@ -8972,19 +10005,19 @@
         <w:t xml:space="preserve">The old project began with abundance. The revived project begins with limits, artifacts, and reviewable decisions. This is progress.</w:t>
       </w:r>
     </w:p>
-    <w:bookmarkEnd w:id="195"/>
-    <w:bookmarkEnd w:id="196"/>
-    <w:bookmarkStart w:id="214" w:name="references"/>
+    <w:bookmarkEnd w:id="228"/>
+    <w:bookmarkEnd w:id="229"/>
+    <w:bookmarkStart w:id="257" w:name="references"/>
     <w:p>
       <w:pPr>
         <w:pStyle w:val="Heading1"/>
       </w:pPr>
       <w:r>
-        <w:t xml:space="preserve">20. References</w:t>
-      </w:r>
-    </w:p>
-    <w:bookmarkStart w:id="213" w:name="refs"/>
-    <w:bookmarkStart w:id="197" w:name="ref-autio2024genai"/>
+        <w:t xml:space="preserve">21. References</w:t>
+      </w:r>
+    </w:p>
+    <w:bookmarkStart w:id="256" w:name="refs"/>
+    <w:bookmarkStart w:id="230" w:name="ref-autio2024genai"/>
     <w:p>
       <w:pPr>
         <w:pStyle w:val="Bibliography"/>
@@ -9010,7 +10043,7 @@
       <w:r>
         <w:t xml:space="preserve"> </w:t>
       </w:r>
-      <w:hyperlink r:id="rId183">
+      <w:hyperlink r:id="rId216">
         <w:r>
           <w:rPr>
             <w:rStyle w:val="Hyperlink"/>
@@ -9022,14 +10055,20 @@
         <w:t xml:space="preserve">.</w:t>
       </w:r>
     </w:p>
-    <w:bookmarkEnd w:id="197"/>
-    <w:bookmarkStart w:id="198" w:name="ref-booth2016systematic"/>
+    <w:bookmarkEnd w:id="230"/>
+    <w:bookmarkStart w:id="231" w:name="ref-beelen2023bias"/>
     <w:p>
       <w:pPr>
         <w:pStyle w:val="Bibliography"/>
       </w:pPr>
       <w:r>
-        <w:t xml:space="preserve">Booth, Andrew, Anthea Sutton, and Diana Papaioannou.</w:t>
+        <w:t xml:space="preserve">Beelen, Kaspar, Jon Lawrence, Daniel C. S. Wilson, and David Beavan.</w:t>
+      </w:r>
+      <w:r>
+        <w:t xml:space="preserve"> </w:t>
+      </w:r>
+      <w:r>
+        <w:t xml:space="preserve">“Bias and Representativeness in Digitized Newspaper Collections: Introducing the Environmental Scan.”</w:t>
       </w:r>
       <w:r>
         <w:t xml:space="preserve"> </w:t>
@@ -9039,14 +10078,100 @@
           <w:i/>
           <w:iCs/>
         </w:rPr>
+        <w:t xml:space="preserve">Digital Scholarship in the Humanities</w:t>
+      </w:r>
+      <w:r>
+        <w:t xml:space="preserve"> </w:t>
+      </w:r>
+      <w:r>
+        <w:t xml:space="preserve">38, no. 1 (2023): 1–22.</w:t>
+      </w:r>
+      <w:r>
+        <w:t xml:space="preserve"> </w:t>
+      </w:r>
+      <w:hyperlink r:id="rId191">
+        <w:r>
+          <w:rPr>
+            <w:rStyle w:val="Hyperlink"/>
+          </w:rPr>
+          <w:t xml:space="preserve">https://doi.org/10.1093/llc/fqac037</w:t>
+        </w:r>
+      </w:hyperlink>
+      <w:r>
+        <w:t xml:space="preserve">.</w:t>
+      </w:r>
+    </w:p>
+    <w:bookmarkEnd w:id="231"/>
+    <w:bookmarkStart w:id="232" w:name="ref-booth2016systematic"/>
+    <w:p>
+      <w:pPr>
+        <w:pStyle w:val="Bibliography"/>
+      </w:pPr>
+      <w:r>
+        <w:t xml:space="preserve">Booth, Andrew, Anthea Sutton, and Diana Papaioannou.</w:t>
+      </w:r>
+      <w:r>
+        <w:t xml:space="preserve"> </w:t>
+      </w:r>
+      <w:r>
+        <w:rPr>
+          <w:i/>
+          <w:iCs/>
+        </w:rPr>
         <w:t xml:space="preserve">Systematic Approaches to a Successful Literature Review</w:t>
       </w:r>
       <w:r>
         <w:t xml:space="preserve">. 2nd ed. London: SAGE Publications, 2016.</w:t>
       </w:r>
     </w:p>
-    <w:bookmarkEnd w:id="198"/>
-    <w:bookmarkStart w:id="199" w:name="ref-braun2021quality"/>
+    <w:bookmarkEnd w:id="232"/>
+    <w:bookmarkStart w:id="233" w:name="ref-brandt2025measurement"/>
+    <w:p>
+      <w:pPr>
+        <w:pStyle w:val="Bibliography"/>
+      </w:pPr>
+      <w:r>
+        <w:t xml:space="preserve">Brandt, Patrick T., and Marcus Sianan.</w:t>
+      </w:r>
+      <w:r>
+        <w:t xml:space="preserve"> </w:t>
+      </w:r>
+      <w:r>
+        <w:t xml:space="preserve">“Measurement of Event Data from Text.”</w:t>
+      </w:r>
+      <w:r>
+        <w:t xml:space="preserve"> </w:t>
+      </w:r>
+      <w:r>
+        <w:rPr>
+          <w:i/>
+          <w:iCs/>
+        </w:rPr>
+        <w:t xml:space="preserve">Frontiers in Political Science</w:t>
+      </w:r>
+      <w:r>
+        <w:t xml:space="preserve"> </w:t>
+      </w:r>
+      <w:r>
+        <w:t xml:space="preserve">6 (2025): 1453640.</w:t>
+      </w:r>
+      <w:r>
+        <w:t xml:space="preserve"> </w:t>
+      </w:r>
+      <w:hyperlink r:id="rId199">
+        <w:r>
+          <w:rPr>
+            <w:rStyle w:val="Hyperlink"/>
+          </w:rPr>
+          <w:t xml:space="preserve">https://doi.org/10.3389/fpos.2024.1453640</w:t>
+        </w:r>
+      </w:hyperlink>
+      <w:r>
+        <w:t xml:space="preserve">.</w:t>
+      </w:r>
+    </w:p>
+    <w:bookmarkEnd w:id="233"/>
+    <w:bookmarkStart w:id="234" w:name="ref-braun2021quality"/>
     <w:p>
       <w:pPr>
         <w:pStyle w:val="Bibliography"/>
@@ -9091,8 +10216,69 @@
         <w:t xml:space="preserve">.</w:t>
       </w:r>
     </w:p>
-    <w:bookmarkEnd w:id="199"/>
-    <w:bookmarkStart w:id="200" w:name="ref-enders2011domestic"/>
+    <w:bookmarkEnd w:id="234"/>
+    <w:bookmarkStart w:id="235" w:name="ref-cai2023montecarlo"/>
+    <w:p>
+      <w:pPr>
+        <w:pStyle w:val="Bibliography"/>
+      </w:pPr>
+      <w:r>
+        <w:t xml:space="preserve">Cai, Erica, and Brendan O’Connor.</w:t>
+      </w:r>
+      <w:r>
+        <w:t xml:space="preserve"> </w:t>
+      </w:r>
+      <w:r>
+        <w:t xml:space="preserve">“A</w:t>
+      </w:r>
+      <w:r>
+        <w:t xml:space="preserve"> </w:t>
+      </w:r>
+      <w:r>
+        <w:t xml:space="preserve">Monte Carlo</w:t>
+      </w:r>
+      <w:r>
+        <w:t xml:space="preserve"> </w:t>
+      </w:r>
+      <w:r>
+        <w:t xml:space="preserve">Language Model Pipeline for Zero-Shot Sociopolitical Event Extraction.”</w:t>
+      </w:r>
+      <w:r>
+        <w:t xml:space="preserve"> </w:t>
+      </w:r>
+      <w:r>
+        <w:t xml:space="preserve">In</w:t>
+      </w:r>
+      <w:r>
+        <w:t xml:space="preserve"> </w:t>
+      </w:r>
+      <w:r>
+        <w:rPr>
+          <w:i/>
+          <w:iCs/>
+        </w:rPr>
+        <w:t xml:space="preserve">NeurIPS 2023 Workshop on Instruction Tuning and Instruction Following</w:t>
+      </w:r>
+      <w:r>
+        <w:t xml:space="preserve">, 2023.</w:t>
+      </w:r>
+      <w:r>
+        <w:t xml:space="preserve"> </w:t>
+      </w:r>
+      <w:hyperlink r:id="rId195">
+        <w:r>
+          <w:rPr>
+            <w:rStyle w:val="Hyperlink"/>
+          </w:rPr>
+          <w:t xml:space="preserve">https://doi.org/10.48550/arXiv.2305.15051</w:t>
+        </w:r>
+      </w:hyperlink>
+      <w:r>
+        <w:t xml:space="preserve">.</w:t>
+      </w:r>
+    </w:p>
+    <w:bookmarkEnd w:id="235"/>
+    <w:bookmarkStart w:id="236" w:name="ref-enders2011domestic"/>
     <w:p>
       <w:pPr>
         <w:pStyle w:val="Bibliography"/>
@@ -9137,14 +10323,32 @@
         <w:t xml:space="preserve">.</w:t>
       </w:r>
     </w:p>
-    <w:bookmarkEnd w:id="200"/>
-    <w:bookmarkStart w:id="201" w:name="ref-gerring2012methodology"/>
+    <w:bookmarkEnd w:id="236"/>
+    <w:bookmarkStart w:id="237" w:name="ref-fairfield2017bayesian"/>
     <w:p>
       <w:pPr>
         <w:pStyle w:val="Bibliography"/>
       </w:pPr>
       <w:r>
-        <w:t xml:space="preserve">Gerring, John.</w:t>
+        <w:t xml:space="preserve">Fairfield, Tasha, and Andrew E. Charman.</w:t>
+      </w:r>
+      <w:r>
+        <w:t xml:space="preserve"> </w:t>
+      </w:r>
+      <w:r>
+        <w:t xml:space="preserve">“Explicit</w:t>
+      </w:r>
+      <w:r>
+        <w:t xml:space="preserve"> </w:t>
+      </w:r>
+      <w:r>
+        <w:t xml:space="preserve">Bayesian</w:t>
+      </w:r>
+      <w:r>
+        <w:t xml:space="preserve"> </w:t>
+      </w:r>
+      <w:r>
+        <w:t xml:space="preserve">Analysis for Process Tracing: Guidelines, Opportunities, and Caveats.”</w:t>
       </w:r>
       <w:r>
         <w:t xml:space="preserve"> </w:t>
@@ -9154,14 +10358,109 @@
           <w:i/>
           <w:iCs/>
         </w:rPr>
+        <w:t xml:space="preserve">Political Analysis</w:t>
+      </w:r>
+      <w:r>
+        <w:t xml:space="preserve"> </w:t>
+      </w:r>
+      <w:r>
+        <w:t xml:space="preserve">25, no. 3 (2017): 363–80.</w:t>
+      </w:r>
+      <w:r>
+        <w:t xml:space="preserve"> </w:t>
+      </w:r>
+      <w:hyperlink r:id="rId202">
+        <w:r>
+          <w:rPr>
+            <w:rStyle w:val="Hyperlink"/>
+          </w:rPr>
+          <w:t xml:space="preserve">https://doi.org/10.1017/pan.2017.14</w:t>
+        </w:r>
+      </w:hyperlink>
+      <w:r>
+        <w:t xml:space="preserve">.</w:t>
+      </w:r>
+    </w:p>
+    <w:bookmarkEnd w:id="237"/>
+    <w:bookmarkStart w:id="238" w:name="ref-gerring2012methodology"/>
+    <w:p>
+      <w:pPr>
+        <w:pStyle w:val="Bibliography"/>
+      </w:pPr>
+      <w:r>
+        <w:t xml:space="preserve">Gerring, John.</w:t>
+      </w:r>
+      <w:r>
+        <w:t xml:space="preserve"> </w:t>
+      </w:r>
+      <w:r>
+        <w:rPr>
+          <w:i/>
+          <w:iCs/>
+        </w:rPr>
         <w:t xml:space="preserve">Social Science Methodology: A Unified Framework</w:t>
       </w:r>
       <w:r>
         <w:t xml:space="preserve">. 2nd ed. Cambridge: Cambridge University Press, 2012.</w:t>
       </w:r>
     </w:p>
-    <w:bookmarkEnd w:id="201"/>
-    <w:bookmarkStart w:id="202" w:name="ref-grant2009typology"/>
+    <w:bookmarkEnd w:id="238"/>
+    <w:bookmarkStart w:id="239" w:name="ref-gilardi2023chatgpt"/>
+    <w:p>
+      <w:pPr>
+        <w:pStyle w:val="Bibliography"/>
+      </w:pPr>
+      <w:r>
+        <w:t xml:space="preserve">Gilardi, Fabrizio, Meysam Alizadeh, and Maël Kubli.</w:t>
+      </w:r>
+      <w:r>
+        <w:t xml:space="preserve"> </w:t>
+      </w:r>
+      <w:r>
+        <w:t xml:space="preserve">“</w:t>
+      </w:r>
+      <w:r>
+        <w:t xml:space="preserve">ChatGPT</w:t>
+      </w:r>
+      <w:r>
+        <w:t xml:space="preserve"> </w:t>
+      </w:r>
+      <w:r>
+        <w:t xml:space="preserve">Outperforms Crowd Workers for Text-Annotation Tasks.”</w:t>
+      </w:r>
+      <w:r>
+        <w:t xml:space="preserve"> </w:t>
+      </w:r>
+      <w:r>
+        <w:rPr>
+          <w:i/>
+          <w:iCs/>
+        </w:rPr>
+        <w:t xml:space="preserve">Proceedings of the National Academy of Sciences</w:t>
+      </w:r>
+      <w:r>
+        <w:t xml:space="preserve"> </w:t>
+      </w:r>
+      <w:r>
+        <w:t xml:space="preserve">120, no. 30 (2023): e2305016120.</w:t>
+      </w:r>
+      <w:r>
+        <w:t xml:space="preserve"> </w:t>
+      </w:r>
+      <w:hyperlink r:id="rId183">
+        <w:r>
+          <w:rPr>
+            <w:rStyle w:val="Hyperlink"/>
+          </w:rPr>
+          <w:t xml:space="preserve">https://doi.org/10.1073/pnas.2305016120</w:t>
+        </w:r>
+      </w:hyperlink>
+      <w:r>
+        <w:t xml:space="preserve">.</w:t>
+      </w:r>
+    </w:p>
+    <w:bookmarkEnd w:id="239"/>
+    <w:bookmarkStart w:id="240" w:name="ref-grant2009typology"/>
     <w:p>
       <w:pPr>
         <w:pStyle w:val="Bibliography"/>
@@ -9216,8 +10515,8 @@
         <w:t xml:space="preserve">.</w:t>
       </w:r>
     </w:p>
-    <w:bookmarkEnd w:id="202"/>
-    <w:bookmarkStart w:id="203" w:name="ref-greenhalgh2005search"/>
+    <w:bookmarkEnd w:id="240"/>
+    <w:bookmarkStart w:id="241" w:name="ref-greenhalgh2005search"/>
     <w:p>
       <w:pPr>
         <w:pStyle w:val="Bibliography"/>
@@ -9262,8 +10561,8 @@
         <w:t xml:space="preserve">.</w:t>
       </w:r>
     </w:p>
-    <w:bookmarkEnd w:id="203"/>
-    <w:bookmarkStart w:id="204" w:name="ref-lebo2013provo"/>
+    <w:bookmarkEnd w:id="241"/>
+    <w:bookmarkStart w:id="242" w:name="ref-lebo2013provo"/>
     <w:p>
       <w:pPr>
         <w:pStyle w:val="Bibliography"/>
@@ -9316,8 +10615,8 @@
         <w:t xml:space="preserve">.</w:t>
       </w:r>
     </w:p>
-    <w:bookmarkEnd w:id="204"/>
-    <w:bookmarkStart w:id="205" w:name="ref-littell2018classification"/>
+    <w:bookmarkEnd w:id="242"/>
+    <w:bookmarkStart w:id="243" w:name="ref-littell2018classification"/>
     <w:p>
       <w:pPr>
         <w:pStyle w:val="Bibliography"/>
@@ -9362,8 +10661,8 @@
         <w:t xml:space="preserve">.</w:t>
       </w:r>
     </w:p>
-    <w:bookmarkEnd w:id="205"/>
-    <w:bookmarkStart w:id="206" w:name="ref-malterud2016information"/>
+    <w:bookmarkEnd w:id="243"/>
+    <w:bookmarkStart w:id="244" w:name="ref-malterud2016information"/>
     <w:p>
       <w:pPr>
         <w:pStyle w:val="Bibliography"/>
@@ -9408,8 +10707,8 @@
         <w:t xml:space="preserve">.</w:t>
       </w:r>
     </w:p>
-    <w:bookmarkEnd w:id="206"/>
-    <w:bookmarkStart w:id="207" w:name="ref-start2024codebook"/>
+    <w:bookmarkEnd w:id="244"/>
+    <w:bookmarkStart w:id="245" w:name="ref-start2024codebook"/>
     <w:p>
       <w:pPr>
         <w:pStyle w:val="Bibliography"/>
@@ -9444,8 +10743,8 @@
         <w:t xml:space="preserve">.</w:t>
       </w:r>
     </w:p>
-    <w:bookmarkEnd w:id="207"/>
-    <w:bookmarkStart w:id="208" w:name="ref-page2021prisma"/>
+    <w:bookmarkEnd w:id="245"/>
+    <w:bookmarkStart w:id="246" w:name="ref-page2021prisma"/>
     <w:p>
       <w:pPr>
         <w:pStyle w:val="Bibliography"/>
@@ -9490,8 +10789,63 @@
         <w:t xml:space="preserve">.</w:t>
       </w:r>
     </w:p>
-    <w:bookmarkEnd w:id="208"/>
-    <w:bookmarkStart w:id="209" w:name="ref-rethlefsen2021prismas"/>
+    <w:bookmarkEnd w:id="246"/>
+    <w:bookmarkStart w:id="247" w:name="ref-pangakis2023annotation"/>
+    <w:p>
+      <w:pPr>
+        <w:pStyle w:val="Bibliography"/>
+      </w:pPr>
+      <w:r>
+        <w:t xml:space="preserve">Pangakis, Nicholas, Samuel Wolken, and Sergio Fasching.</w:t>
+      </w:r>
+      <w:r>
+        <w:t xml:space="preserve"> </w:t>
+      </w:r>
+      <w:r>
+        <w:t xml:space="preserve">“Automated Annotation with Generative</w:t>
+      </w:r>
+      <w:r>
+        <w:t xml:space="preserve"> </w:t>
+      </w:r>
+      <w:r>
+        <w:t xml:space="preserve">AI</w:t>
+      </w:r>
+      <w:r>
+        <w:t xml:space="preserve"> </w:t>
+      </w:r>
+      <w:r>
+        <w:t xml:space="preserve">Requires Validation.”</w:t>
+      </w:r>
+      <w:r>
+        <w:t xml:space="preserve"> </w:t>
+      </w:r>
+      <w:r>
+        <w:rPr>
+          <w:i/>
+          <w:iCs/>
+        </w:rPr>
+        <w:t xml:space="preserve">arXiv</w:t>
+      </w:r>
+      <w:r>
+        <w:t xml:space="preserve">, 2023.</w:t>
+      </w:r>
+      <w:r>
+        <w:t xml:space="preserve"> </w:t>
+      </w:r>
+      <w:hyperlink r:id="rId184">
+        <w:r>
+          <w:rPr>
+            <w:rStyle w:val="Hyperlink"/>
+          </w:rPr>
+          <w:t xml:space="preserve">https://doi.org/10.48550/arXiv.2306.00176</w:t>
+        </w:r>
+      </w:hyperlink>
+      <w:r>
+        <w:t xml:space="preserve">.</w:t>
+      </w:r>
+    </w:p>
+    <w:bookmarkEnd w:id="247"/>
+    <w:bookmarkStart w:id="248" w:name="ref-rethlefsen2021prismas"/>
     <w:p>
       <w:pPr>
         <w:pStyle w:val="Bibliography"/>
@@ -9536,8 +10890,54 @@
         <w:t xml:space="preserve">.</w:t>
       </w:r>
     </w:p>
-    <w:bookmarkEnd w:id="209"/>
-    <w:bookmarkStart w:id="210" w:name="ref-saunders2018saturation"/>
+    <w:bookmarkEnd w:id="248"/>
+    <w:bookmarkStart w:id="249" w:name="ref-roberts2021mediacloud"/>
+    <w:p>
+      <w:pPr>
+        <w:pStyle w:val="Bibliography"/>
+      </w:pPr>
+      <w:r>
+        <w:t xml:space="preserve">Roberts, Hal, Rahul Bhargava, Linas Valiukas, Dennis Jen, Momin M. Malik, Cindy Bishop, Emily B. Ndulue, et al.</w:t>
+      </w:r>
+      <w:r>
+        <w:t xml:space="preserve"> </w:t>
+      </w:r>
+      <w:r>
+        <w:t xml:space="preserve">“Media Cloud: Massive Open Source Collection of Global News on the Open Web.”</w:t>
+      </w:r>
+      <w:r>
+        <w:t xml:space="preserve"> </w:t>
+      </w:r>
+      <w:r>
+        <w:rPr>
+          <w:i/>
+          <w:iCs/>
+        </w:rPr>
+        <w:t xml:space="preserve">Proceedings of the International AAAI Conference on Web and Social Media</w:t>
+      </w:r>
+      <w:r>
+        <w:t xml:space="preserve"> </w:t>
+      </w:r>
+      <w:r>
+        <w:t xml:space="preserve">15, no. 1 (2021): 1034–45.</w:t>
+      </w:r>
+      <w:r>
+        <w:t xml:space="preserve"> </w:t>
+      </w:r>
+      <w:hyperlink r:id="rId189">
+        <w:r>
+          <w:rPr>
+            <w:rStyle w:val="Hyperlink"/>
+          </w:rPr>
+          <w:t xml:space="preserve">https://doi.org/10.1609/icwsm.v15i1.18127</w:t>
+        </w:r>
+      </w:hyperlink>
+      <w:r>
+        <w:t xml:space="preserve">.</w:t>
+      </w:r>
+    </w:p>
+    <w:bookmarkEnd w:id="249"/>
+    <w:bookmarkStart w:id="250" w:name="ref-saunders2018saturation"/>
     <w:p>
       <w:pPr>
         <w:pStyle w:val="Bibliography"/>
@@ -9582,8 +10982,8 @@
         <w:t xml:space="preserve">.</w:t>
       </w:r>
     </w:p>
-    <w:bookmarkEnd w:id="210"/>
-    <w:bookmarkStart w:id="211" w:name="ref-snyder2019literature"/>
+    <w:bookmarkEnd w:id="250"/>
+    <w:bookmarkStart w:id="251" w:name="ref-snyder2019literature"/>
     <w:p>
       <w:pPr>
         <w:pStyle w:val="Bibliography"/>
@@ -9628,8 +11028,8 @@
         <w:t xml:space="preserve">.</w:t>
       </w:r>
     </w:p>
-    <w:bookmarkEnd w:id="211"/>
-    <w:bookmarkStart w:id="212" w:name="ref-wohlin2014snowballing"/>
+    <w:bookmarkEnd w:id="251"/>
+    <w:bookmarkStart w:id="252" w:name="ref-wohlin2014snowballing"/>
     <w:p>
       <w:pPr>
         <w:pStyle w:val="Bibliography"/>
@@ -9677,9 +11077,192 @@
         <w:t xml:space="preserve">.</w:t>
       </w:r>
     </w:p>
-    <w:bookmarkEnd w:id="212"/>
-    <w:bookmarkEnd w:id="213"/>
-    <w:bookmarkEnd w:id="214"/>
+    <w:bookmarkEnd w:id="252"/>
+    <w:bookmarkStart w:id="253" w:name="ref-xiong2024uncertainty"/>
+    <w:p>
+      <w:pPr>
+        <w:pStyle w:val="Bibliography"/>
+      </w:pPr>
+      <w:r>
+        <w:t xml:space="preserve">Xiong, Miao, Zhiyuan Hu, Xinyang Lu, Yifei Li, Jie Fu, Junxian He, and Bryan Hooi.</w:t>
+      </w:r>
+      <w:r>
+        <w:t xml:space="preserve"> </w:t>
+      </w:r>
+      <w:r>
+        <w:t xml:space="preserve">“Can</w:t>
+      </w:r>
+      <w:r>
+        <w:t xml:space="preserve"> </w:t>
+      </w:r>
+      <w:r>
+        <w:t xml:space="preserve">LLMs</w:t>
+      </w:r>
+      <w:r>
+        <w:t xml:space="preserve"> </w:t>
+      </w:r>
+      <w:r>
+        <w:t xml:space="preserve">Express Their Uncertainty? An Empirical Evaluation of Confidence Elicitation in</w:t>
+      </w:r>
+      <w:r>
+        <w:t xml:space="preserve"> </w:t>
+      </w:r>
+      <w:r>
+        <w:t xml:space="preserve">LLMs</w:t>
+      </w:r>
+      <w:r>
+        <w:t xml:space="preserve">.”</w:t>
+      </w:r>
+      <w:r>
+        <w:t xml:space="preserve"> </w:t>
+      </w:r>
+      <w:r>
+        <w:t xml:space="preserve">In</w:t>
+      </w:r>
+      <w:r>
+        <w:t xml:space="preserve"> </w:t>
+      </w:r>
+      <w:r>
+        <w:rPr>
+          <w:i/>
+          <w:iCs/>
+        </w:rPr>
+        <w:t xml:space="preserve">The Twelfth International Conference on Learning Representations</w:t>
+      </w:r>
+      <w:r>
+        <w:t xml:space="preserve">, 2024.</w:t>
+      </w:r>
+      <w:r>
+        <w:t xml:space="preserve"> </w:t>
+      </w:r>
+      <w:hyperlink r:id="rId205">
+        <w:r>
+          <w:rPr>
+            <w:rStyle w:val="Hyperlink"/>
+          </w:rPr>
+          <w:t xml:space="preserve">https://openreview.net/forum?id=gjeQKFxFpZ</w:t>
+        </w:r>
+      </w:hyperlink>
+      <w:r>
+        <w:t xml:space="preserve">.</w:t>
+      </w:r>
+    </w:p>
+    <w:bookmarkEnd w:id="253"/>
+    <w:bookmarkStart w:id="254" w:name="ref-zaks2021updating"/>
+    <w:p>
+      <w:pPr>
+        <w:pStyle w:val="Bibliography"/>
+      </w:pPr>
+      <w:r>
+        <w:t xml:space="preserve">Zaks, Sherry.</w:t>
+      </w:r>
+      <w:r>
+        <w:t xml:space="preserve"> </w:t>
+      </w:r>
+      <w:r>
+        <w:t xml:space="preserve">“Updating</w:t>
+      </w:r>
+      <w:r>
+        <w:t xml:space="preserve"> </w:t>
+      </w:r>
+      <w:r>
+        <w:t xml:space="preserve">Bayesian(s)</w:t>
+      </w:r>
+      <w:r>
+        <w:t xml:space="preserve">: A Critical Evaluation of</w:t>
+      </w:r>
+      <w:r>
+        <w:t xml:space="preserve"> </w:t>
+      </w:r>
+      <w:r>
+        <w:t xml:space="preserve">Bayesian</w:t>
+      </w:r>
+      <w:r>
+        <w:t xml:space="preserve"> </w:t>
+      </w:r>
+      <w:r>
+        <w:t xml:space="preserve">Process Tracing.”</w:t>
+      </w:r>
+      <w:r>
+        <w:t xml:space="preserve"> </w:t>
+      </w:r>
+      <w:r>
+        <w:rPr>
+          <w:i/>
+          <w:iCs/>
+        </w:rPr>
+        <w:t xml:space="preserve">Political Analysis</w:t>
+      </w:r>
+      <w:r>
+        <w:t xml:space="preserve"> </w:t>
+      </w:r>
+      <w:r>
+        <w:t xml:space="preserve">29, no. 1 (2021): 58–74.</w:t>
+      </w:r>
+      <w:r>
+        <w:t xml:space="preserve"> </w:t>
+      </w:r>
+      <w:hyperlink r:id="rId203">
+        <w:r>
+          <w:rPr>
+            <w:rStyle w:val="Hyperlink"/>
+          </w:rPr>
+          <w:t xml:space="preserve">https://doi.org/10.1017/pan.2020.10</w:t>
+        </w:r>
+      </w:hyperlink>
+      <w:r>
+        <w:t xml:space="preserve">.</w:t>
+      </w:r>
+    </w:p>
+    <w:bookmarkEnd w:id="254"/>
+    <w:bookmarkStart w:id="255" w:name="ref-ziems2024transform"/>
+    <w:p>
+      <w:pPr>
+        <w:pStyle w:val="Bibliography"/>
+      </w:pPr>
+      <w:r>
+        <w:t xml:space="preserve">Ziems, Caleb, William Held, Omar Shaikh, Jiaao Chen, Zhehao Zhang, and Diyi Yang.</w:t>
+      </w:r>
+      <w:r>
+        <w:t xml:space="preserve"> </w:t>
+      </w:r>
+      <w:r>
+        <w:t xml:space="preserve">“Can Large Language Models Transform Computational Social Science?”</w:t>
+      </w:r>
+      <w:r>
+        <w:t xml:space="preserve"> </w:t>
+      </w:r>
+      <w:r>
+        <w:rPr>
+          <w:i/>
+          <w:iCs/>
+        </w:rPr>
+        <w:t xml:space="preserve">Computational Linguistics</w:t>
+      </w:r>
+      <w:r>
+        <w:t xml:space="preserve"> </w:t>
+      </w:r>
+      <w:r>
+        <w:t xml:space="preserve">50, no. 1 (2024): 237–91.</w:t>
+      </w:r>
+      <w:r>
+        <w:t xml:space="preserve"> </w:t>
+      </w:r>
+      <w:hyperlink r:id="rId185">
+        <w:r>
+          <w:rPr>
+            <w:rStyle w:val="Hyperlink"/>
+          </w:rPr>
+          <w:t xml:space="preserve">https://doi.org/10.1162/coli_a_00502</w:t>
+        </w:r>
+      </w:hyperlink>
+      <w:r>
+        <w:t xml:space="preserve">.</w:t>
+      </w:r>
+    </w:p>
+    <w:bookmarkEnd w:id="255"/>
+    <w:bookmarkEnd w:id="256"/>
+    <w:bookmarkEnd w:id="257"/>
     <w:sectPr>
       <w:footnotePr>
         <w:numRestart w:val="eachSect"/>
@@ -10733,6 +12316,589 @@
         <w:t xml:space="preserve"> </w:t>
       </w:r>
       <w:r>
+        <w:t xml:space="preserve">Fabrizio Gilardi, Meysam Alizadeh, and Maël Kubli,</w:t>
+      </w:r>
+      <w:r>
+        <w:t xml:space="preserve"> </w:t>
+      </w:r>
+      <w:r>
+        <w:t xml:space="preserve">“</w:t>
+      </w:r>
+      <w:r>
+        <w:t xml:space="preserve">ChatGPT</w:t>
+      </w:r>
+      <w:r>
+        <w:t xml:space="preserve"> </w:t>
+      </w:r>
+      <w:r>
+        <w:t xml:space="preserve">Outperforms Crowd Workers for Text-Annotation Tasks,”</w:t>
+      </w:r>
+      <w:r>
+        <w:t xml:space="preserve"> </w:t>
+      </w:r>
+      <w:r>
+        <w:rPr>
+          <w:i/>
+          <w:iCs/>
+        </w:rPr>
+        <w:t xml:space="preserve">Proceedings of the National Academy of Sciences</w:t>
+      </w:r>
+      <w:r>
+        <w:t xml:space="preserve"> </w:t>
+      </w:r>
+      <w:r>
+        <w:t xml:space="preserve">120, no. 30 (2023): e2305016120,</w:t>
+      </w:r>
+      <w:r>
+        <w:t xml:space="preserve"> </w:t>
+      </w:r>
+      <w:hyperlink r:id="rId183">
+        <w:r>
+          <w:rPr>
+            <w:rStyle w:val="Hyperlink"/>
+          </w:rPr>
+          <w:t xml:space="preserve">https://doi.org/10.1073/pnas.2305016120</w:t>
+        </w:r>
+      </w:hyperlink>
+      <w:r>
+        <w:t xml:space="preserve">; Nicholas Pangakis, Samuel Wolken, and Sergio Fasching,</w:t>
+      </w:r>
+      <w:r>
+        <w:t xml:space="preserve"> </w:t>
+      </w:r>
+      <w:r>
+        <w:t xml:space="preserve">“Automated Annotation with Generative</w:t>
+      </w:r>
+      <w:r>
+        <w:t xml:space="preserve"> </w:t>
+      </w:r>
+      <w:r>
+        <w:t xml:space="preserve">AI</w:t>
+      </w:r>
+      <w:r>
+        <w:t xml:space="preserve"> </w:t>
+      </w:r>
+      <w:r>
+        <w:t xml:space="preserve">Requires Validation,”</w:t>
+      </w:r>
+      <w:r>
+        <w:t xml:space="preserve"> </w:t>
+      </w:r>
+      <w:r>
+        <w:rPr>
+          <w:i/>
+          <w:iCs/>
+        </w:rPr>
+        <w:t xml:space="preserve">arXiv</w:t>
+      </w:r>
+      <w:r>
+        <w:t xml:space="preserve">, 2023,</w:t>
+      </w:r>
+      <w:r>
+        <w:t xml:space="preserve"> </w:t>
+      </w:r>
+      <w:hyperlink r:id="rId184">
+        <w:r>
+          <w:rPr>
+            <w:rStyle w:val="Hyperlink"/>
+          </w:rPr>
+          <w:t xml:space="preserve">https://doi.org/10.48550/arXiv.2306.00176</w:t>
+        </w:r>
+      </w:hyperlink>
+      <w:r>
+        <w:t xml:space="preserve">; Caleb Ziems et al.,</w:t>
+      </w:r>
+      <w:r>
+        <w:t xml:space="preserve"> </w:t>
+      </w:r>
+      <w:r>
+        <w:t xml:space="preserve">“Can Large Language Models Transform Computational Social Science?”</w:t>
+      </w:r>
+      <w:r>
+        <w:t xml:space="preserve"> </w:t>
+      </w:r>
+      <w:r>
+        <w:rPr>
+          <w:i/>
+          <w:iCs/>
+        </w:rPr>
+        <w:t xml:space="preserve">Computational Linguistics</w:t>
+      </w:r>
+      <w:r>
+        <w:t xml:space="preserve"> </w:t>
+      </w:r>
+      <w:r>
+        <w:t xml:space="preserve">50, no. 1 (2024): 237–91,</w:t>
+      </w:r>
+      <w:r>
+        <w:t xml:space="preserve"> </w:t>
+      </w:r>
+      <w:hyperlink r:id="rId185">
+        <w:r>
+          <w:rPr>
+            <w:rStyle w:val="Hyperlink"/>
+          </w:rPr>
+          <w:t xml:space="preserve">https://doi.org/10.1162/coli_a_00502</w:t>
+        </w:r>
+      </w:hyperlink>
+      <w:r>
+        <w:t xml:space="preserve">.</w:t>
+      </w:r>
+    </w:p>
+  </w:footnote>
+  <w:footnote w:id="188">
+    <w:p>
+      <w:pPr>
+        <w:pStyle w:val="FootnoteText"/>
+      </w:pPr>
+      <w:r>
+        <w:rPr>
+          <w:rStyle w:val="FootnoteReference"/>
+        </w:rPr>
+        <w:footnoteRef/>
+      </w:r>
+      <w:r>
+        <w:t xml:space="preserve"> </w:t>
+      </w:r>
+      <w:r>
+        <w:t xml:space="preserve">Hal Roberts et al.,</w:t>
+      </w:r>
+      <w:r>
+        <w:t xml:space="preserve"> </w:t>
+      </w:r>
+      <w:r>
+        <w:t xml:space="preserve">“Media Cloud: Massive Open Source Collection of Global News on the Open Web,”</w:t>
+      </w:r>
+      <w:r>
+        <w:t xml:space="preserve"> </w:t>
+      </w:r>
+      <w:r>
+        <w:rPr>
+          <w:i/>
+          <w:iCs/>
+        </w:rPr>
+        <w:t xml:space="preserve">Proceedings of the International AAAI Conference on Web and Social Media</w:t>
+      </w:r>
+      <w:r>
+        <w:t xml:space="preserve"> </w:t>
+      </w:r>
+      <w:r>
+        <w:t xml:space="preserve">15, no. 1 (2021): 1034–45,</w:t>
+      </w:r>
+      <w:r>
+        <w:t xml:space="preserve"> </w:t>
+      </w:r>
+      <w:hyperlink r:id="rId189">
+        <w:r>
+          <w:rPr>
+            <w:rStyle w:val="Hyperlink"/>
+          </w:rPr>
+          <w:t xml:space="preserve">https://doi.org/10.1609/icwsm.v15i1.18127</w:t>
+        </w:r>
+      </w:hyperlink>
+      <w:r>
+        <w:t xml:space="preserve">.</w:t>
+      </w:r>
+    </w:p>
+  </w:footnote>
+  <w:footnote w:id="190">
+    <w:p>
+      <w:pPr>
+        <w:pStyle w:val="FootnoteText"/>
+      </w:pPr>
+      <w:r>
+        <w:rPr>
+          <w:rStyle w:val="FootnoteReference"/>
+        </w:rPr>
+        <w:footnoteRef/>
+      </w:r>
+      <w:r>
+        <w:t xml:space="preserve"> </w:t>
+      </w:r>
+      <w:r>
+        <w:t xml:space="preserve">Kaspar Beelen et al.,</w:t>
+      </w:r>
+      <w:r>
+        <w:t xml:space="preserve"> </w:t>
+      </w:r>
+      <w:r>
+        <w:t xml:space="preserve">“Bias and Representativeness in Digitized Newspaper Collections: Introducing the Environmental Scan,”</w:t>
+      </w:r>
+      <w:r>
+        <w:t xml:space="preserve"> </w:t>
+      </w:r>
+      <w:r>
+        <w:rPr>
+          <w:i/>
+          <w:iCs/>
+        </w:rPr>
+        <w:t xml:space="preserve">Digital Scholarship in the Humanities</w:t>
+      </w:r>
+      <w:r>
+        <w:t xml:space="preserve"> </w:t>
+      </w:r>
+      <w:r>
+        <w:t xml:space="preserve">38, no. 1 (2023): 1–22,</w:t>
+      </w:r>
+      <w:r>
+        <w:t xml:space="preserve"> </w:t>
+      </w:r>
+      <w:hyperlink r:id="rId191">
+        <w:r>
+          <w:rPr>
+            <w:rStyle w:val="Hyperlink"/>
+          </w:rPr>
+          <w:t xml:space="preserve">https://doi.org/10.1093/llc/fqac037</w:t>
+        </w:r>
+      </w:hyperlink>
+      <w:r>
+        <w:t xml:space="preserve">.</w:t>
+      </w:r>
+    </w:p>
+  </w:footnote>
+  <w:footnote w:id="194">
+    <w:p>
+      <w:pPr>
+        <w:pStyle w:val="FootnoteText"/>
+      </w:pPr>
+      <w:r>
+        <w:rPr>
+          <w:rStyle w:val="FootnoteReference"/>
+        </w:rPr>
+        <w:footnoteRef/>
+      </w:r>
+      <w:r>
+        <w:t xml:space="preserve"> </w:t>
+      </w:r>
+      <w:r>
+        <w:t xml:space="preserve">Erica Cai and Brendan O’Connor,</w:t>
+      </w:r>
+      <w:r>
+        <w:t xml:space="preserve"> </w:t>
+      </w:r>
+      <w:r>
+        <w:t xml:space="preserve">“A</w:t>
+      </w:r>
+      <w:r>
+        <w:t xml:space="preserve"> </w:t>
+      </w:r>
+      <w:r>
+        <w:t xml:space="preserve">Monte Carlo</w:t>
+      </w:r>
+      <w:r>
+        <w:t xml:space="preserve"> </w:t>
+      </w:r>
+      <w:r>
+        <w:t xml:space="preserve">Language Model Pipeline for Zero-Shot Sociopolitical Event Extraction,”</w:t>
+      </w:r>
+      <w:r>
+        <w:t xml:space="preserve"> </w:t>
+      </w:r>
+      <w:r>
+        <w:t xml:space="preserve">in</w:t>
+      </w:r>
+      <w:r>
+        <w:t xml:space="preserve"> </w:t>
+      </w:r>
+      <w:r>
+        <w:rPr>
+          <w:i/>
+          <w:iCs/>
+        </w:rPr>
+        <w:t xml:space="preserve">NeurIPS 2023 Workshop on Instruction Tuning and Instruction Following</w:t>
+      </w:r>
+      <w:r>
+        <w:t xml:space="preserve">, 2023,</w:t>
+      </w:r>
+      <w:r>
+        <w:t xml:space="preserve"> </w:t>
+      </w:r>
+      <w:hyperlink r:id="rId195">
+        <w:r>
+          <w:rPr>
+            <w:rStyle w:val="Hyperlink"/>
+          </w:rPr>
+          <w:t xml:space="preserve">https://doi.org/10.48550/arXiv.2305.15051</w:t>
+        </w:r>
+      </w:hyperlink>
+      <w:r>
+        <w:t xml:space="preserve">.</w:t>
+      </w:r>
+    </w:p>
+  </w:footnote>
+  <w:footnote w:id="198">
+    <w:p>
+      <w:pPr>
+        <w:pStyle w:val="FootnoteText"/>
+      </w:pPr>
+      <w:r>
+        <w:rPr>
+          <w:rStyle w:val="FootnoteReference"/>
+        </w:rPr>
+        <w:footnoteRef/>
+      </w:r>
+      <w:r>
+        <w:t xml:space="preserve"> </w:t>
+      </w:r>
+      <w:r>
+        <w:t xml:space="preserve">Patrick T. Brandt and Marcus Sianan,</w:t>
+      </w:r>
+      <w:r>
+        <w:t xml:space="preserve"> </w:t>
+      </w:r>
+      <w:r>
+        <w:t xml:space="preserve">“Measurement of Event Data from Text,”</w:t>
+      </w:r>
+      <w:r>
+        <w:t xml:space="preserve"> </w:t>
+      </w:r>
+      <w:r>
+        <w:rPr>
+          <w:i/>
+          <w:iCs/>
+        </w:rPr>
+        <w:t xml:space="preserve">Frontiers in Political Science</w:t>
+      </w:r>
+      <w:r>
+        <w:t xml:space="preserve"> </w:t>
+      </w:r>
+      <w:r>
+        <w:t xml:space="preserve">6 (2025): 1453640,</w:t>
+      </w:r>
+      <w:r>
+        <w:t xml:space="preserve"> </w:t>
+      </w:r>
+      <w:hyperlink r:id="rId199">
+        <w:r>
+          <w:rPr>
+            <w:rStyle w:val="Hyperlink"/>
+          </w:rPr>
+          <w:t xml:space="preserve">https://doi.org/10.3389/fpos.2024.1453640</w:t>
+        </w:r>
+      </w:hyperlink>
+      <w:r>
+        <w:t xml:space="preserve">.</w:t>
+      </w:r>
+    </w:p>
+  </w:footnote>
+  <w:footnote w:id="201">
+    <w:p>
+      <w:pPr>
+        <w:pStyle w:val="FootnoteText"/>
+      </w:pPr>
+      <w:r>
+        <w:rPr>
+          <w:rStyle w:val="FootnoteReference"/>
+        </w:rPr>
+        <w:footnoteRef/>
+      </w:r>
+      <w:r>
+        <w:t xml:space="preserve"> </w:t>
+      </w:r>
+      <w:r>
+        <w:t xml:space="preserve">Tasha Fairfield and Andrew E. Charman,</w:t>
+      </w:r>
+      <w:r>
+        <w:t xml:space="preserve"> </w:t>
+      </w:r>
+      <w:r>
+        <w:t xml:space="preserve">“Explicit</w:t>
+      </w:r>
+      <w:r>
+        <w:t xml:space="preserve"> </w:t>
+      </w:r>
+      <w:r>
+        <w:t xml:space="preserve">Bayesian</w:t>
+      </w:r>
+      <w:r>
+        <w:t xml:space="preserve"> </w:t>
+      </w:r>
+      <w:r>
+        <w:t xml:space="preserve">Analysis for Process Tracing: Guidelines, Opportunities, and Caveats,”</w:t>
+      </w:r>
+      <w:r>
+        <w:t xml:space="preserve"> </w:t>
+      </w:r>
+      <w:r>
+        <w:rPr>
+          <w:i/>
+          <w:iCs/>
+        </w:rPr>
+        <w:t xml:space="preserve">Political Analysis</w:t>
+      </w:r>
+      <w:r>
+        <w:t xml:space="preserve"> </w:t>
+      </w:r>
+      <w:r>
+        <w:t xml:space="preserve">25, no. 3 (2017): 363–80,</w:t>
+      </w:r>
+      <w:r>
+        <w:t xml:space="preserve"> </w:t>
+      </w:r>
+      <w:hyperlink r:id="rId202">
+        <w:r>
+          <w:rPr>
+            <w:rStyle w:val="Hyperlink"/>
+          </w:rPr>
+          <w:t xml:space="preserve">https://doi.org/10.1017/pan.2017.14</w:t>
+        </w:r>
+      </w:hyperlink>
+      <w:r>
+        <w:t xml:space="preserve">; Sherry Zaks,</w:t>
+      </w:r>
+      <w:r>
+        <w:t xml:space="preserve"> </w:t>
+      </w:r>
+      <w:r>
+        <w:t xml:space="preserve">“Updating</w:t>
+      </w:r>
+      <w:r>
+        <w:t xml:space="preserve"> </w:t>
+      </w:r>
+      <w:r>
+        <w:t xml:space="preserve">Bayesian(s)</w:t>
+      </w:r>
+      <w:r>
+        <w:t xml:space="preserve">: A Critical Evaluation of</w:t>
+      </w:r>
+      <w:r>
+        <w:t xml:space="preserve"> </w:t>
+      </w:r>
+      <w:r>
+        <w:t xml:space="preserve">Bayesian</w:t>
+      </w:r>
+      <w:r>
+        <w:t xml:space="preserve"> </w:t>
+      </w:r>
+      <w:r>
+        <w:t xml:space="preserve">Process Tracing,”</w:t>
+      </w:r>
+      <w:r>
+        <w:t xml:space="preserve"> </w:t>
+      </w:r>
+      <w:r>
+        <w:rPr>
+          <w:i/>
+          <w:iCs/>
+        </w:rPr>
+        <w:t xml:space="preserve">Political Analysis</w:t>
+      </w:r>
+      <w:r>
+        <w:t xml:space="preserve"> </w:t>
+      </w:r>
+      <w:r>
+        <w:t xml:space="preserve">29, no. 1 (2021): 58–74,</w:t>
+      </w:r>
+      <w:r>
+        <w:t xml:space="preserve"> </w:t>
+      </w:r>
+      <w:hyperlink r:id="rId203">
+        <w:r>
+          <w:rPr>
+            <w:rStyle w:val="Hyperlink"/>
+          </w:rPr>
+          <w:t xml:space="preserve">https://doi.org/10.1017/pan.2020.10</w:t>
+        </w:r>
+      </w:hyperlink>
+      <w:r>
+        <w:t xml:space="preserve">.</w:t>
+      </w:r>
+    </w:p>
+  </w:footnote>
+  <w:footnote w:id="204">
+    <w:p>
+      <w:pPr>
+        <w:pStyle w:val="FootnoteText"/>
+      </w:pPr>
+      <w:r>
+        <w:rPr>
+          <w:rStyle w:val="FootnoteReference"/>
+        </w:rPr>
+        <w:footnoteRef/>
+      </w:r>
+      <w:r>
+        <w:t xml:space="preserve"> </w:t>
+      </w:r>
+      <w:r>
+        <w:t xml:space="preserve">Miao Xiong et al.,</w:t>
+      </w:r>
+      <w:r>
+        <w:t xml:space="preserve"> </w:t>
+      </w:r>
+      <w:r>
+        <w:t xml:space="preserve">“Can</w:t>
+      </w:r>
+      <w:r>
+        <w:t xml:space="preserve"> </w:t>
+      </w:r>
+      <w:r>
+        <w:t xml:space="preserve">LLMs</w:t>
+      </w:r>
+      <w:r>
+        <w:t xml:space="preserve"> </w:t>
+      </w:r>
+      <w:r>
+        <w:t xml:space="preserve">Express Their Uncertainty? An Empirical Evaluation of Confidence Elicitation in</w:t>
+      </w:r>
+      <w:r>
+        <w:t xml:space="preserve"> </w:t>
+      </w:r>
+      <w:r>
+        <w:t xml:space="preserve">LLMs</w:t>
+      </w:r>
+      <w:r>
+        <w:t xml:space="preserve">,”</w:t>
+      </w:r>
+      <w:r>
+        <w:t xml:space="preserve"> </w:t>
+      </w:r>
+      <w:r>
+        <w:t xml:space="preserve">in</w:t>
+      </w:r>
+      <w:r>
+        <w:t xml:space="preserve"> </w:t>
+      </w:r>
+      <w:r>
+        <w:rPr>
+          <w:i/>
+          <w:iCs/>
+        </w:rPr>
+        <w:t xml:space="preserve">The Twelfth International Conference on Learning Representations</w:t>
+      </w:r>
+      <w:r>
+        <w:t xml:space="preserve">, 2024,</w:t>
+      </w:r>
+      <w:r>
+        <w:t xml:space="preserve"> </w:t>
+      </w:r>
+      <w:hyperlink r:id="rId205">
+        <w:r>
+          <w:rPr>
+            <w:rStyle w:val="Hyperlink"/>
+          </w:rPr>
+          <w:t xml:space="preserve">https://openreview.net/forum?id=gjeQKFxFpZ</w:t>
+        </w:r>
+      </w:hyperlink>
+      <w:r>
+        <w:t xml:space="preserve">.</w:t>
+      </w:r>
+    </w:p>
+  </w:footnote>
+  <w:footnote w:id="215">
+    <w:p>
+      <w:pPr>
+        <w:pStyle w:val="FootnoteText"/>
+      </w:pPr>
+      <w:r>
+        <w:rPr>
+          <w:rStyle w:val="FootnoteReference"/>
+        </w:rPr>
+        <w:footnoteRef/>
+      </w:r>
+      <w:r>
+        <w:t xml:space="preserve"> </w:t>
+      </w:r>
+      <w:r>
         <w:t xml:space="preserve">See</w:t>
       </w:r>
       <w:r>
@@ -10762,7 +12928,7 @@
       <w:r>
         <w:t xml:space="preserve"> </w:t>
       </w:r>
-      <w:hyperlink r:id="rId183">
+      <w:hyperlink r:id="rId216">
         <w:r>
           <w:rPr>
             <w:rStyle w:val="Hyperlink"/>

</xml_diff>

<commit_message>
feat: publish evidence synthesis chapter
</commit_message>
<xml_diff>
--- a/field-guide/book/From-Question-to-Evidence.docx
+++ b/field-guide/book/From-Question-to-Evidence.docx
@@ -130,7 +130,7 @@
         <w:pStyle w:val="BodyText"/>
       </w:pPr>
       <w:r>
-        <w:t xml:space="preserve">The full field guide follows a qualitative project from its first question to a documented corpus, an analysis, and a public claim. We are publishing it in reviewed modules so readers can use, test, and challenge each part before the first edition closes. The current revision contains two complete modules. The first follows the path from a question to an evidence map. The second carries the same logic into a literature review. A new bridge chapter shows how AI can accelerate the construction of event databases while preserving provenance, validation, and causal discipline. A third complete module will connect the collection plan to a responsibly assembled research corpus. Later modules will address preparation, analysis, disconfirmation, writing, sharing, and maintenance.</w:t>
+        <w:t xml:space="preserve">The full field guide follows a qualitative project from its first question to a documented corpus, an analysis, and a public claim. We are publishing it in reviewed modules so readers can use, test, and challenge each part before the first edition closes. The current revision contains two complete modules. The first follows the path from a question to an evidence map. The second carries the same logic into a literature review. A new synthesis chapter examines how review articles and meta-analyses are becoming open, versioned research objects. A second bridge chapter shows how AI can accelerate the construction of event databases while preserving provenance, validation, and causal discipline. A third complete module will connect the collection plan to a responsibly assembled research corpus. Later modules will address preparation, analysis, disconfirmation, writing, sharing, and maintenance.</w:t>
       </w:r>
     </w:p>
     <w:p>
@@ -8329,16 +8329,16 @@
     </w:p>
     <w:bookmarkEnd w:id="180"/>
     <w:bookmarkEnd w:id="181"/>
-    <w:bookmarkStart w:id="214" w:name="building-event-databases-with-ai"/>
+    <w:bookmarkStart w:id="218" w:name="X8b4529a10d3ba454a8d9dd74d260212e93d1d6f"/>
     <w:p>
       <w:pPr>
         <w:pStyle w:val="Heading1"/>
       </w:pPr>
       <w:r>
-        <w:t xml:space="preserve">18. Building Event Databases with AI</w:t>
-      </w:r>
-    </w:p>
-    <w:bookmarkStart w:id="186" w:name="orientation-13"/>
+        <w:t xml:space="preserve">18. Review Articles and Meta-Analysis in Transition</w:t>
+      </w:r>
+    </w:p>
+    <w:bookmarkStart w:id="182" w:name="orientation-13"/>
     <w:p>
       <w:pPr>
         <w:pStyle w:val="Heading2"/>
@@ -8352,298 +8352,1348 @@
         <w:pStyle w:val="FirstParagraph"/>
       </w:pPr>
       <w:r>
-        <w:t xml:space="preserve">Event databases convert dispersed accounts into comparable records. A researcher may begin with a question about protest, repression, political violence, institutional reform, migration, or disaster response. The relevant traces may appear across newspapers, archival catalogues, government reports, organizational records, and born-digital collections. Before generative AI, much of the work required repetitive searching, copying, normalization, and initial classification. These tasks consumed time that researchers needed for interpretation.</w:t>
-      </w:r>
-    </w:p>
-    <w:p>
-      <w:pPr>
-        <w:pStyle w:val="BodyText"/>
-      </w:pPr>
-      <w:r>
-        <w:t xml:space="preserve">AI changes the feasible scale of this work. A system can expand queries, search an authorized collection, extract candidate fields, compare reports, and flag records that may describe the same occurrence. It can apply a preliminary codebook to thousands of passages and identify dimensions the original codebook omitted. Studies of text annotation show that language models can perform some bounded classification tasks quickly and inexpensively. Performance, however, varies substantially across tasks and datasets, which makes local validation indispensable.</w:t>
+        <w:t xml:space="preserve">A review article once appeared to be a retrospective product. Its authors surveyed an established literature, organized its main findings, and published a settled account. That model still has value, but it no longer describes the entire task. Digital discovery produces larger and more varied corpora. Open research practices expose protocols, coding decisions, data, and analysis. New studies can make a synthesis stale soon after publication. AI can accelerate several clerical operations, while also multiplying plausible errors.</w:t>
+      </w:r>
+    </w:p>
+    <w:p>
+      <w:pPr>
+        <w:pStyle w:val="BodyText"/>
+      </w:pPr>
+      <w:r>
+        <w:t xml:space="preserve">These changes are turning the review from a static article into a form of research infrastructure. The article remains an argument, but the argument now rests on inspectable and potentially reusable objects: a protocol, search history, screening record, coded corpus, analysis, sensitivity tests, and update policy. A trustworthy review links these objects without pretending that procedural detail can replace judgment.</w:t>
+      </w:r>
+    </w:p>
+    <w:p>
+      <w:pPr>
+        <w:pStyle w:val="BodyText"/>
+      </w:pPr>
+      <w:r>
+        <w:t xml:space="preserve">This chapter explains the present and plausible future of review articles and meta-analyses in the social sciences. Its central claim is simple. New tools can shorten discovery, screening, extraction, and updating, but they cannot decide what evidence is comparable or what variation means. The durable unit of progress is therefore not an automated summary. It is a versioned chain of decisions that another researcher can inspect, challenge, and extend.</w:t>
+      </w:r>
+    </w:p>
+    <w:bookmarkEnd w:id="182"/>
+    <w:bookmarkStart w:id="211" w:name="learn-13"/>
+    <w:p>
+      <w:pPr>
+        <w:pStyle w:val="Heading2"/>
+      </w:pPr>
+      <w:r>
+        <w:t xml:space="preserve">18.2 Learn</w:t>
+      </w:r>
+    </w:p>
+    <w:bookmarkStart w:id="184" w:name="begin-with-the-review-family"/>
+    <w:p>
+      <w:pPr>
+        <w:pStyle w:val="Heading3"/>
+      </w:pPr>
+      <w:r>
+        <w:t xml:space="preserve">18.2.1 Begin with the review family</w:t>
+      </w:r>
+    </w:p>
+    <w:p>
+      <w:pPr>
+        <w:pStyle w:val="FirstParagraph"/>
+      </w:pPr>
+      <w:r>
+        <w:t xml:space="preserve">The term</w:t>
+      </w:r>
+      <w:r>
+        <w:t xml:space="preserve"> </w:t>
+      </w:r>
+      <w:r>
+        <w:rPr>
+          <w:i/>
+          <w:iCs/>
+        </w:rPr>
+        <w:t xml:space="preserve">literature review</w:t>
+      </w:r>
+      <w:r>
+        <w:t xml:space="preserve"> </w:t>
+      </w:r>
+      <w:r>
+        <w:t xml:space="preserve">covers several products with different purposes. A narrative or integrative review may clarify a concept, reconstruct an intellectual debate, or develop a theoretical account. A scoping review maps the extent and characteristics of a broad body of work. A systematic review answers a bounded question through explicit, reproducible procedures. A qualitative evidence synthesis interprets meanings or mechanisms across studies. An evidence and gap map describes the distribution of evidence without necessarily estimating a common effect. An umbrella review examines existing reviews. A rapid review makes declared concessions to produce a timely answer. Meta-analysis statistically synthesizes estimates that meet defined comparability conditions.</w:t>
       </w:r>
       <w:r>
         <w:rPr>
           <w:rStyle w:val="FootnoteReference"/>
         </w:rPr>
-        <w:footnoteReference w:id="182"/>
-      </w:r>
-    </w:p>
-    <w:p>
-      <w:pPr>
-        <w:pStyle w:val="BodyText"/>
-      </w:pPr>
-      <w:r>
-        <w:t xml:space="preserve">The resulting speed creates a methodological danger. A fluent extraction can make an uncertain mention look like an observed event. Several articles can make one wire report look like independent confirmation. A model can produce a precise code for an ambiguous passage or a causal probability without defining the comparison that gives the number meaning. Faster processing does not remove these problems. It can reproduce them at scale.</w:t>
-      </w:r>
-    </w:p>
-    <w:p>
-      <w:pPr>
-        <w:pStyle w:val="BodyText"/>
-      </w:pPr>
-      <w:r>
-        <w:t xml:space="preserve">This chapter presents an auditable alternative. AI compresses clerical stages while the researcher preserves a visible chain from source to record, record to event, event to variable, and written evidence to causal inference. Every transition produces an artifact that can be reviewed, corrected, and versioned.</w:t>
-      </w:r>
-    </w:p>
-    <w:bookmarkEnd w:id="186"/>
-    <w:bookmarkStart w:id="207" w:name="learn-13"/>
+        <w:footnoteReference w:id="183"/>
+      </w:r>
+    </w:p>
+    <w:p>
+      <w:pPr>
+        <w:pStyle w:val="BodyText"/>
+      </w:pPr>
+      <w:r>
+        <w:t xml:space="preserve">This review family is not a hierarchy. A systematic review is not automatically superior to an interpretive review. A meta-analysis is not a badge of rigor that can be added to any corpus. Each form answers a different question and makes different assumptions. The first design decision is therefore functional: what must the review allow its reader to understand, estimate, compare, or decide?</w:t>
+      </w:r>
+    </w:p>
+    <w:p>
+      <w:pPr>
+        <w:pStyle w:val="BodyText"/>
+      </w:pPr>
+      <w:r>
+        <w:t xml:space="preserve">A review of how a concept changed across disciplines may require close comparison of definitions and citation lineages. A review of whether an intervention changes an outcome may support statistical synthesis. A review of how participants experience that intervention may require qualitative synthesis. A review of an emerging field may first need a scoping map because its populations, measures, and outcomes remain unstable. Combining these products can be useful, but their inferential roles must remain distinct.</w:t>
+      </w:r>
+    </w:p>
+    <w:p>
+      <w:pPr>
+        <w:pStyle w:val="BodyText"/>
+      </w:pPr>
+      <w:r>
+        <w:t xml:space="preserve">Method names do not settle the design. Authors sometimes label a broad database search a systematic review even when eligibility decisions and synthesis rules remain unclear. Other reviews apply a narrow checklist to a question that requires historical or conceptual interpretation. The defensible sequence runs from question to evidence type, from evidence type to review form, and from review form to procedure.</w:t>
+      </w:r>
+    </w:p>
+    <w:bookmarkEnd w:id="184"/>
+    <w:bookmarkStart w:id="187" w:name="understand-what-meta-analysis-adds"/>
+    <w:p>
+      <w:pPr>
+        <w:pStyle w:val="Heading3"/>
+      </w:pPr>
+      <w:r>
+        <w:t xml:space="preserve">18.2.2 Understand what meta-analysis adds</w:t>
+      </w:r>
+    </w:p>
+    <w:p>
+      <w:pPr>
+        <w:pStyle w:val="FirstParagraph"/>
+      </w:pPr>
+      <w:r>
+        <w:t xml:space="preserve">Meta-analysis is not a synonym for systematic review. It is a set of statistical methods for describing and explaining a distribution of comparable effect estimates within a defined corpus.</w:t>
+      </w:r>
+      <w:r>
+        <w:rPr>
+          <w:rStyle w:val="FootnoteReference"/>
+        </w:rPr>
+        <w:footnoteReference w:id="185"/>
+      </w:r>
+      <w:r>
+        <w:t xml:space="preserve"> </w:t>
+      </w:r>
+      <w:r>
+        <w:t xml:space="preserve">The systematic review establishes how studies entered that corpus. The meta-analysis addresses what their estimates imply under declared statistical assumptions.</w:t>
+      </w:r>
+    </w:p>
+    <w:p>
+      <w:pPr>
+        <w:pStyle w:val="BodyText"/>
+      </w:pPr>
+      <w:r>
+        <w:t xml:space="preserve">This distinction matters because a precise pooled estimate can conceal a weak evidence base. Studies may use different constructs under the same label, compare unlike populations, report incompatible outcomes, or estimate effects under different causal conditions. A statistical model can combine the numbers, but it cannot make the underlying questions equivalent.</w:t>
+      </w:r>
+    </w:p>
+    <w:p>
+      <w:pPr>
+        <w:pStyle w:val="BodyText"/>
+      </w:pPr>
+      <w:r>
+        <w:t xml:space="preserve">Before pooling, construct an estimand table. Each row should record the population, treatment or exposure, comparison, outcome, timing, design, effect measure, and adjustment set. Add the unit of assignment, unit of analysis, and level at which uncertainty was estimated. The table makes comparability a visible decision instead of an assumption hidden inside software.</w:t>
+      </w:r>
+    </w:p>
+    <w:p>
+      <w:pPr>
+        <w:pStyle w:val="BodyText"/>
+      </w:pPr>
+      <w:r>
+        <w:t xml:space="preserve">The pooled mean is only one possible target. A review may seek the average association across settings, the distribution of effects, an expected effect in a new setting, or the moderators that account for variation. These are different questions. A model chosen for one should not be interpreted as if it answered the others.</w:t>
+      </w:r>
+    </w:p>
+    <w:bookmarkEnd w:id="187"/>
+    <w:bookmarkStart w:id="188" w:name="Xda6239effdb3f6c25f568a72c585327e6952cf0"/>
+    <w:p>
+      <w:pPr>
+        <w:pStyle w:val="Heading3"/>
+      </w:pPr>
+      <w:r>
+        <w:t xml:space="preserve">18.2.3 Treat heterogeneity as substantive evidence</w:t>
+      </w:r>
+    </w:p>
+    <w:p>
+      <w:pPr>
+        <w:pStyle w:val="FirstParagraph"/>
+      </w:pPr>
+      <w:r>
+        <w:t xml:space="preserve">Social science effects often vary because institutions, histories, populations, measures, and implementation differ. Heterogeneity is therefore more than noise around a universal effect. It may be the principal finding.</w:t>
+      </w:r>
+    </w:p>
+    <w:p>
+      <w:pPr>
+        <w:pStyle w:val="BodyText"/>
+      </w:pPr>
+      <w:r>
+        <w:t xml:space="preserve">A random-effects model acknowledges variation among the effects represented by the included studies. It does not prove that those studies form one meaningful population. Nor does it license an inference to every setting beyond them. The review must explain which sources of variation were expected before analysis and which appeared only after inspecting the data.</w:t>
+      </w:r>
+    </w:p>
+    <w:p>
+      <w:pPr>
+        <w:pStyle w:val="BodyText"/>
+      </w:pPr>
+      <w:r>
+        <w:t xml:space="preserve">Report the distribution of effects, not only its mean. A confidence interval describes uncertainty around an estimated parameter. A prediction interval addresses a different question: where an effect from a comparable future setting might plausibly fall. When heterogeneity is substantial, the prediction interval may cross thresholds that the pooled mean does not. Its width can be more informative for policy than the significance of the mean.</w:t>
+      </w:r>
+    </w:p>
+    <w:p>
+      <w:pPr>
+        <w:pStyle w:val="BodyText"/>
+      </w:pPr>
+      <w:r>
+        <w:t xml:space="preserve">Moderator analyses can examine theoretically specified variation, but they are vulnerable to low power, multiple testing, and ecological interpretation. A moderator measured at the study level cannot establish the corresponding individual-level mechanism. Separate planned tests from exploratory ones. Record which coding distinctions existed before results were examined.</w:t>
+      </w:r>
+    </w:p>
+    <w:p>
+      <w:pPr>
+        <w:pStyle w:val="BodyText"/>
+      </w:pPr>
+      <w:r>
+        <w:t xml:space="preserve">Qualitative and quantitative synthesis can inform each other here. Close reading may identify institutional differences that define plausible moderator categories. Quantitative patterns may identify cases that deserve renewed interpretation. Mixed evidence becomes valuable when the forms remain legible, not when one is used to decorate the other.</w:t>
+      </w:r>
+    </w:p>
+    <w:bookmarkEnd w:id="188"/>
+    <w:bookmarkStart w:id="193" w:name="preserve-dependence-and-multiplicity"/>
+    <w:p>
+      <w:pPr>
+        <w:pStyle w:val="Heading3"/>
+      </w:pPr>
+      <w:r>
+        <w:t xml:space="preserve">18.2.4 Preserve dependence and multiplicity</w:t>
+      </w:r>
+    </w:p>
+    <w:p>
+      <w:pPr>
+        <w:pStyle w:val="FirstParagraph"/>
+      </w:pPr>
+      <w:r>
+        <w:t xml:space="preserve">Many social science studies report several outcomes, time points, subgroups, models, or treatment contrasts. Several articles may also analyze the same dataset. These estimates share observations and design decisions. Treating them as independent produces excessive precision and gives prolific studies or datasets disproportionate influence.</w:t>
+      </w:r>
+    </w:p>
+    <w:p>
+      <w:pPr>
+        <w:pStyle w:val="BodyText"/>
+      </w:pPr>
+      <w:r>
+        <w:t xml:space="preserve">Every effect table should therefore include a study identifier, sample identifier, dataset identifier, outcome family, time point, and model family. This structure reveals dependent effect estimates before analysis. The reviewer can then select one estimate under a preregistered rule, model the hierarchy, use an appropriate multivariate method, or apply robust variance estimation when its assumptions and sample requirements fit the corpus.</w:t>
+      </w:r>
+      <w:r>
+        <w:rPr>
+          <w:rStyle w:val="FootnoteReference"/>
+        </w:rPr>
+        <w:footnoteReference w:id="189"/>
+      </w:r>
+    </w:p>
+    <w:p>
+      <w:pPr>
+        <w:pStyle w:val="BodyText"/>
+      </w:pPr>
+      <w:r>
+        <w:t xml:space="preserve">Dependence is also intellectual. A set of studies may repeat one operationalization, share code, or inherit the same measurement error. Statistical correction for clustered standard errors does not remove that shared conceptual ancestry. The written synthesis should distinguish repeated analysis from independent replication.</w:t>
+      </w:r>
+    </w:p>
+    <w:p>
+      <w:pPr>
+        <w:pStyle w:val="BodyText"/>
+      </w:pPr>
+      <w:r>
+        <w:t xml:space="preserve">Model multiplicity creates another problem. Authors can often report many defensible specifications. Reviews that select one estimate per study after seeing the results may reproduce selective reporting. Collecting all relevant estimates and modeling their dependence can be preferable, but it requires careful coding and a declared strategy. Contemporary social science guidance identifies dependence, systematic heterogeneity, and publication selection as recurring issues that every quantitative synthesis should address.</w:t>
+      </w:r>
+      <w:r>
+        <w:rPr>
+          <w:rStyle w:val="FootnoteReference"/>
+        </w:rPr>
+        <w:footnoteReference w:id="191"/>
+      </w:r>
+    </w:p>
+    <w:bookmarkEnd w:id="193"/>
+    <w:bookmarkStart w:id="194" w:name="X348bcba91fd1a3122643b352c1cdc055a72afdd"/>
+    <w:p>
+      <w:pPr>
+        <w:pStyle w:val="Heading3"/>
+      </w:pPr>
+      <w:r>
+        <w:t xml:space="preserve">18.2.5 Examine selective reporting without a mechanical verdict</w:t>
+      </w:r>
+    </w:p>
+    <w:p>
+      <w:pPr>
+        <w:pStyle w:val="FirstParagraph"/>
+      </w:pPr>
+      <w:r>
+        <w:t xml:space="preserve">The available literature is not a neutral sample of completed research. Statistically striking results may be more likely to be written, submitted, accepted, or emphasized. Outcomes and specifications can also be selected within a published study. Gray literature searches may reduce some forms of selection while introducing new differences in reviewability and metadata.</w:t>
+      </w:r>
+    </w:p>
+    <w:p>
+      <w:pPr>
+        <w:pStyle w:val="BodyText"/>
+      </w:pPr>
+      <w:r>
+        <w:t xml:space="preserve">No single funnel plot, regression, or adjustment method can diagnose and repair every form of publication bias. Small-study patterns can arise from heterogeneity, design quality, or genuine differences in populations. Statistical corrections rely on assumptions that may not fit the selection process. Use several sources of evidence: prospective registrations where available, dissertations and reports, requests for unreported results, outcome comparison within studies, sensitivity analyses, and a substantive account of incentives in the field.</w:t>
+      </w:r>
+    </w:p>
+    <w:p>
+      <w:pPr>
+        <w:pStyle w:val="BodyText"/>
+      </w:pPr>
+      <w:r>
+        <w:t xml:space="preserve">The review should state what would have to be missing to change its conclusion. That question turns a generic limitation into a sensitivity claim. It also prevents the adjusted estimate from appearing as a recovered truth. A corrected result remains conditional on a model of what became observable.</w:t>
+      </w:r>
+    </w:p>
+    <w:bookmarkEnd w:id="194"/>
+    <w:bookmarkStart w:id="200" w:name="make-the-synthesis-reproducible"/>
+    <w:p>
+      <w:pPr>
+        <w:pStyle w:val="Heading3"/>
+      </w:pPr>
+      <w:r>
+        <w:t xml:space="preserve">18.2.6 Make the synthesis reproducible</w:t>
+      </w:r>
+    </w:p>
+    <w:p>
+      <w:pPr>
+        <w:pStyle w:val="FirstParagraph"/>
+      </w:pPr>
+      <w:r>
+        <w:t xml:space="preserve">Open practice changes a meta-analysis from a report about an analysis into a rerunnable research object. A strong public package includes the protocol, complete search strategies, screening decisions, extraction definitions, coded data, transformation code, analysis code, output tables, and a record of deviations. When materials cannot be shared, the package should describe the restriction and expose the largest safe portion.</w:t>
+      </w:r>
+    </w:p>
+    <w:p>
+      <w:pPr>
+        <w:pStyle w:val="BodyText"/>
+      </w:pPr>
+      <w:r>
+        <w:t xml:space="preserve">Preregistration does not freeze a review against learning. It distinguishes planned decisions from changes made after contact with the evidence. A deviation log can record what changed, why it changed, when the team decided, and which outputs the change affected. Open materials allow readers to evaluate those decisions and allow later teams to update the review rather than reconstruct it.</w:t>
+      </w:r>
+      <w:r>
+        <w:rPr>
+          <w:rStyle w:val="FootnoteReference"/>
+        </w:rPr>
+        <w:footnoteReference w:id="195"/>
+      </w:r>
+    </w:p>
+    <w:p>
+      <w:pPr>
+        <w:pStyle w:val="BodyText"/>
+      </w:pPr>
+      <w:r>
+        <w:t xml:space="preserve">Transparency must extend to the quantitative data structure. A spreadsheet of final effect sizes is insufficient if it omits study relationships, transformation rules, excluded estimates, and coding uncertainty. Preserve raw extracted values alongside derived values. Give every effect a stable identifier that links it to its source location and coding decision.</w:t>
+      </w:r>
+    </w:p>
+    <w:p>
+      <w:pPr>
+        <w:pStyle w:val="BodyText"/>
+      </w:pPr>
+      <w:r>
+        <w:t xml:space="preserve">Meta-research has found persistent gaps in the transparency and reproducibility of published meta-analyses.</w:t>
+      </w:r>
+      <w:r>
+        <w:rPr>
+          <w:rStyle w:val="FootnoteReference"/>
+        </w:rPr>
+        <w:footnoteReference w:id="197"/>
+      </w:r>
+      <w:r>
+        <w:t xml:space="preserve"> </w:t>
+      </w:r>
+      <w:r>
+        <w:t xml:space="preserve">A long methods section does not by itself solve the problem. Reproducibility depends on whether the released objects recreate the stated result and make consequential judgment visible.</w:t>
+      </w:r>
+    </w:p>
+    <w:bookmarkEnd w:id="200"/>
+    <w:bookmarkStart w:id="203" w:name="Xcf1145567e92e95c81c9085f4b8e3dd9e2e40ff"/>
+    <w:p>
+      <w:pPr>
+        <w:pStyle w:val="Heading3"/>
+      </w:pPr>
+      <w:r>
+        <w:t xml:space="preserve">18.2.7 Design living reviews as governed projects</w:t>
+      </w:r>
+    </w:p>
+    <w:p>
+      <w:pPr>
+        <w:pStyle w:val="FirstParagraph"/>
+      </w:pPr>
+      <w:r>
+        <w:t xml:space="preserve">A living review incorporates new evidence under a continuing workflow. It is an update mode, not another review question type. The same systematic review can be maintained in living form when new research arrives frequently and could change a consequential conclusion.</w:t>
+      </w:r>
+      <w:r>
+        <w:rPr>
+          <w:rStyle w:val="FootnoteReference"/>
+        </w:rPr>
+        <w:footnoteReference w:id="201"/>
+      </w:r>
+    </w:p>
+    <w:p>
+      <w:pPr>
+        <w:pStyle w:val="BodyText"/>
+      </w:pPr>
+      <w:r>
+        <w:t xml:space="preserve">Living status requires more than an editable webpage. The team needs a surveillance strategy, update trigger, review interval, ownership rule, version number, correction process, and retirement condition. Each release should preserve a citable snapshot. Readers must be able to identify which evidence and analysis supported the version they used.</w:t>
+      </w:r>
+    </w:p>
+    <w:p>
+      <w:pPr>
+        <w:pStyle w:val="BodyText"/>
+      </w:pPr>
+      <w:r>
+        <w:t xml:space="preserve">Updates also create statistical problems. Repeatedly recalculating and testing a pooled effect as new studies arrive can change error rates. A living meta-analysis therefore needs a declared updating method, especially when policy decisions depend on crossing a threshold. The correct method depends on the inferential target, expected evidence flow, heterogeneity, and cost of error. No universal update rule replaces these design choices.</w:t>
+      </w:r>
+    </w:p>
+    <w:p>
+      <w:pPr>
+        <w:pStyle w:val="BodyText"/>
+      </w:pPr>
+      <w:r>
+        <w:t xml:space="preserve">Maintenance should be selective. A slowly changing historical literature may not justify continuous surveillance. A fast-moving policy question might. A review can leave living mode when new studies become unlikely, the conclusion stabilizes for its decision purpose, or resources no longer support responsible maintenance. Calling every online review living would conceal these commitments.</w:t>
+      </w:r>
+    </w:p>
+    <w:bookmarkEnd w:id="203"/>
+    <w:bookmarkStart w:id="209" w:name="give-ai-bounded-work"/>
+    <w:p>
+      <w:pPr>
+        <w:pStyle w:val="Heading3"/>
+      </w:pPr>
+      <w:r>
+        <w:t xml:space="preserve">18.2.8 Give AI bounded work</w:t>
+      </w:r>
+    </w:p>
+    <w:p>
+      <w:pPr>
+        <w:pStyle w:val="FirstParagraph"/>
+      </w:pPr>
+      <w:r>
+        <w:t xml:space="preserve">AI can assist with query expansion, deduplication, screening prioritization, structured extraction, citation checking, code explanation, and update surveillance. Earlier machine-learning research found some mature applications for study identification, while extraction and judgment-intensive tasks required more development.</w:t>
+      </w:r>
+      <w:r>
+        <w:rPr>
+          <w:rStyle w:val="FootnoteReference"/>
+        </w:rPr>
+        <w:footnoteReference w:id="204"/>
+      </w:r>
+      <w:r>
+        <w:t xml:space="preserve"> </w:t>
+      </w:r>
+      <w:r>
+        <w:t xml:space="preserve">Later reviews documented rapid growth in available systems, especially around search, screening, extraction, and synthesis.</w:t>
+      </w:r>
+      <w:r>
+        <w:rPr>
+          <w:rStyle w:val="FootnoteReference"/>
+        </w:rPr>
+        <w:footnoteReference w:id="206"/>
+      </w:r>
+    </w:p>
+    <w:p>
+      <w:pPr>
+        <w:pStyle w:val="BodyText"/>
+      </w:pPr>
+      <w:r>
+        <w:t xml:space="preserve">The number of tools does not establish their reliability for a particular review. Performance depends on the question, source type, language, study design, prevalence of eligible records, and definition of an error. A system that ranks relevant records near the top may save labor without being safe for autonomous exclusion. A fluent extraction may still assign a number to the wrong group, outcome, or time point.</w:t>
+      </w:r>
+    </w:p>
+    <w:p>
+      <w:pPr>
+        <w:pStyle w:val="BodyText"/>
+      </w:pPr>
+      <w:r>
+        <w:t xml:space="preserve">Use AI as a proposal layer. The system can suggest records, fields, links, and checks. A controlled review step decides what enters the evidence base. For screening, validate recall on a representative researcher-coded sample and inspect every false exclusion. For extraction, require an exact source span and abstention option. For risk-of-bias assessment, causal interpretation, and final inclusion, retain human adjudication.</w:t>
+      </w:r>
+    </w:p>
+    <w:p>
+      <w:pPr>
+        <w:pStyle w:val="BodyText"/>
+      </w:pPr>
+      <w:r>
+        <w:t xml:space="preserve">Human validation is not a ceremonial final glance. It is a measured procedure. Record the validation sample, sampling rule, reference coding, error categories, model and prompt version, decision threshold, and response to failure. Revalidate after material changes in the corpus or system.</w:t>
+      </w:r>
+    </w:p>
+    <w:bookmarkEnd w:id="209"/>
+    <w:bookmarkStart w:id="210" w:name="separate-the-present-from-the-forecast"/>
+    <w:p>
+      <w:pPr>
+        <w:pStyle w:val="Heading3"/>
+      </w:pPr>
+      <w:r>
+        <w:t xml:space="preserve">18.2.9 Separate the present from the forecast</w:t>
+      </w:r>
+    </w:p>
+    <w:p>
+      <w:pPr>
+        <w:pStyle w:val="FirstParagraph"/>
+      </w:pPr>
+      <w:r>
+        <w:t xml:space="preserve">The current review article can already be modular and open. Protocols, machine-readable data, executable analysis, linked corrections, and citable releases are available practices. Semi-automated screening and extraction are emerging practices whose value must be demonstrated in the local corpus. Continuous synthesis across interoperable evidence registries remains a conditional future.</w:t>
+      </w:r>
+    </w:p>
+    <w:tbl>
+      <w:tblPr>
+        <w:tblStyle w:val="Table"/>
+        <w:tblW w:type="pct" w:w="5000"/>
+        <w:tblLayout w:type="fixed"/>
+        <w:tblLook w:firstRow="1" w:lastRow="0" w:firstColumn="0" w:lastColumn="0" w:noHBand="0" w:noVBand="0" w:val="0020"/>
+      </w:tblPr>
+      <w:tblGrid>
+        <w:gridCol w:w="2640"/>
+        <w:gridCol w:w="2640"/>
+        <w:gridCol w:w="2640"/>
+      </w:tblGrid>
+      <w:tr>
+        <w:trPr>
+          <w:tblHeader w:val="on"/>
+        </w:trPr>
+        <w:tc>
+          <w:tcPr/>
+          <w:p>
+            <w:pPr>
+              <w:pStyle w:val="Compact"/>
+            </w:pPr>
+            <w:r>
+              <w:t xml:space="preserve">Horizon</w:t>
+            </w:r>
+          </w:p>
+        </w:tc>
+        <w:tc>
+          <w:tcPr/>
+          <w:p>
+            <w:pPr>
+              <w:pStyle w:val="Compact"/>
+            </w:pPr>
+            <w:r>
+              <w:t xml:space="preserve">Review form</w:t>
+            </w:r>
+          </w:p>
+        </w:tc>
+        <w:tc>
+          <w:tcPr/>
+          <w:p>
+            <w:pPr>
+              <w:pStyle w:val="Compact"/>
+            </w:pPr>
+            <w:r>
+              <w:t xml:space="preserve">Required safeguard</w:t>
+            </w:r>
+          </w:p>
+        </w:tc>
+      </w:tr>
+      <w:tr>
+        <w:tc>
+          <w:tcPr/>
+          <w:p>
+            <w:pPr>
+              <w:pStyle w:val="Compact"/>
+            </w:pPr>
+            <w:r>
+              <w:t xml:space="preserve">Current practice</w:t>
+            </w:r>
+          </w:p>
+        </w:tc>
+        <w:tc>
+          <w:tcPr/>
+          <w:p>
+            <w:pPr>
+              <w:pStyle w:val="Compact"/>
+            </w:pPr>
+            <w:r>
+              <w:t xml:space="preserve">An article linked to protocol, corpus, code, and a citable release</w:t>
+            </w:r>
+          </w:p>
+        </w:tc>
+        <w:tc>
+          <w:tcPr/>
+          <w:p>
+            <w:pPr>
+              <w:pStyle w:val="Compact"/>
+            </w:pPr>
+            <w:r>
+              <w:t xml:space="preserve">Reproducibility, provenance, and disclosed deviations</w:t>
+            </w:r>
+          </w:p>
+        </w:tc>
+      </w:tr>
+      <w:tr>
+        <w:tc>
+          <w:tcPr/>
+          <w:p>
+            <w:pPr>
+              <w:pStyle w:val="Compact"/>
+            </w:pPr>
+            <w:r>
+              <w:t xml:space="preserve">Emerging practice</w:t>
+            </w:r>
+          </w:p>
+        </w:tc>
+        <w:tc>
+          <w:tcPr/>
+          <w:p>
+            <w:pPr>
+              <w:pStyle w:val="Compact"/>
+            </w:pPr>
+            <w:r>
+              <w:t xml:space="preserve">A living review with AI-assisted surveillance, prioritization, and extraction</w:t>
+            </w:r>
+          </w:p>
+        </w:tc>
+        <w:tc>
+          <w:tcPr/>
+          <w:p>
+            <w:pPr>
+              <w:pStyle w:val="Compact"/>
+            </w:pPr>
+            <w:r>
+              <w:t xml:space="preserve">Local validation, human adjudication, and version governance</w:t>
+            </w:r>
+          </w:p>
+        </w:tc>
+      </w:tr>
+      <w:tr>
+        <w:tc>
+          <w:tcPr/>
+          <w:p>
+            <w:pPr>
+              <w:pStyle w:val="Compact"/>
+            </w:pPr>
+            <w:r>
+              <w:t xml:space="preserve">Conditional future</w:t>
+            </w:r>
+          </w:p>
+        </w:tc>
+        <w:tc>
+          <w:tcPr/>
+          <w:p>
+            <w:pPr>
+              <w:pStyle w:val="Compact"/>
+            </w:pPr>
+            <w:r>
+              <w:t xml:space="preserve">A continuously updated evidence service built from interoperable study, claim, and effect objects</w:t>
+            </w:r>
+          </w:p>
+        </w:tc>
+        <w:tc>
+          <w:tcPr/>
+          <w:p>
+            <w:pPr>
+              <w:pStyle w:val="Compact"/>
+            </w:pPr>
+            <w:r>
+              <w:t xml:space="preserve">Durable standards, equitable access, preservation, and accountable ownership</w:t>
+            </w:r>
+          </w:p>
+        </w:tc>
+      </w:tr>
+    </w:tbl>
+    <w:p>
+      <w:pPr>
+        <w:pStyle w:val="BodyText"/>
+      </w:pPr>
+      <w:r>
+        <w:t xml:space="preserve">The conditional future is technically plausible but institutionally demanding. Journals and repositories would need stable citation rules for changing objects. Research teams would need credit for maintenance, correction, data stewardship, and negative updates. Shared schemas would need to preserve construct differences rather than forcing every study into one vocabulary.</w:t>
+      </w:r>
+    </w:p>
+    <w:p>
+      <w:pPr>
+        <w:pStyle w:val="BodyText"/>
+      </w:pPr>
+      <w:r>
+        <w:t xml:space="preserve">The review article may become an interface over a versioned evidence system. Readers could inspect the current conclusion, trace it to effects or qualitative findings, change defensible assumptions, and compare releases. Such an interface would not eliminate authorship. Its design would make authorship more visible by showing where inclusion, coding, modeling, and interpretation shaped the answer.</w:t>
+      </w:r>
+    </w:p>
+    <w:p>
+      <w:pPr>
+        <w:pStyle w:val="BodyText"/>
+      </w:pPr>
+      <w:r>
+        <w:t xml:space="preserve">This future also carries risks. Well-resourced fields may maintain sophisticated living syntheses while other regions and languages remain poorly indexed. Proprietary systems may make public evidence dependent on private infrastructure. Continuous updating can create an illusion of completeness and exhaust the teams responsible for it. The goal is not permanent motion. It is controlled revision when new evidence matters.</w:t>
+      </w:r>
+    </w:p>
+    <w:bookmarkEnd w:id="210"/>
+    <w:bookmarkEnd w:id="211"/>
+    <w:bookmarkStart w:id="212" w:name="worked-example-13"/>
     <w:p>
       <w:pPr>
         <w:pStyle w:val="Heading2"/>
       </w:pPr>
       <w:r>
-        <w:t xml:space="preserve">18.2 Learn</w:t>
-      </w:r>
-    </w:p>
-    <w:bookmarkStart w:id="187" w:name="begin-with-the-unit-not-the-model"/>
-    <w:p>
-      <w:pPr>
-        <w:pStyle w:val="Heading3"/>
-      </w:pPr>
-      <w:r>
-        <w:t xml:space="preserve">18.2.1 Begin with the unit, not the model</w:t>
-      </w:r>
-    </w:p>
-    <w:p>
-      <w:pPr>
-        <w:pStyle w:val="FirstParagraph"/>
-      </w:pPr>
-      <w:r>
-        <w:t xml:space="preserve">An event database requires a declared unit of observation. The unit might be an attack, demonstration, arrest, policy decision, organizational founding, public statement, or interaction between named actors. Its boundary must state what counts as one event, when two reports refer to the same event, and when one report contains several events.</w:t>
-      </w:r>
-    </w:p>
-    <w:p>
-      <w:pPr>
-        <w:pStyle w:val="BodyText"/>
-      </w:pPr>
-      <w:r>
-        <w:t xml:space="preserve">Write the boundary before retrieval. Record inclusion and exclusion rules, temporal and geographic scope, actor and action definitions, and the minimum evidence required for a verified record. The first codebook should follow the research question and hypotheses. It should identify the variables needed to describe the event, evaluate rival explanations, and document the reporting process.</w:t>
-      </w:r>
-    </w:p>
-    <w:p>
-      <w:pPr>
-        <w:pStyle w:val="BodyText"/>
-      </w:pPr>
-      <w:r>
-        <w:t xml:space="preserve">This order matters because a model will readily propose whatever categories are easy to extract. Extractability is not theoretical importance. If the system defines the unit through its output, the database may record what the model recognizes instead of what the research design requires.</w:t>
-      </w:r>
-    </w:p>
-    <w:bookmarkEnd w:id="187"/>
-    <w:bookmarkStart w:id="192" w:name="build-a-source-frame"/>
-    <w:p>
-      <w:pPr>
-        <w:pStyle w:val="Heading3"/>
-      </w:pPr>
-      <w:r>
-        <w:t xml:space="preserve">18.2.2 Build a source frame</w:t>
-      </w:r>
-    </w:p>
-    <w:p>
-      <w:pPr>
-        <w:pStyle w:val="FirstParagraph"/>
-      </w:pPr>
-      <w:r>
-        <w:t xml:space="preserve">Manual newspaper searching often proceeds title by title and query by query. A digital source frame allows the researcher to define a collection before searching it. The frame records each newspaper, archive, database, date range, language, access route, known gap, and relevant restriction. Open news infrastructures can support large-scale retrieval, while library archives can expose searchable historical newspapers and catalogue records.</w:t>
-      </w:r>
-      <w:r>
-        <w:rPr>
-          <w:rStyle w:val="FootnoteReference"/>
-        </w:rPr>
-        <w:footnoteReference w:id="188"/>
-      </w:r>
-      <w:r>
-        <w:t xml:space="preserve"> </w:t>
-      </w:r>
-      <w:r>
-        <w:t xml:space="preserve">The frame should also include local and oppositional sources that a prominent aggregator may not index.</w:t>
-      </w:r>
-    </w:p>
-    <w:p>
-      <w:pPr>
-        <w:pStyle w:val="BodyText"/>
-      </w:pPr>
-      <w:r>
-        <w:t xml:space="preserve">Digitized collections are not transparent windows onto the past. Selection, survival, digitization, OCR quality, licensing, and search interfaces shape what becomes discoverable. Studies of newspaper digitization show why collection composition must be examined before researchers interpret search results as historical coverage.</w:t>
-      </w:r>
-      <w:r>
-        <w:rPr>
-          <w:rStyle w:val="FootnoteReference"/>
-        </w:rPr>
-        <w:footnoteReference w:id="190"/>
-      </w:r>
-      <w:r>
-        <w:t xml:space="preserve"> </w:t>
-      </w:r>
-      <w:r>
-        <w:t xml:space="preserve">A failed query may indicate absence, vocabulary mismatch, OCR error, unavailable dates, or a source omitted from the platform. Record which explanation remains plausible.</w:t>
-      </w:r>
-    </w:p>
-    <w:p>
-      <w:pPr>
-        <w:pStyle w:val="BodyText"/>
-      </w:pPr>
-      <w:r>
-        <w:t xml:space="preserve">AI can accelerate work inside the source frame. It can translate query concepts, generate historical names, adapt syntax across archives, and rank retrieved documents for review. A search-connected system may also query an approved interface directly. These operations remain collection procedures. The search log should preserve the source collection, query, date, filters, result count, model or script, and review decision. Access must comply with archive rules, licenses, privacy obligations, and research ethics.</w:t>
-      </w:r>
-    </w:p>
-    <w:bookmarkEnd w:id="192"/>
-    <w:bookmarkStart w:id="193" w:name="separate-discovery-from-verification"/>
-    <w:p>
-      <w:pPr>
-        <w:pStyle w:val="Heading3"/>
-      </w:pPr>
-      <w:r>
-        <w:t xml:space="preserve">18.2.3 Separate discovery from verification</w:t>
-      </w:r>
-    </w:p>
-    <w:p>
-      <w:pPr>
-        <w:pStyle w:val="FirstParagraph"/>
-      </w:pPr>
-      <w:r>
-        <w:t xml:space="preserve">The first extraction produces a</w:t>
-      </w:r>
-      <w:r>
-        <w:t xml:space="preserve"> </w:t>
-      </w:r>
+        <w:t xml:space="preserve">18.3 Worked Example</w:t>
+      </w:r>
+    </w:p>
+    <w:p>
+      <w:pPr>
+        <w:pStyle w:val="FirstParagraph"/>
+      </w:pPr>
+      <w:r>
+        <w:t xml:space="preserve">Consider a review asking whether community-policing programs increase public trust in police. The first search identifies experiments, quasi-experiments, surveys, qualitative interviews, and program evaluations across several countries. A single pooled estimate would answer the wrong question because the studies do not share one treatment, outcome, or causal design.</w:t>
+      </w:r>
+    </w:p>
+    <w:p>
+      <w:pPr>
+        <w:pStyle w:val="BodyText"/>
+      </w:pPr>
+      <w:r>
+        <w:t xml:space="preserve">The team divides the project into linked products. A scoping map describes programs, populations, research designs, trust measures, and geographic coverage. A systematic review evaluates studies with a defensible comparison group. A qualitative synthesis examines how residents describe contact, legitimacy, safety, and unequal treatment. The products share a source register but maintain separate eligibility and synthesis rules.</w:t>
+      </w:r>
+    </w:p>
+    <w:p>
+      <w:pPr>
+        <w:pStyle w:val="BodyText"/>
+      </w:pPr>
+      <w:r>
+        <w:t xml:space="preserve">The quantitative subset still contains hidden multiplicity. Several reports use one national survey. Individual studies report trust immediately after contact and again months later. Some programs combine foot patrols with public meetings, while others change only officer assignment. The estimand table exposes these differences. The effect table links multiple estimates to samples, outcomes, and program families.</w:t>
+      </w:r>
+    </w:p>
+    <w:p>
+      <w:pPr>
+        <w:pStyle w:val="BodyText"/>
+      </w:pPr>
+      <w:r>
+        <w:t xml:space="preserve">The main model estimates an average across a defined family of programs. It also reports a prediction interval and planned comparisons by intervention component and institutional setting. A dependence-aware analysis prevents one large survey and its related articles from dominating precision. The review treats the remaining heterogeneity as a finding: program labels conceal distinct mechanisms and political contexts.</w:t>
+      </w:r>
+    </w:p>
+    <w:p>
+      <w:pPr>
+        <w:pStyle w:val="BodyText"/>
+      </w:pPr>
+      <w:r>
+        <w:t xml:space="preserve">Publication-bias analysis finds that small published studies report more favorable estimates. The team does not declare the pattern corrected after one adjustment. It searches evaluation repositories and dissertations, compares registered outcomes where possible, and reports sensitivity to several selection assumptions. The conclusion becomes conditional: favorable average results do not establish that every program or setting will improve trust.</w:t>
+      </w:r>
+    </w:p>
+    <w:p>
+      <w:pPr>
+        <w:pStyle w:val="BodyText"/>
+      </w:pPr>
+      <w:r>
+        <w:t xml:space="preserve">The public package contains the protocol, search histories, decision log, coded corpus, effect transformations, analysis code, and a redacted qualitative matrix. The team schedules annual surveillance but triggers an earlier update if a large multisite evaluation appears. Release 1.0 remains frozen and citable when release 1.1 adds new evidence.</w:t>
+      </w:r>
+    </w:p>
+    <w:p>
+      <w:pPr>
+        <w:pStyle w:val="BodyText"/>
+      </w:pPr>
+      <w:r>
+        <w:t xml:space="preserve">An AI system expands intervention names and ranks new search results. It proposes extraction fields with source spans. Researchers validate screening recall on a stratified sample and adjudicate all exclusions near the decision boundary. The system never decides whether a program belongs in the same causal family or whether a trust measure is substantively comparable. Those judgments remain part of the review’s argument.</w:t>
+      </w:r>
+    </w:p>
+    <w:bookmarkEnd w:id="212"/>
+    <w:bookmarkStart w:id="213" w:name="try-it-13"/>
+    <w:p>
+      <w:pPr>
+        <w:pStyle w:val="Heading2"/>
+      </w:pPr>
+      <w:r>
+        <w:t xml:space="preserve">18.4 Try It</w:t>
+      </w:r>
+    </w:p>
+    <w:p>
+      <w:pPr>
+        <w:pStyle w:val="FirstParagraph"/>
+      </w:pPr>
+      <w:r>
+        <w:t xml:space="preserve">Start with one review question and write the decision it must support. Name the review form that best fits that purpose. Then state why two neighboring forms would answer different questions.</w:t>
+      </w:r>
+    </w:p>
+    <w:p>
+      <w:pPr>
+        <w:pStyle w:val="BodyText"/>
+      </w:pPr>
+      <w:r>
+        <w:t xml:space="preserve">Create an estimand table for five candidate studies. Record population, exposure or intervention, comparison, outcome, timing, design, and effect measure. Add sample and dataset identifiers. Mark which studies could enter one quantitative synthesis and explain every exclusion from pooling.</w:t>
+      </w:r>
+    </w:p>
+    <w:p>
+      <w:pPr>
+        <w:pStyle w:val="BodyText"/>
+      </w:pPr>
+      <w:r>
+        <w:t xml:space="preserve">For the eligible estimates, draw a dependence map. Connect effects that share participants, datasets, outcomes, authorship pipelines, or measurement instruments. Choose a strategy for each connection and state what assumption the strategy requires.</w:t>
+      </w:r>
+    </w:p>
+    <w:p>
+      <w:pPr>
+        <w:pStyle w:val="BodyText"/>
+      </w:pPr>
+      <w:r>
+        <w:t xml:space="preserve">Draft a result paragraph that reports the mean, its uncertainty, heterogeneity, a prediction interval, and one limitation arising from the corpus. Remove any sentence that treats statistical significance as a complete substantive conclusion.</w:t>
+      </w:r>
+    </w:p>
+    <w:p>
+      <w:pPr>
+        <w:pStyle w:val="BodyText"/>
+      </w:pPr>
+      <w:r>
+        <w:t xml:space="preserve">Finally, write an update policy. Specify surveillance sources, cadence, update triggers, owner, release format, correction route, and retirement condition. Label each planned feature as current, emerging, or conditional future. This prevents an aspiration from being presented as an implemented method.</w:t>
+      </w:r>
+    </w:p>
+    <w:bookmarkEnd w:id="213"/>
+    <w:bookmarkStart w:id="214" w:name="guided-ai-workflow-13"/>
+    <w:p>
+      <w:pPr>
+        <w:pStyle w:val="Heading2"/>
+      </w:pPr>
+      <w:r>
+        <w:t xml:space="preserve">18.5 Guided AI Workflow</w:t>
+      </w:r>
+    </w:p>
+    <w:p>
+      <w:pPr>
+        <w:pStyle w:val="FirstParagraph"/>
+      </w:pPr>
+      <w:r>
+        <w:t xml:space="preserve">Use AI in four bounded passes. In the design pass, provide the research question and intended decision. Ask the system to compare plausible review forms and list the evidence each would require. In the structure pass, provide verified study metadata and researcher-defined fields. Ask it to flag possible construct mismatch, dependence, and missing values without deciding eligibility. In the audit pass, provide the analysis plan and output. Ask for unsupported inferences, omitted sensitivity tests, and discrepancies between the estimand and conclusion. In the update pass, ask it to rank new candidate records and explain each ranking.</w:t>
+      </w:r>
+    </w:p>
+    <w:p>
+      <w:pPr>
+        <w:pStyle w:val="BodyText"/>
+      </w:pPr>
+      <w:r>
+        <w:t xml:space="preserve">A useful audit prompt is:</w:t>
+      </w:r>
+    </w:p>
+    <w:p>
+      <w:pPr>
+        <w:pStyle w:val="BlockText"/>
+      </w:pPr>
+      <w:r>
+        <w:t xml:space="preserve">Review this estimand table, effect structure, analysis plan, and draft conclusion. Identify claims that exceed the eligible corpus, effect estimates that may be dependent, sources of heterogeneity not represented in the model, and statements that confuse a pooled mean with an expected effect in a new setting. Cite only the supplied record identifiers. Return “not established” when the record is insufficient.</w:t>
+      </w:r>
+    </w:p>
+    <w:p>
+      <w:pPr>
+        <w:pStyle w:val="FirstParagraph"/>
+      </w:pPr>
       <w:r>
         <w:rPr>
           <w:b/>
           <w:bCs/>
         </w:rPr>
-        <w:t xml:space="preserve">candidate record</w:t>
-      </w:r>
-      <w:r>
-        <w:t xml:space="preserve">, not an event. A candidate record reports that a particular source span may describe an event within scope. It should preserve the document identifier, publication date, page or URL, exact source span, retrieval route, proposed event date, actors, action, target, location, and model output. The preserved span allows a reviewer to return to the evidence without trusting the summary.</w:t>
-      </w:r>
-    </w:p>
-    <w:p>
-      <w:pPr>
-        <w:pStyle w:val="BodyText"/>
-      </w:pPr>
-      <w:r>
-        <w:t xml:space="preserve">A candidate becomes a</w:t>
-      </w:r>
-      <w:r>
-        <w:t xml:space="preserve"> </w:t>
+        <w:t xml:space="preserve">Permitted input:</w:t>
+      </w:r>
+      <w:r>
+        <w:t xml:space="preserve"> </w:t>
+      </w:r>
+      <w:r>
+        <w:t xml:space="preserve">Verified metadata, researcher-authored protocols, rights-cleared text, structured extraction fields, de-identified effect data, code, and public analytical output.</w:t>
+      </w:r>
+      <w:r>
+        <w:br/>
       </w:r>
       <w:r>
         <w:rPr>
           <w:b/>
           <w:bCs/>
         </w:rPr>
-        <w:t xml:space="preserve">verified record</w:t>
-      </w:r>
-      <w:r>
-        <w:t xml:space="preserve"> </w:t>
-      </w:r>
-      <w:r>
-        <w:t xml:space="preserve">only after the relevant passage and metadata have been checked. Verification asks whether the source exists, whether the passage supports the proposed fields, whether uncertainty has been preserved, and whether the item satisfies the inclusion rule. The decision may be accepted, rejected, or marked unresolved. It must name the reviewer and date.</w:t>
-      </w:r>
-    </w:p>
-    <w:p>
-      <w:pPr>
-        <w:pStyle w:val="BodyText"/>
-      </w:pPr>
-      <w:r>
-        <w:t xml:space="preserve">This separation allows wide retrieval without lowering the evidentiary threshold. The system can favor recall during discovery because false positives remain outside the verified dataset. Reviewers can then favor precision when deciding what enters the database. A model should have an abstention route for passages that do not support a stable classification.</w:t>
-      </w:r>
-    </w:p>
-    <w:bookmarkEnd w:id="193"/>
-    <w:bookmarkStart w:id="196" w:name="resolve-reports-into-events"/>
-    <w:p>
-      <w:pPr>
-        <w:pStyle w:val="Heading3"/>
-      </w:pPr>
-      <w:r>
-        <w:t xml:space="preserve">18.2.4 Resolve reports into events</w:t>
-      </w:r>
-    </w:p>
-    <w:p>
-      <w:pPr>
-        <w:pStyle w:val="FirstParagraph"/>
-      </w:pPr>
-      <w:r>
-        <w:t xml:space="preserve">News collections rarely provide one document per event. The same account may be syndicated, translated, updated, quoted by another outlet, or repeated in a retrospective report. Conversely, one article may describe several occurrences. The database therefore needs an event-resolution stage between verified records and analytical events.</w:t>
-      </w:r>
-    </w:p>
-    <w:p>
-      <w:pPr>
-        <w:pStyle w:val="BodyText"/>
-      </w:pPr>
-      <w:r>
-        <w:t xml:space="preserve">AI can compare names, dates, places, actions, and source spans to generate possible matches. Event extraction research shows, however, that simple zero-shot prompting can perform poorly when reports contain ambiguity, hypothetical language, or several interacting actors.</w:t>
-      </w:r>
-      <w:r>
-        <w:rPr>
-          <w:rStyle w:val="FootnoteReference"/>
-        </w:rPr>
-        <w:footnoteReference w:id="194"/>
-      </w:r>
-      <w:r>
-        <w:t xml:space="preserve"> </w:t>
-      </w:r>
-      <w:r>
-        <w:t xml:space="preserve">A match score should therefore open a review task instead of merging records automatically.</w:t>
-      </w:r>
-    </w:p>
-    <w:p>
-      <w:pPr>
-        <w:pStyle w:val="BodyText"/>
-      </w:pPr>
-      <w:r>
-        <w:t xml:space="preserve">The</w:t>
-      </w:r>
-      <w:r>
-        <w:t xml:space="preserve"> </w:t>
+        <w:t xml:space="preserve">Do not provide:</w:t>
+      </w:r>
+      <w:r>
+        <w:t xml:space="preserve"> </w:t>
+      </w:r>
+      <w:r>
+        <w:t xml:space="preserve">Licensed full text without permission, confidential peer-review material, protected participant data, restricted archives, or identifiable sensitive records.</w:t>
+      </w:r>
+      <w:r>
+        <w:br/>
       </w:r>
       <w:r>
         <w:rPr>
           <w:b/>
           <w:bCs/>
         </w:rPr>
-        <w:t xml:space="preserve">event resolution log</w:t>
-      </w:r>
-      <w:r>
-        <w:t xml:space="preserve"> </w:t>
-      </w:r>
-      <w:r>
-        <w:t xml:space="preserve">records every merge, split, and non-match. It links source-record identifiers to a stable event identifier and gives the rule, evidence, reviewer, and confidence category. It also records dependence. Five newspapers repeating one wire dispatch represent broad circulation, not five independent observations. Preserving that distinction prevents source abundance from becoming false corroboration.</w:t>
-      </w:r>
-    </w:p>
-    <w:bookmarkEnd w:id="196"/>
-    <w:bookmarkStart w:id="197" w:name="Xa4d8203b4f7a31b0cadf854735a5261c2c5f19b"/>
-    <w:p>
-      <w:pPr>
-        <w:pStyle w:val="Heading3"/>
-      </w:pPr>
-      <w:r>
-        <w:t xml:space="preserve">18.2.5 Let the codebook learn without moving silently</w:t>
-      </w:r>
-    </w:p>
-    <w:p>
-      <w:pPr>
-        <w:pStyle w:val="FirstParagraph"/>
-      </w:pPr>
-      <w:r>
-        <w:t xml:space="preserve">An initial codebook should express the research hypotheses, but it should not be treated as complete. Early records may reveal unanticipated actors, mechanisms, event sequences, source effects, or confounders. AI can scan verified records and propose additional variables that distinguish rival explanations or capture recurrent variation.</w:t>
-      </w:r>
-    </w:p>
-    <w:p>
-      <w:pPr>
-        <w:pStyle w:val="BodyText"/>
-      </w:pPr>
-      <w:r>
-        <w:t xml:space="preserve">Dynamic coding requires controlled change. The codebook should contain a stable core and an experimental extension layer. Core variables remain fixed during a declared release. Proposed variables enter the extension layer with a definition, rationale, allowed values, inclusion and exclusion rules, supporting examples, and an account of the hypothesis or comparison they serve. The</w:t>
-      </w:r>
-      <w:r>
-        <w:t xml:space="preserve"> </w:t>
+        <w:t xml:space="preserve">Verify:</w:t>
+      </w:r>
+      <w:r>
+        <w:t xml:space="preserve"> </w:t>
+      </w:r>
+      <w:r>
+        <w:t xml:space="preserve">Check every proposed inclusion, exclusion, extracted value, source span, transformation, dependence link, citation, and analytical claim. Test screening and extraction performance on a representative human-coded sample.</w:t>
+      </w:r>
+      <w:r>
+        <w:br/>
       </w:r>
       <w:r>
         <w:rPr>
           <w:b/>
           <w:bCs/>
         </w:rPr>
+        <w:t xml:space="preserve">Record:</w:t>
+      </w:r>
+      <w:r>
+        <w:t xml:space="preserve"> </w:t>
+      </w:r>
+      <w:r>
+        <w:t xml:space="preserve">Save model and version, prompt, input description, output, reviewer decision, error category, protocol and corpus versions, analysis release, and date.</w:t>
+      </w:r>
+    </w:p>
+    <w:p>
+      <w:pPr>
+        <w:pStyle w:val="BodyText"/>
+      </w:pPr>
+      <w:r>
+        <w:t xml:space="preserve">Do not ask a model to select the final review form, infer missing statistics without a declared method, adjudicate risk of bias alone, or choose a publication-bias correction after seeing which result is favorable. Do not accept a causal or policy conclusion that cannot be reconstructed from the reviewed evidence objects.</w:t>
+      </w:r>
+    </w:p>
+    <w:bookmarkEnd w:id="214"/>
+    <w:bookmarkStart w:id="215" w:name="integrity-checkpoint-13"/>
+    <w:p>
+      <w:pPr>
+        <w:pStyle w:val="Heading2"/>
+      </w:pPr>
+      <w:r>
+        <w:t xml:space="preserve">18.6 Integrity Checkpoint</w:t>
+      </w:r>
+    </w:p>
+    <w:p>
+      <w:pPr>
+        <w:pStyle w:val="FirstParagraph"/>
+      </w:pPr>
+      <w:r>
+        <w:t xml:space="preserve">A comprehensive search can still reproduce unequal visibility. Dominant databases index some journals, languages, regions, and publication forms more completely than others. AI systems inherit those boundaries and may rank familiar terminology above locally specific concepts. Audit discovery by language, geography, discipline, publication form, and institutional access.</w:t>
+      </w:r>
+    </w:p>
+    <w:p>
+      <w:pPr>
+        <w:pStyle w:val="BodyText"/>
+      </w:pPr>
+      <w:r>
+        <w:t xml:space="preserve">Quantitative synthesis can erase difference through a common effect measure. Before converting outcomes, ask whether they represent the same construct and decision. Preserve original scales and definitions alongside transformed values. Report exclusions from pooling without treating unpooled studies as inferior evidence.</w:t>
+      </w:r>
+    </w:p>
+    <w:p>
+      <w:pPr>
+        <w:pStyle w:val="BodyText"/>
+      </w:pPr>
+      <w:r>
+        <w:t xml:space="preserve">Open release also has limits. Study-level data may contain confidential information or enable reidentification. Search histories can expose sensitive research interests or restricted holdings. Release a calibrated public package and document the withheld components, access basis, and responsible contact.</w:t>
+      </w:r>
+    </w:p>
+    <w:p>
+      <w:pPr>
+        <w:pStyle w:val="BodyText"/>
+      </w:pPr>
+      <w:r>
+        <w:t xml:space="preserve">AI assistance creates additional disclosure duties. Name the operations it supported, the system version, validation procedure, and known failures. Do not list a general-purpose model as an author or allow it to conceal who made consequential decisions.</w:t>
+      </w:r>
+    </w:p>
+    <w:p>
+      <w:pPr>
+        <w:pStyle w:val="BodyText"/>
+      </w:pPr>
+      <w:r>
+        <w:t xml:space="preserve">Finally, resist prestige by method. A complex model cannot compensate for a weak corpus. A transparent narrative synthesis can be more informative than an invalid pooled estimate. The review earns trust by matching its claim to its evidence and preserving the path between them.</w:t>
+      </w:r>
+    </w:p>
+    <w:bookmarkEnd w:id="215"/>
+    <w:bookmarkStart w:id="216" w:name="save-the-artifact-13"/>
+    <w:p>
+      <w:pPr>
+        <w:pStyle w:val="Heading2"/>
+      </w:pPr>
+      <w:r>
+        <w:t xml:space="preserve">18.7 Save the Artifact</w:t>
+      </w:r>
+    </w:p>
+    <w:p>
+      <w:pPr>
+        <w:pStyle w:val="FirstParagraph"/>
+      </w:pPr>
+      <w:r>
+        <w:t xml:space="preserve">Save a review design memo that links the question, intended decision, review form, eligible evidence, and synthesis method. Preserve the protocol and every dated amendment.</w:t>
+      </w:r>
+    </w:p>
+    <w:p>
+      <w:pPr>
+        <w:pStyle w:val="BodyText"/>
+      </w:pPr>
+      <w:r>
+        <w:t xml:space="preserve">Maintain a source register, screening log, extraction dictionary, coded corpus, dependence map, and synthesis memo. For meta-analysis, add raw and transformed effect data, executable code, session information, model diagnostics, prediction intervals, and sensitivity results.</w:t>
+      </w:r>
+    </w:p>
+    <w:p>
+      <w:pPr>
+        <w:pStyle w:val="BodyText"/>
+      </w:pPr>
+      <w:r>
+        <w:t xml:space="preserve">Create a release manifest. It should name the corpus version, protocol version, codebook version, analysis commit, public files, restricted files, license, citation, review date, correction route, update trigger, and retirement condition. Give each release a stable identifier and preserve earlier releases.</w:t>
+      </w:r>
+    </w:p>
+    <w:p>
+      <w:pPr>
+        <w:pStyle w:val="BodyText"/>
+      </w:pPr>
+      <w:r>
+        <w:t xml:space="preserve">The article, dataset, code, and review website should point to the same manifest. This shared reference prevents a current webpage from silently changing the evidence behind an older citation.</w:t>
+      </w:r>
+    </w:p>
+    <w:bookmarkEnd w:id="216"/>
+    <w:bookmarkStart w:id="217" w:name="advanced-practice-13"/>
+    <w:p>
+      <w:pPr>
+        <w:pStyle w:val="Heading2"/>
+      </w:pPr>
+      <w:r>
+        <w:t xml:space="preserve">18.8 Advanced Practice</w:t>
+      </w:r>
+    </w:p>
+    <w:p>
+      <w:pPr>
+        <w:pStyle w:val="FirstParagraph"/>
+      </w:pPr>
+      <w:r>
+        <w:t xml:space="preserve">Prospective meta-analysis coordinates eligible studies and analyses before their results become known. It can reduce some forms of outcome selection and harmonize measures while preserving study-level independence. It requires governance that protects local study ownership and records any changes made after results arrive.</w:t>
+      </w:r>
+    </w:p>
+    <w:p>
+      <w:pPr>
+        <w:pStyle w:val="BodyText"/>
+      </w:pPr>
+      <w:r>
+        <w:t xml:space="preserve">Individual-participant-data meta-analysis can examine common definitions and participant-level variation that published aggregates cannot support. Its advantages depend on data access, harmonization quality, missingness, and representation of studies that cannot share data. The unavailable studies remain part of the inference problem.</w:t>
+      </w:r>
+    </w:p>
+    <w:p>
+      <w:pPr>
+        <w:pStyle w:val="BodyText"/>
+      </w:pPr>
+      <w:r>
+        <w:t xml:space="preserve">Bayesian meta-analysis can encode uncertainty about heterogeneity, combine prior information with new evidence, and support sequential updating. Priors should be justified, sensitivity-tested, and separated from evidence supplied by the included studies. Bayesian computation does not make incomparable effects comparable.</w:t>
+      </w:r>
+    </w:p>
+    <w:p>
+      <w:pPr>
+        <w:pStyle w:val="BodyText"/>
+      </w:pPr>
+      <w:r>
+        <w:t xml:space="preserve">Multiverse meta-analysis can reveal how defensible choices about inclusion, effect selection, dependence, and modeling affect the conclusion. The set of specifications must follow substantive and methodological reasoning. A large grid of arbitrary models can obscure judgment as easily as one preferred model.</w:t>
+      </w:r>
+    </w:p>
+    <w:p>
+      <w:pPr>
+        <w:pStyle w:val="BodyText"/>
+      </w:pPr>
+      <w:r>
+        <w:t xml:space="preserve">The mature review program connects these methods to a Second Brain without collapsing private work into public evidence. Source notes, decision records, and synthesis memos support learning. Stable public releases support scrutiny and reuse. The boundary between them is deliberate.</w:t>
+      </w:r>
+    </w:p>
+    <w:p>
+      <w:pPr>
+        <w:pStyle w:val="BodyText"/>
+      </w:pPr>
+      <w:r>
+        <w:t xml:space="preserve">The future review article is therefore neither a traditional essay with added links nor a database without an argument. It is a governed scholarly claim over a versioned evidence system. Its authority comes from the fit among question, corpus, method, and interpretation. Its capacity to change becomes a strength only when readers can see what changed, why it changed, and which conclusion the earlier evidence supported.</w:t>
+      </w:r>
+    </w:p>
+    <w:bookmarkEnd w:id="217"/>
+    <w:bookmarkEnd w:id="218"/>
+    <w:bookmarkStart w:id="251" w:name="building-event-databases-with-ai"/>
+    <w:p>
+      <w:pPr>
+        <w:pStyle w:val="Heading1"/>
+      </w:pPr>
+      <w:r>
+        <w:t xml:space="preserve">19. Building Event Databases with AI</w:t>
+      </w:r>
+    </w:p>
+    <w:bookmarkStart w:id="223" w:name="orientation-14"/>
+    <w:p>
+      <w:pPr>
+        <w:pStyle w:val="Heading2"/>
+      </w:pPr>
+      <w:r>
+        <w:t xml:space="preserve">19.1 Orientation</w:t>
+      </w:r>
+    </w:p>
+    <w:p>
+      <w:pPr>
+        <w:pStyle w:val="FirstParagraph"/>
+      </w:pPr>
+      <w:r>
+        <w:t xml:space="preserve">Event databases convert dispersed accounts into comparable records. A researcher may begin with a question about protest, repression, political violence, institutional reform, migration, or disaster response. The relevant traces may appear across newspapers, archival catalogues, government reports, organizational records, and born-digital collections. Before generative AI, much of the work required repetitive searching, copying, normalization, and initial classification. These tasks consumed time that researchers needed for interpretation.</w:t>
+      </w:r>
+    </w:p>
+    <w:p>
+      <w:pPr>
+        <w:pStyle w:val="BodyText"/>
+      </w:pPr>
+      <w:r>
+        <w:t xml:space="preserve">AI changes the feasible scale of this work. A system can expand queries, search an authorized collection, extract candidate fields, compare reports, and flag records that may describe the same occurrence. It can apply a preliminary codebook to thousands of passages and identify dimensions the original codebook omitted. Studies of text annotation show that language models can perform some bounded classification tasks quickly and inexpensively. Performance, however, varies substantially across tasks and datasets, which makes local validation indispensable.</w:t>
+      </w:r>
+      <w:r>
+        <w:rPr>
+          <w:rStyle w:val="FootnoteReference"/>
+        </w:rPr>
+        <w:footnoteReference w:id="219"/>
+      </w:r>
+    </w:p>
+    <w:p>
+      <w:pPr>
+        <w:pStyle w:val="BodyText"/>
+      </w:pPr>
+      <w:r>
+        <w:t xml:space="preserve">The resulting speed creates a methodological danger. A fluent extraction can make an uncertain mention look like an observed event. Several articles can make one wire report look like independent confirmation. A model can produce a precise code for an ambiguous passage or a causal probability without defining the comparison that gives the number meaning. Faster processing does not remove these problems. It can reproduce them at scale.</w:t>
+      </w:r>
+    </w:p>
+    <w:p>
+      <w:pPr>
+        <w:pStyle w:val="BodyText"/>
+      </w:pPr>
+      <w:r>
+        <w:t xml:space="preserve">This chapter presents an auditable alternative. AI compresses clerical stages while the researcher preserves a visible chain from source to record, record to event, event to variable, and written evidence to causal inference. Every transition produces an artifact that can be reviewed, corrected, and versioned.</w:t>
+      </w:r>
+    </w:p>
+    <w:bookmarkEnd w:id="223"/>
+    <w:bookmarkStart w:id="244" w:name="learn-14"/>
+    <w:p>
+      <w:pPr>
+        <w:pStyle w:val="Heading2"/>
+      </w:pPr>
+      <w:r>
+        <w:t xml:space="preserve">19.2 Learn</w:t>
+      </w:r>
+    </w:p>
+    <w:bookmarkStart w:id="224" w:name="begin-with-the-unit-not-the-model"/>
+    <w:p>
+      <w:pPr>
+        <w:pStyle w:val="Heading3"/>
+      </w:pPr>
+      <w:r>
+        <w:t xml:space="preserve">19.2.1 Begin with the unit, not the model</w:t>
+      </w:r>
+    </w:p>
+    <w:p>
+      <w:pPr>
+        <w:pStyle w:val="FirstParagraph"/>
+      </w:pPr>
+      <w:r>
+        <w:t xml:space="preserve">An event database requires a declared unit of observation. The unit might be an attack, demonstration, arrest, policy decision, organizational founding, public statement, or interaction between named actors. Its boundary must state what counts as one event, when two reports refer to the same event, and when one report contains several events.</w:t>
+      </w:r>
+    </w:p>
+    <w:p>
+      <w:pPr>
+        <w:pStyle w:val="BodyText"/>
+      </w:pPr>
+      <w:r>
+        <w:t xml:space="preserve">Write the boundary before retrieval. Record inclusion and exclusion rules, temporal and geographic scope, actor and action definitions, and the minimum evidence required for a verified record. The first codebook should follow the research question and hypotheses. It should identify the variables needed to describe the event, evaluate rival explanations, and document the reporting process.</w:t>
+      </w:r>
+    </w:p>
+    <w:p>
+      <w:pPr>
+        <w:pStyle w:val="BodyText"/>
+      </w:pPr>
+      <w:r>
+        <w:t xml:space="preserve">This order matters because a model will readily propose whatever categories are easy to extract. Extractability is not theoretical importance. If the system defines the unit through its output, the database may record what the model recognizes instead of what the research design requires.</w:t>
+      </w:r>
+    </w:p>
+    <w:bookmarkEnd w:id="224"/>
+    <w:bookmarkStart w:id="229" w:name="build-a-source-frame"/>
+    <w:p>
+      <w:pPr>
+        <w:pStyle w:val="Heading3"/>
+      </w:pPr>
+      <w:r>
+        <w:t xml:space="preserve">19.2.2 Build a source frame</w:t>
+      </w:r>
+    </w:p>
+    <w:p>
+      <w:pPr>
+        <w:pStyle w:val="FirstParagraph"/>
+      </w:pPr>
+      <w:r>
+        <w:t xml:space="preserve">Manual newspaper searching often proceeds title by title and query by query. A digital source frame allows the researcher to define a collection before searching it. The frame records each newspaper, archive, database, date range, language, access route, known gap, and relevant restriction. Open news infrastructures can support large-scale retrieval, while library archives can expose searchable historical newspapers and catalogue records.</w:t>
+      </w:r>
+      <w:r>
+        <w:rPr>
+          <w:rStyle w:val="FootnoteReference"/>
+        </w:rPr>
+        <w:footnoteReference w:id="225"/>
+      </w:r>
+      <w:r>
+        <w:t xml:space="preserve"> </w:t>
+      </w:r>
+      <w:r>
+        <w:t xml:space="preserve">The frame should also include local and oppositional sources that a prominent aggregator may not index.</w:t>
+      </w:r>
+    </w:p>
+    <w:p>
+      <w:pPr>
+        <w:pStyle w:val="BodyText"/>
+      </w:pPr>
+      <w:r>
+        <w:t xml:space="preserve">Digitized collections are not transparent windows onto the past. Selection, survival, digitization, OCR quality, licensing, and search interfaces shape what becomes discoverable. Studies of newspaper digitization show why collection composition must be examined before researchers interpret search results as historical coverage.</w:t>
+      </w:r>
+      <w:r>
+        <w:rPr>
+          <w:rStyle w:val="FootnoteReference"/>
+        </w:rPr>
+        <w:footnoteReference w:id="227"/>
+      </w:r>
+      <w:r>
+        <w:t xml:space="preserve"> </w:t>
+      </w:r>
+      <w:r>
+        <w:t xml:space="preserve">A failed query may indicate absence, vocabulary mismatch, OCR error, unavailable dates, or a source omitted from the platform. Record which explanation remains plausible.</w:t>
+      </w:r>
+    </w:p>
+    <w:p>
+      <w:pPr>
+        <w:pStyle w:val="BodyText"/>
+      </w:pPr>
+      <w:r>
+        <w:t xml:space="preserve">AI can accelerate work inside the source frame. It can translate query concepts, generate historical names, adapt syntax across archives, and rank retrieved documents for review. A search-connected system may also query an approved interface directly. These operations remain collection procedures. The search log should preserve the source collection, query, date, filters, result count, model or script, and review decision. Access must comply with archive rules, licenses, privacy obligations, and research ethics.</w:t>
+      </w:r>
+    </w:p>
+    <w:bookmarkEnd w:id="229"/>
+    <w:bookmarkStart w:id="230" w:name="separate-discovery-from-verification"/>
+    <w:p>
+      <w:pPr>
+        <w:pStyle w:val="Heading3"/>
+      </w:pPr>
+      <w:r>
+        <w:t xml:space="preserve">19.2.3 Separate discovery from verification</w:t>
+      </w:r>
+    </w:p>
+    <w:p>
+      <w:pPr>
+        <w:pStyle w:val="FirstParagraph"/>
+      </w:pPr>
+      <w:r>
+        <w:t xml:space="preserve">The first extraction produces a</w:t>
+      </w:r>
+      <w:r>
+        <w:t xml:space="preserve"> </w:t>
+      </w:r>
+      <w:r>
+        <w:rPr>
+          <w:b/>
+          <w:bCs/>
+        </w:rPr>
+        <w:t xml:space="preserve">candidate record</w:t>
+      </w:r>
+      <w:r>
+        <w:t xml:space="preserve">, not an event. A candidate record reports that a particular source span may describe an event within scope. It should preserve the document identifier, publication date, page or URL, exact source span, retrieval route, proposed event date, actors, action, target, location, and model output. The preserved span allows a reviewer to return to the evidence without trusting the summary.</w:t>
+      </w:r>
+    </w:p>
+    <w:p>
+      <w:pPr>
+        <w:pStyle w:val="BodyText"/>
+      </w:pPr>
+      <w:r>
+        <w:t xml:space="preserve">A candidate becomes a</w:t>
+      </w:r>
+      <w:r>
+        <w:t xml:space="preserve"> </w:t>
+      </w:r>
+      <w:r>
+        <w:rPr>
+          <w:b/>
+          <w:bCs/>
+        </w:rPr>
+        <w:t xml:space="preserve">verified record</w:t>
+      </w:r>
+      <w:r>
+        <w:t xml:space="preserve"> </w:t>
+      </w:r>
+      <w:r>
+        <w:t xml:space="preserve">only after the relevant passage and metadata have been checked. Verification asks whether the source exists, whether the passage supports the proposed fields, whether uncertainty has been preserved, and whether the item satisfies the inclusion rule. The decision may be accepted, rejected, or marked unresolved. It must name the reviewer and date.</w:t>
+      </w:r>
+    </w:p>
+    <w:p>
+      <w:pPr>
+        <w:pStyle w:val="BodyText"/>
+      </w:pPr>
+      <w:r>
+        <w:t xml:space="preserve">This separation allows wide retrieval without lowering the evidentiary threshold. The system can favor recall during discovery because false positives remain outside the verified dataset. Reviewers can then favor precision when deciding what enters the database. A model should have an abstention route for passages that do not support a stable classification.</w:t>
+      </w:r>
+    </w:p>
+    <w:bookmarkEnd w:id="230"/>
+    <w:bookmarkStart w:id="233" w:name="resolve-reports-into-events"/>
+    <w:p>
+      <w:pPr>
+        <w:pStyle w:val="Heading3"/>
+      </w:pPr>
+      <w:r>
+        <w:t xml:space="preserve">19.2.4 Resolve reports into events</w:t>
+      </w:r>
+    </w:p>
+    <w:p>
+      <w:pPr>
+        <w:pStyle w:val="FirstParagraph"/>
+      </w:pPr>
+      <w:r>
+        <w:t xml:space="preserve">News collections rarely provide one document per event. The same account may be syndicated, translated, updated, quoted by another outlet, or repeated in a retrospective report. Conversely, one article may describe several occurrences. The database therefore needs an event-resolution stage between verified records and analytical events.</w:t>
+      </w:r>
+    </w:p>
+    <w:p>
+      <w:pPr>
+        <w:pStyle w:val="BodyText"/>
+      </w:pPr>
+      <w:r>
+        <w:t xml:space="preserve">AI can compare names, dates, places, actions, and source spans to generate possible matches. Event extraction research shows, however, that simple zero-shot prompting can perform poorly when reports contain ambiguity, hypothetical language, or several interacting actors.</w:t>
+      </w:r>
+      <w:r>
+        <w:rPr>
+          <w:rStyle w:val="FootnoteReference"/>
+        </w:rPr>
+        <w:footnoteReference w:id="231"/>
+      </w:r>
+      <w:r>
+        <w:t xml:space="preserve"> </w:t>
+      </w:r>
+      <w:r>
+        <w:t xml:space="preserve">A match score should therefore open a review task instead of merging records automatically.</w:t>
+      </w:r>
+    </w:p>
+    <w:p>
+      <w:pPr>
+        <w:pStyle w:val="BodyText"/>
+      </w:pPr>
+      <w:r>
+        <w:t xml:space="preserve">The</w:t>
+      </w:r>
+      <w:r>
+        <w:t xml:space="preserve"> </w:t>
+      </w:r>
+      <w:r>
+        <w:rPr>
+          <w:b/>
+          <w:bCs/>
+        </w:rPr>
+        <w:t xml:space="preserve">event resolution log</w:t>
+      </w:r>
+      <w:r>
+        <w:t xml:space="preserve"> </w:t>
+      </w:r>
+      <w:r>
+        <w:t xml:space="preserve">records every merge, split, and non-match. It links source-record identifiers to a stable event identifier and gives the rule, evidence, reviewer, and confidence category. It also records dependence. Five newspapers repeating one wire dispatch represent broad circulation, not five independent observations. Preserving that distinction prevents source abundance from becoming false corroboration.</w:t>
+      </w:r>
+    </w:p>
+    <w:bookmarkEnd w:id="233"/>
+    <w:bookmarkStart w:id="234" w:name="Xa4d8203b4f7a31b0cadf854735a5261c2c5f19b"/>
+    <w:p>
+      <w:pPr>
+        <w:pStyle w:val="Heading3"/>
+      </w:pPr>
+      <w:r>
+        <w:t xml:space="preserve">19.2.5 Let the codebook learn without moving silently</w:t>
+      </w:r>
+    </w:p>
+    <w:p>
+      <w:pPr>
+        <w:pStyle w:val="FirstParagraph"/>
+      </w:pPr>
+      <w:r>
+        <w:t xml:space="preserve">An initial codebook should express the research hypotheses, but it should not be treated as complete. Early records may reveal unanticipated actors, mechanisms, event sequences, source effects, or confounders. AI can scan verified records and propose additional variables that distinguish rival explanations or capture recurrent variation.</w:t>
+      </w:r>
+    </w:p>
+    <w:p>
+      <w:pPr>
+        <w:pStyle w:val="BodyText"/>
+      </w:pPr>
+      <w:r>
+        <w:t xml:space="preserve">Dynamic coding requires controlled change. The codebook should contain a stable core and an experimental extension layer. Core variables remain fixed during a declared release. Proposed variables enter the extension layer with a definition, rationale, allowed values, inclusion and exclusion rules, supporting examples, and an account of the hypothesis or comparison they serve. The</w:t>
+      </w:r>
+      <w:r>
+        <w:t xml:space="preserve"> </w:t>
+      </w:r>
+      <w:r>
+        <w:rPr>
+          <w:b/>
+          <w:bCs/>
+        </w:rPr>
         <w:t xml:space="preserve">codebook version</w:t>
       </w:r>
       <w:r>
@@ -8669,14 +9719,14 @@
         <w:t xml:space="preserve">This workflow turns AI into a critic of the original design. The model may notice a missing variable, but it does not decide that the variable belongs in the database. That decision remains theoretical, empirical, and comparative.</w:t>
       </w:r>
     </w:p>
-    <w:bookmarkEnd w:id="197"/>
-    <w:bookmarkStart w:id="200" w:name="validate-before-scaling"/>
+    <w:bookmarkEnd w:id="234"/>
+    <w:bookmarkStart w:id="237" w:name="validate-before-scaling"/>
     <w:p>
       <w:pPr>
         <w:pStyle w:val="Heading3"/>
       </w:pPr>
       <w:r>
-        <w:t xml:space="preserve">18.2.6 Validate before scaling</w:t>
+        <w:t xml:space="preserve">19.2.6 Validate before scaling</w:t>
       </w:r>
     </w:p>
     <w:p>
@@ -8698,7 +9748,7 @@
         <w:rPr>
           <w:rStyle w:val="FootnoteReference"/>
         </w:rPr>
-        <w:footnoteReference w:id="198"/>
+        <w:footnoteReference w:id="235"/>
       </w:r>
     </w:p>
     <w:p>
@@ -8709,14 +9759,14 @@
         <w:t xml:space="preserve">Validation has a scope. A model that performs well on English national newspapers from one decade has not been validated for local-language archives or another period. Record the tested population, prompt, model, codebook version, and decision threshold. Revalidate after a material change to any of them.</w:t>
       </w:r>
     </w:p>
-    <w:bookmarkEnd w:id="200"/>
-    <w:bookmarkStart w:id="206" w:name="Xbb3b6a25e4d702c2b579e02febfbdbbde948889"/>
+    <w:bookmarkEnd w:id="237"/>
+    <w:bookmarkStart w:id="243" w:name="Xbb3b6a25e4d702c2b579e02febfbdbbde948889"/>
     <w:p>
       <w:pPr>
         <w:pStyle w:val="Heading3"/>
       </w:pPr>
       <w:r>
-        <w:t xml:space="preserve">18.2.7 Use Bayesian updating as a declared argument</w:t>
+        <w:t xml:space="preserve">19.2.7 Use Bayesian updating as a declared argument</w:t>
       </w:r>
     </w:p>
     <w:p>
@@ -9000,7 +10050,7 @@
         <w:rPr>
           <w:rStyle w:val="FootnoteReference"/>
         </w:rPr>
-        <w:footnoteReference w:id="201"/>
+        <w:footnoteReference w:id="238"/>
       </w:r>
     </w:p>
     <w:p>
@@ -9022,7 +10072,7 @@
         <w:rPr>
           <w:rStyle w:val="FootnoteReference"/>
         </w:rPr>
-        <w:footnoteReference w:id="204"/>
+        <w:footnoteReference w:id="241"/>
       </w:r>
     </w:p>
     <w:p>
@@ -9033,15 +10083,15 @@
         <w:t xml:space="preserve">The Bayesian evidence table should therefore record the hypothesis pair, evidence identifier, provenance, predicted observation under each hypothesis, dependence group, likelihood range, rationale, reviewer, update, and sensitivity result. The model may draft alternatives for review. It may not convert fluent interpretation into causal probability.</w:t>
       </w:r>
     </w:p>
-    <w:bookmarkEnd w:id="206"/>
-    <w:bookmarkEnd w:id="207"/>
-    <w:bookmarkStart w:id="208" w:name="worked-example-13"/>
+    <w:bookmarkEnd w:id="243"/>
+    <w:bookmarkEnd w:id="244"/>
+    <w:bookmarkStart w:id="245" w:name="worked-example-14"/>
     <w:p>
       <w:pPr>
         <w:pStyle w:val="Heading2"/>
       </w:pPr>
       <w:r>
-        <w:t xml:space="preserve">18.3 Worked Example</w:t>
+        <w:t xml:space="preserve">19.3 Worked Example</w:t>
       </w:r>
     </w:p>
     <w:p>
@@ -9084,14 +10134,14 @@
         <w:t xml:space="preserve">The final database is smaller than the first extraction and stronger than a manually assembled spreadsheet. AI shortened retrieval, comparison, and preliminary coding. The audit chain preserved the difference between speed and evidence.</w:t>
       </w:r>
     </w:p>
-    <w:bookmarkEnd w:id="208"/>
-    <w:bookmarkStart w:id="209" w:name="try-it-13"/>
+    <w:bookmarkEnd w:id="245"/>
+    <w:bookmarkStart w:id="246" w:name="try-it-14"/>
     <w:p>
       <w:pPr>
         <w:pStyle w:val="Heading2"/>
       </w:pPr>
       <w:r>
-        <w:t xml:space="preserve">18.4 Try It</w:t>
+        <w:t xml:space="preserve">19.4 Try It</w:t>
       </w:r>
     </w:p>
     <w:p>
@@ -9126,14 +10176,14 @@
         <w:t xml:space="preserve">Finally, select two rival hypotheses and one verified item of written evidence. State what each hypothesis predicts, assign a transparent likelihood range, and calculate the posterior odds across that range. Repeat the calculation after treating two apparently separate reports as dependent. Explain why the answer changed or remained stable.</w:t>
       </w:r>
     </w:p>
-    <w:bookmarkEnd w:id="209"/>
-    <w:bookmarkStart w:id="210" w:name="guided-ai-workflow-13"/>
+    <w:bookmarkEnd w:id="246"/>
+    <w:bookmarkStart w:id="247" w:name="guided-ai-workflow-14"/>
     <w:p>
       <w:pPr>
         <w:pStyle w:val="Heading2"/>
       </w:pPr>
       <w:r>
-        <w:t xml:space="preserve">18.5 Guided AI Workflow</w:t>
+        <w:t xml:space="preserve">19.5 Guided AI Workflow</w:t>
       </w:r>
     </w:p>
     <w:p>
@@ -9234,14 +10284,14 @@
         <w:t xml:space="preserve">The model should return structured candidates, not silently edit the database. A human-controlled import step provides the boundary between proposal and record.</w:t>
       </w:r>
     </w:p>
-    <w:bookmarkEnd w:id="210"/>
-    <w:bookmarkStart w:id="211" w:name="integrity-checkpoint-13"/>
+    <w:bookmarkEnd w:id="247"/>
+    <w:bookmarkStart w:id="248" w:name="integrity-checkpoint-14"/>
     <w:p>
       <w:pPr>
         <w:pStyle w:val="Heading2"/>
       </w:pPr>
       <w:r>
-        <w:t xml:space="preserve">18.6 Integrity Checkpoint</w:t>
+        <w:t xml:space="preserve">19.6 Integrity Checkpoint</w:t>
       </w:r>
     </w:p>
     <w:p>
@@ -9276,14 +10326,14 @@
         <w:t xml:space="preserve">Dynamic coding can also produce retrospective confirmation. A variable proposed after seeing the outcome may be analytically useful, but its origin must be disclosed. Mark exploratory variables and test them against new material where possible.</w:t>
       </w:r>
     </w:p>
-    <w:bookmarkEnd w:id="211"/>
-    <w:bookmarkStart w:id="212" w:name="save-the-artifact-13"/>
+    <w:bookmarkEnd w:id="248"/>
+    <w:bookmarkStart w:id="249" w:name="save-the-artifact-14"/>
     <w:p>
       <w:pPr>
         <w:pStyle w:val="Heading2"/>
       </w:pPr>
       <w:r>
-        <w:t xml:space="preserve">18.7 Save the Artifact</w:t>
+        <w:t xml:space="preserve">19.7 Save the Artifact</w:t>
       </w:r>
     </w:p>
     <w:p>
@@ -9310,14 +10360,14 @@
         <w:t xml:space="preserve">Release only what rights, privacy, security, and ethics permit. A public methodological register can describe restricted evidence without exposing it.</w:t>
       </w:r>
     </w:p>
-    <w:bookmarkEnd w:id="212"/>
-    <w:bookmarkStart w:id="213" w:name="advanced-practice-13"/>
+    <w:bookmarkEnd w:id="249"/>
+    <w:bookmarkStart w:id="250" w:name="advanced-practice-14"/>
     <w:p>
       <w:pPr>
         <w:pStyle w:val="Heading2"/>
       </w:pPr>
       <w:r>
-        <w:t xml:space="preserve">18.8 Advanced Practice</w:t>
+        <w:t xml:space="preserve">19.8 Advanced Practice</w:t>
       </w:r>
     </w:p>
     <w:p>
@@ -9360,24 +10410,24 @@
         <w:t xml:space="preserve">AI improves an event database when it makes the pipeline faster and the transformations more visible. It weakens the database when convenience conceals where evidence ended and inference began.</w:t>
       </w:r>
     </w:p>
-    <w:bookmarkEnd w:id="213"/>
-    <w:bookmarkEnd w:id="214"/>
-    <w:bookmarkStart w:id="224" w:name="ai-and-research-integrity"/>
+    <w:bookmarkEnd w:id="250"/>
+    <w:bookmarkEnd w:id="251"/>
+    <w:bookmarkStart w:id="261" w:name="ai-and-research-integrity"/>
     <w:p>
       <w:pPr>
         <w:pStyle w:val="Heading1"/>
       </w:pPr>
       <w:r>
-        <w:t xml:space="preserve">19. AI and Research Integrity</w:t>
-      </w:r>
-    </w:p>
-    <w:bookmarkStart w:id="217" w:name="a-division-of-labor"/>
+        <w:t xml:space="preserve">20. AI and Research Integrity</w:t>
+      </w:r>
+    </w:p>
+    <w:bookmarkStart w:id="254" w:name="a-division-of-labor"/>
     <w:p>
       <w:pPr>
         <w:pStyle w:val="Heading2"/>
       </w:pPr>
       <w:r>
-        <w:t xml:space="preserve">19.1 A Division of Labor</w:t>
+        <w:t xml:space="preserve">20.1 A Division of Labor</w:t>
       </w:r>
     </w:p>
     <w:p>
@@ -9407,17 +10457,17 @@
         <w:rPr>
           <w:rStyle w:val="FootnoteReference"/>
         </w:rPr>
-        <w:footnoteReference w:id="215"/>
-      </w:r>
-    </w:p>
-    <w:bookmarkEnd w:id="217"/>
-    <w:bookmarkStart w:id="218" w:name="model-neutral-workflows"/>
+        <w:footnoteReference w:id="252"/>
+      </w:r>
+    </w:p>
+    <w:bookmarkEnd w:id="254"/>
+    <w:bookmarkStart w:id="255" w:name="model-neutral-workflows"/>
     <w:p>
       <w:pPr>
         <w:pStyle w:val="Heading2"/>
       </w:pPr>
       <w:r>
-        <w:t xml:space="preserve">19.2 Model-Neutral Workflows</w:t>
+        <w:t xml:space="preserve">20.2 Model-Neutral Workflows</w:t>
       </w:r>
     </w:p>
     <w:p>
@@ -9452,14 +10502,14 @@
         <w:t xml:space="preserve">Model neutrality has a limit worth stating. The verification-heavy workflows in this guide assume access to a capable model, and capable models often cost money. The privacy fallback assumes a local or institutional system that many researchers do not have. Capability also varies by tool, language, and region. For these reasons the method does not depend on AI. The map, the search log, the evidence register, and the stopping rule stand on their own. A researcher without access to a frontier model loses an assistant, not the method.</w:t>
       </w:r>
     </w:p>
-    <w:bookmarkEnd w:id="218"/>
-    <w:bookmarkStart w:id="219" w:name="privacy-and-data-minimization"/>
+    <w:bookmarkEnd w:id="255"/>
+    <w:bookmarkStart w:id="256" w:name="privacy-and-data-minimization"/>
     <w:p>
       <w:pPr>
         <w:pStyle w:val="Heading2"/>
       </w:pPr>
       <w:r>
-        <w:t xml:space="preserve">19.3 Privacy and Data Minimization</w:t>
+        <w:t xml:space="preserve">20.3 Privacy and Data Minimization</w:t>
       </w:r>
     </w:p>
     <w:p>
@@ -9478,14 +10528,14 @@
         <w:t xml:space="preserve">The audit log records what category of material entered the system. It need not reproduce protected content. It should record the model, date, task, input description, relevant settings, output disposition, and human reviewer.</w:t>
       </w:r>
     </w:p>
-    <w:bookmarkEnd w:id="219"/>
-    <w:bookmarkStart w:id="220" w:name="verification"/>
+    <w:bookmarkEnd w:id="256"/>
+    <w:bookmarkStart w:id="257" w:name="verification"/>
     <w:p>
       <w:pPr>
         <w:pStyle w:val="Heading2"/>
       </w:pPr>
       <w:r>
-        <w:t xml:space="preserve">19.4 Verification</w:t>
+        <w:t xml:space="preserve">20.4 Verification</w:t>
       </w:r>
     </w:p>
     <w:p>
@@ -9512,14 +10562,14 @@
         <w:t xml:space="preserve">The same rule applies to summaries. A model may produce an elegant account of a document while missing a qualification that changes its meaning. Verify against the original and record which passages support the summary.</w:t>
       </w:r>
     </w:p>
-    <w:bookmarkEnd w:id="220"/>
-    <w:bookmarkStart w:id="221" w:name="bias-and-missing-perspectives"/>
+    <w:bookmarkEnd w:id="257"/>
+    <w:bookmarkStart w:id="258" w:name="bias-and-missing-perspectives"/>
     <w:p>
       <w:pPr>
         <w:pStyle w:val="Heading2"/>
       </w:pPr>
       <w:r>
-        <w:t xml:space="preserve">19.5 Bias and Missing Perspectives</w:t>
+        <w:t xml:space="preserve">20.5 Bias and Missing Perspectives</w:t>
       </w:r>
     </w:p>
     <w:p>
@@ -9538,14 +10588,14 @@
         <w:t xml:space="preserve">Ask what position the response assumes. Ask which actors it treats as authoritative. Ask which language and region dominate its suggestions. Then use domain expertise and human consultation to correct the map.</w:t>
       </w:r>
     </w:p>
-    <w:bookmarkEnd w:id="221"/>
-    <w:bookmarkStart w:id="222" w:name="reproducibility-and-drift"/>
+    <w:bookmarkEnd w:id="258"/>
+    <w:bookmarkStart w:id="259" w:name="reproducibility-and-drift"/>
     <w:p>
       <w:pPr>
         <w:pStyle w:val="Heading2"/>
       </w:pPr>
       <w:r>
-        <w:t xml:space="preserve">19.6 Reproducibility and Drift</w:t>
+        <w:t xml:space="preserve">20.6 Reproducibility and Drift</w:t>
       </w:r>
     </w:p>
     <w:p>
@@ -9564,14 +10614,14 @@
         <w:t xml:space="preserve">Preserve consequential outputs when terms permit. Record accepted and rejected suggestions. State when AI assistance changed the question, search vocabulary, source inventory, or stopping rule. The manuscript needs the decision trail more than it needs a transcript of every exchange.</w:t>
       </w:r>
     </w:p>
-    <w:bookmarkEnd w:id="222"/>
-    <w:bookmarkStart w:id="223" w:name="the-standard"/>
+    <w:bookmarkEnd w:id="259"/>
+    <w:bookmarkStart w:id="260" w:name="the-standard"/>
     <w:p>
       <w:pPr>
         <w:pStyle w:val="Heading2"/>
       </w:pPr>
       <w:r>
-        <w:t xml:space="preserve">19.7 The Standard</w:t>
+        <w:t xml:space="preserve">20.7 The Standard</w:t>
       </w:r>
     </w:p>
     <w:p>
@@ -9582,24 +10632,24 @@
         <w:t xml:space="preserve">AI use is defensible when it makes judgment more visible. It fails when it hides judgment behind convenience.</w:t>
       </w:r>
     </w:p>
-    <w:bookmarkEnd w:id="223"/>
-    <w:bookmarkEnd w:id="224"/>
-    <w:bookmarkStart w:id="229" w:name="building-the-full-field-guide"/>
+    <w:bookmarkEnd w:id="260"/>
+    <w:bookmarkEnd w:id="261"/>
+    <w:bookmarkStart w:id="266" w:name="building-the-full-field-guide"/>
     <w:p>
       <w:pPr>
         <w:pStyle w:val="Heading1"/>
       </w:pPr>
       <w:r>
-        <w:t xml:space="preserve">20. Building the Full Field Guide</w:t>
-      </w:r>
-    </w:p>
-    <w:bookmarkStart w:id="225" w:name="what-the-current-modules-establish"/>
+        <w:t xml:space="preserve">21. Building the Full Field Guide</w:t>
+      </w:r>
+    </w:p>
+    <w:bookmarkStart w:id="262" w:name="what-the-current-modules-establish"/>
     <w:p>
       <w:pPr>
         <w:pStyle w:val="Heading2"/>
       </w:pPr>
       <w:r>
-        <w:t xml:space="preserve">20.1 What the Current Modules Establish</w:t>
+        <w:t xml:space="preserve">21.1 What the Current Modules Establish</w:t>
       </w:r>
     </w:p>
     <w:p>
@@ -9908,17 +10958,17 @@
         <w:pStyle w:val="BodyText"/>
       </w:pPr>
       <w:r>
-        <w:t xml:space="preserve">The modules also reveal what remains outside the draft. They do not collect an interview, preserve a website, prepare a full archival corpus, or write the final empirical analysis. The bridge chapter on event databases introduces document extraction, dynamic coding, validation, and explicit causal updating. Each still requires fuller treatment across source types and analytical traditions.</w:t>
-      </w:r>
-    </w:p>
-    <w:bookmarkEnd w:id="225"/>
-    <w:bookmarkStart w:id="226" w:name="the-full-field-guide"/>
+        <w:t xml:space="preserve">The modules also reveal what remains outside the draft. They do not collect an interview, preserve a website, prepare a full archival corpus, or write the final empirical analysis. The synthesis chapter extends the literature workflow into open, living, and quantitative reviews. The bridge chapter on event databases introduces document extraction, dynamic coding, validation, and explicit causal updating. Each still requires fuller treatment across source types and analytical traditions.</w:t>
+      </w:r>
+    </w:p>
+    <w:bookmarkEnd w:id="262"/>
+    <w:bookmarkStart w:id="263" w:name="the-full-field-guide"/>
     <w:p>
       <w:pPr>
         <w:pStyle w:val="Heading2"/>
       </w:pPr>
       <w:r>
-        <w:t xml:space="preserve">20.2 The Full Field Guide</w:t>
+        <w:t xml:space="preserve">21.2 The Full Field Guide</w:t>
       </w:r>
     </w:p>
     <w:p>
@@ -9953,14 +11003,14 @@
         <w:t xml:space="preserve">A communication module will cover manuscripts, presentations, public data, visual explanation, repositories, and long-term access. Sharing is not the final act after research. Decisions made during collection determine what can later be verified, reused, or protected.</w:t>
       </w:r>
     </w:p>
-    <w:bookmarkEnd w:id="226"/>
-    <w:bookmarkStart w:id="227" w:name="a-hebrew-edition"/>
+    <w:bookmarkEnd w:id="263"/>
+    <w:bookmarkStart w:id="264" w:name="a-hebrew-edition"/>
     <w:p>
       <w:pPr>
         <w:pStyle w:val="Heading2"/>
       </w:pPr>
       <w:r>
-        <w:t xml:space="preserve">20.3 A Hebrew Edition</w:t>
+        <w:t xml:space="preserve">21.3 A Hebrew Edition</w:t>
       </w:r>
     </w:p>
     <w:p>
@@ -9971,14 +11021,14 @@
         <w:t xml:space="preserve">English remains the canonical language during the pilot. A Hebrew edition should follow after the content model and navigation stabilize. Translation will require more than sentence substitution. Search terms, institutional examples, interfaces, and right-to-left design must be adapted. Stable page identifiers will keep the two editions connected without forcing them to change at the same pace.</w:t>
       </w:r>
     </w:p>
-    <w:bookmarkEnd w:id="227"/>
-    <w:bookmarkStart w:id="228" w:name="an-invitation"/>
+    <w:bookmarkEnd w:id="264"/>
+    <w:bookmarkStart w:id="265" w:name="an-invitation"/>
     <w:p>
       <w:pPr>
         <w:pStyle w:val="Heading2"/>
       </w:pPr>
       <w:r>
-        <w:t xml:space="preserve">20.4 An Invitation</w:t>
+        <w:t xml:space="preserve">21.4 An Invitation</w:t>
       </w:r>
     </w:p>
     <w:p>
@@ -10005,19 +11055,19 @@
         <w:t xml:space="preserve">The old project began with abundance. The revived project begins with limits, artifacts, and reviewable decisions. This is progress.</w:t>
       </w:r>
     </w:p>
-    <w:bookmarkEnd w:id="228"/>
-    <w:bookmarkEnd w:id="229"/>
-    <w:bookmarkStart w:id="257" w:name="references"/>
+    <w:bookmarkEnd w:id="265"/>
+    <w:bookmarkEnd w:id="266"/>
+    <w:bookmarkStart w:id="304" w:name="references"/>
     <w:p>
       <w:pPr>
         <w:pStyle w:val="Heading1"/>
       </w:pPr>
       <w:r>
-        <w:t xml:space="preserve">21. References</w:t>
-      </w:r>
-    </w:p>
-    <w:bookmarkStart w:id="256" w:name="refs"/>
-    <w:bookmarkStart w:id="230" w:name="ref-autio2024genai"/>
+        <w:t xml:space="preserve">22. References</w:t>
+      </w:r>
+    </w:p>
+    <w:bookmarkStart w:id="303" w:name="refs"/>
+    <w:bookmarkStart w:id="267" w:name="ref-autio2024genai"/>
     <w:p>
       <w:pPr>
         <w:pStyle w:val="Bibliography"/>
@@ -10043,7 +11093,7 @@
       <w:r>
         <w:t xml:space="preserve"> </w:t>
       </w:r>
-      <w:hyperlink r:id="rId216">
+      <w:hyperlink r:id="rId253">
         <w:r>
           <w:rPr>
             <w:rStyle w:val="Hyperlink"/>
@@ -10055,8 +11105,8 @@
         <w:t xml:space="preserve">.</w:t>
       </w:r>
     </w:p>
-    <w:bookmarkEnd w:id="230"/>
-    <w:bookmarkStart w:id="231" w:name="ref-beelen2023bias"/>
+    <w:bookmarkEnd w:id="267"/>
+    <w:bookmarkStart w:id="268" w:name="ref-beelen2023bias"/>
     <w:p>
       <w:pPr>
         <w:pStyle w:val="Bibliography"/>
@@ -10089,7 +11139,7 @@
       <w:r>
         <w:t xml:space="preserve"> </w:t>
       </w:r>
-      <w:hyperlink r:id="rId191">
+      <w:hyperlink r:id="rId228">
         <w:r>
           <w:rPr>
             <w:rStyle w:val="Hyperlink"/>
@@ -10101,14 +11151,20 @@
         <w:t xml:space="preserve">.</w:t>
       </w:r>
     </w:p>
-    <w:bookmarkEnd w:id="231"/>
-    <w:bookmarkStart w:id="232" w:name="ref-booth2016systematic"/>
+    <w:bookmarkEnd w:id="268"/>
+    <w:bookmarkStart w:id="269" w:name="ref-blaizot2022ai"/>
     <w:p>
       <w:pPr>
         <w:pStyle w:val="Bibliography"/>
       </w:pPr>
       <w:r>
-        <w:t xml:space="preserve">Booth, Andrew, Anthea Sutton, and Diana Papaioannou.</w:t>
+        <w:t xml:space="preserve">Blaizot, Aymeric, Sajesh K. Veettil, Pantakarn Saidoung, Carlos Francisco Moreno-Garcia, Nirmalie Wiratunga, Magaly Aceves-Martins, Nai Ming Lai, and Nathorn Chaiyakunapruk.</w:t>
+      </w:r>
+      <w:r>
+        <w:t xml:space="preserve"> </w:t>
+      </w:r>
+      <w:r>
+        <w:t xml:space="preserve">“Using Artificial Intelligence Methods for Systematic Review in Health Sciences: A Systematic Review.”</w:t>
       </w:r>
       <w:r>
         <w:t xml:space="preserve"> </w:t>
@@ -10118,26 +11174,37 @@
           <w:i/>
           <w:iCs/>
         </w:rPr>
-        <w:t xml:space="preserve">Systematic Approaches to a Successful Literature Review</w:t>
-      </w:r>
-      <w:r>
-        <w:t xml:space="preserve">. 2nd ed. London: SAGE Publications, 2016.</w:t>
-      </w:r>
-    </w:p>
-    <w:bookmarkEnd w:id="232"/>
-    <w:bookmarkStart w:id="233" w:name="ref-brandt2025measurement"/>
+        <w:t xml:space="preserve">Research Synthesis Methods</w:t>
+      </w:r>
+      <w:r>
+        <w:t xml:space="preserve"> </w:t>
+      </w:r>
+      <w:r>
+        <w:t xml:space="preserve">13, no. 3 (2022): 353–62.</w:t>
+      </w:r>
+      <w:r>
+        <w:t xml:space="preserve"> </w:t>
+      </w:r>
+      <w:hyperlink r:id="rId207">
+        <w:r>
+          <w:rPr>
+            <w:rStyle w:val="Hyperlink"/>
+          </w:rPr>
+          <w:t xml:space="preserve">https://doi.org/10.1002/jrsm.1553</w:t>
+        </w:r>
+      </w:hyperlink>
+      <w:r>
+        <w:t xml:space="preserve">.</w:t>
+      </w:r>
+    </w:p>
+    <w:bookmarkEnd w:id="269"/>
+    <w:bookmarkStart w:id="270" w:name="ref-booth2016systematic"/>
     <w:p>
       <w:pPr>
         <w:pStyle w:val="Bibliography"/>
       </w:pPr>
       <w:r>
-        <w:t xml:space="preserve">Brandt, Patrick T., and Marcus Sianan.</w:t>
-      </w:r>
-      <w:r>
-        <w:t xml:space="preserve"> </w:t>
-      </w:r>
-      <w:r>
-        <w:t xml:space="preserve">“Measurement of Event Data from Text.”</w:t>
+        <w:t xml:space="preserve">Booth, Andrew, Anthea Sutton, and Diana Papaioannou.</w:t>
       </w:r>
       <w:r>
         <w:t xml:space="preserve"> </w:t>
@@ -10147,6 +11214,35 @@
           <w:i/>
           <w:iCs/>
         </w:rPr>
+        <w:t xml:space="preserve">Systematic Approaches to a Successful Literature Review</w:t>
+      </w:r>
+      <w:r>
+        <w:t xml:space="preserve">. 2nd ed. London: SAGE Publications, 2016.</w:t>
+      </w:r>
+    </w:p>
+    <w:bookmarkEnd w:id="270"/>
+    <w:bookmarkStart w:id="271" w:name="ref-brandt2025measurement"/>
+    <w:p>
+      <w:pPr>
+        <w:pStyle w:val="Bibliography"/>
+      </w:pPr>
+      <w:r>
+        <w:t xml:space="preserve">Brandt, Patrick T., and Marcus Sianan.</w:t>
+      </w:r>
+      <w:r>
+        <w:t xml:space="preserve"> </w:t>
+      </w:r>
+      <w:r>
+        <w:t xml:space="preserve">“Measurement of Event Data from Text.”</w:t>
+      </w:r>
+      <w:r>
+        <w:t xml:space="preserve"> </w:t>
+      </w:r>
+      <w:r>
+        <w:rPr>
+          <w:i/>
+          <w:iCs/>
+        </w:rPr>
         <w:t xml:space="preserve">Frontiers in Political Science</w:t>
       </w:r>
       <w:r>
@@ -10158,7 +11254,7 @@
       <w:r>
         <w:t xml:space="preserve"> </w:t>
       </w:r>
-      <w:hyperlink r:id="rId199">
+      <w:hyperlink r:id="rId236">
         <w:r>
           <w:rPr>
             <w:rStyle w:val="Hyperlink"/>
@@ -10170,8 +11266,8 @@
         <w:t xml:space="preserve">.</w:t>
       </w:r>
     </w:p>
-    <w:bookmarkEnd w:id="233"/>
-    <w:bookmarkStart w:id="234" w:name="ref-braun2021quality"/>
+    <w:bookmarkEnd w:id="271"/>
+    <w:bookmarkStart w:id="272" w:name="ref-braun2021quality"/>
     <w:p>
       <w:pPr>
         <w:pStyle w:val="Bibliography"/>
@@ -10216,8 +11312,8 @@
         <w:t xml:space="preserve">.</w:t>
       </w:r>
     </w:p>
-    <w:bookmarkEnd w:id="234"/>
-    <w:bookmarkStart w:id="235" w:name="ref-cai2023montecarlo"/>
+    <w:bookmarkEnd w:id="272"/>
+    <w:bookmarkStart w:id="273" w:name="ref-cai2023montecarlo"/>
     <w:p>
       <w:pPr>
         <w:pStyle w:val="Bibliography"/>
@@ -10265,7 +11361,7 @@
       <w:r>
         <w:t xml:space="preserve"> </w:t>
       </w:r>
-      <w:hyperlink r:id="rId195">
+      <w:hyperlink r:id="rId232">
         <w:r>
           <w:rPr>
             <w:rStyle w:val="Hyperlink"/>
@@ -10277,8 +11373,54 @@
         <w:t xml:space="preserve">.</w:t>
       </w:r>
     </w:p>
-    <w:bookmarkEnd w:id="235"/>
-    <w:bookmarkStart w:id="236" w:name="ref-enders2011domestic"/>
+    <w:bookmarkEnd w:id="273"/>
+    <w:bookmarkStart w:id="274" w:name="ref-elliott2017living"/>
+    <w:p>
+      <w:pPr>
+        <w:pStyle w:val="Bibliography"/>
+      </w:pPr>
+      <w:r>
+        <w:t xml:space="preserve">Elliott, Julian H., Anneliese Synnot, Tari Turner, Mark Simmonds, Elie A. Akl, Steve McDonald, Georgia Salanti, et al.</w:t>
+      </w:r>
+      <w:r>
+        <w:t xml:space="preserve"> </w:t>
+      </w:r>
+      <w:r>
+        <w:t xml:space="preserve">“Living Systematic Review: 1. Introduction, the Why, What, When, and How.”</w:t>
+      </w:r>
+      <w:r>
+        <w:t xml:space="preserve"> </w:t>
+      </w:r>
+      <w:r>
+        <w:rPr>
+          <w:i/>
+          <w:iCs/>
+        </w:rPr>
+        <w:t xml:space="preserve">Journal of Clinical Epidemiology</w:t>
+      </w:r>
+      <w:r>
+        <w:t xml:space="preserve"> </w:t>
+      </w:r>
+      <w:r>
+        <w:t xml:space="preserve">91 (2017): 23–30.</w:t>
+      </w:r>
+      <w:r>
+        <w:t xml:space="preserve"> </w:t>
+      </w:r>
+      <w:hyperlink r:id="rId202">
+        <w:r>
+          <w:rPr>
+            <w:rStyle w:val="Hyperlink"/>
+          </w:rPr>
+          <w:t xml:space="preserve">https://doi.org/10.1016/j.jclinepi.2017.08.010</w:t>
+        </w:r>
+      </w:hyperlink>
+      <w:r>
+        <w:t xml:space="preserve">.</w:t>
+      </w:r>
+    </w:p>
+    <w:bookmarkEnd w:id="274"/>
+    <w:bookmarkStart w:id="275" w:name="ref-enders2011domestic"/>
     <w:p>
       <w:pPr>
         <w:pStyle w:val="Bibliography"/>
@@ -10323,8 +11465,8 @@
         <w:t xml:space="preserve">.</w:t>
       </w:r>
     </w:p>
-    <w:bookmarkEnd w:id="236"/>
-    <w:bookmarkStart w:id="237" w:name="ref-fairfield2017bayesian"/>
+    <w:bookmarkEnd w:id="275"/>
+    <w:bookmarkStart w:id="276" w:name="ref-fairfield2017bayesian"/>
     <w:p>
       <w:pPr>
         <w:pStyle w:val="Bibliography"/>
@@ -10369,7 +11511,7 @@
       <w:r>
         <w:t xml:space="preserve"> </w:t>
       </w:r>
-      <w:hyperlink r:id="rId202">
+      <w:hyperlink r:id="rId239">
         <w:r>
           <w:rPr>
             <w:rStyle w:val="Hyperlink"/>
@@ -10381,8 +11523,8 @@
         <w:t xml:space="preserve">.</w:t>
       </w:r>
     </w:p>
-    <w:bookmarkEnd w:id="237"/>
-    <w:bookmarkStart w:id="238" w:name="ref-gerring2012methodology"/>
+    <w:bookmarkEnd w:id="276"/>
+    <w:bookmarkStart w:id="277" w:name="ref-gerring2012methodology"/>
     <w:p>
       <w:pPr>
         <w:pStyle w:val="Bibliography"/>
@@ -10404,8 +11546,8 @@
         <w:t xml:space="preserve">. 2nd ed. Cambridge: Cambridge University Press, 2012.</w:t>
       </w:r>
     </w:p>
-    <w:bookmarkEnd w:id="238"/>
-    <w:bookmarkStart w:id="239" w:name="ref-gilardi2023chatgpt"/>
+    <w:bookmarkEnd w:id="277"/>
+    <w:bookmarkStart w:id="278" w:name="ref-gilardi2023chatgpt"/>
     <w:p>
       <w:pPr>
         <w:pStyle w:val="Bibliography"/>
@@ -10447,7 +11589,7 @@
       <w:r>
         <w:t xml:space="preserve"> </w:t>
       </w:r>
-      <w:hyperlink r:id="rId183">
+      <w:hyperlink r:id="rId220">
         <w:r>
           <w:rPr>
             <w:rStyle w:val="Hyperlink"/>
@@ -10459,8 +11601,8 @@
         <w:t xml:space="preserve">.</w:t>
       </w:r>
     </w:p>
-    <w:bookmarkEnd w:id="239"/>
-    <w:bookmarkStart w:id="240" w:name="ref-grant2009typology"/>
+    <w:bookmarkEnd w:id="278"/>
+    <w:bookmarkStart w:id="279" w:name="ref-grant2009typology"/>
     <w:p>
       <w:pPr>
         <w:pStyle w:val="Bibliography"/>
@@ -10515,8 +11657,8 @@
         <w:t xml:space="preserve">.</w:t>
       </w:r>
     </w:p>
-    <w:bookmarkEnd w:id="240"/>
-    <w:bookmarkStart w:id="241" w:name="ref-greenhalgh2005search"/>
+    <w:bookmarkEnd w:id="279"/>
+    <w:bookmarkStart w:id="280" w:name="ref-greenhalgh2005search"/>
     <w:p>
       <w:pPr>
         <w:pStyle w:val="Bibliography"/>
@@ -10561,8 +11703,100 @@
         <w:t xml:space="preserve">.</w:t>
       </w:r>
     </w:p>
-    <w:bookmarkEnd w:id="241"/>
-    <w:bookmarkStart w:id="242" w:name="ref-lebo2013provo"/>
+    <w:bookmarkEnd w:id="280"/>
+    <w:bookmarkStart w:id="281" w:name="ref-hedges2010robust"/>
+    <w:p>
+      <w:pPr>
+        <w:pStyle w:val="Bibliography"/>
+      </w:pPr>
+      <w:r>
+        <w:t xml:space="preserve">Hedges, Larry V., Elizabeth Tipton, and Matthew C. Johnson.</w:t>
+      </w:r>
+      <w:r>
+        <w:t xml:space="preserve"> </w:t>
+      </w:r>
+      <w:r>
+        <w:t xml:space="preserve">“Robust Variance Estimation in Meta-Regression with Dependent Effect Size Estimates.”</w:t>
+      </w:r>
+      <w:r>
+        <w:t xml:space="preserve"> </w:t>
+      </w:r>
+      <w:r>
+        <w:rPr>
+          <w:i/>
+          <w:iCs/>
+        </w:rPr>
+        <w:t xml:space="preserve">Research Synthesis Methods</w:t>
+      </w:r>
+      <w:r>
+        <w:t xml:space="preserve"> </w:t>
+      </w:r>
+      <w:r>
+        <w:t xml:space="preserve">1, no. 1 (2010): 39–65.</w:t>
+      </w:r>
+      <w:r>
+        <w:t xml:space="preserve"> </w:t>
+      </w:r>
+      <w:hyperlink r:id="rId190">
+        <w:r>
+          <w:rPr>
+            <w:rStyle w:val="Hyperlink"/>
+          </w:rPr>
+          <w:t xml:space="preserve">https://doi.org/10.1002/jrsm.5</w:t>
+        </w:r>
+      </w:hyperlink>
+      <w:r>
+        <w:t xml:space="preserve">.</w:t>
+      </w:r>
+    </w:p>
+    <w:bookmarkEnd w:id="281"/>
+    <w:bookmarkStart w:id="282" w:name="ref-irsova2024meta"/>
+    <w:p>
+      <w:pPr>
+        <w:pStyle w:val="Bibliography"/>
+      </w:pPr>
+      <w:r>
+        <w:t xml:space="preserve">Irsova, Zuzana, Hristos Doucouliagos, Tomas Havranek, and T. D. Stanley.</w:t>
+      </w:r>
+      <w:r>
+        <w:t xml:space="preserve"> </w:t>
+      </w:r>
+      <w:r>
+        <w:t xml:space="preserve">“Meta-Analysis of Social Science Research: A Practitioner’s Guide.”</w:t>
+      </w:r>
+      <w:r>
+        <w:t xml:space="preserve"> </w:t>
+      </w:r>
+      <w:r>
+        <w:rPr>
+          <w:i/>
+          <w:iCs/>
+        </w:rPr>
+        <w:t xml:space="preserve">Journal of Economic Surveys</w:t>
+      </w:r>
+      <w:r>
+        <w:t xml:space="preserve"> </w:t>
+      </w:r>
+      <w:r>
+        <w:t xml:space="preserve">38, no. 5 (2024): 1547–66.</w:t>
+      </w:r>
+      <w:r>
+        <w:t xml:space="preserve"> </w:t>
+      </w:r>
+      <w:hyperlink r:id="rId192">
+        <w:r>
+          <w:rPr>
+            <w:rStyle w:val="Hyperlink"/>
+          </w:rPr>
+          <w:t xml:space="preserve">https://doi.org/10.1111/joes.12595</w:t>
+        </w:r>
+      </w:hyperlink>
+      <w:r>
+        <w:t xml:space="preserve">.</w:t>
+      </w:r>
+    </w:p>
+    <w:bookmarkEnd w:id="282"/>
+    <w:bookmarkStart w:id="283" w:name="ref-lebo2013provo"/>
     <w:p>
       <w:pPr>
         <w:pStyle w:val="Bibliography"/>
@@ -10615,8 +11849,8 @@
         <w:t xml:space="preserve">.</w:t>
       </w:r>
     </w:p>
-    <w:bookmarkEnd w:id="242"/>
-    <w:bookmarkStart w:id="243" w:name="ref-littell2018classification"/>
+    <w:bookmarkEnd w:id="283"/>
+    <w:bookmarkStart w:id="284" w:name="ref-littell2018classification"/>
     <w:p>
       <w:pPr>
         <w:pStyle w:val="Bibliography"/>
@@ -10661,8 +11895,8 @@
         <w:t xml:space="preserve">.</w:t>
       </w:r>
     </w:p>
-    <w:bookmarkEnd w:id="243"/>
-    <w:bookmarkStart w:id="244" w:name="ref-malterud2016information"/>
+    <w:bookmarkEnd w:id="284"/>
+    <w:bookmarkStart w:id="285" w:name="ref-malterud2016information"/>
     <w:p>
       <w:pPr>
         <w:pStyle w:val="Bibliography"/>
@@ -10707,8 +11941,100 @@
         <w:t xml:space="preserve">.</w:t>
       </w:r>
     </w:p>
-    <w:bookmarkEnd w:id="244"/>
-    <w:bookmarkStart w:id="245" w:name="ref-start2024codebook"/>
+    <w:bookmarkEnd w:id="285"/>
+    <w:bookmarkStart w:id="286" w:name="ref-marshall2019automation"/>
+    <w:p>
+      <w:pPr>
+        <w:pStyle w:val="Bibliography"/>
+      </w:pPr>
+      <w:r>
+        <w:t xml:space="preserve">Marshall, Iain J., and Byron C. Wallace.</w:t>
+      </w:r>
+      <w:r>
+        <w:t xml:space="preserve"> </w:t>
+      </w:r>
+      <w:r>
+        <w:t xml:space="preserve">“Toward Systematic Review Automation: A Practical Guide to Using Machine Learning Tools in Research Synthesis.”</w:t>
+      </w:r>
+      <w:r>
+        <w:t xml:space="preserve"> </w:t>
+      </w:r>
+      <w:r>
+        <w:rPr>
+          <w:i/>
+          <w:iCs/>
+        </w:rPr>
+        <w:t xml:space="preserve">Systematic Reviews</w:t>
+      </w:r>
+      <w:r>
+        <w:t xml:space="preserve"> </w:t>
+      </w:r>
+      <w:r>
+        <w:t xml:space="preserve">8, no. 1 (2019): 163.</w:t>
+      </w:r>
+      <w:r>
+        <w:t xml:space="preserve"> </w:t>
+      </w:r>
+      <w:hyperlink r:id="rId205">
+        <w:r>
+          <w:rPr>
+            <w:rStyle w:val="Hyperlink"/>
+          </w:rPr>
+          <w:t xml:space="preserve">https://doi.org/10.1186/s13643-019-1074-9</w:t>
+        </w:r>
+      </w:hyperlink>
+      <w:r>
+        <w:t xml:space="preserve">.</w:t>
+      </w:r>
+    </w:p>
+    <w:bookmarkEnd w:id="286"/>
+    <w:bookmarkStart w:id="287" w:name="ref-moreau2022open"/>
+    <w:p>
+      <w:pPr>
+        <w:pStyle w:val="Bibliography"/>
+      </w:pPr>
+      <w:r>
+        <w:t xml:space="preserve">Moreau, David, and Beau Gamble.</w:t>
+      </w:r>
+      <w:r>
+        <w:t xml:space="preserve"> </w:t>
+      </w:r>
+      <w:r>
+        <w:t xml:space="preserve">“Conducting a Meta-Analysis in the Age of Open Science: Tools, Tips, and Practical Recommendations.”</w:t>
+      </w:r>
+      <w:r>
+        <w:t xml:space="preserve"> </w:t>
+      </w:r>
+      <w:r>
+        <w:rPr>
+          <w:i/>
+          <w:iCs/>
+        </w:rPr>
+        <w:t xml:space="preserve">Psychological Methods</w:t>
+      </w:r>
+      <w:r>
+        <w:t xml:space="preserve"> </w:t>
+      </w:r>
+      <w:r>
+        <w:t xml:space="preserve">27, no. 3 (2022): 426–32.</w:t>
+      </w:r>
+      <w:r>
+        <w:t xml:space="preserve"> </w:t>
+      </w:r>
+      <w:hyperlink r:id="rId196">
+        <w:r>
+          <w:rPr>
+            <w:rStyle w:val="Hyperlink"/>
+          </w:rPr>
+          <w:t xml:space="preserve">https://doi.org/10.1037/met0000351</w:t>
+        </w:r>
+      </w:hyperlink>
+      <w:r>
+        <w:t xml:space="preserve">.</w:t>
+      </w:r>
+    </w:p>
+    <w:bookmarkEnd w:id="287"/>
+    <w:bookmarkStart w:id="288" w:name="ref-start2024codebook"/>
     <w:p>
       <w:pPr>
         <w:pStyle w:val="Bibliography"/>
@@ -10743,8 +12069,8 @@
         <w:t xml:space="preserve">.</w:t>
       </w:r>
     </w:p>
-    <w:bookmarkEnd w:id="245"/>
-    <w:bookmarkStart w:id="246" w:name="ref-page2021prisma"/>
+    <w:bookmarkEnd w:id="288"/>
+    <w:bookmarkStart w:id="289" w:name="ref-page2021prisma"/>
     <w:p>
       <w:pPr>
         <w:pStyle w:val="Bibliography"/>
@@ -10789,8 +12115,8 @@
         <w:t xml:space="preserve">.</w:t>
       </w:r>
     </w:p>
-    <w:bookmarkEnd w:id="246"/>
-    <w:bookmarkStart w:id="247" w:name="ref-pangakis2023annotation"/>
+    <w:bookmarkEnd w:id="289"/>
+    <w:bookmarkStart w:id="290" w:name="ref-pangakis2023annotation"/>
     <w:p>
       <w:pPr>
         <w:pStyle w:val="Bibliography"/>
@@ -10832,7 +12158,7 @@
       <w:r>
         <w:t xml:space="preserve"> </w:t>
       </w:r>
-      <w:hyperlink r:id="rId184">
+      <w:hyperlink r:id="rId221">
         <w:r>
           <w:rPr>
             <w:rStyle w:val="Hyperlink"/>
@@ -10844,8 +12170,100 @@
         <w:t xml:space="preserve">.</w:t>
       </w:r>
     </w:p>
-    <w:bookmarkEnd w:id="247"/>
-    <w:bookmarkStart w:id="248" w:name="ref-rethlefsen2021prismas"/>
+    <w:bookmarkEnd w:id="290"/>
+    <w:bookmarkStart w:id="291" w:name="ref-pigott2020meta"/>
+    <w:p>
+      <w:pPr>
+        <w:pStyle w:val="Bibliography"/>
+      </w:pPr>
+      <w:r>
+        <w:t xml:space="preserve">Pigott, Terri D., and Joshua R. Polanin.</w:t>
+      </w:r>
+      <w:r>
+        <w:t xml:space="preserve"> </w:t>
+      </w:r>
+      <w:r>
+        <w:t xml:space="preserve">“Methodological Guidance Paper: High-Quality Meta-Analysis in a Systematic Review.”</w:t>
+      </w:r>
+      <w:r>
+        <w:t xml:space="preserve"> </w:t>
+      </w:r>
+      <w:r>
+        <w:rPr>
+          <w:i/>
+          <w:iCs/>
+        </w:rPr>
+        <w:t xml:space="preserve">Review of Educational Research</w:t>
+      </w:r>
+      <w:r>
+        <w:t xml:space="preserve"> </w:t>
+      </w:r>
+      <w:r>
+        <w:t xml:space="preserve">90, no. 1 (2020): 24–46.</w:t>
+      </w:r>
+      <w:r>
+        <w:t xml:space="preserve"> </w:t>
+      </w:r>
+      <w:hyperlink r:id="rId186">
+        <w:r>
+          <w:rPr>
+            <w:rStyle w:val="Hyperlink"/>
+          </w:rPr>
+          <w:t xml:space="preserve">https://doi.org/10.3102/0034654319877153</w:t>
+        </w:r>
+      </w:hyperlink>
+      <w:r>
+        <w:t xml:space="preserve">.</w:t>
+      </w:r>
+    </w:p>
+    <w:bookmarkEnd w:id="291"/>
+    <w:bookmarkStart w:id="292" w:name="ref-polanin2020transparency"/>
+    <w:p>
+      <w:pPr>
+        <w:pStyle w:val="Bibliography"/>
+      </w:pPr>
+      <w:r>
+        <w:t xml:space="preserve">Polanin, Joshua R., Emily A. Hennessy, and Sho Tsuji.</w:t>
+      </w:r>
+      <w:r>
+        <w:t xml:space="preserve"> </w:t>
+      </w:r>
+      <w:r>
+        <w:t xml:space="preserve">“Transparency and Reproducibility of Meta-Analyses in Psychology: A Meta-Review.”</w:t>
+      </w:r>
+      <w:r>
+        <w:t xml:space="preserve"> </w:t>
+      </w:r>
+      <w:r>
+        <w:rPr>
+          <w:i/>
+          <w:iCs/>
+        </w:rPr>
+        <w:t xml:space="preserve">Perspectives on Psychological Science</w:t>
+      </w:r>
+      <w:r>
+        <w:t xml:space="preserve"> </w:t>
+      </w:r>
+      <w:r>
+        <w:t xml:space="preserve">15, no. 4 (2020): 1026–41.</w:t>
+      </w:r>
+      <w:r>
+        <w:t xml:space="preserve"> </w:t>
+      </w:r>
+      <w:hyperlink r:id="rId198">
+        <w:r>
+          <w:rPr>
+            <w:rStyle w:val="Hyperlink"/>
+          </w:rPr>
+          <w:t xml:space="preserve">https://doi.org/10.1177/1745691620906416</w:t>
+        </w:r>
+      </w:hyperlink>
+      <w:r>
+        <w:t xml:space="preserve">.</w:t>
+      </w:r>
+    </w:p>
+    <w:bookmarkEnd w:id="292"/>
+    <w:bookmarkStart w:id="293" w:name="ref-rethlefsen2021prismas"/>
     <w:p>
       <w:pPr>
         <w:pStyle w:val="Bibliography"/>
@@ -10890,8 +12308,8 @@
         <w:t xml:space="preserve">.</w:t>
       </w:r>
     </w:p>
-    <w:bookmarkEnd w:id="248"/>
-    <w:bookmarkStart w:id="249" w:name="ref-roberts2021mediacloud"/>
+    <w:bookmarkEnd w:id="293"/>
+    <w:bookmarkStart w:id="294" w:name="ref-roberts2021mediacloud"/>
     <w:p>
       <w:pPr>
         <w:pStyle w:val="Bibliography"/>
@@ -10924,7 +12342,7 @@
       <w:r>
         <w:t xml:space="preserve"> </w:t>
       </w:r>
-      <w:hyperlink r:id="rId189">
+      <w:hyperlink r:id="rId226">
         <w:r>
           <w:rPr>
             <w:rStyle w:val="Hyperlink"/>
@@ -10936,8 +12354,8 @@
         <w:t xml:space="preserve">.</w:t>
       </w:r>
     </w:p>
-    <w:bookmarkEnd w:id="249"/>
-    <w:bookmarkStart w:id="250" w:name="ref-saunders2018saturation"/>
+    <w:bookmarkEnd w:id="294"/>
+    <w:bookmarkStart w:id="295" w:name="ref-saunders2018saturation"/>
     <w:p>
       <w:pPr>
         <w:pStyle w:val="Bibliography"/>
@@ -10982,8 +12400,8 @@
         <w:t xml:space="preserve">.</w:t>
       </w:r>
     </w:p>
-    <w:bookmarkEnd w:id="250"/>
-    <w:bookmarkStart w:id="251" w:name="ref-snyder2019literature"/>
+    <w:bookmarkEnd w:id="295"/>
+    <w:bookmarkStart w:id="296" w:name="ref-snyder2019literature"/>
     <w:p>
       <w:pPr>
         <w:pStyle w:val="Bibliography"/>
@@ -11028,8 +12446,100 @@
         <w:t xml:space="preserve">.</w:t>
       </w:r>
     </w:p>
-    <w:bookmarkEnd w:id="251"/>
-    <w:bookmarkStart w:id="252" w:name="ref-wohlin2014snowballing"/>
+    <w:bookmarkEnd w:id="296"/>
+    <w:bookmarkStart w:id="297" w:name="ref-sousa2026ai"/>
+    <w:p>
+      <w:pPr>
+        <w:pStyle w:val="Bibliography"/>
+      </w:pPr>
+      <w:r>
+        <w:t xml:space="preserve">Sousa, M. Sharmila A., Sasha Peiris, Mabel F. Figueiró, Michelle M. Haby, Ana Cyntia Baraldi, Ludovic Reveiz, and João Paulo Souza.</w:t>
+      </w:r>
+      <w:r>
+        <w:t xml:space="preserve"> </w:t>
+      </w:r>
+      <w:r>
+        <w:t xml:space="preserve">“The Landscape of Artificial Intelligence Tools and Platforms for Evidence Synthesis: A Scoping Review.”</w:t>
+      </w:r>
+      <w:r>
+        <w:t xml:space="preserve"> </w:t>
+      </w:r>
+      <w:r>
+        <w:rPr>
+          <w:i/>
+          <w:iCs/>
+        </w:rPr>
+        <w:t xml:space="preserve">Systematic Reviews</w:t>
+      </w:r>
+      <w:r>
+        <w:t xml:space="preserve"> </w:t>
+      </w:r>
+      <w:r>
+        <w:t xml:space="preserve">15, no. 1 (2026): 82.</w:t>
+      </w:r>
+      <w:r>
+        <w:t xml:space="preserve"> </w:t>
+      </w:r>
+      <w:hyperlink r:id="rId208">
+        <w:r>
+          <w:rPr>
+            <w:rStyle w:val="Hyperlink"/>
+          </w:rPr>
+          <w:t xml:space="preserve">https://doi.org/10.1186/s13643-025-02842-y</w:t>
+        </w:r>
+      </w:hyperlink>
+      <w:r>
+        <w:t xml:space="preserve">.</w:t>
+      </w:r>
+    </w:p>
+    <w:bookmarkEnd w:id="297"/>
+    <w:bookmarkStart w:id="298" w:name="ref-uttley2026meta"/>
+    <w:p>
+      <w:pPr>
+        <w:pStyle w:val="Bibliography"/>
+      </w:pPr>
+      <w:r>
+        <w:t xml:space="preserve">Uttley, Lesley, Yuliang Weng, and Louise Falzon.</w:t>
+      </w:r>
+      <w:r>
+        <w:t xml:space="preserve"> </w:t>
+      </w:r>
+      <w:r>
+        <w:t xml:space="preserve">“What’s the Meta Now? More Updates on the Problems with Systematic Reviews.”</w:t>
+      </w:r>
+      <w:r>
+        <w:t xml:space="preserve"> </w:t>
+      </w:r>
+      <w:r>
+        <w:rPr>
+          <w:i/>
+          <w:iCs/>
+        </w:rPr>
+        <w:t xml:space="preserve">Journal of Clinical Epidemiology</w:t>
+      </w:r>
+      <w:r>
+        <w:t xml:space="preserve"> </w:t>
+      </w:r>
+      <w:r>
+        <w:t xml:space="preserve">198 (2026): 112393.</w:t>
+      </w:r>
+      <w:r>
+        <w:t xml:space="preserve"> </w:t>
+      </w:r>
+      <w:hyperlink r:id="rId199">
+        <w:r>
+          <w:rPr>
+            <w:rStyle w:val="Hyperlink"/>
+          </w:rPr>
+          <w:t xml:space="preserve">https://doi.org/10.1016/j.jclinepi.2026.112393</w:t>
+        </w:r>
+      </w:hyperlink>
+      <w:r>
+        <w:t xml:space="preserve">.</w:t>
+      </w:r>
+    </w:p>
+    <w:bookmarkEnd w:id="298"/>
+    <w:bookmarkStart w:id="299" w:name="ref-wohlin2014snowballing"/>
     <w:p>
       <w:pPr>
         <w:pStyle w:val="Bibliography"/>
@@ -11077,8 +12587,8 @@
         <w:t xml:space="preserve">.</w:t>
       </w:r>
     </w:p>
-    <w:bookmarkEnd w:id="252"/>
-    <w:bookmarkStart w:id="253" w:name="ref-xiong2024uncertainty"/>
+    <w:bookmarkEnd w:id="299"/>
+    <w:bookmarkStart w:id="300" w:name="ref-xiong2024uncertainty"/>
     <w:p>
       <w:pPr>
         <w:pStyle w:val="Bibliography"/>
@@ -11135,7 +12645,7 @@
       <w:r>
         <w:t xml:space="preserve"> </w:t>
       </w:r>
-      <w:hyperlink r:id="rId205">
+      <w:hyperlink r:id="rId242">
         <w:r>
           <w:rPr>
             <w:rStyle w:val="Hyperlink"/>
@@ -11147,8 +12657,8 @@
         <w:t xml:space="preserve">.</w:t>
       </w:r>
     </w:p>
-    <w:bookmarkEnd w:id="253"/>
-    <w:bookmarkStart w:id="254" w:name="ref-zaks2021updating"/>
+    <w:bookmarkEnd w:id="300"/>
+    <w:bookmarkStart w:id="301" w:name="ref-zaks2021updating"/>
     <w:p>
       <w:pPr>
         <w:pStyle w:val="Bibliography"/>
@@ -11202,7 +12712,7 @@
       <w:r>
         <w:t xml:space="preserve"> </w:t>
       </w:r>
-      <w:hyperlink r:id="rId203">
+      <w:hyperlink r:id="rId240">
         <w:r>
           <w:rPr>
             <w:rStyle w:val="Hyperlink"/>
@@ -11214,8 +12724,8 @@
         <w:t xml:space="preserve">.</w:t>
       </w:r>
     </w:p>
-    <w:bookmarkEnd w:id="254"/>
-    <w:bookmarkStart w:id="255" w:name="ref-ziems2024transform"/>
+    <w:bookmarkEnd w:id="301"/>
+    <w:bookmarkStart w:id="302" w:name="ref-ziems2024transform"/>
     <w:p>
       <w:pPr>
         <w:pStyle w:val="Bibliography"/>
@@ -11248,7 +12758,7 @@
       <w:r>
         <w:t xml:space="preserve"> </w:t>
       </w:r>
-      <w:hyperlink r:id="rId185">
+      <w:hyperlink r:id="rId222">
         <w:r>
           <w:rPr>
             <w:rStyle w:val="Hyperlink"/>
@@ -11260,9 +12770,9 @@
         <w:t xml:space="preserve">.</w:t>
       </w:r>
     </w:p>
-    <w:bookmarkEnd w:id="255"/>
-    <w:bookmarkEnd w:id="256"/>
-    <w:bookmarkEnd w:id="257"/>
+    <w:bookmarkEnd w:id="302"/>
+    <w:bookmarkEnd w:id="303"/>
+    <w:bookmarkEnd w:id="304"/>
     <w:sectPr>
       <w:footnotePr>
         <w:numRestart w:val="eachSect"/>
@@ -12301,7 +13811,7 @@
       </w:r>
     </w:p>
   </w:footnote>
-  <w:footnote w:id="182">
+  <w:footnote w:id="183">
     <w:p>
       <w:pPr>
         <w:pStyle w:val="FootnoteText"/>
@@ -12316,22 +13826,56 @@
         <w:t xml:space="preserve"> </w:t>
       </w:r>
       <w:r>
-        <w:t xml:space="preserve">Fabrizio Gilardi, Meysam Alizadeh, and Maël Kubli,</w:t>
-      </w:r>
-      <w:r>
-        <w:t xml:space="preserve"> </w:t>
-      </w:r>
-      <w:r>
-        <w:t xml:space="preserve">“</w:t>
-      </w:r>
-      <w:r>
-        <w:t xml:space="preserve">ChatGPT</w:t>
-      </w:r>
-      <w:r>
-        <w:t xml:space="preserve"> </w:t>
-      </w:r>
-      <w:r>
-        <w:t xml:space="preserve">Outperforms Crowd Workers for Text-Annotation Tasks,”</w:t>
+        <w:t xml:space="preserve">Grant and Booth,</w:t>
+      </w:r>
+      <w:r>
+        <w:t xml:space="preserve"> </w:t>
+      </w:r>
+      <w:r>
+        <w:t xml:space="preserve">“A Typology of Reviews”</w:t>
+      </w:r>
+      <w:r>
+        <w:t xml:space="preserve">; Littell,</w:t>
+      </w:r>
+      <w:r>
+        <w:t xml:space="preserve"> </w:t>
+      </w:r>
+      <w:r>
+        <w:t xml:space="preserve">“Conceptual and Practical Classification of Research Reviews and Other Evidence Synthesis Products”</w:t>
+      </w:r>
+      <w:r>
+        <w:t xml:space="preserve">; Snyder,</w:t>
+      </w:r>
+      <w:r>
+        <w:t xml:space="preserve"> </w:t>
+      </w:r>
+      <w:r>
+        <w:t xml:space="preserve">“Literature Review as a Research Methodology.”</w:t>
+      </w:r>
+    </w:p>
+  </w:footnote>
+  <w:footnote w:id="185">
+    <w:p>
+      <w:pPr>
+        <w:pStyle w:val="FootnoteText"/>
+      </w:pPr>
+      <w:r>
+        <w:rPr>
+          <w:rStyle w:val="FootnoteReference"/>
+        </w:rPr>
+        <w:footnoteRef/>
+      </w:r>
+      <w:r>
+        <w:t xml:space="preserve"> </w:t>
+      </w:r>
+      <w:r>
+        <w:t xml:space="preserve">Terri D. Pigott and Joshua R. Polanin,</w:t>
+      </w:r>
+      <w:r>
+        <w:t xml:space="preserve"> </w:t>
+      </w:r>
+      <w:r>
+        <w:t xml:space="preserve">“Methodological Guidance Paper: High-Quality Meta-Analysis in a Systematic Review,”</w:t>
       </w:r>
       <w:r>
         <w:t xml:space="preserve"> </w:t>
@@ -12341,6 +13885,527 @@
           <w:i/>
           <w:iCs/>
         </w:rPr>
+        <w:t xml:space="preserve">Review of Educational Research</w:t>
+      </w:r>
+      <w:r>
+        <w:t xml:space="preserve"> </w:t>
+      </w:r>
+      <w:r>
+        <w:t xml:space="preserve">90, no. 1 (2020): 24–46,</w:t>
+      </w:r>
+      <w:r>
+        <w:t xml:space="preserve"> </w:t>
+      </w:r>
+      <w:hyperlink r:id="rId186">
+        <w:r>
+          <w:rPr>
+            <w:rStyle w:val="Hyperlink"/>
+          </w:rPr>
+          <w:t xml:space="preserve">https://doi.org/10.3102/0034654319877153</w:t>
+        </w:r>
+      </w:hyperlink>
+      <w:r>
+        <w:t xml:space="preserve">.</w:t>
+      </w:r>
+    </w:p>
+  </w:footnote>
+  <w:footnote w:id="189">
+    <w:p>
+      <w:pPr>
+        <w:pStyle w:val="FootnoteText"/>
+      </w:pPr>
+      <w:r>
+        <w:rPr>
+          <w:rStyle w:val="FootnoteReference"/>
+        </w:rPr>
+        <w:footnoteRef/>
+      </w:r>
+      <w:r>
+        <w:t xml:space="preserve"> </w:t>
+      </w:r>
+      <w:r>
+        <w:t xml:space="preserve">Larry V. Hedges, Elizabeth Tipton, and Matthew C. Johnson,</w:t>
+      </w:r>
+      <w:r>
+        <w:t xml:space="preserve"> </w:t>
+      </w:r>
+      <w:r>
+        <w:t xml:space="preserve">“Robust Variance Estimation in Meta-Regression with Dependent Effect Size Estimates,”</w:t>
+      </w:r>
+      <w:r>
+        <w:t xml:space="preserve"> </w:t>
+      </w:r>
+      <w:r>
+        <w:rPr>
+          <w:i/>
+          <w:iCs/>
+        </w:rPr>
+        <w:t xml:space="preserve">Research Synthesis Methods</w:t>
+      </w:r>
+      <w:r>
+        <w:t xml:space="preserve"> </w:t>
+      </w:r>
+      <w:r>
+        <w:t xml:space="preserve">1, no. 1 (2010): 39–65,</w:t>
+      </w:r>
+      <w:r>
+        <w:t xml:space="preserve"> </w:t>
+      </w:r>
+      <w:hyperlink r:id="rId190">
+        <w:r>
+          <w:rPr>
+            <w:rStyle w:val="Hyperlink"/>
+          </w:rPr>
+          <w:t xml:space="preserve">https://doi.org/10.1002/jrsm.5</w:t>
+        </w:r>
+      </w:hyperlink>
+      <w:r>
+        <w:t xml:space="preserve">.</w:t>
+      </w:r>
+    </w:p>
+  </w:footnote>
+  <w:footnote w:id="191">
+    <w:p>
+      <w:pPr>
+        <w:pStyle w:val="FootnoteText"/>
+      </w:pPr>
+      <w:r>
+        <w:rPr>
+          <w:rStyle w:val="FootnoteReference"/>
+        </w:rPr>
+        <w:footnoteRef/>
+      </w:r>
+      <w:r>
+        <w:t xml:space="preserve"> </w:t>
+      </w:r>
+      <w:r>
+        <w:t xml:space="preserve">Zuzana Irsova et al.,</w:t>
+      </w:r>
+      <w:r>
+        <w:t xml:space="preserve"> </w:t>
+      </w:r>
+      <w:r>
+        <w:t xml:space="preserve">“Meta-Analysis of Social Science Research: A Practitioner’s Guide,”</w:t>
+      </w:r>
+      <w:r>
+        <w:t xml:space="preserve"> </w:t>
+      </w:r>
+      <w:r>
+        <w:rPr>
+          <w:i/>
+          <w:iCs/>
+        </w:rPr>
+        <w:t xml:space="preserve">Journal of Economic Surveys</w:t>
+      </w:r>
+      <w:r>
+        <w:t xml:space="preserve"> </w:t>
+      </w:r>
+      <w:r>
+        <w:t xml:space="preserve">38, no. 5 (2024): 1547–66,</w:t>
+      </w:r>
+      <w:r>
+        <w:t xml:space="preserve"> </w:t>
+      </w:r>
+      <w:hyperlink r:id="rId192">
+        <w:r>
+          <w:rPr>
+            <w:rStyle w:val="Hyperlink"/>
+          </w:rPr>
+          <w:t xml:space="preserve">https://doi.org/10.1111/joes.12595</w:t>
+        </w:r>
+      </w:hyperlink>
+      <w:r>
+        <w:t xml:space="preserve">.</w:t>
+      </w:r>
+    </w:p>
+  </w:footnote>
+  <w:footnote w:id="195">
+    <w:p>
+      <w:pPr>
+        <w:pStyle w:val="FootnoteText"/>
+      </w:pPr>
+      <w:r>
+        <w:rPr>
+          <w:rStyle w:val="FootnoteReference"/>
+        </w:rPr>
+        <w:footnoteRef/>
+      </w:r>
+      <w:r>
+        <w:t xml:space="preserve"> </w:t>
+      </w:r>
+      <w:r>
+        <w:t xml:space="preserve">David Moreau and Beau Gamble,</w:t>
+      </w:r>
+      <w:r>
+        <w:t xml:space="preserve"> </w:t>
+      </w:r>
+      <w:r>
+        <w:t xml:space="preserve">“Conducting a Meta-Analysis in the Age of Open Science: Tools, Tips, and Practical Recommendations,”</w:t>
+      </w:r>
+      <w:r>
+        <w:t xml:space="preserve"> </w:t>
+      </w:r>
+      <w:r>
+        <w:rPr>
+          <w:i/>
+          <w:iCs/>
+        </w:rPr>
+        <w:t xml:space="preserve">Psychological Methods</w:t>
+      </w:r>
+      <w:r>
+        <w:t xml:space="preserve"> </w:t>
+      </w:r>
+      <w:r>
+        <w:t xml:space="preserve">27, no. 3 (2022): 426–32,</w:t>
+      </w:r>
+      <w:r>
+        <w:t xml:space="preserve"> </w:t>
+      </w:r>
+      <w:hyperlink r:id="rId196">
+        <w:r>
+          <w:rPr>
+            <w:rStyle w:val="Hyperlink"/>
+          </w:rPr>
+          <w:t xml:space="preserve">https://doi.org/10.1037/met0000351</w:t>
+        </w:r>
+      </w:hyperlink>
+      <w:r>
+        <w:t xml:space="preserve">.</w:t>
+      </w:r>
+    </w:p>
+  </w:footnote>
+  <w:footnote w:id="197">
+    <w:p>
+      <w:pPr>
+        <w:pStyle w:val="FootnoteText"/>
+      </w:pPr>
+      <w:r>
+        <w:rPr>
+          <w:rStyle w:val="FootnoteReference"/>
+        </w:rPr>
+        <w:footnoteRef/>
+      </w:r>
+      <w:r>
+        <w:t xml:space="preserve"> </w:t>
+      </w:r>
+      <w:r>
+        <w:t xml:space="preserve">Joshua R. Polanin, Emily A. Hennessy, and Sho Tsuji,</w:t>
+      </w:r>
+      <w:r>
+        <w:t xml:space="preserve"> </w:t>
+      </w:r>
+      <w:r>
+        <w:t xml:space="preserve">“Transparency and Reproducibility of Meta-Analyses in Psychology: A Meta-Review,”</w:t>
+      </w:r>
+      <w:r>
+        <w:t xml:space="preserve"> </w:t>
+      </w:r>
+      <w:r>
+        <w:rPr>
+          <w:i/>
+          <w:iCs/>
+        </w:rPr>
+        <w:t xml:space="preserve">Perspectives on Psychological Science</w:t>
+      </w:r>
+      <w:r>
+        <w:t xml:space="preserve"> </w:t>
+      </w:r>
+      <w:r>
+        <w:t xml:space="preserve">15, no. 4 (2020): 1026–41,</w:t>
+      </w:r>
+      <w:r>
+        <w:t xml:space="preserve"> </w:t>
+      </w:r>
+      <w:hyperlink r:id="rId198">
+        <w:r>
+          <w:rPr>
+            <w:rStyle w:val="Hyperlink"/>
+          </w:rPr>
+          <w:t xml:space="preserve">https://doi.org/10.1177/1745691620906416</w:t>
+        </w:r>
+      </w:hyperlink>
+      <w:r>
+        <w:t xml:space="preserve">; Lesley Uttley, Yuliang Weng, and Louise Falzon,</w:t>
+      </w:r>
+      <w:r>
+        <w:t xml:space="preserve"> </w:t>
+      </w:r>
+      <w:r>
+        <w:t xml:space="preserve">“What’s the Meta Now? More Updates on the Problems with Systematic Reviews,”</w:t>
+      </w:r>
+      <w:r>
+        <w:t xml:space="preserve"> </w:t>
+      </w:r>
+      <w:r>
+        <w:rPr>
+          <w:i/>
+          <w:iCs/>
+        </w:rPr>
+        <w:t xml:space="preserve">Journal of Clinical Epidemiology</w:t>
+      </w:r>
+      <w:r>
+        <w:t xml:space="preserve"> </w:t>
+      </w:r>
+      <w:r>
+        <w:t xml:space="preserve">198 (2026): 112393,</w:t>
+      </w:r>
+      <w:r>
+        <w:t xml:space="preserve"> </w:t>
+      </w:r>
+      <w:hyperlink r:id="rId199">
+        <w:r>
+          <w:rPr>
+            <w:rStyle w:val="Hyperlink"/>
+          </w:rPr>
+          <w:t xml:space="preserve">https://doi.org/10.1016/j.jclinepi.2026.112393</w:t>
+        </w:r>
+      </w:hyperlink>
+      <w:r>
+        <w:t xml:space="preserve">.</w:t>
+      </w:r>
+    </w:p>
+  </w:footnote>
+  <w:footnote w:id="201">
+    <w:p>
+      <w:pPr>
+        <w:pStyle w:val="FootnoteText"/>
+      </w:pPr>
+      <w:r>
+        <w:rPr>
+          <w:rStyle w:val="FootnoteReference"/>
+        </w:rPr>
+        <w:footnoteRef/>
+      </w:r>
+      <w:r>
+        <w:t xml:space="preserve"> </w:t>
+      </w:r>
+      <w:r>
+        <w:t xml:space="preserve">Julian H. Elliott et al.,</w:t>
+      </w:r>
+      <w:r>
+        <w:t xml:space="preserve"> </w:t>
+      </w:r>
+      <w:r>
+        <w:t xml:space="preserve">“Living Systematic Review: 1. Introduction, the Why, What, When, and How,”</w:t>
+      </w:r>
+      <w:r>
+        <w:t xml:space="preserve"> </w:t>
+      </w:r>
+      <w:r>
+        <w:rPr>
+          <w:i/>
+          <w:iCs/>
+        </w:rPr>
+        <w:t xml:space="preserve">Journal of Clinical Epidemiology</w:t>
+      </w:r>
+      <w:r>
+        <w:t xml:space="preserve"> </w:t>
+      </w:r>
+      <w:r>
+        <w:t xml:space="preserve">91 (2017): 23–30,</w:t>
+      </w:r>
+      <w:r>
+        <w:t xml:space="preserve"> </w:t>
+      </w:r>
+      <w:hyperlink r:id="rId202">
+        <w:r>
+          <w:rPr>
+            <w:rStyle w:val="Hyperlink"/>
+          </w:rPr>
+          <w:t xml:space="preserve">https://doi.org/10.1016/j.jclinepi.2017.08.010</w:t>
+        </w:r>
+      </w:hyperlink>
+      <w:r>
+        <w:t xml:space="preserve">.</w:t>
+      </w:r>
+    </w:p>
+  </w:footnote>
+  <w:footnote w:id="204">
+    <w:p>
+      <w:pPr>
+        <w:pStyle w:val="FootnoteText"/>
+      </w:pPr>
+      <w:r>
+        <w:rPr>
+          <w:rStyle w:val="FootnoteReference"/>
+        </w:rPr>
+        <w:footnoteRef/>
+      </w:r>
+      <w:r>
+        <w:t xml:space="preserve"> </w:t>
+      </w:r>
+      <w:r>
+        <w:t xml:space="preserve">Iain J. Marshall and Byron C. Wallace,</w:t>
+      </w:r>
+      <w:r>
+        <w:t xml:space="preserve"> </w:t>
+      </w:r>
+      <w:r>
+        <w:t xml:space="preserve">“Toward Systematic Review Automation: A Practical Guide to Using Machine Learning Tools in Research Synthesis,”</w:t>
+      </w:r>
+      <w:r>
+        <w:t xml:space="preserve"> </w:t>
+      </w:r>
+      <w:r>
+        <w:rPr>
+          <w:i/>
+          <w:iCs/>
+        </w:rPr>
+        <w:t xml:space="preserve">Systematic Reviews</w:t>
+      </w:r>
+      <w:r>
+        <w:t xml:space="preserve"> </w:t>
+      </w:r>
+      <w:r>
+        <w:t xml:space="preserve">8, no. 1 (2019): 163,</w:t>
+      </w:r>
+      <w:r>
+        <w:t xml:space="preserve"> </w:t>
+      </w:r>
+      <w:hyperlink r:id="rId205">
+        <w:r>
+          <w:rPr>
+            <w:rStyle w:val="Hyperlink"/>
+          </w:rPr>
+          <w:t xml:space="preserve">https://doi.org/10.1186/s13643-019-1074-9</w:t>
+        </w:r>
+      </w:hyperlink>
+      <w:r>
+        <w:t xml:space="preserve">.</w:t>
+      </w:r>
+    </w:p>
+  </w:footnote>
+  <w:footnote w:id="206">
+    <w:p>
+      <w:pPr>
+        <w:pStyle w:val="FootnoteText"/>
+      </w:pPr>
+      <w:r>
+        <w:rPr>
+          <w:rStyle w:val="FootnoteReference"/>
+        </w:rPr>
+        <w:footnoteRef/>
+      </w:r>
+      <w:r>
+        <w:t xml:space="preserve"> </w:t>
+      </w:r>
+      <w:r>
+        <w:t xml:space="preserve">Aymeric Blaizot et al.,</w:t>
+      </w:r>
+      <w:r>
+        <w:t xml:space="preserve"> </w:t>
+      </w:r>
+      <w:r>
+        <w:t xml:space="preserve">“Using Artificial Intelligence Methods for Systematic Review in Health Sciences: A Systematic Review,”</w:t>
+      </w:r>
+      <w:r>
+        <w:t xml:space="preserve"> </w:t>
+      </w:r>
+      <w:r>
+        <w:rPr>
+          <w:i/>
+          <w:iCs/>
+        </w:rPr>
+        <w:t xml:space="preserve">Research Synthesis Methods</w:t>
+      </w:r>
+      <w:r>
+        <w:t xml:space="preserve"> </w:t>
+      </w:r>
+      <w:r>
+        <w:t xml:space="preserve">13, no. 3 (2022): 353–62,</w:t>
+      </w:r>
+      <w:r>
+        <w:t xml:space="preserve"> </w:t>
+      </w:r>
+      <w:hyperlink r:id="rId207">
+        <w:r>
+          <w:rPr>
+            <w:rStyle w:val="Hyperlink"/>
+          </w:rPr>
+          <w:t xml:space="preserve">https://doi.org/10.1002/jrsm.1553</w:t>
+        </w:r>
+      </w:hyperlink>
+      <w:r>
+        <w:t xml:space="preserve">; M. Sharmila A. Sousa et al.,</w:t>
+      </w:r>
+      <w:r>
+        <w:t xml:space="preserve"> </w:t>
+      </w:r>
+      <w:r>
+        <w:t xml:space="preserve">“The Landscape of Artificial Intelligence Tools and Platforms for Evidence Synthesis: A Scoping Review,”</w:t>
+      </w:r>
+      <w:r>
+        <w:t xml:space="preserve"> </w:t>
+      </w:r>
+      <w:r>
+        <w:rPr>
+          <w:i/>
+          <w:iCs/>
+        </w:rPr>
+        <w:t xml:space="preserve">Systematic Reviews</w:t>
+      </w:r>
+      <w:r>
+        <w:t xml:space="preserve"> </w:t>
+      </w:r>
+      <w:r>
+        <w:t xml:space="preserve">15, no. 1 (2026): 82,</w:t>
+      </w:r>
+      <w:r>
+        <w:t xml:space="preserve"> </w:t>
+      </w:r>
+      <w:hyperlink r:id="rId208">
+        <w:r>
+          <w:rPr>
+            <w:rStyle w:val="Hyperlink"/>
+          </w:rPr>
+          <w:t xml:space="preserve">https://doi.org/10.1186/s13643-025-02842-y</w:t>
+        </w:r>
+      </w:hyperlink>
+      <w:r>
+        <w:t xml:space="preserve">.</w:t>
+      </w:r>
+    </w:p>
+  </w:footnote>
+  <w:footnote w:id="219">
+    <w:p>
+      <w:pPr>
+        <w:pStyle w:val="FootnoteText"/>
+      </w:pPr>
+      <w:r>
+        <w:rPr>
+          <w:rStyle w:val="FootnoteReference"/>
+        </w:rPr>
+        <w:footnoteRef/>
+      </w:r>
+      <w:r>
+        <w:t xml:space="preserve"> </w:t>
+      </w:r>
+      <w:r>
+        <w:t xml:space="preserve">Fabrizio Gilardi, Meysam Alizadeh, and Maël Kubli,</w:t>
+      </w:r>
+      <w:r>
+        <w:t xml:space="preserve"> </w:t>
+      </w:r>
+      <w:r>
+        <w:t xml:space="preserve">“</w:t>
+      </w:r>
+      <w:r>
+        <w:t xml:space="preserve">ChatGPT</w:t>
+      </w:r>
+      <w:r>
+        <w:t xml:space="preserve"> </w:t>
+      </w:r>
+      <w:r>
+        <w:t xml:space="preserve">Outperforms Crowd Workers for Text-Annotation Tasks,”</w:t>
+      </w:r>
+      <w:r>
+        <w:t xml:space="preserve"> </w:t>
+      </w:r>
+      <w:r>
+        <w:rPr>
+          <w:i/>
+          <w:iCs/>
+        </w:rPr>
         <w:t xml:space="preserve">Proceedings of the National Academy of Sciences</w:t>
       </w:r>
       <w:r>
@@ -12352,7 +14417,7 @@
       <w:r>
         <w:t xml:space="preserve"> </w:t>
       </w:r>
-      <w:hyperlink r:id="rId183">
+      <w:hyperlink r:id="rId220">
         <w:r>
           <w:rPr>
             <w:rStyle w:val="Hyperlink"/>
@@ -12397,7 +14462,7 @@
       <w:r>
         <w:t xml:space="preserve"> </w:t>
       </w:r>
-      <w:hyperlink r:id="rId184">
+      <w:hyperlink r:id="rId221">
         <w:r>
           <w:rPr>
             <w:rStyle w:val="Hyperlink"/>
@@ -12433,7 +14498,7 @@
       <w:r>
         <w:t xml:space="preserve"> </w:t>
       </w:r>
-      <w:hyperlink r:id="rId185">
+      <w:hyperlink r:id="rId222">
         <w:r>
           <w:rPr>
             <w:rStyle w:val="Hyperlink"/>
@@ -12446,7 +14511,7 @@
       </w:r>
     </w:p>
   </w:footnote>
-  <w:footnote w:id="188">
+  <w:footnote w:id="225">
     <w:p>
       <w:pPr>
         <w:pStyle w:val="FootnoteText"/>
@@ -12488,7 +14553,7 @@
       <w:r>
         <w:t xml:space="preserve"> </w:t>
       </w:r>
-      <w:hyperlink r:id="rId189">
+      <w:hyperlink r:id="rId226">
         <w:r>
           <w:rPr>
             <w:rStyle w:val="Hyperlink"/>
@@ -12501,7 +14566,7 @@
       </w:r>
     </w:p>
   </w:footnote>
-  <w:footnote w:id="190">
+  <w:footnote w:id="227">
     <w:p>
       <w:pPr>
         <w:pStyle w:val="FootnoteText"/>
@@ -12543,7 +14608,7 @@
       <w:r>
         <w:t xml:space="preserve"> </w:t>
       </w:r>
-      <w:hyperlink r:id="rId191">
+      <w:hyperlink r:id="rId228">
         <w:r>
           <w:rPr>
             <w:rStyle w:val="Hyperlink"/>
@@ -12556,7 +14621,7 @@
       </w:r>
     </w:p>
   </w:footnote>
-  <w:footnote w:id="194">
+  <w:footnote w:id="231">
     <w:p>
       <w:pPr>
         <w:pStyle w:val="FootnoteText"/>
@@ -12613,7 +14678,7 @@
       <w:r>
         <w:t xml:space="preserve"> </w:t>
       </w:r>
-      <w:hyperlink r:id="rId195">
+      <w:hyperlink r:id="rId232">
         <w:r>
           <w:rPr>
             <w:rStyle w:val="Hyperlink"/>
@@ -12626,7 +14691,7 @@
       </w:r>
     </w:p>
   </w:footnote>
-  <w:footnote w:id="198">
+  <w:footnote w:id="235">
     <w:p>
       <w:pPr>
         <w:pStyle w:val="FootnoteText"/>
@@ -12668,7 +14733,7 @@
       <w:r>
         <w:t xml:space="preserve"> </w:t>
       </w:r>
-      <w:hyperlink r:id="rId199">
+      <w:hyperlink r:id="rId236">
         <w:r>
           <w:rPr>
             <w:rStyle w:val="Hyperlink"/>
@@ -12681,7 +14746,7 @@
       </w:r>
     </w:p>
   </w:footnote>
-  <w:footnote w:id="201">
+  <w:footnote w:id="238">
     <w:p>
       <w:pPr>
         <w:pStyle w:val="FootnoteText"/>
@@ -12735,7 +14800,7 @@
       <w:r>
         <w:t xml:space="preserve"> </w:t>
       </w:r>
-      <w:hyperlink r:id="rId202">
+      <w:hyperlink r:id="rId239">
         <w:r>
           <w:rPr>
             <w:rStyle w:val="Hyperlink"/>
@@ -12792,7 +14857,7 @@
       <w:r>
         <w:t xml:space="preserve"> </w:t>
       </w:r>
-      <w:hyperlink r:id="rId203">
+      <w:hyperlink r:id="rId240">
         <w:r>
           <w:rPr>
             <w:rStyle w:val="Hyperlink"/>
@@ -12805,7 +14870,7 @@
       </w:r>
     </w:p>
   </w:footnote>
-  <w:footnote w:id="204">
+  <w:footnote w:id="241">
     <w:p>
       <w:pPr>
         <w:pStyle w:val="FootnoteText"/>
@@ -12871,7 +14936,7 @@
       <w:r>
         <w:t xml:space="preserve"> </w:t>
       </w:r>
-      <w:hyperlink r:id="rId205">
+      <w:hyperlink r:id="rId242">
         <w:r>
           <w:rPr>
             <w:rStyle w:val="Hyperlink"/>
@@ -12884,7 +14949,7 @@
       </w:r>
     </w:p>
   </w:footnote>
-  <w:footnote w:id="215">
+  <w:footnote w:id="252">
     <w:p>
       <w:pPr>
         <w:pStyle w:val="FootnoteText"/>
@@ -12928,7 +14993,7 @@
       <w:r>
         <w:t xml:space="preserve"> </w:t>
       </w:r>
-      <w:hyperlink r:id="rId216">
+      <w:hyperlink r:id="rId253">
         <w:r>
           <w:rPr>
             <w:rStyle w:val="Hyperlink"/>

</xml_diff>

<commit_message>
feat: publish research skills and agent discussion
</commit_message>
<xml_diff>
--- a/field-guide/book/From-Question-to-Evidence.docx
+++ b/field-guide/book/From-Question-to-Evidence.docx
@@ -130,7 +130,7 @@
         <w:pStyle w:val="BodyText"/>
       </w:pPr>
       <w:r>
-        <w:t xml:space="preserve">The full field guide follows a qualitative project from its first question to a documented corpus, an analysis, and a public claim. We are publishing it in reviewed modules so readers can use, test, and challenge each part before the first edition closes. The current revision contains two complete modules. The first follows the path from a question to an evidence map. The second carries the same logic into a literature review. A new synthesis chapter examines how review articles and meta-analyses are becoming open, versioned research objects. A second bridge chapter shows how AI can accelerate the construction of event databases while preserving provenance, validation, and causal discipline. A third complete module will connect the collection plan to a responsibly assembled research corpus. Later modules will address preparation, analysis, disconfirmation, writing, sharing, and maintenance.</w:t>
+        <w:t xml:space="preserve">The full field guide follows a qualitative project from its first question to a documented corpus, an analysis, and a public claim. We are publishing it in reviewed modules so readers can use, test, and challenge each part before the first edition closes. The current revision contains two complete modules. The first follows the path from a question to an evidence map. The second carries the same logic into a literature review. A new synthesis chapter examines how review articles and meta-analyses are becoming open, versioned research objects. It also shows how reusable skills, bounded agents, and versioned project context can support discovery, gap analysis, methodology, and collection without transferring scholarly authority to the system. A second bridge chapter shows how AI can accelerate the construction of event databases while preserving provenance, validation, and causal discipline. A third complete module will connect the collection plan to a responsibly assembled research corpus. Later modules will address preparation, analysis, disconfirmation, writing, sharing, and maintenance.</w:t>
       </w:r>
     </w:p>
     <w:p>
@@ -8329,7 +8329,7 @@
     </w:p>
     <w:bookmarkEnd w:id="180"/>
     <w:bookmarkEnd w:id="181"/>
-    <w:bookmarkStart w:id="218" w:name="X8b4529a10d3ba454a8d9dd74d260212e93d1d6f"/>
+    <w:bookmarkStart w:id="228" w:name="X8b4529a10d3ba454a8d9dd74d260212e93d1d6f"/>
     <w:p>
       <w:pPr>
         <w:pStyle w:val="Heading1"/>
@@ -8372,7 +8372,7 @@
       </w:r>
     </w:p>
     <w:bookmarkEnd w:id="182"/>
-    <w:bookmarkStart w:id="211" w:name="learn-13"/>
+    <w:bookmarkStart w:id="221" w:name="learn-13"/>
     <w:p>
       <w:pPr>
         <w:pStyle w:val="Heading2"/>
@@ -8805,13 +8805,680 @@
       </w:r>
     </w:p>
     <w:bookmarkEnd w:id="209"/>
-    <w:bookmarkStart w:id="210" w:name="separate-the-present-from-the-forecast"/>
+    <w:bookmarkStart w:id="219" w:name="X8056ed0eaf2d5a7e64d8c63bb7fbc846487b0a9"/>
     <w:p>
       <w:pPr>
         <w:pStyle w:val="Heading3"/>
       </w:pPr>
       <w:r>
-        <w:t xml:space="preserve">18.2.9 Separate the present from the forecast</w:t>
+        <w:t xml:space="preserve">18.2.9 Build skills, agents, and project context as separate layers</w:t>
+      </w:r>
+    </w:p>
+    <w:p>
+      <w:pPr>
+        <w:pStyle w:val="FirstParagraph"/>
+      </w:pPr>
+      <w:r>
+        <w:t xml:space="preserve">Repeated AI use becomes more reliable when a project separates procedure, execution, and memory. A</w:t>
+      </w:r>
+      <w:r>
+        <w:t xml:space="preserve"> </w:t>
+      </w:r>
+      <w:r>
+        <w:rPr>
+          <w:b/>
+          <w:bCs/>
+        </w:rPr>
+        <w:t xml:space="preserve">skill is a reusable research procedure</w:t>
+      </w:r>
+      <w:r>
+        <w:t xml:space="preserve">. It specifies when a task should run, what inputs it accepts, which steps it follows, what it must produce, and how its output will be checked. An</w:t>
+      </w:r>
+      <w:r>
+        <w:t xml:space="preserve"> </w:t>
+      </w:r>
+      <w:r>
+        <w:rPr>
+          <w:b/>
+          <w:bCs/>
+        </w:rPr>
+        <w:t xml:space="preserve">agent is a bounded executor</w:t>
+      </w:r>
+      <w:r>
+        <w:t xml:space="preserve"> </w:t>
+      </w:r>
+      <w:r>
+        <w:t xml:space="preserve">that receives a goal, approved tools, selected context, stopping conditions, and an output schema. It may combine several skills and adjust its plan as evidence appears. Neither should become the authority that decides what the project means.</w:t>
+      </w:r>
+    </w:p>
+    <w:p>
+      <w:pPr>
+        <w:pStyle w:val="BodyText"/>
+      </w:pPr>
+      <w:r>
+        <w:t xml:space="preserve">This distinction prevents a common design error. A long prompt may contain a useful procedure, but it remains difficult to test, version, and reuse. A general agent may take many actions, but breadth makes its errors harder to locate. Skills should hold stable method. Agents should coordinate bounded work. Human gates should control consequential changes to the corpus, protocol, argument, and public record.</w:t>
+      </w:r>
+    </w:p>
+    <w:bookmarkStart w:id="210" w:name="design-a-minimal-research-skill-stack"/>
+    <w:p>
+      <w:pPr>
+        <w:pStyle w:val="Heading4"/>
+      </w:pPr>
+      <w:r>
+        <w:t xml:space="preserve">18.2.9.1 Design a minimal research skill stack</w:t>
+      </w:r>
+    </w:p>
+    <w:p>
+      <w:pPr>
+        <w:pStyle w:val="FirstParagraph"/>
+      </w:pPr>
+      <w:r>
+        <w:t xml:space="preserve">A skill should encode knowledge that the project would otherwise have to reconstruct. Its manifest should name its purpose, triggers, required inputs, procedure, output schema, verification rules, failure conditions, permissions, version, and benchmark cases. High-risk operations need narrow instructions and deterministic checks. Interpretive tasks need room for alternatives, but they still require evidence identifiers and an abstention route.</w:t>
+      </w:r>
+    </w:p>
+    <w:p>
+      <w:pPr>
+        <w:pStyle w:val="BodyText"/>
+      </w:pPr>
+      <w:r>
+        <w:t xml:space="preserve">Five skills provide a useful starting stack for review-based social research:</w:t>
+      </w:r>
+    </w:p>
+    <w:tbl>
+      <w:tblPr>
+        <w:tblStyle w:val="Table"/>
+        <w:tblW w:type="pct" w:w="5000"/>
+        <w:tblLayout w:type="fixed"/>
+        <w:tblLook w:firstRow="1" w:lastRow="0" w:firstColumn="0" w:lastColumn="0" w:noHBand="0" w:noVBand="0" w:val="0020"/>
+      </w:tblPr>
+      <w:tblGrid>
+        <w:gridCol w:w="1980"/>
+        <w:gridCol w:w="1980"/>
+        <w:gridCol w:w="1980"/>
+        <w:gridCol w:w="1980"/>
+      </w:tblGrid>
+      <w:tr>
+        <w:trPr>
+          <w:tblHeader w:val="on"/>
+        </w:trPr>
+        <w:tc>
+          <w:tcPr/>
+          <w:p>
+            <w:pPr>
+              <w:pStyle w:val="Compact"/>
+            </w:pPr>
+            <w:r>
+              <w:t xml:space="preserve">Research function</w:t>
+            </w:r>
+          </w:p>
+        </w:tc>
+        <w:tc>
+          <w:tcPr/>
+          <w:p>
+            <w:pPr>
+              <w:pStyle w:val="Compact"/>
+            </w:pPr>
+            <w:r>
+              <w:t xml:space="preserve">Reusable skill</w:t>
+            </w:r>
+          </w:p>
+        </w:tc>
+        <w:tc>
+          <w:tcPr/>
+          <w:p>
+            <w:pPr>
+              <w:pStyle w:val="Compact"/>
+            </w:pPr>
+            <w:r>
+              <w:t xml:space="preserve">Required artifact</w:t>
+            </w:r>
+          </w:p>
+        </w:tc>
+        <w:tc>
+          <w:tcPr/>
+          <w:p>
+            <w:pPr>
+              <w:pStyle w:val="Compact"/>
+            </w:pPr>
+            <w:r>
+              <w:t xml:space="preserve">Human gate</w:t>
+            </w:r>
+          </w:p>
+        </w:tc>
+      </w:tr>
+      <w:tr>
+        <w:tc>
+          <w:tcPr/>
+          <w:p>
+            <w:pPr>
+              <w:pStyle w:val="Compact"/>
+            </w:pPr>
+            <w:r>
+              <w:t xml:space="preserve">Literature discovery</w:t>
+            </w:r>
+          </w:p>
+        </w:tc>
+        <w:tc>
+          <w:tcPr/>
+          <w:p>
+            <w:pPr>
+              <w:pStyle w:val="Compact"/>
+            </w:pPr>
+            <w:r>
+              <w:rPr>
+                <w:b/>
+                <w:bCs/>
+              </w:rPr>
+              <w:t xml:space="preserve">Literature-discovery skill</w:t>
+            </w:r>
+          </w:p>
+        </w:tc>
+        <w:tc>
+          <w:tcPr/>
+          <w:p>
+            <w:pPr>
+              <w:pStyle w:val="Compact"/>
+            </w:pPr>
+            <w:r>
+              <w:t xml:space="preserve">Candidate register, query history, discovery-route coverage</w:t>
+            </w:r>
+          </w:p>
+        </w:tc>
+        <w:tc>
+          <w:tcPr/>
+          <w:p>
+            <w:pPr>
+              <w:pStyle w:val="Compact"/>
+            </w:pPr>
+            <w:r>
+              <w:t xml:space="preserve">Approve final inclusion and exclusion</w:t>
+            </w:r>
+          </w:p>
+        </w:tc>
+      </w:tr>
+      <w:tr>
+        <w:tc>
+          <w:tcPr/>
+          <w:p>
+            <w:pPr>
+              <w:pStyle w:val="Compact"/>
+            </w:pPr>
+            <w:r>
+              <w:t xml:space="preserve">Gap identification</w:t>
+            </w:r>
+          </w:p>
+        </w:tc>
+        <w:tc>
+          <w:tcPr/>
+          <w:p>
+            <w:pPr>
+              <w:pStyle w:val="Compact"/>
+            </w:pPr>
+            <w:r>
+              <w:rPr>
+                <w:b/>
+                <w:bCs/>
+              </w:rPr>
+              <w:t xml:space="preserve">Gap-analysis skill</w:t>
+            </w:r>
+          </w:p>
+        </w:tc>
+        <w:tc>
+          <w:tcPr/>
+          <w:p>
+            <w:pPr>
+              <w:pStyle w:val="Compact"/>
+            </w:pPr>
+            <w:r>
+              <w:t xml:space="preserve">Gap-claim register with supporting and contrary corpus entries</w:t>
+            </w:r>
+          </w:p>
+        </w:tc>
+        <w:tc>
+          <w:tcPr/>
+          <w:p>
+            <w:pPr>
+              <w:pStyle w:val="Compact"/>
+            </w:pPr>
+            <w:r>
+              <w:t xml:space="preserve">Authorize any claim that a field lacks evidence</w:t>
+            </w:r>
+          </w:p>
+        </w:tc>
+      </w:tr>
+      <w:tr>
+        <w:tc>
+          <w:tcPr/>
+          <w:p>
+            <w:pPr>
+              <w:pStyle w:val="Compact"/>
+            </w:pPr>
+            <w:r>
+              <w:t xml:space="preserve">Methodology</w:t>
+            </w:r>
+          </w:p>
+        </w:tc>
+        <w:tc>
+          <w:tcPr/>
+          <w:p>
+            <w:pPr>
+              <w:pStyle w:val="Compact"/>
+            </w:pPr>
+            <w:r>
+              <w:rPr>
+                <w:b/>
+                <w:bCs/>
+              </w:rPr>
+              <w:t xml:space="preserve">Methodology-audit skill</w:t>
+            </w:r>
+          </w:p>
+        </w:tc>
+        <w:tc>
+          <w:tcPr/>
+          <w:p>
+            <w:pPr>
+              <w:pStyle w:val="Compact"/>
+            </w:pPr>
+            <w:r>
+              <w:t xml:space="preserve">Question-design alignment memo, threat register, proposed tests</w:t>
+            </w:r>
+          </w:p>
+        </w:tc>
+        <w:tc>
+          <w:tcPr/>
+          <w:p>
+            <w:pPr>
+              <w:pStyle w:val="Compact"/>
+            </w:pPr>
+            <w:r>
+              <w:t xml:space="preserve">Approve protocol or analysis changes</w:t>
+            </w:r>
+          </w:p>
+        </w:tc>
+      </w:tr>
+      <w:tr>
+        <w:tc>
+          <w:tcPr/>
+          <w:p>
+            <w:pPr>
+              <w:pStyle w:val="Compact"/>
+            </w:pPr>
+            <w:r>
+              <w:t xml:space="preserve">Data collection</w:t>
+            </w:r>
+          </w:p>
+        </w:tc>
+        <w:tc>
+          <w:tcPr/>
+          <w:p>
+            <w:pPr>
+              <w:pStyle w:val="Compact"/>
+            </w:pPr>
+            <w:r>
+              <w:rPr>
+                <w:b/>
+                <w:bCs/>
+              </w:rPr>
+              <w:t xml:space="preserve">Data-collection skill</w:t>
+            </w:r>
+          </w:p>
+        </w:tc>
+        <w:tc>
+          <w:tcPr/>
+          <w:p>
+            <w:pPr>
+              <w:pStyle w:val="Compact"/>
+            </w:pPr>
+            <w:r>
+              <w:t xml:space="preserve">Candidate records, provenance links, validation report</w:t>
+            </w:r>
+          </w:p>
+        </w:tc>
+        <w:tc>
+          <w:tcPr/>
+          <w:p>
+            <w:pPr>
+              <w:pStyle w:val="Compact"/>
+            </w:pPr>
+            <w:r>
+              <w:t xml:space="preserve">Promote records into the research corpus</w:t>
+            </w:r>
+          </w:p>
+        </w:tc>
+      </w:tr>
+      <w:tr>
+        <w:tc>
+          <w:tcPr/>
+          <w:p>
+            <w:pPr>
+              <w:pStyle w:val="Compact"/>
+            </w:pPr>
+            <w:r>
+              <w:t xml:space="preserve">Project continuity</w:t>
+            </w:r>
+          </w:p>
+        </w:tc>
+        <w:tc>
+          <w:tcPr/>
+          <w:p>
+            <w:pPr>
+              <w:pStyle w:val="Compact"/>
+            </w:pPr>
+            <w:r>
+              <w:rPr>
+                <w:b/>
+                <w:bCs/>
+              </w:rPr>
+              <w:t xml:space="preserve">Project-context skill</w:t>
+            </w:r>
+          </w:p>
+        </w:tc>
+        <w:tc>
+          <w:tcPr/>
+          <w:p>
+            <w:pPr>
+              <w:pStyle w:val="Compact"/>
+            </w:pPr>
+            <w:r>
+              <w:t xml:space="preserve">Versioned project context packet and proposed change log</w:t>
+            </w:r>
+          </w:p>
+        </w:tc>
+        <w:tc>
+          <w:tcPr/>
+          <w:p>
+            <w:pPr>
+              <w:pStyle w:val="Compact"/>
+            </w:pPr>
+            <w:r>
+              <w:t xml:space="preserve">Modify the project charter, concepts, or accepted claims</w:t>
+            </w:r>
+          </w:p>
+        </w:tc>
+      </w:tr>
+    </w:tbl>
+    <w:p>
+      <w:pPr>
+        <w:pStyle w:val="BodyText"/>
+      </w:pPr>
+      <w:r>
+        <w:t xml:space="preserve">The literature-discovery skill should translate concepts into search vocabulary, vary discovery routes, preserve queries, deduplicate candidates, and flag coverage risks. It should not produce a list of “the most important” publications from model recall. Its unit of output is a candidate with a discovery route and verification status.</w:t>
+      </w:r>
+    </w:p>
+    <w:p>
+      <w:pPr>
+        <w:pStyle w:val="BodyText"/>
+      </w:pPr>
+      <w:r>
+        <w:t xml:space="preserve">The gap-analysis skill should distinguish several kinds of gap. A corpus may lack evidence about a population, setting, period, mechanism, measure, comparison, or method. It may contain contradictory findings, weak replication, or a concept that has not been operationalized consistently. These are different research problems. The skill must also distinguish absence in the bounded corpus from absence in the field. A</w:t>
+      </w:r>
+      <w:r>
+        <w:t xml:space="preserve"> </w:t>
+      </w:r>
+      <w:r>
+        <w:rPr>
+          <w:b/>
+          <w:bCs/>
+        </w:rPr>
+        <w:t xml:space="preserve">false gap</w:t>
+      </w:r>
+      <w:r>
+        <w:t xml:space="preserve"> </w:t>
+      </w:r>
+      <w:r>
+        <w:t xml:space="preserve">occurs when failed retrieval, unfamiliar vocabulary, access limits, language bias, or an incorrect boundary is presented as a missing body of knowledge.</w:t>
+      </w:r>
+    </w:p>
+    <w:p>
+      <w:pPr>
+        <w:pStyle w:val="BodyText"/>
+      </w:pPr>
+      <w:r>
+        <w:t xml:space="preserve">The methodology-audit skill should compare the research question with the evidence, design, unit of analysis, estimand, inferential claim, and known threats. It can propose alternative designs or sensitivity tests. It should not silently rewrite the approved protocol. Every recommendation needs a location, a reason, the evidence affected, and the decision that remains with the researcher.</w:t>
+      </w:r>
+    </w:p>
+    <w:p>
+      <w:pPr>
+        <w:pStyle w:val="BodyText"/>
+      </w:pPr>
+      <w:r>
+        <w:t xml:space="preserve">The data-collection skill should enforce the transformations defined elsewhere in this book. It can create candidate records, check required fields, preserve source spans, detect likely duplicates, and route uncertain cases. It should write only to a staging area. Promotion into the verified corpus requires source review, rights and ethics checks, and a named human decision.</w:t>
+      </w:r>
+    </w:p>
+    <w:p>
+      <w:pPr>
+        <w:pStyle w:val="BodyText"/>
+      </w:pPr>
+      <w:r>
+        <w:t xml:space="preserve">The project-context skill is different from the other four. Its task is not to perform a substantive review operation. It prepares the smallest sufficient account of the project for another task. It retrieves the current research question, approved scope, working concepts, source hierarchy, ethical limits, corpus and codebook versions, accepted decisions, unresolved disputes, artifact locations, and active release. It also reports conflicts among these objects rather than resolving them through a plausible summary.</w:t>
+      </w:r>
+    </w:p>
+    <w:p>
+      <w:pPr>
+        <w:pStyle w:val="BodyText"/>
+      </w:pPr>
+      <w:r>
+        <w:t xml:space="preserve">Skills need tests before routine use. Discovery can be evaluated through recall, false exclusions, route diversity, and labor saved. Gap analysis needs cases where a missing concept is genuine and cases where it is only hidden by vocabulary or indexing. Methodology audits need known design defects and defensible designs that should not be criticized. Data collection needs stratified extraction and provenance benchmarks. Project-context tests should include stale decisions, conflicting versions, renamed concepts, and inaccessible artifacts.</w:t>
+      </w:r>
+    </w:p>
+    <w:bookmarkEnd w:id="210"/>
+    <w:bookmarkStart w:id="215" w:name="Xcfcda89ca1fe5106ead5e93afe90e917fcff108"/>
+    <w:p>
+      <w:pPr>
+        <w:pStyle w:val="Heading4"/>
+      </w:pPr>
+      <w:r>
+        <w:t xml:space="preserve">18.2.9.2 Assign agents work packages, not identities</w:t>
+      </w:r>
+    </w:p>
+    <w:p>
+      <w:pPr>
+        <w:pStyle w:val="FirstParagraph"/>
+      </w:pPr>
+      <w:r>
+        <w:t xml:space="preserve">Language-model agents can interleave planning, retrieval, tool use, and revision.</w:t>
+      </w:r>
+      <w:r>
+        <w:rPr>
+          <w:rStyle w:val="FootnoteReference"/>
+        </w:rPr>
+        <w:footnoteReference w:id="211"/>
+      </w:r>
+      <w:r>
+        <w:t xml:space="preserve"> </w:t>
+      </w:r>
+      <w:r>
+        <w:t xml:space="preserve">Research prototypes have also combined observation, retrieval, reflection, and planning in persistent agent architectures.</w:t>
+      </w:r>
+      <w:r>
+        <w:rPr>
+          <w:rStyle w:val="FootnoteReference"/>
+        </w:rPr>
+        <w:footnoteReference w:id="213"/>
+      </w:r>
+      <w:r>
+        <w:t xml:space="preserve"> </w:t>
+      </w:r>
+      <w:r>
+        <w:t xml:space="preserve">These patterns make multi-step research assistance possible. They do not show that an agent can independently establish relevance, a scholarly gap, methodological validity, or causal interpretation.</w:t>
+      </w:r>
+    </w:p>
+    <w:p>
+      <w:pPr>
+        <w:pStyle w:val="BodyText"/>
+      </w:pPr>
+      <w:r>
+        <w:t xml:space="preserve">A research agent should therefore receive a work order. The order names one goal, the skill versions it may invoke, permitted collections and tools, project context version, expected artifacts, prohibited actions, stopping rule, and escalation conditions. The agent should return evidence-linked proposals and an execution log. It should not inherit an open-ended instruction to “finish the literature review.”</w:t>
+      </w:r>
+    </w:p>
+    <w:p>
+      <w:pPr>
+        <w:pStyle w:val="BodyText"/>
+      </w:pPr>
+      <w:r>
+        <w:t xml:space="preserve">The five skills above can support corresponding agents. A literature scout executes searches and updates the candidate register but cannot reject the final record. A gap analyst compares the verified corpus with the review protocol and produces candidate gap claims with counterevidence. A methodology critic tests alignment and assumptions without editing the protocol. A collection steward prepares and validates candidate data while leaving promotion to a reviewer. A context curator assembles the current project packet and proposes corrections without overwriting canonical project records.</w:t>
+      </w:r>
+    </w:p>
+    <w:p>
+      <w:pPr>
+        <w:pStyle w:val="BodyText"/>
+      </w:pPr>
+      <w:r>
+        <w:t xml:space="preserve">Agent specialization should reduce ambiguity, not imitate an academic department. Adding several agents that use the same model, sources, and instructions does not create independent corroboration. Their errors remain correlated. Agreement among them is not consensus, and disagreement is not automatically informative. Use multiple agents when tasks can be separated by evidence, method, or validation role. Do not create a panel merely to generate more text.</w:t>
+      </w:r>
+    </w:p>
+    <w:p>
+      <w:pPr>
+        <w:pStyle w:val="BodyText"/>
+      </w:pPr>
+      <w:r>
+        <w:t xml:space="preserve">Apply least privilege. A discovery agent usually needs search and read access, not permission to change the corpus. A methodology critic needs the protocol and selected artifacts, not participant data. A context curator needs approved project records, but it should not publish, delete, or revise them. Rights, privacy, security, and cost boundaries belong in the work order rather than in an informal reminder.</w:t>
+      </w:r>
+    </w:p>
+    <w:p>
+      <w:pPr>
+        <w:pStyle w:val="BodyText"/>
+      </w:pPr>
+      <w:r>
+        <w:t xml:space="preserve">Consequential decisions require explicit human gates. These include approving inclusion and exclusion, declaring a research gap, changing the research question or protocol, promoting a candidate record, accepting a new variable, interpreting a causal relationship, and releasing a public claim. The gate should record who decided, which agent output was reviewed, what evidence supported the decision, and what changed downstream.</w:t>
+      </w:r>
+    </w:p>
+    <w:bookmarkEnd w:id="215"/>
+    <w:bookmarkStart w:id="218" w:name="Xc4ca27d5342aed56b7b108ef51b44a0c390f886"/>
+    <w:p>
+      <w:pPr>
+        <w:pStyle w:val="Heading4"/>
+      </w:pPr>
+      <w:r>
+        <w:t xml:space="preserve">18.2.9.3 Preserve broad context through governed retrieval</w:t>
+      </w:r>
+    </w:p>
+    <w:p>
+      <w:pPr>
+        <w:pStyle w:val="FirstParagraph"/>
+      </w:pPr>
+      <w:r>
+        <w:t xml:space="preserve">The broad project context should live outside the conversation. A chat transcript mixes instructions, exploration, corrections, and obsolete claims. Treating all of it as memory makes current and superseded decisions difficult to distinguish. Supplying the entire project archive is not a solution either. Empirical work on long-context models shows that access to a long input does not ensure reliable use of information throughout that input.</w:t>
+      </w:r>
+      <w:r>
+        <w:rPr>
+          <w:rStyle w:val="FootnoteReference"/>
+        </w:rPr>
+        <w:footnoteReference w:id="216"/>
+      </w:r>
+    </w:p>
+    <w:p>
+      <w:pPr>
+        <w:pStyle w:val="BodyText"/>
+      </w:pPr>
+      <w:r>
+        <w:t xml:space="preserve">Create a</w:t>
+      </w:r>
+      <w:r>
+        <w:t xml:space="preserve"> </w:t>
+      </w:r>
+      <w:r>
+        <w:rPr>
+          <w:b/>
+          <w:bCs/>
+        </w:rPr>
+        <w:t xml:space="preserve">project context packet</w:t>
+      </w:r>
+      <w:r>
+        <w:t xml:space="preserve"> </w:t>
+      </w:r>
+      <w:r>
+        <w:t xml:space="preserve">with three layers. The stable layer contains the research question, scope, central concepts, evidence standards, ethics and rights constraints, and authority for decisions. The current-state layer names the active stage, corpus and codebook versions, accepted claims, unresolved questions, recent decisions, and release status. The task layer contains only the materials, instructions, and stopping rule needed for the present work.</w:t>
+      </w:r>
+    </w:p>
+    <w:p>
+      <w:pPr>
+        <w:pStyle w:val="BodyText"/>
+      </w:pPr>
+      <w:r>
+        <w:t xml:space="preserve">Use progressive disclosure. Every agent receives a short project card and the task layer. It retrieves method, corpus, or source details only when the work requires them. Each retrieved item carries a stable identifier, version, date, and authority status. This design preserves the global argument while reducing irrelevant material and exposure of sensitive records.</w:t>
+      </w:r>
+    </w:p>
+    <w:p>
+      <w:pPr>
+        <w:pStyle w:val="BodyText"/>
+      </w:pPr>
+      <w:r>
+        <w:t xml:space="preserve">The project context packet is a map, not a substitute for evidence. It may say that a definition was adopted in decision</w:t>
+      </w:r>
+      <w:r>
+        <w:t xml:space="preserve"> </w:t>
+      </w:r>
+      <w:r>
+        <w:rPr>
+          <w:rStyle w:val="VerbatimChar"/>
+        </w:rPr>
+        <w:t xml:space="preserve">D-014</w:t>
+      </w:r>
+      <w:r>
+        <w:t xml:space="preserve">, that corpus</w:t>
+      </w:r>
+      <w:r>
+        <w:t xml:space="preserve"> </w:t>
+      </w:r>
+      <w:r>
+        <w:rPr>
+          <w:rStyle w:val="VerbatimChar"/>
+        </w:rPr>
+        <w:t xml:space="preserve">C-03</w:t>
+      </w:r>
+      <w:r>
+        <w:t xml:space="preserve"> </w:t>
+      </w:r>
+      <w:r>
+        <w:t xml:space="preserve">supports claim</w:t>
+      </w:r>
+      <w:r>
+        <w:t xml:space="preserve"> </w:t>
+      </w:r>
+      <w:r>
+        <w:rPr>
+          <w:rStyle w:val="VerbatimChar"/>
+        </w:rPr>
+        <w:t xml:space="preserve">CL-08</w:t>
+      </w:r>
+      <w:r>
+        <w:t xml:space="preserve">, and that a contrary memo remains unresolved. The agent must follow those identifiers to the relevant artifact before making a consequential recommendation. A compressed statement without provenance remains a lead.</w:t>
+      </w:r>
+    </w:p>
+    <w:p>
+      <w:pPr>
+        <w:pStyle w:val="BodyText"/>
+      </w:pPr>
+      <w:r>
+        <w:t xml:space="preserve">Context updates should follow the same proposal boundary as data extraction. An agent may identify that the active question conflicts with the latest protocol or that a manuscript cites an obsolete corpus. It writes the proposed correction to a staging area. A researcher decides whether to update the canonical packet, records the reason, and increments its version.</w:t>
+      </w:r>
+    </w:p>
+    <w:p>
+      <w:pPr>
+        <w:pStyle w:val="BodyText"/>
+      </w:pPr>
+      <w:r>
+        <w:t xml:space="preserve">This architecture supports continuity across literature review, gap analysis, methodology, and collection. The literature scout sees the current vocabulary and boundaries. The gap analyst sees the verified coverage audit. The methodology critic sees the approved estimand and threats. The collection steward sees the source frame and codebook. The context curator sees how their artifacts connect, but it does not turn their provisional outputs into settled project knowledge.</w:t>
+      </w:r>
+    </w:p>
+    <w:p>
+      <w:pPr>
+        <w:pStyle w:val="BodyText"/>
+      </w:pPr>
+      <w:r>
+        <w:t xml:space="preserve">Evaluate the system as a chain. Record whether a task used the correct context version, whether the appropriate skill triggered, whether the agent stayed within permissions, whether its evidence links resolved, whether it abstained when required, and whether the human gate caught consequential errors. Productivity matters, but speed without these measures can make an incoherent project move faster.</w:t>
+      </w:r>
+    </w:p>
+    <w:bookmarkEnd w:id="218"/>
+    <w:bookmarkEnd w:id="219"/>
+    <w:bookmarkStart w:id="220" w:name="separate-the-present-from-the-forecast"/>
+    <w:p>
+      <w:pPr>
+        <w:pStyle w:val="Heading3"/>
+      </w:pPr>
+      <w:r>
+        <w:t xml:space="preserve">18.2.10 Separate the present from the forecast</w:t>
       </w:r>
     </w:p>
     <w:p>
@@ -9002,9 +9669,9 @@
         <w:t xml:space="preserve">This future also carries risks. Well-resourced fields may maintain sophisticated living syntheses while other regions and languages remain poorly indexed. Proprietary systems may make public evidence dependent on private infrastructure. Continuous updating can create an illusion of completeness and exhaust the teams responsible for it. The goal is not permanent motion. It is controlled revision when new evidence matters.</w:t>
       </w:r>
     </w:p>
-    <w:bookmarkEnd w:id="210"/>
-    <w:bookmarkEnd w:id="211"/>
-    <w:bookmarkStart w:id="212" w:name="worked-example-13"/>
+    <w:bookmarkEnd w:id="220"/>
+    <w:bookmarkEnd w:id="221"/>
+    <w:bookmarkStart w:id="222" w:name="worked-example-13"/>
     <w:p>
       <w:pPr>
         <w:pStyle w:val="Heading2"/>
@@ -9069,8 +9736,24 @@
         <w:t xml:space="preserve">An AI system expands intervention names and ranks new search results. It proposes extraction fields with source spans. Researchers validate screening recall on a stratified sample and adjudicate all exclusions near the decision boundary. The system never decides whether a program belongs in the same causal family or whether a trust measure is substantively comparable. Those judgments remain part of the review’s argument.</w:t>
       </w:r>
     </w:p>
-    <w:bookmarkEnd w:id="212"/>
-    <w:bookmarkStart w:id="213" w:name="try-it-13"/>
+    <w:p>
+      <w:pPr>
+        <w:pStyle w:val="BodyText"/>
+      </w:pPr>
+      <w:r>
+        <w:t xml:space="preserve">The team implements this arrangement as separate skills and agents. The literature-discovery skill records every query and route. A scout agent runs that skill against approved databases and deposits candidates in a staging register. The gap-analysis skill compares the verified corpus with the protocol. Its agent proposes a geographic gap, but the coverage audit shows that two relevant local-language indexes were never searched. The team records an unresolved coverage limit instead of claiming that no such research exists.</w:t>
+      </w:r>
+    </w:p>
+    <w:p>
+      <w:pPr>
+        <w:pStyle w:val="BodyText"/>
+      </w:pPr>
+      <w:r>
+        <w:t xml:space="preserve">The context curator prepares project packet 1.3 for the annual update. It includes the current question, intervention taxonomy, approved trust measures, corpus release, open disagreement about quasi-experimental designs, and links to every decision. The methodology critic identifies that a proposed new synthesis would mix immediate and long-term outcomes. It recommends a protocol amendment but cannot make it. Researchers review the affected records, approve a revised timing rule, and issue packet 1.4 before the other agents resume work.</w:t>
+      </w:r>
+    </w:p>
+    <w:bookmarkEnd w:id="222"/>
+    <w:bookmarkStart w:id="223" w:name="try-it-13"/>
     <w:p>
       <w:pPr>
         <w:pStyle w:val="Heading2"/>
@@ -9119,8 +9802,24 @@
         <w:t xml:space="preserve">Finally, write an update policy. Specify surveillance sources, cadence, update triggers, owner, release format, correction route, and retirement condition. Label each planned feature as current, emerging, or conditional future. This prevents an aspiration from being presented as an implemented method.</w:t>
       </w:r>
     </w:p>
-    <w:bookmarkEnd w:id="213"/>
-    <w:bookmarkStart w:id="214" w:name="guided-ai-workflow-13"/>
+    <w:p>
+      <w:pPr>
+        <w:pStyle w:val="BodyText"/>
+      </w:pPr>
+      <w:r>
+        <w:t xml:space="preserve">Design one research skill for the review. Write its trigger, required inputs, procedure, output schema, verification rule, permissions, failure condition, and three benchmark cases. Then write an agent work order that may invoke the skill. Give the agent one goal, a context version, approved tools, a stopping rule, and an escalation route.</w:t>
+      </w:r>
+    </w:p>
+    <w:p>
+      <w:pPr>
+        <w:pStyle w:val="BodyText"/>
+      </w:pPr>
+      <w:r>
+        <w:t xml:space="preserve">Create project context packet 0.1. Limit its stable layer to one page. Add a current-state table and a task layer for one operation. Ask a colleague to locate one accepted decision, one unresolved dispute, and one source artifact using only the packet. Revise any entry that cannot be traced.</w:t>
+      </w:r>
+    </w:p>
+    <w:bookmarkEnd w:id="223"/>
+    <w:bookmarkStart w:id="224" w:name="guided-ai-workflow-13"/>
     <w:p>
       <w:pPr>
         <w:pStyle w:val="Heading2"/>
@@ -9134,7 +9833,7 @@
         <w:pStyle w:val="FirstParagraph"/>
       </w:pPr>
       <w:r>
-        <w:t xml:space="preserve">Use AI in four bounded passes. In the design pass, provide the research question and intended decision. Ask the system to compare plausible review forms and list the evidence each would require. In the structure pass, provide verified study metadata and researcher-defined fields. Ask it to flag possible construct mismatch, dependence, and missing values without deciding eligibility. In the audit pass, provide the analysis plan and output. Ask for unsupported inferences, omitted sensitivity tests, and discrepancies between the estimand and conclusion. In the update pass, ask it to rank new candidate records and explain each ranking.</w:t>
+        <w:t xml:space="preserve">Begin by issuing a versioned project context packet and work order. Then use AI in four bounded passes. In the design pass, provide the research question and intended decision. Ask the system to compare plausible review forms and list the evidence each would require. In the structure pass, provide verified study metadata and researcher-defined fields. Ask it to flag possible construct mismatch, dependence, and missing values without deciding eligibility. In the audit pass, provide the analysis plan and output. Ask for unsupported inferences, omitted sensitivity tests, and discrepancies between the estimand and conclusion. In the update pass, ask it to rank new candidate records and explain each ranking.</w:t>
       </w:r>
     </w:p>
     <w:p>
@@ -9216,7 +9915,7 @@
         <w:t xml:space="preserve"> </w:t>
       </w:r>
       <w:r>
-        <w:t xml:space="preserve">Save model and version, prompt, input description, output, reviewer decision, error category, protocol and corpus versions, analysis release, and date.</w:t>
+        <w:t xml:space="preserve">Save model and version, skill and agent versions, project context packet, work order, prompt, input description, tool actions, output, reviewer decision, error category, protocol and corpus versions, analysis release, and date.</w:t>
       </w:r>
     </w:p>
     <w:p>
@@ -9227,8 +9926,8 @@
         <w:t xml:space="preserve">Do not ask a model to select the final review form, infer missing statistics without a declared method, adjudicate risk of bias alone, or choose a publication-bias correction after seeing which result is favorable. Do not accept a causal or policy conclusion that cannot be reconstructed from the reviewed evidence objects.</w:t>
       </w:r>
     </w:p>
-    <w:bookmarkEnd w:id="214"/>
-    <w:bookmarkStart w:id="215" w:name="integrity-checkpoint-13"/>
+    <w:bookmarkEnd w:id="224"/>
+    <w:bookmarkStart w:id="225" w:name="integrity-checkpoint-13"/>
     <w:p>
       <w:pPr>
         <w:pStyle w:val="Heading2"/>
@@ -9274,11 +9973,27 @@
         <w:pStyle w:val="BodyText"/>
       </w:pPr>
       <w:r>
+        <w:t xml:space="preserve">Agent delegation can obscure responsibility. A coordinating agent may summarize another agent’s output and remove its qualifications. Several agents may repeat one mistaken extraction and make it appear independently confirmed. Preserve the complete provenance chain, label shared models and inputs, and route agent outputs through the same evidence checks as direct model output.</w:t>
+      </w:r>
+    </w:p>
+    <w:p>
+      <w:pPr>
+        <w:pStyle w:val="BodyText"/>
+      </w:pPr>
+      <w:r>
+        <w:t xml:space="preserve">Project context can contain unpublished arguments, access credentials, participant information, and restricted source locations. Give each agent only the layer required for its task. A context packet prepared for discovery should not expose material needed only for confidential analysis.</w:t>
+      </w:r>
+    </w:p>
+    <w:p>
+      <w:pPr>
+        <w:pStyle w:val="BodyText"/>
+      </w:pPr>
+      <w:r>
         <w:t xml:space="preserve">Finally, resist prestige by method. A complex model cannot compensate for a weak corpus. A transparent narrative synthesis can be more informative than an invalid pooled estimate. The review earns trust by matching its claim to its evidence and preserving the path between them.</w:t>
       </w:r>
     </w:p>
-    <w:bookmarkEnd w:id="215"/>
-    <w:bookmarkStart w:id="216" w:name="save-the-artifact-13"/>
+    <w:bookmarkEnd w:id="225"/>
+    <w:bookmarkStart w:id="226" w:name="save-the-artifact-13"/>
     <w:p>
       <w:pPr>
         <w:pStyle w:val="Heading2"/>
@@ -9316,11 +10031,19 @@
         <w:pStyle w:val="BodyText"/>
       </w:pPr>
       <w:r>
+        <w:t xml:space="preserve">Maintain a research-automation register. For every skill, save its manifest, instructions, scripts or schemas, benchmark set, evaluation results, permissions, owner, and version. For every agent, save its work-order template, permitted skills and tools, expected output, escalation rule, and tests. Archive each project context packet and its approved change log. Do not store credentials or protected source content in these public or reusable definitions.</w:t>
+      </w:r>
+    </w:p>
+    <w:p>
+      <w:pPr>
+        <w:pStyle w:val="BodyText"/>
+      </w:pPr>
+      <w:r>
         <w:t xml:space="preserve">The article, dataset, code, and review website should point to the same manifest. This shared reference prevents a current webpage from silently changing the evidence behind an older citation.</w:t>
       </w:r>
     </w:p>
-    <w:bookmarkEnd w:id="216"/>
-    <w:bookmarkStart w:id="217" w:name="advanced-practice-13"/>
+    <w:bookmarkEnd w:id="226"/>
+    <w:bookmarkStart w:id="227" w:name="advanced-practice-13"/>
     <w:p>
       <w:pPr>
         <w:pStyle w:val="Heading2"/>
@@ -9374,12 +10097,28 @@
         <w:pStyle w:val="BodyText"/>
       </w:pPr>
       <w:r>
+        <w:t xml:space="preserve">An advanced system may use a coordinating agent to divide a review update into discovery, gap analysis, methods audit, and collection tasks. Coordination should occur through artifacts rather than conversational summaries. Each specialist receives the same approved project card, a distinct work order, and only the context needed for its task. The coordinator can detect missing outputs and schema conflicts, but human reviewers still control the gates between candidate, verified, accepted, and published states.</w:t>
+      </w:r>
+    </w:p>
+    <w:p>
+      <w:pPr>
+        <w:pStyle w:val="BodyText"/>
+      </w:pPr>
+      <w:r>
+        <w:t xml:space="preserve">Treat the context curator as a librarian, not an executive. It maintains indexes, reports contradictions, assembles task packets, and proposes version changes. It does not decide that a disputed claim has become accepted or that an old limitation no longer matters. Keeping this boundary protects the project’s intellectual history from being rewritten for the convenience of the current task.</w:t>
+      </w:r>
+    </w:p>
+    <w:p>
+      <w:pPr>
+        <w:pStyle w:val="BodyText"/>
+      </w:pPr>
+      <w:r>
         <w:t xml:space="preserve">The future review article is therefore neither a traditional essay with added links nor a database without an argument. It is a governed scholarly claim over a versioned evidence system. Its authority comes from the fit among question, corpus, method, and interpretation. Its capacity to change becomes a strength only when readers can see what changed, why it changed, and which conclusion the earlier evidence supported.</w:t>
       </w:r>
     </w:p>
-    <w:bookmarkEnd w:id="217"/>
-    <w:bookmarkEnd w:id="218"/>
-    <w:bookmarkStart w:id="251" w:name="building-event-databases-with-ai"/>
+    <w:bookmarkEnd w:id="227"/>
+    <w:bookmarkEnd w:id="228"/>
+    <w:bookmarkStart w:id="261" w:name="building-event-databases-with-ai"/>
     <w:p>
       <w:pPr>
         <w:pStyle w:val="Heading1"/>
@@ -9388,7 +10127,7 @@
         <w:t xml:space="preserve">19. Building Event Databases with AI</w:t>
       </w:r>
     </w:p>
-    <w:bookmarkStart w:id="223" w:name="orientation-14"/>
+    <w:bookmarkStart w:id="233" w:name="orientation-14"/>
     <w:p>
       <w:pPr>
         <w:pStyle w:val="Heading2"/>
@@ -9416,7 +10155,7 @@
         <w:rPr>
           <w:rStyle w:val="FootnoteReference"/>
         </w:rPr>
-        <w:footnoteReference w:id="219"/>
+        <w:footnoteReference w:id="229"/>
       </w:r>
     </w:p>
     <w:p>
@@ -9435,8 +10174,8 @@
         <w:t xml:space="preserve">This chapter presents an auditable alternative. AI compresses clerical stages while the researcher preserves a visible chain from source to record, record to event, event to variable, and written evidence to causal inference. Every transition produces an artifact that can be reviewed, corrected, and versioned.</w:t>
       </w:r>
     </w:p>
-    <w:bookmarkEnd w:id="223"/>
-    <w:bookmarkStart w:id="244" w:name="learn-14"/>
+    <w:bookmarkEnd w:id="233"/>
+    <w:bookmarkStart w:id="254" w:name="learn-14"/>
     <w:p>
       <w:pPr>
         <w:pStyle w:val="Heading2"/>
@@ -9445,7 +10184,7 @@
         <w:t xml:space="preserve">19.2 Learn</w:t>
       </w:r>
     </w:p>
-    <w:bookmarkStart w:id="224" w:name="begin-with-the-unit-not-the-model"/>
+    <w:bookmarkStart w:id="234" w:name="begin-with-the-unit-not-the-model"/>
     <w:p>
       <w:pPr>
         <w:pStyle w:val="Heading3"/>
@@ -9478,8 +10217,8 @@
         <w:t xml:space="preserve">This order matters because a model will readily propose whatever categories are easy to extract. Extractability is not theoretical importance. If the system defines the unit through its output, the database may record what the model recognizes instead of what the research design requires.</w:t>
       </w:r>
     </w:p>
-    <w:bookmarkEnd w:id="224"/>
-    <w:bookmarkStart w:id="229" w:name="build-a-source-frame"/>
+    <w:bookmarkEnd w:id="234"/>
+    <w:bookmarkStart w:id="239" w:name="build-a-source-frame"/>
     <w:p>
       <w:pPr>
         <w:pStyle w:val="Heading3"/>
@@ -9499,7 +10238,7 @@
         <w:rPr>
           <w:rStyle w:val="FootnoteReference"/>
         </w:rPr>
-        <w:footnoteReference w:id="225"/>
+        <w:footnoteReference w:id="235"/>
       </w:r>
       <w:r>
         <w:t xml:space="preserve"> </w:t>
@@ -9519,7 +10258,7 @@
         <w:rPr>
           <w:rStyle w:val="FootnoteReference"/>
         </w:rPr>
-        <w:footnoteReference w:id="227"/>
+        <w:footnoteReference w:id="237"/>
       </w:r>
       <w:r>
         <w:t xml:space="preserve"> </w:t>
@@ -9536,8 +10275,8 @@
         <w:t xml:space="preserve">AI can accelerate work inside the source frame. It can translate query concepts, generate historical names, adapt syntax across archives, and rank retrieved documents for review. A search-connected system may also query an approved interface directly. These operations remain collection procedures. The search log should preserve the source collection, query, date, filters, result count, model or script, and review decision. Access must comply with archive rules, licenses, privacy obligations, and research ethics.</w:t>
       </w:r>
     </w:p>
-    <w:bookmarkEnd w:id="229"/>
-    <w:bookmarkStart w:id="230" w:name="separate-discovery-from-verification"/>
+    <w:bookmarkEnd w:id="239"/>
+    <w:bookmarkStart w:id="240" w:name="separate-discovery-from-verification"/>
     <w:p>
       <w:pPr>
         <w:pStyle w:val="Heading3"/>
@@ -9599,8 +10338,8 @@
         <w:t xml:space="preserve">This separation allows wide retrieval without lowering the evidentiary threshold. The system can favor recall during discovery because false positives remain outside the verified dataset. Reviewers can then favor precision when deciding what enters the database. A model should have an abstention route for passages that do not support a stable classification.</w:t>
       </w:r>
     </w:p>
-    <w:bookmarkEnd w:id="230"/>
-    <w:bookmarkStart w:id="233" w:name="resolve-reports-into-events"/>
+    <w:bookmarkEnd w:id="240"/>
+    <w:bookmarkStart w:id="243" w:name="resolve-reports-into-events"/>
     <w:p>
       <w:pPr>
         <w:pStyle w:val="Heading3"/>
@@ -9628,7 +10367,7 @@
         <w:rPr>
           <w:rStyle w:val="FootnoteReference"/>
         </w:rPr>
-        <w:footnoteReference w:id="231"/>
+        <w:footnoteReference w:id="241"/>
       </w:r>
       <w:r>
         <w:t xml:space="preserve"> </w:t>
@@ -9661,8 +10400,8 @@
         <w:t xml:space="preserve">records every merge, split, and non-match. It links source-record identifiers to a stable event identifier and gives the rule, evidence, reviewer, and confidence category. It also records dependence. Five newspapers repeating one wire dispatch represent broad circulation, not five independent observations. Preserving that distinction prevents source abundance from becoming false corroboration.</w:t>
       </w:r>
     </w:p>
-    <w:bookmarkEnd w:id="233"/>
-    <w:bookmarkStart w:id="234" w:name="Xa4d8203b4f7a31b0cadf854735a5261c2c5f19b"/>
+    <w:bookmarkEnd w:id="243"/>
+    <w:bookmarkStart w:id="244" w:name="Xa4d8203b4f7a31b0cadf854735a5261c2c5f19b"/>
     <w:p>
       <w:pPr>
         <w:pStyle w:val="Heading3"/>
@@ -9719,8 +10458,8 @@
         <w:t xml:space="preserve">This workflow turns AI into a critic of the original design. The model may notice a missing variable, but it does not decide that the variable belongs in the database. That decision remains theoretical, empirical, and comparative.</w:t>
       </w:r>
     </w:p>
-    <w:bookmarkEnd w:id="234"/>
-    <w:bookmarkStart w:id="237" w:name="validate-before-scaling"/>
+    <w:bookmarkEnd w:id="244"/>
+    <w:bookmarkStart w:id="247" w:name="validate-before-scaling"/>
     <w:p>
       <w:pPr>
         <w:pStyle w:val="Heading3"/>
@@ -9748,7 +10487,7 @@
         <w:rPr>
           <w:rStyle w:val="FootnoteReference"/>
         </w:rPr>
-        <w:footnoteReference w:id="235"/>
+        <w:footnoteReference w:id="245"/>
       </w:r>
     </w:p>
     <w:p>
@@ -9759,8 +10498,8 @@
         <w:t xml:space="preserve">Validation has a scope. A model that performs well on English national newspapers from one decade has not been validated for local-language archives or another period. Record the tested population, prompt, model, codebook version, and decision threshold. Revalidate after a material change to any of them.</w:t>
       </w:r>
     </w:p>
-    <w:bookmarkEnd w:id="237"/>
-    <w:bookmarkStart w:id="243" w:name="Xbb3b6a25e4d702c2b579e02febfbdbbde948889"/>
+    <w:bookmarkEnd w:id="247"/>
+    <w:bookmarkStart w:id="253" w:name="Xbb3b6a25e4d702c2b579e02febfbdbbde948889"/>
     <w:p>
       <w:pPr>
         <w:pStyle w:val="Heading3"/>
@@ -10050,7 +10789,7 @@
         <w:rPr>
           <w:rStyle w:val="FootnoteReference"/>
         </w:rPr>
-        <w:footnoteReference w:id="238"/>
+        <w:footnoteReference w:id="248"/>
       </w:r>
     </w:p>
     <w:p>
@@ -10072,7 +10811,7 @@
         <w:rPr>
           <w:rStyle w:val="FootnoteReference"/>
         </w:rPr>
-        <w:footnoteReference w:id="241"/>
+        <w:footnoteReference w:id="251"/>
       </w:r>
     </w:p>
     <w:p>
@@ -10083,9 +10822,9 @@
         <w:t xml:space="preserve">The Bayesian evidence table should therefore record the hypothesis pair, evidence identifier, provenance, predicted observation under each hypothesis, dependence group, likelihood range, rationale, reviewer, update, and sensitivity result. The model may draft alternatives for review. It may not convert fluent interpretation into causal probability.</w:t>
       </w:r>
     </w:p>
-    <w:bookmarkEnd w:id="243"/>
-    <w:bookmarkEnd w:id="244"/>
-    <w:bookmarkStart w:id="245" w:name="worked-example-14"/>
+    <w:bookmarkEnd w:id="253"/>
+    <w:bookmarkEnd w:id="254"/>
+    <w:bookmarkStart w:id="255" w:name="worked-example-14"/>
     <w:p>
       <w:pPr>
         <w:pStyle w:val="Heading2"/>
@@ -10134,8 +10873,8 @@
         <w:t xml:space="preserve">The final database is smaller than the first extraction and stronger than a manually assembled spreadsheet. AI shortened retrieval, comparison, and preliminary coding. The audit chain preserved the difference between speed and evidence.</w:t>
       </w:r>
     </w:p>
-    <w:bookmarkEnd w:id="245"/>
-    <w:bookmarkStart w:id="246" w:name="try-it-14"/>
+    <w:bookmarkEnd w:id="255"/>
+    <w:bookmarkStart w:id="256" w:name="try-it-14"/>
     <w:p>
       <w:pPr>
         <w:pStyle w:val="Heading2"/>
@@ -10176,8 +10915,8 @@
         <w:t xml:space="preserve">Finally, select two rival hypotheses and one verified item of written evidence. State what each hypothesis predicts, assign a transparent likelihood range, and calculate the posterior odds across that range. Repeat the calculation after treating two apparently separate reports as dependent. Explain why the answer changed or remained stable.</w:t>
       </w:r>
     </w:p>
-    <w:bookmarkEnd w:id="246"/>
-    <w:bookmarkStart w:id="247" w:name="guided-ai-workflow-14"/>
+    <w:bookmarkEnd w:id="256"/>
+    <w:bookmarkStart w:id="257" w:name="guided-ai-workflow-14"/>
     <w:p>
       <w:pPr>
         <w:pStyle w:val="Heading2"/>
@@ -10284,8 +11023,8 @@
         <w:t xml:space="preserve">The model should return structured candidates, not silently edit the database. A human-controlled import step provides the boundary between proposal and record.</w:t>
       </w:r>
     </w:p>
-    <w:bookmarkEnd w:id="247"/>
-    <w:bookmarkStart w:id="248" w:name="integrity-checkpoint-14"/>
+    <w:bookmarkEnd w:id="257"/>
+    <w:bookmarkStart w:id="258" w:name="integrity-checkpoint-14"/>
     <w:p>
       <w:pPr>
         <w:pStyle w:val="Heading2"/>
@@ -10326,8 +11065,8 @@
         <w:t xml:space="preserve">Dynamic coding can also produce retrospective confirmation. A variable proposed after seeing the outcome may be analytically useful, but its origin must be disclosed. Mark exploratory variables and test them against new material where possible.</w:t>
       </w:r>
     </w:p>
-    <w:bookmarkEnd w:id="248"/>
-    <w:bookmarkStart w:id="249" w:name="save-the-artifact-14"/>
+    <w:bookmarkEnd w:id="258"/>
+    <w:bookmarkStart w:id="259" w:name="save-the-artifact-14"/>
     <w:p>
       <w:pPr>
         <w:pStyle w:val="Heading2"/>
@@ -10360,8 +11099,8 @@
         <w:t xml:space="preserve">Release only what rights, privacy, security, and ethics permit. A public methodological register can describe restricted evidence without exposing it.</w:t>
       </w:r>
     </w:p>
-    <w:bookmarkEnd w:id="249"/>
-    <w:bookmarkStart w:id="250" w:name="advanced-practice-14"/>
+    <w:bookmarkEnd w:id="259"/>
+    <w:bookmarkStart w:id="260" w:name="advanced-practice-14"/>
     <w:p>
       <w:pPr>
         <w:pStyle w:val="Heading2"/>
@@ -10408,242 +11147,242 @@
       </w:pPr>
       <w:r>
         <w:t xml:space="preserve">AI improves an event database when it makes the pipeline faster and the transformations more visible. It weakens the database when convenience conceals where evidence ended and inference began.</w:t>
-      </w:r>
-    </w:p>
-    <w:bookmarkEnd w:id="250"/>
-    <w:bookmarkEnd w:id="251"/>
-    <w:bookmarkStart w:id="261" w:name="ai-and-research-integrity"/>
-    <w:p>
-      <w:pPr>
-        <w:pStyle w:val="Heading1"/>
-      </w:pPr>
-      <w:r>
-        <w:t xml:space="preserve">20. AI and Research Integrity</w:t>
-      </w:r>
-    </w:p>
-    <w:bookmarkStart w:id="254" w:name="a-division-of-labor"/>
-    <w:p>
-      <w:pPr>
-        <w:pStyle w:val="Heading2"/>
-      </w:pPr>
-      <w:r>
-        <w:t xml:space="preserve">20.1 A Division of Labor</w:t>
-      </w:r>
-    </w:p>
-    <w:p>
-      <w:pPr>
-        <w:pStyle w:val="FirstParagraph"/>
-      </w:pPr>
-      <w:r>
-        <w:t xml:space="preserve">Generative AI can accelerate parts of evidence mapping. It can propose synonyms, group candidate records, compare definitions, and question a stopping rule. These are acts of assistance. They are not transfers of authorship or responsibility.</w:t>
-      </w:r>
-    </w:p>
-    <w:p>
-      <w:pPr>
-        <w:pStyle w:val="BodyText"/>
-      </w:pPr>
-      <w:r>
-        <w:t xml:space="preserve">The researcher defines the purpose. The researcher controls the material supplied to the system. The researcher verifies claims and sources. The researcher decides what enters the corpus. The researcher accounts for the result.</w:t>
-      </w:r>
-    </w:p>
-    <w:p>
-      <w:pPr>
-        <w:pStyle w:val="BodyText"/>
-      </w:pPr>
-      <w:r>
-        <w:t xml:space="preserve">This division of labor is necessary because fluent output can contain fabricated references, unsupported inference, privacy disclosure, and bias inherited from training data or the prompt. Current risk guidance treats these as properties that require management across the system’s use, not as rare accidents.</w:t>
-      </w:r>
-      <w:r>
-        <w:rPr>
-          <w:rStyle w:val="FootnoteReference"/>
-        </w:rPr>
-        <w:footnoteReference w:id="252"/>
-      </w:r>
-    </w:p>
-    <w:bookmarkEnd w:id="254"/>
-    <w:bookmarkStart w:id="255" w:name="model-neutral-workflows"/>
-    <w:p>
-      <w:pPr>
-        <w:pStyle w:val="Heading2"/>
-      </w:pPr>
-      <w:r>
-        <w:t xml:space="preserve">20.2 Model-Neutral Workflows</w:t>
-      </w:r>
-    </w:p>
-    <w:p>
-      <w:pPr>
-        <w:pStyle w:val="FirstParagraph"/>
-      </w:pPr>
-      <w:r>
-        <w:t xml:space="preserve">The guide avoids instructions that depend on one product interface. A workflow states the research task, required input, prompt sequence, verification procedure, and audit record. The model may change. The scholarly obligation does not.</w:t>
-      </w:r>
-    </w:p>
-    <w:p>
-      <w:pPr>
-        <w:pStyle w:val="BodyText"/>
-      </w:pPr>
-      <w:r>
-        <w:t xml:space="preserve">A useful prompt gives the system a bounded role. “Identify candidate dimensions missing from this question frame” is inspectable. “Research this topic for me” conceals the stages at which error can enter. Prompts should request candidates, alternatives, or critiques. They should not request certainty the system cannot establish.</w:t>
-      </w:r>
-    </w:p>
-    <w:p>
-      <w:pPr>
-        <w:pStyle w:val="BodyText"/>
-      </w:pPr>
-      <w:r>
-        <w:t xml:space="preserve">Run more than one pass when the task matters. The first pass generates. The second challenges. The third compares the output with the evidence map. Repetition does not guarantee truth, but role separation makes error easier to see.</w:t>
-      </w:r>
-    </w:p>
-    <w:p>
-      <w:pPr>
-        <w:pStyle w:val="BodyText"/>
-      </w:pPr>
-      <w:r>
-        <w:t xml:space="preserve">Model neutrality has a limit worth stating. The verification-heavy workflows in this guide assume access to a capable model, and capable models often cost money. The privacy fallback assumes a local or institutional system that many researchers do not have. Capability also varies by tool, language, and region. For these reasons the method does not depend on AI. The map, the search log, the evidence register, and the stopping rule stand on their own. A researcher without access to a frontier model loses an assistant, not the method.</w:t>
-      </w:r>
-    </w:p>
-    <w:bookmarkEnd w:id="255"/>
-    <w:bookmarkStart w:id="256" w:name="privacy-and-data-minimization"/>
-    <w:p>
-      <w:pPr>
-        <w:pStyle w:val="Heading2"/>
-      </w:pPr>
-      <w:r>
-        <w:t xml:space="preserve">20.3 Privacy and Data Minimization</w:t>
-      </w:r>
-    </w:p>
-    <w:p>
-      <w:pPr>
-        <w:pStyle w:val="FirstParagraph"/>
-      </w:pPr>
-      <w:r>
-        <w:t xml:space="preserve">Do not place material into an external system merely because it accepts text. Interview transcripts, archival restrictions, personal data, allegations, unpublished findings, and partner-owned datasets may carry legal and ethical limits. Removing names does not lift those limits. De-identification of qualitative data is unreliable, and re-identification is often possible from context alone. Under most data-protection regimes and ethics approvals, pseudonymized participant data remains regulated personal data, and many approvals and data agreements forbid sending it to a third-party processor at all. Consumer tools may also retain inputs or train on them. Before any participant-derived material enters an external system, confirm that the ethics approval and the data agreements permit third-party processing. Use an abstract description when the full record is unnecessary. Prefer a local or institutionally approved system when protection requires it. When in doubt, do not upload, and consult the ethics board or the data-protection officer.</w:t>
-      </w:r>
-    </w:p>
-    <w:p>
-      <w:pPr>
-        <w:pStyle w:val="BodyText"/>
-      </w:pPr>
-      <w:r>
-        <w:t xml:space="preserve">The audit log records what category of material entered the system. It need not reproduce protected content. It should record the model, date, task, input description, relevant settings, output disposition, and human reviewer.</w:t>
-      </w:r>
-    </w:p>
-    <w:bookmarkEnd w:id="256"/>
-    <w:bookmarkStart w:id="257" w:name="verification"/>
-    <w:p>
-      <w:pPr>
-        <w:pStyle w:val="Heading2"/>
-      </w:pPr>
-      <w:r>
-        <w:t xml:space="preserve">20.4 Verification</w:t>
-      </w:r>
-    </w:p>
-    <w:p>
-      <w:pPr>
-        <w:pStyle w:val="FirstParagraph"/>
-      </w:pPr>
-      <w:r>
-        <w:t xml:space="preserve">Verification follows the claim. A proposed publication must be located through a DOI resolver, library catalogue, publisher, or trusted index. A named archive must be checked through the institution. A quotation must be compared with the source. A classification must be traced to the evidence and decision rule.</w:t>
-      </w:r>
-    </w:p>
-    <w:p>
-      <w:pPr>
-        <w:pStyle w:val="BodyText"/>
-      </w:pPr>
-      <w:r>
-        <w:t xml:space="preserve">An AI-generated reference is not a citation. It is a search lead.</w:t>
-      </w:r>
-    </w:p>
-    <w:p>
-      <w:pPr>
-        <w:pStyle w:val="BodyText"/>
-      </w:pPr>
-      <w:r>
-        <w:t xml:space="preserve">The same rule applies to summaries. A model may produce an elegant account of a document while missing a qualification that changes its meaning. Verify against the original and record which passages support the summary.</w:t>
-      </w:r>
-    </w:p>
-    <w:bookmarkEnd w:id="257"/>
-    <w:bookmarkStart w:id="258" w:name="bias-and-missing-perspectives"/>
-    <w:p>
-      <w:pPr>
-        <w:pStyle w:val="Heading2"/>
-      </w:pPr>
-      <w:r>
-        <w:t xml:space="preserve">20.5 Bias and Missing Perspectives</w:t>
-      </w:r>
-    </w:p>
-    <w:p>
-      <w:pPr>
-        <w:pStyle w:val="FirstParagraph"/>
-      </w:pPr>
-      <w:r>
-        <w:t xml:space="preserve">Models can reproduce the visibility structure of their training material. Well-indexed English-language institutions may appear central because they are easier for the system to name. Local archives, non-English terms, and informal records may disappear from the response. This weakness makes AI useful as one critic among several, never as the sole designer of a source map.</w:t>
-      </w:r>
-    </w:p>
-    <w:p>
-      <w:pPr>
-        <w:pStyle w:val="BodyText"/>
-      </w:pPr>
-      <w:r>
-        <w:t xml:space="preserve">Ask what position the response assumes. Ask which actors it treats as authoritative. Ask which language and region dominate its suggestions. Then use domain expertise and human consultation to correct the map.</w:t>
-      </w:r>
-    </w:p>
-    <w:bookmarkEnd w:id="258"/>
-    <w:bookmarkStart w:id="259" w:name="reproducibility-and-drift"/>
-    <w:p>
-      <w:pPr>
-        <w:pStyle w:val="Heading2"/>
-      </w:pPr>
-      <w:r>
-        <w:t xml:space="preserve">20.6 Reproducibility and Drift</w:t>
-      </w:r>
-    </w:p>
-    <w:p>
-      <w:pPr>
-        <w:pStyle w:val="FirstParagraph"/>
-      </w:pPr>
-      <w:r>
-        <w:t xml:space="preserve">The same prompt may produce different outputs across runs. A provider may change the model without preserving the prior version. Search-connected systems may draw on a changing index. The audit record should therefore support reconstruction of the decision, not promise exact reproduction of the text.</w:t>
-      </w:r>
-    </w:p>
-    <w:p>
-      <w:pPr>
-        <w:pStyle w:val="BodyText"/>
-      </w:pPr>
-      <w:r>
-        <w:t xml:space="preserve">Preserve consequential outputs when terms permit. Record accepted and rejected suggestions. State when AI assistance changed the question, search vocabulary, source inventory, or stopping rule. The manuscript needs the decision trail more than it needs a transcript of every exchange.</w:t>
-      </w:r>
-    </w:p>
-    <w:bookmarkEnd w:id="259"/>
-    <w:bookmarkStart w:id="260" w:name="the-standard"/>
-    <w:p>
-      <w:pPr>
-        <w:pStyle w:val="Heading2"/>
-      </w:pPr>
-      <w:r>
-        <w:t xml:space="preserve">20.7 The Standard</w:t>
-      </w:r>
-    </w:p>
-    <w:p>
-      <w:pPr>
-        <w:pStyle w:val="FirstParagraph"/>
-      </w:pPr>
-      <w:r>
-        <w:t xml:space="preserve">AI use is defensible when it makes judgment more visible. It fails when it hides judgment behind convenience.</w:t>
       </w:r>
     </w:p>
     <w:bookmarkEnd w:id="260"/>
     <w:bookmarkEnd w:id="261"/>
-    <w:bookmarkStart w:id="266" w:name="building-the-full-field-guide"/>
+    <w:bookmarkStart w:id="271" w:name="ai-and-research-integrity"/>
     <w:p>
       <w:pPr>
         <w:pStyle w:val="Heading1"/>
       </w:pPr>
       <w:r>
+        <w:t xml:space="preserve">20. AI and Research Integrity</w:t>
+      </w:r>
+    </w:p>
+    <w:bookmarkStart w:id="264" w:name="a-division-of-labor"/>
+    <w:p>
+      <w:pPr>
+        <w:pStyle w:val="Heading2"/>
+      </w:pPr>
+      <w:r>
+        <w:t xml:space="preserve">20.1 A Division of Labor</w:t>
+      </w:r>
+    </w:p>
+    <w:p>
+      <w:pPr>
+        <w:pStyle w:val="FirstParagraph"/>
+      </w:pPr>
+      <w:r>
+        <w:t xml:space="preserve">Generative AI can accelerate parts of evidence mapping. It can propose synonyms, group candidate records, compare definitions, and question a stopping rule. These are acts of assistance. They are not transfers of authorship or responsibility.</w:t>
+      </w:r>
+    </w:p>
+    <w:p>
+      <w:pPr>
+        <w:pStyle w:val="BodyText"/>
+      </w:pPr>
+      <w:r>
+        <w:t xml:space="preserve">The researcher defines the purpose. The researcher controls the material supplied to the system. The researcher verifies claims and sources. The researcher decides what enters the corpus. The researcher accounts for the result.</w:t>
+      </w:r>
+    </w:p>
+    <w:p>
+      <w:pPr>
+        <w:pStyle w:val="BodyText"/>
+      </w:pPr>
+      <w:r>
+        <w:t xml:space="preserve">This division of labor is necessary because fluent output can contain fabricated references, unsupported inference, privacy disclosure, and bias inherited from training data or the prompt. Current risk guidance treats these as properties that require management across the system’s use, not as rare accidents.</w:t>
+      </w:r>
+      <w:r>
+        <w:rPr>
+          <w:rStyle w:val="FootnoteReference"/>
+        </w:rPr>
+        <w:footnoteReference w:id="262"/>
+      </w:r>
+    </w:p>
+    <w:bookmarkEnd w:id="264"/>
+    <w:bookmarkStart w:id="265" w:name="model-neutral-workflows"/>
+    <w:p>
+      <w:pPr>
+        <w:pStyle w:val="Heading2"/>
+      </w:pPr>
+      <w:r>
+        <w:t xml:space="preserve">20.2 Model-Neutral Workflows</w:t>
+      </w:r>
+    </w:p>
+    <w:p>
+      <w:pPr>
+        <w:pStyle w:val="FirstParagraph"/>
+      </w:pPr>
+      <w:r>
+        <w:t xml:space="preserve">The guide avoids instructions that depend on one product interface. A workflow states the research task, required input, prompt sequence, verification procedure, and audit record. The model may change. The scholarly obligation does not.</w:t>
+      </w:r>
+    </w:p>
+    <w:p>
+      <w:pPr>
+        <w:pStyle w:val="BodyText"/>
+      </w:pPr>
+      <w:r>
+        <w:t xml:space="preserve">A useful prompt gives the system a bounded role. “Identify candidate dimensions missing from this question frame” is inspectable. “Research this topic for me” conceals the stages at which error can enter. Prompts should request candidates, alternatives, or critiques. They should not request certainty the system cannot establish.</w:t>
+      </w:r>
+    </w:p>
+    <w:p>
+      <w:pPr>
+        <w:pStyle w:val="BodyText"/>
+      </w:pPr>
+      <w:r>
+        <w:t xml:space="preserve">Run more than one pass when the task matters. The first pass generates. The second challenges. The third compares the output with the evidence map. Repetition does not guarantee truth, but role separation makes error easier to see.</w:t>
+      </w:r>
+    </w:p>
+    <w:p>
+      <w:pPr>
+        <w:pStyle w:val="BodyText"/>
+      </w:pPr>
+      <w:r>
+        <w:t xml:space="preserve">Model neutrality has a limit worth stating. The verification-heavy workflows in this guide assume access to a capable model, and capable models often cost money. The privacy fallback assumes a local or institutional system that many researchers do not have. Capability also varies by tool, language, and region. For these reasons the method does not depend on AI. The map, the search log, the evidence register, and the stopping rule stand on their own. A researcher without access to a frontier model loses an assistant, not the method.</w:t>
+      </w:r>
+    </w:p>
+    <w:bookmarkEnd w:id="265"/>
+    <w:bookmarkStart w:id="266" w:name="privacy-and-data-minimization"/>
+    <w:p>
+      <w:pPr>
+        <w:pStyle w:val="Heading2"/>
+      </w:pPr>
+      <w:r>
+        <w:t xml:space="preserve">20.3 Privacy and Data Minimization</w:t>
+      </w:r>
+    </w:p>
+    <w:p>
+      <w:pPr>
+        <w:pStyle w:val="FirstParagraph"/>
+      </w:pPr>
+      <w:r>
+        <w:t xml:space="preserve">Do not place material into an external system merely because it accepts text. Interview transcripts, archival restrictions, personal data, allegations, unpublished findings, and partner-owned datasets may carry legal and ethical limits. Removing names does not lift those limits. De-identification of qualitative data is unreliable, and re-identification is often possible from context alone. Under most data-protection regimes and ethics approvals, pseudonymized participant data remains regulated personal data, and many approvals and data agreements forbid sending it to a third-party processor at all. Consumer tools may also retain inputs or train on them. Before any participant-derived material enters an external system, confirm that the ethics approval and the data agreements permit third-party processing. Use an abstract description when the full record is unnecessary. Prefer a local or institutionally approved system when protection requires it. When in doubt, do not upload, and consult the ethics board or the data-protection officer.</w:t>
+      </w:r>
+    </w:p>
+    <w:p>
+      <w:pPr>
+        <w:pStyle w:val="BodyText"/>
+      </w:pPr>
+      <w:r>
+        <w:t xml:space="preserve">The audit log records what category of material entered the system. It need not reproduce protected content. It should record the model, date, task, input description, relevant settings, output disposition, and human reviewer.</w:t>
+      </w:r>
+    </w:p>
+    <w:bookmarkEnd w:id="266"/>
+    <w:bookmarkStart w:id="267" w:name="verification"/>
+    <w:p>
+      <w:pPr>
+        <w:pStyle w:val="Heading2"/>
+      </w:pPr>
+      <w:r>
+        <w:t xml:space="preserve">20.4 Verification</w:t>
+      </w:r>
+    </w:p>
+    <w:p>
+      <w:pPr>
+        <w:pStyle w:val="FirstParagraph"/>
+      </w:pPr>
+      <w:r>
+        <w:t xml:space="preserve">Verification follows the claim. A proposed publication must be located through a DOI resolver, library catalogue, publisher, or trusted index. A named archive must be checked through the institution. A quotation must be compared with the source. A classification must be traced to the evidence and decision rule.</w:t>
+      </w:r>
+    </w:p>
+    <w:p>
+      <w:pPr>
+        <w:pStyle w:val="BodyText"/>
+      </w:pPr>
+      <w:r>
+        <w:t xml:space="preserve">An AI-generated reference is not a citation. It is a search lead.</w:t>
+      </w:r>
+    </w:p>
+    <w:p>
+      <w:pPr>
+        <w:pStyle w:val="BodyText"/>
+      </w:pPr>
+      <w:r>
+        <w:t xml:space="preserve">The same rule applies to summaries. A model may produce an elegant account of a document while missing a qualification that changes its meaning. Verify against the original and record which passages support the summary.</w:t>
+      </w:r>
+    </w:p>
+    <w:bookmarkEnd w:id="267"/>
+    <w:bookmarkStart w:id="268" w:name="bias-and-missing-perspectives"/>
+    <w:p>
+      <w:pPr>
+        <w:pStyle w:val="Heading2"/>
+      </w:pPr>
+      <w:r>
+        <w:t xml:space="preserve">20.5 Bias and Missing Perspectives</w:t>
+      </w:r>
+    </w:p>
+    <w:p>
+      <w:pPr>
+        <w:pStyle w:val="FirstParagraph"/>
+      </w:pPr>
+      <w:r>
+        <w:t xml:space="preserve">Models can reproduce the visibility structure of their training material. Well-indexed English-language institutions may appear central because they are easier for the system to name. Local archives, non-English terms, and informal records may disappear from the response. This weakness makes AI useful as one critic among several, never as the sole designer of a source map.</w:t>
+      </w:r>
+    </w:p>
+    <w:p>
+      <w:pPr>
+        <w:pStyle w:val="BodyText"/>
+      </w:pPr>
+      <w:r>
+        <w:t xml:space="preserve">Ask what position the response assumes. Ask which actors it treats as authoritative. Ask which language and region dominate its suggestions. Then use domain expertise and human consultation to correct the map.</w:t>
+      </w:r>
+    </w:p>
+    <w:bookmarkEnd w:id="268"/>
+    <w:bookmarkStart w:id="269" w:name="reproducibility-and-drift"/>
+    <w:p>
+      <w:pPr>
+        <w:pStyle w:val="Heading2"/>
+      </w:pPr>
+      <w:r>
+        <w:t xml:space="preserve">20.6 Reproducibility and Drift</w:t>
+      </w:r>
+    </w:p>
+    <w:p>
+      <w:pPr>
+        <w:pStyle w:val="FirstParagraph"/>
+      </w:pPr>
+      <w:r>
+        <w:t xml:space="preserve">The same prompt may produce different outputs across runs. A provider may change the model without preserving the prior version. Search-connected systems may draw on a changing index. The audit record should therefore support reconstruction of the decision, not promise exact reproduction of the text.</w:t>
+      </w:r>
+    </w:p>
+    <w:p>
+      <w:pPr>
+        <w:pStyle w:val="BodyText"/>
+      </w:pPr>
+      <w:r>
+        <w:t xml:space="preserve">Preserve consequential outputs when terms permit. Record accepted and rejected suggestions. State when AI assistance changed the question, search vocabulary, source inventory, or stopping rule. The manuscript needs the decision trail more than it needs a transcript of every exchange.</w:t>
+      </w:r>
+    </w:p>
+    <w:bookmarkEnd w:id="269"/>
+    <w:bookmarkStart w:id="270" w:name="the-standard"/>
+    <w:p>
+      <w:pPr>
+        <w:pStyle w:val="Heading2"/>
+      </w:pPr>
+      <w:r>
+        <w:t xml:space="preserve">20.7 The Standard</w:t>
+      </w:r>
+    </w:p>
+    <w:p>
+      <w:pPr>
+        <w:pStyle w:val="FirstParagraph"/>
+      </w:pPr>
+      <w:r>
+        <w:t xml:space="preserve">AI use is defensible when it makes judgment more visible. It fails when it hides judgment behind convenience.</w:t>
+      </w:r>
+    </w:p>
+    <w:bookmarkEnd w:id="270"/>
+    <w:bookmarkEnd w:id="271"/>
+    <w:bookmarkStart w:id="276" w:name="building-the-full-field-guide"/>
+    <w:p>
+      <w:pPr>
+        <w:pStyle w:val="Heading1"/>
+      </w:pPr>
+      <w:r>
         <w:t xml:space="preserve">21. Building the Full Field Guide</w:t>
       </w:r>
     </w:p>
-    <w:bookmarkStart w:id="262" w:name="what-the-current-modules-establish"/>
+    <w:bookmarkStart w:id="272" w:name="what-the-current-modules-establish"/>
     <w:p>
       <w:pPr>
         <w:pStyle w:val="Heading2"/>
@@ -10961,8 +11700,8 @@
         <w:t xml:space="preserve">The modules also reveal what remains outside the draft. They do not collect an interview, preserve a website, prepare a full archival corpus, or write the final empirical analysis. The synthesis chapter extends the literature workflow into open, living, and quantitative reviews. The bridge chapter on event databases introduces document extraction, dynamic coding, validation, and explicit causal updating. Each still requires fuller treatment across source types and analytical traditions.</w:t>
       </w:r>
     </w:p>
-    <w:bookmarkEnd w:id="262"/>
-    <w:bookmarkStart w:id="263" w:name="the-full-field-guide"/>
+    <w:bookmarkEnd w:id="272"/>
+    <w:bookmarkStart w:id="273" w:name="the-full-field-guide"/>
     <w:p>
       <w:pPr>
         <w:pStyle w:val="Heading2"/>
@@ -11003,8 +11742,8 @@
         <w:t xml:space="preserve">A communication module will cover manuscripts, presentations, public data, visual explanation, repositories, and long-term access. Sharing is not the final act after research. Decisions made during collection determine what can later be verified, reused, or protected.</w:t>
       </w:r>
     </w:p>
-    <w:bookmarkEnd w:id="263"/>
-    <w:bookmarkStart w:id="264" w:name="a-hebrew-edition"/>
+    <w:bookmarkEnd w:id="273"/>
+    <w:bookmarkStart w:id="274" w:name="a-hebrew-edition"/>
     <w:p>
       <w:pPr>
         <w:pStyle w:val="Heading2"/>
@@ -11021,8 +11760,8 @@
         <w:t xml:space="preserve">English remains the canonical language during the pilot. A Hebrew edition should follow after the content model and navigation stabilize. Translation will require more than sentence substitution. Search terms, institutional examples, interfaces, and right-to-left design must be adapted. Stable page identifiers will keep the two editions connected without forcing them to change at the same pace.</w:t>
       </w:r>
     </w:p>
-    <w:bookmarkEnd w:id="264"/>
-    <w:bookmarkStart w:id="265" w:name="an-invitation"/>
+    <w:bookmarkEnd w:id="274"/>
+    <w:bookmarkStart w:id="275" w:name="an-invitation"/>
     <w:p>
       <w:pPr>
         <w:pStyle w:val="Heading2"/>
@@ -11055,9 +11794,9 @@
         <w:t xml:space="preserve">The old project began with abundance. The revived project begins with limits, artifacts, and reviewable decisions. This is progress.</w:t>
       </w:r>
     </w:p>
-    <w:bookmarkEnd w:id="265"/>
-    <w:bookmarkEnd w:id="266"/>
-    <w:bookmarkStart w:id="304" w:name="references"/>
+    <w:bookmarkEnd w:id="275"/>
+    <w:bookmarkEnd w:id="276"/>
+    <w:bookmarkStart w:id="317" w:name="references"/>
     <w:p>
       <w:pPr>
         <w:pStyle w:val="Heading1"/>
@@ -11066,8 +11805,8 @@
         <w:t xml:space="preserve">22. References</w:t>
       </w:r>
     </w:p>
-    <w:bookmarkStart w:id="303" w:name="refs"/>
-    <w:bookmarkStart w:id="267" w:name="ref-autio2024genai"/>
+    <w:bookmarkStart w:id="316" w:name="refs"/>
+    <w:bookmarkStart w:id="277" w:name="ref-autio2024genai"/>
     <w:p>
       <w:pPr>
         <w:pStyle w:val="Bibliography"/>
@@ -11093,7 +11832,7 @@
       <w:r>
         <w:t xml:space="preserve"> </w:t>
       </w:r>
-      <w:hyperlink r:id="rId253">
+      <w:hyperlink r:id="rId263">
         <w:r>
           <w:rPr>
             <w:rStyle w:val="Hyperlink"/>
@@ -11105,8 +11844,8 @@
         <w:t xml:space="preserve">.</w:t>
       </w:r>
     </w:p>
-    <w:bookmarkEnd w:id="267"/>
-    <w:bookmarkStart w:id="268" w:name="ref-beelen2023bias"/>
+    <w:bookmarkEnd w:id="277"/>
+    <w:bookmarkStart w:id="278" w:name="ref-beelen2023bias"/>
     <w:p>
       <w:pPr>
         <w:pStyle w:val="Bibliography"/>
@@ -11139,7 +11878,7 @@
       <w:r>
         <w:t xml:space="preserve"> </w:t>
       </w:r>
-      <w:hyperlink r:id="rId228">
+      <w:hyperlink r:id="rId238">
         <w:r>
           <w:rPr>
             <w:rStyle w:val="Hyperlink"/>
@@ -11151,8 +11890,8 @@
         <w:t xml:space="preserve">.</w:t>
       </w:r>
     </w:p>
-    <w:bookmarkEnd w:id="268"/>
-    <w:bookmarkStart w:id="269" w:name="ref-blaizot2022ai"/>
+    <w:bookmarkEnd w:id="278"/>
+    <w:bookmarkStart w:id="279" w:name="ref-blaizot2022ai"/>
     <w:p>
       <w:pPr>
         <w:pStyle w:val="Bibliography"/>
@@ -11197,8 +11936,8 @@
         <w:t xml:space="preserve">.</w:t>
       </w:r>
     </w:p>
-    <w:bookmarkEnd w:id="269"/>
-    <w:bookmarkStart w:id="270" w:name="ref-booth2016systematic"/>
+    <w:bookmarkEnd w:id="279"/>
+    <w:bookmarkStart w:id="280" w:name="ref-booth2016systematic"/>
     <w:p>
       <w:pPr>
         <w:pStyle w:val="Bibliography"/>
@@ -11220,8 +11959,8 @@
         <w:t xml:space="preserve">. 2nd ed. London: SAGE Publications, 2016.</w:t>
       </w:r>
     </w:p>
-    <w:bookmarkEnd w:id="270"/>
-    <w:bookmarkStart w:id="271" w:name="ref-brandt2025measurement"/>
+    <w:bookmarkEnd w:id="280"/>
+    <w:bookmarkStart w:id="281" w:name="ref-brandt2025measurement"/>
     <w:p>
       <w:pPr>
         <w:pStyle w:val="Bibliography"/>
@@ -11254,7 +11993,7 @@
       <w:r>
         <w:t xml:space="preserve"> </w:t>
       </w:r>
-      <w:hyperlink r:id="rId236">
+      <w:hyperlink r:id="rId246">
         <w:r>
           <w:rPr>
             <w:rStyle w:val="Hyperlink"/>
@@ -11266,8 +12005,8 @@
         <w:t xml:space="preserve">.</w:t>
       </w:r>
     </w:p>
-    <w:bookmarkEnd w:id="271"/>
-    <w:bookmarkStart w:id="272" w:name="ref-braun2021quality"/>
+    <w:bookmarkEnd w:id="281"/>
+    <w:bookmarkStart w:id="282" w:name="ref-braun2021quality"/>
     <w:p>
       <w:pPr>
         <w:pStyle w:val="Bibliography"/>
@@ -11312,8 +12051,8 @@
         <w:t xml:space="preserve">.</w:t>
       </w:r>
     </w:p>
-    <w:bookmarkEnd w:id="272"/>
-    <w:bookmarkStart w:id="273" w:name="ref-cai2023montecarlo"/>
+    <w:bookmarkEnd w:id="282"/>
+    <w:bookmarkStart w:id="283" w:name="ref-cai2023montecarlo"/>
     <w:p>
       <w:pPr>
         <w:pStyle w:val="Bibliography"/>
@@ -11361,7 +12100,7 @@
       <w:r>
         <w:t xml:space="preserve"> </w:t>
       </w:r>
-      <w:hyperlink r:id="rId232">
+      <w:hyperlink r:id="rId242">
         <w:r>
           <w:rPr>
             <w:rStyle w:val="Hyperlink"/>
@@ -11373,8 +12112,8 @@
         <w:t xml:space="preserve">.</w:t>
       </w:r>
     </w:p>
-    <w:bookmarkEnd w:id="273"/>
-    <w:bookmarkStart w:id="274" w:name="ref-elliott2017living"/>
+    <w:bookmarkEnd w:id="283"/>
+    <w:bookmarkStart w:id="284" w:name="ref-elliott2017living"/>
     <w:p>
       <w:pPr>
         <w:pStyle w:val="Bibliography"/>
@@ -11419,8 +12158,8 @@
         <w:t xml:space="preserve">.</w:t>
       </w:r>
     </w:p>
-    <w:bookmarkEnd w:id="274"/>
-    <w:bookmarkStart w:id="275" w:name="ref-enders2011domestic"/>
+    <w:bookmarkEnd w:id="284"/>
+    <w:bookmarkStart w:id="285" w:name="ref-enders2011domestic"/>
     <w:p>
       <w:pPr>
         <w:pStyle w:val="Bibliography"/>
@@ -11465,8 +12204,8 @@
         <w:t xml:space="preserve">.</w:t>
       </w:r>
     </w:p>
-    <w:bookmarkEnd w:id="275"/>
-    <w:bookmarkStart w:id="276" w:name="ref-fairfield2017bayesian"/>
+    <w:bookmarkEnd w:id="285"/>
+    <w:bookmarkStart w:id="286" w:name="ref-fairfield2017bayesian"/>
     <w:p>
       <w:pPr>
         <w:pStyle w:val="Bibliography"/>
@@ -11511,7 +12250,7 @@
       <w:r>
         <w:t xml:space="preserve"> </w:t>
       </w:r>
-      <w:hyperlink r:id="rId239">
+      <w:hyperlink r:id="rId249">
         <w:r>
           <w:rPr>
             <w:rStyle w:val="Hyperlink"/>
@@ -11523,8 +12262,8 @@
         <w:t xml:space="preserve">.</w:t>
       </w:r>
     </w:p>
-    <w:bookmarkEnd w:id="276"/>
-    <w:bookmarkStart w:id="277" w:name="ref-gerring2012methodology"/>
+    <w:bookmarkEnd w:id="286"/>
+    <w:bookmarkStart w:id="287" w:name="ref-gerring2012methodology"/>
     <w:p>
       <w:pPr>
         <w:pStyle w:val="Bibliography"/>
@@ -11546,8 +12285,8 @@
         <w:t xml:space="preserve">. 2nd ed. Cambridge: Cambridge University Press, 2012.</w:t>
       </w:r>
     </w:p>
-    <w:bookmarkEnd w:id="277"/>
-    <w:bookmarkStart w:id="278" w:name="ref-gilardi2023chatgpt"/>
+    <w:bookmarkEnd w:id="287"/>
+    <w:bookmarkStart w:id="288" w:name="ref-gilardi2023chatgpt"/>
     <w:p>
       <w:pPr>
         <w:pStyle w:val="Bibliography"/>
@@ -11589,7 +12328,7 @@
       <w:r>
         <w:t xml:space="preserve"> </w:t>
       </w:r>
-      <w:hyperlink r:id="rId220">
+      <w:hyperlink r:id="rId230">
         <w:r>
           <w:rPr>
             <w:rStyle w:val="Hyperlink"/>
@@ -11601,8 +12340,8 @@
         <w:t xml:space="preserve">.</w:t>
       </w:r>
     </w:p>
-    <w:bookmarkEnd w:id="278"/>
-    <w:bookmarkStart w:id="279" w:name="ref-grant2009typology"/>
+    <w:bookmarkEnd w:id="288"/>
+    <w:bookmarkStart w:id="289" w:name="ref-grant2009typology"/>
     <w:p>
       <w:pPr>
         <w:pStyle w:val="Bibliography"/>
@@ -11657,8 +12396,8 @@
         <w:t xml:space="preserve">.</w:t>
       </w:r>
     </w:p>
-    <w:bookmarkEnd w:id="279"/>
-    <w:bookmarkStart w:id="280" w:name="ref-greenhalgh2005search"/>
+    <w:bookmarkEnd w:id="289"/>
+    <w:bookmarkStart w:id="290" w:name="ref-greenhalgh2005search"/>
     <w:p>
       <w:pPr>
         <w:pStyle w:val="Bibliography"/>
@@ -11703,8 +12442,8 @@
         <w:t xml:space="preserve">.</w:t>
       </w:r>
     </w:p>
-    <w:bookmarkEnd w:id="280"/>
-    <w:bookmarkStart w:id="281" w:name="ref-hedges2010robust"/>
+    <w:bookmarkEnd w:id="290"/>
+    <w:bookmarkStart w:id="291" w:name="ref-hedges2010robust"/>
     <w:p>
       <w:pPr>
         <w:pStyle w:val="Bibliography"/>
@@ -11749,8 +12488,8 @@
         <w:t xml:space="preserve">.</w:t>
       </w:r>
     </w:p>
-    <w:bookmarkEnd w:id="281"/>
-    <w:bookmarkStart w:id="282" w:name="ref-irsova2024meta"/>
+    <w:bookmarkEnd w:id="291"/>
+    <w:bookmarkStart w:id="292" w:name="ref-irsova2024meta"/>
     <w:p>
       <w:pPr>
         <w:pStyle w:val="Bibliography"/>
@@ -11795,8 +12534,8 @@
         <w:t xml:space="preserve">.</w:t>
       </w:r>
     </w:p>
-    <w:bookmarkEnd w:id="282"/>
-    <w:bookmarkStart w:id="283" w:name="ref-lebo2013provo"/>
+    <w:bookmarkEnd w:id="292"/>
+    <w:bookmarkStart w:id="293" w:name="ref-lebo2013provo"/>
     <w:p>
       <w:pPr>
         <w:pStyle w:val="Bibliography"/>
@@ -11849,8 +12588,8 @@
         <w:t xml:space="preserve">.</w:t>
       </w:r>
     </w:p>
-    <w:bookmarkEnd w:id="283"/>
-    <w:bookmarkStart w:id="284" w:name="ref-littell2018classification"/>
+    <w:bookmarkEnd w:id="293"/>
+    <w:bookmarkStart w:id="294" w:name="ref-littell2018classification"/>
     <w:p>
       <w:pPr>
         <w:pStyle w:val="Bibliography"/>
@@ -11895,8 +12634,54 @@
         <w:t xml:space="preserve">.</w:t>
       </w:r>
     </w:p>
-    <w:bookmarkEnd w:id="284"/>
-    <w:bookmarkStart w:id="285" w:name="ref-malterud2016information"/>
+    <w:bookmarkEnd w:id="294"/>
+    <w:bookmarkStart w:id="295" w:name="ref-liu2024lost"/>
+    <w:p>
+      <w:pPr>
+        <w:pStyle w:val="Bibliography"/>
+      </w:pPr>
+      <w:r>
+        <w:t xml:space="preserve">Liu, Nelson F., Kevin Lin, John Hewitt, Ashwin Paranjape, Michele Bevilacqua, Fabio Petroni, and Percy Liang.</w:t>
+      </w:r>
+      <w:r>
+        <w:t xml:space="preserve"> </w:t>
+      </w:r>
+      <w:r>
+        <w:t xml:space="preserve">“Lost in the Middle: How Language Models Use Long Contexts.”</w:t>
+      </w:r>
+      <w:r>
+        <w:t xml:space="preserve"> </w:t>
+      </w:r>
+      <w:r>
+        <w:rPr>
+          <w:i/>
+          <w:iCs/>
+        </w:rPr>
+        <w:t xml:space="preserve">Transactions of the Association for Computational Linguistics</w:t>
+      </w:r>
+      <w:r>
+        <w:t xml:space="preserve"> </w:t>
+      </w:r>
+      <w:r>
+        <w:t xml:space="preserve">12 (2024): 157–73.</w:t>
+      </w:r>
+      <w:r>
+        <w:t xml:space="preserve"> </w:t>
+      </w:r>
+      <w:hyperlink r:id="rId217">
+        <w:r>
+          <w:rPr>
+            <w:rStyle w:val="Hyperlink"/>
+          </w:rPr>
+          <w:t xml:space="preserve">https://doi.org/10.1162/tacl_a_00638</w:t>
+        </w:r>
+      </w:hyperlink>
+      <w:r>
+        <w:t xml:space="preserve">.</w:t>
+      </w:r>
+    </w:p>
+    <w:bookmarkEnd w:id="295"/>
+    <w:bookmarkStart w:id="296" w:name="ref-malterud2016information"/>
     <w:p>
       <w:pPr>
         <w:pStyle w:val="Bibliography"/>
@@ -11941,8 +12726,8 @@
         <w:t xml:space="preserve">.</w:t>
       </w:r>
     </w:p>
-    <w:bookmarkEnd w:id="285"/>
-    <w:bookmarkStart w:id="286" w:name="ref-marshall2019automation"/>
+    <w:bookmarkEnd w:id="296"/>
+    <w:bookmarkStart w:id="297" w:name="ref-marshall2019automation"/>
     <w:p>
       <w:pPr>
         <w:pStyle w:val="Bibliography"/>
@@ -11987,8 +12772,8 @@
         <w:t xml:space="preserve">.</w:t>
       </w:r>
     </w:p>
-    <w:bookmarkEnd w:id="286"/>
-    <w:bookmarkStart w:id="287" w:name="ref-moreau2022open"/>
+    <w:bookmarkEnd w:id="297"/>
+    <w:bookmarkStart w:id="298" w:name="ref-moreau2022open"/>
     <w:p>
       <w:pPr>
         <w:pStyle w:val="Bibliography"/>
@@ -12033,8 +12818,8 @@
         <w:t xml:space="preserve">.</w:t>
       </w:r>
     </w:p>
-    <w:bookmarkEnd w:id="287"/>
-    <w:bookmarkStart w:id="288" w:name="ref-start2024codebook"/>
+    <w:bookmarkEnd w:id="298"/>
+    <w:bookmarkStart w:id="299" w:name="ref-start2024codebook"/>
     <w:p>
       <w:pPr>
         <w:pStyle w:val="Bibliography"/>
@@ -12069,8 +12854,8 @@
         <w:t xml:space="preserve">.</w:t>
       </w:r>
     </w:p>
-    <w:bookmarkEnd w:id="288"/>
-    <w:bookmarkStart w:id="289" w:name="ref-page2021prisma"/>
+    <w:bookmarkEnd w:id="299"/>
+    <w:bookmarkStart w:id="300" w:name="ref-page2021prisma"/>
     <w:p>
       <w:pPr>
         <w:pStyle w:val="Bibliography"/>
@@ -12115,8 +12900,8 @@
         <w:t xml:space="preserve">.</w:t>
       </w:r>
     </w:p>
-    <w:bookmarkEnd w:id="289"/>
-    <w:bookmarkStart w:id="290" w:name="ref-pangakis2023annotation"/>
+    <w:bookmarkEnd w:id="300"/>
+    <w:bookmarkStart w:id="301" w:name="ref-pangakis2023annotation"/>
     <w:p>
       <w:pPr>
         <w:pStyle w:val="Bibliography"/>
@@ -12158,7 +12943,7 @@
       <w:r>
         <w:t xml:space="preserve"> </w:t>
       </w:r>
-      <w:hyperlink r:id="rId221">
+      <w:hyperlink r:id="rId231">
         <w:r>
           <w:rPr>
             <w:rStyle w:val="Hyperlink"/>
@@ -12170,8 +12955,57 @@
         <w:t xml:space="preserve">.</w:t>
       </w:r>
     </w:p>
-    <w:bookmarkEnd w:id="290"/>
-    <w:bookmarkStart w:id="291" w:name="ref-pigott2020meta"/>
+    <w:bookmarkEnd w:id="301"/>
+    <w:bookmarkStart w:id="302" w:name="ref-park2023generative"/>
+    <w:p>
+      <w:pPr>
+        <w:pStyle w:val="Bibliography"/>
+      </w:pPr>
+      <w:r>
+        <w:t xml:space="preserve">Park, Joon Sung, Joseph C. O’Brien, Carrie J. Cai, Meredith Ringel Morris, Percy Liang, and Michael S. Bernstein.</w:t>
+      </w:r>
+      <w:r>
+        <w:t xml:space="preserve"> </w:t>
+      </w:r>
+      <w:r>
+        <w:t xml:space="preserve">“Generative Agents: Interactive Simulacra of Human Behavior.”</w:t>
+      </w:r>
+      <w:r>
+        <w:t xml:space="preserve"> </w:t>
+      </w:r>
+      <w:r>
+        <w:t xml:space="preserve">In</w:t>
+      </w:r>
+      <w:r>
+        <w:t xml:space="preserve"> </w:t>
+      </w:r>
+      <w:r>
+        <w:rPr>
+          <w:i/>
+          <w:iCs/>
+        </w:rPr>
+        <w:t xml:space="preserve">Proceedings of the 36th Annual ACM Symposium on User Interface Software and Technology</w:t>
+      </w:r>
+      <w:r>
+        <w:t xml:space="preserve">, 1–22, 2023.</w:t>
+      </w:r>
+      <w:r>
+        <w:t xml:space="preserve"> </w:t>
+      </w:r>
+      <w:hyperlink r:id="rId214">
+        <w:r>
+          <w:rPr>
+            <w:rStyle w:val="Hyperlink"/>
+          </w:rPr>
+          <w:t xml:space="preserve">https://doi.org/10.1145/3586183.3606763</w:t>
+        </w:r>
+      </w:hyperlink>
+      <w:r>
+        <w:t xml:space="preserve">.</w:t>
+      </w:r>
+    </w:p>
+    <w:bookmarkEnd w:id="302"/>
+    <w:bookmarkStart w:id="303" w:name="ref-pigott2020meta"/>
     <w:p>
       <w:pPr>
         <w:pStyle w:val="Bibliography"/>
@@ -12216,8 +13050,8 @@
         <w:t xml:space="preserve">.</w:t>
       </w:r>
     </w:p>
-    <w:bookmarkEnd w:id="291"/>
-    <w:bookmarkStart w:id="292" w:name="ref-polanin2020transparency"/>
+    <w:bookmarkEnd w:id="303"/>
+    <w:bookmarkStart w:id="304" w:name="ref-polanin2020transparency"/>
     <w:p>
       <w:pPr>
         <w:pStyle w:val="Bibliography"/>
@@ -12262,8 +13096,8 @@
         <w:t xml:space="preserve">.</w:t>
       </w:r>
     </w:p>
-    <w:bookmarkEnd w:id="292"/>
-    <w:bookmarkStart w:id="293" w:name="ref-rethlefsen2021prismas"/>
+    <w:bookmarkEnd w:id="304"/>
+    <w:bookmarkStart w:id="305" w:name="ref-rethlefsen2021prismas"/>
     <w:p>
       <w:pPr>
         <w:pStyle w:val="Bibliography"/>
@@ -12308,8 +13142,8 @@
         <w:t xml:space="preserve">.</w:t>
       </w:r>
     </w:p>
-    <w:bookmarkEnd w:id="293"/>
-    <w:bookmarkStart w:id="294" w:name="ref-roberts2021mediacloud"/>
+    <w:bookmarkEnd w:id="305"/>
+    <w:bookmarkStart w:id="306" w:name="ref-roberts2021mediacloud"/>
     <w:p>
       <w:pPr>
         <w:pStyle w:val="Bibliography"/>
@@ -12342,7 +13176,7 @@
       <w:r>
         <w:t xml:space="preserve"> </w:t>
       </w:r>
-      <w:hyperlink r:id="rId226">
+      <w:hyperlink r:id="rId236">
         <w:r>
           <w:rPr>
             <w:rStyle w:val="Hyperlink"/>
@@ -12354,8 +13188,8 @@
         <w:t xml:space="preserve">.</w:t>
       </w:r>
     </w:p>
-    <w:bookmarkEnd w:id="294"/>
-    <w:bookmarkStart w:id="295" w:name="ref-saunders2018saturation"/>
+    <w:bookmarkEnd w:id="306"/>
+    <w:bookmarkStart w:id="307" w:name="ref-saunders2018saturation"/>
     <w:p>
       <w:pPr>
         <w:pStyle w:val="Bibliography"/>
@@ -12400,8 +13234,8 @@
         <w:t xml:space="preserve">.</w:t>
       </w:r>
     </w:p>
-    <w:bookmarkEnd w:id="295"/>
-    <w:bookmarkStart w:id="296" w:name="ref-snyder2019literature"/>
+    <w:bookmarkEnd w:id="307"/>
+    <w:bookmarkStart w:id="308" w:name="ref-snyder2019literature"/>
     <w:p>
       <w:pPr>
         <w:pStyle w:val="Bibliography"/>
@@ -12446,8 +13280,8 @@
         <w:t xml:space="preserve">.</w:t>
       </w:r>
     </w:p>
-    <w:bookmarkEnd w:id="296"/>
-    <w:bookmarkStart w:id="297" w:name="ref-sousa2026ai"/>
+    <w:bookmarkEnd w:id="308"/>
+    <w:bookmarkStart w:id="309" w:name="ref-sousa2026ai"/>
     <w:p>
       <w:pPr>
         <w:pStyle w:val="Bibliography"/>
@@ -12492,8 +13326,8 @@
         <w:t xml:space="preserve">.</w:t>
       </w:r>
     </w:p>
-    <w:bookmarkEnd w:id="297"/>
-    <w:bookmarkStart w:id="298" w:name="ref-uttley2026meta"/>
+    <w:bookmarkEnd w:id="309"/>
+    <w:bookmarkStart w:id="310" w:name="ref-uttley2026meta"/>
     <w:p>
       <w:pPr>
         <w:pStyle w:val="Bibliography"/>
@@ -12538,8 +13372,8 @@
         <w:t xml:space="preserve">.</w:t>
       </w:r>
     </w:p>
-    <w:bookmarkEnd w:id="298"/>
-    <w:bookmarkStart w:id="299" w:name="ref-wohlin2014snowballing"/>
+    <w:bookmarkEnd w:id="310"/>
+    <w:bookmarkStart w:id="311" w:name="ref-wohlin2014snowballing"/>
     <w:p>
       <w:pPr>
         <w:pStyle w:val="Bibliography"/>
@@ -12587,8 +13421,8 @@
         <w:t xml:space="preserve">.</w:t>
       </w:r>
     </w:p>
-    <w:bookmarkEnd w:id="299"/>
-    <w:bookmarkStart w:id="300" w:name="ref-xiong2024uncertainty"/>
+    <w:bookmarkEnd w:id="311"/>
+    <w:bookmarkStart w:id="312" w:name="ref-xiong2024uncertainty"/>
     <w:p>
       <w:pPr>
         <w:pStyle w:val="Bibliography"/>
@@ -12645,7 +13479,7 @@
       <w:r>
         <w:t xml:space="preserve"> </w:t>
       </w:r>
-      <w:hyperlink r:id="rId242">
+      <w:hyperlink r:id="rId252">
         <w:r>
           <w:rPr>
             <w:rStyle w:val="Hyperlink"/>
@@ -12657,41 +13491,32 @@
         <w:t xml:space="preserve">.</w:t>
       </w:r>
     </w:p>
-    <w:bookmarkEnd w:id="300"/>
-    <w:bookmarkStart w:id="301" w:name="ref-zaks2021updating"/>
+    <w:bookmarkEnd w:id="312"/>
+    <w:bookmarkStart w:id="313" w:name="ref-yao2023react"/>
     <w:p>
       <w:pPr>
         <w:pStyle w:val="Bibliography"/>
       </w:pPr>
       <w:r>
-        <w:t xml:space="preserve">Zaks, Sherry.</w:t>
-      </w:r>
-      <w:r>
-        <w:t xml:space="preserve"> </w:t>
-      </w:r>
-      <w:r>
-        <w:t xml:space="preserve">“Updating</w:t>
-      </w:r>
-      <w:r>
-        <w:t xml:space="preserve"> </w:t>
-      </w:r>
-      <w:r>
-        <w:t xml:space="preserve">Bayesian(s)</w:t>
-      </w:r>
-      <w:r>
-        <w:t xml:space="preserve">: A Critical Evaluation of</w:t>
-      </w:r>
-      <w:r>
-        <w:t xml:space="preserve"> </w:t>
-      </w:r>
-      <w:r>
-        <w:t xml:space="preserve">Bayesian</w:t>
-      </w:r>
-      <w:r>
-        <w:t xml:space="preserve"> </w:t>
-      </w:r>
-      <w:r>
-        <w:t xml:space="preserve">Process Tracing.”</w:t>
+        <w:t xml:space="preserve">Yao, Shunyu, Jeffrey Zhao, Dian Yu, Nan Du, Izhak Shafran, Karthik Narasimhan, and Yuan Cao.</w:t>
+      </w:r>
+      <w:r>
+        <w:t xml:space="preserve"> </w:t>
+      </w:r>
+      <w:r>
+        <w:t xml:space="preserve">“</w:t>
+      </w:r>
+      <w:r>
+        <w:t xml:space="preserve">ReAct</w:t>
+      </w:r>
+      <w:r>
+        <w:t xml:space="preserve">: Synergizing Reasoning and Acting in Language Models.”</w:t>
+      </w:r>
+      <w:r>
+        <w:t xml:space="preserve"> </w:t>
+      </w:r>
+      <w:r>
+        <w:t xml:space="preserve">In</w:t>
       </w:r>
       <w:r>
         <w:t xml:space="preserve"> </w:t>
@@ -12701,6 +13526,70 @@
           <w:i/>
           <w:iCs/>
         </w:rPr>
+        <w:t xml:space="preserve">The Eleventh International Conference on Learning Representations</w:t>
+      </w:r>
+      <w:r>
+        <w:t xml:space="preserve">, 2023.</w:t>
+      </w:r>
+      <w:r>
+        <w:t xml:space="preserve"> </w:t>
+      </w:r>
+      <w:hyperlink r:id="rId212">
+        <w:r>
+          <w:rPr>
+            <w:rStyle w:val="Hyperlink"/>
+          </w:rPr>
+          <w:t xml:space="preserve">https://openreview.net/forum?id=WE_vluYUL-X</w:t>
+        </w:r>
+      </w:hyperlink>
+      <w:r>
+        <w:t xml:space="preserve">.</w:t>
+      </w:r>
+    </w:p>
+    <w:bookmarkEnd w:id="313"/>
+    <w:bookmarkStart w:id="314" w:name="ref-zaks2021updating"/>
+    <w:p>
+      <w:pPr>
+        <w:pStyle w:val="Bibliography"/>
+      </w:pPr>
+      <w:r>
+        <w:t xml:space="preserve">Zaks, Sherry.</w:t>
+      </w:r>
+      <w:r>
+        <w:t xml:space="preserve"> </w:t>
+      </w:r>
+      <w:r>
+        <w:t xml:space="preserve">“Updating</w:t>
+      </w:r>
+      <w:r>
+        <w:t xml:space="preserve"> </w:t>
+      </w:r>
+      <w:r>
+        <w:t xml:space="preserve">Bayesian(s)</w:t>
+      </w:r>
+      <w:r>
+        <w:t xml:space="preserve">: A Critical Evaluation of</w:t>
+      </w:r>
+      <w:r>
+        <w:t xml:space="preserve"> </w:t>
+      </w:r>
+      <w:r>
+        <w:t xml:space="preserve">Bayesian</w:t>
+      </w:r>
+      <w:r>
+        <w:t xml:space="preserve"> </w:t>
+      </w:r>
+      <w:r>
+        <w:t xml:space="preserve">Process Tracing.”</w:t>
+      </w:r>
+      <w:r>
+        <w:t xml:space="preserve"> </w:t>
+      </w:r>
+      <w:r>
+        <w:rPr>
+          <w:i/>
+          <w:iCs/>
+        </w:rPr>
         <w:t xml:space="preserve">Political Analysis</w:t>
       </w:r>
       <w:r>
@@ -12712,7 +13601,7 @@
       <w:r>
         <w:t xml:space="preserve"> </w:t>
       </w:r>
-      <w:hyperlink r:id="rId240">
+      <w:hyperlink r:id="rId250">
         <w:r>
           <w:rPr>
             <w:rStyle w:val="Hyperlink"/>
@@ -12724,8 +13613,8 @@
         <w:t xml:space="preserve">.</w:t>
       </w:r>
     </w:p>
-    <w:bookmarkEnd w:id="301"/>
-    <w:bookmarkStart w:id="302" w:name="ref-ziems2024transform"/>
+    <w:bookmarkEnd w:id="314"/>
+    <w:bookmarkStart w:id="315" w:name="ref-ziems2024transform"/>
     <w:p>
       <w:pPr>
         <w:pStyle w:val="Bibliography"/>
@@ -12758,7 +13647,7 @@
       <w:r>
         <w:t xml:space="preserve"> </w:t>
       </w:r>
-      <w:hyperlink r:id="rId222">
+      <w:hyperlink r:id="rId232">
         <w:r>
           <w:rPr>
             <w:rStyle w:val="Hyperlink"/>
@@ -12770,9 +13659,9 @@
         <w:t xml:space="preserve">.</w:t>
       </w:r>
     </w:p>
-    <w:bookmarkEnd w:id="302"/>
-    <w:bookmarkEnd w:id="303"/>
-    <w:bookmarkEnd w:id="304"/>
+    <w:bookmarkEnd w:id="315"/>
+    <w:bookmarkEnd w:id="316"/>
+    <w:bookmarkEnd w:id="317"/>
     <w:sectPr>
       <w:footnotePr>
         <w:numRestart w:val="eachSect"/>
@@ -14366,7 +15255,7 @@
       </w:r>
     </w:p>
   </w:footnote>
-  <w:footnote w:id="219">
+  <w:footnote w:id="211">
     <w:p>
       <w:pPr>
         <w:pStyle w:val="FootnoteText"/>
@@ -14381,7 +15270,7 @@
         <w:t xml:space="preserve"> </w:t>
       </w:r>
       <w:r>
-        <w:t xml:space="preserve">Fabrizio Gilardi, Meysam Alizadeh, and Maël Kubli,</w:t>
+        <w:t xml:space="preserve">Shunyu Yao et al.,</w:t>
       </w:r>
       <w:r>
         <w:t xml:space="preserve"> </w:t>
@@ -14390,13 +15279,16 @@
         <w:t xml:space="preserve">“</w:t>
       </w:r>
       <w:r>
-        <w:t xml:space="preserve">ChatGPT</w:t>
-      </w:r>
-      <w:r>
-        <w:t xml:space="preserve"> </w:t>
-      </w:r>
-      <w:r>
-        <w:t xml:space="preserve">Outperforms Crowd Workers for Text-Annotation Tasks,”</w:t>
+        <w:t xml:space="preserve">ReAct</w:t>
+      </w:r>
+      <w:r>
+        <w:t xml:space="preserve">: Synergizing Reasoning and Acting in Language Models,”</w:t>
+      </w:r>
+      <w:r>
+        <w:t xml:space="preserve"> </w:t>
+      </w:r>
+      <w:r>
+        <w:t xml:space="preserve">in</w:t>
       </w:r>
       <w:r>
         <w:t xml:space="preserve"> </w:t>
@@ -14406,6 +15298,180 @@
           <w:i/>
           <w:iCs/>
         </w:rPr>
+        <w:t xml:space="preserve">The Eleventh International Conference on Learning Representations</w:t>
+      </w:r>
+      <w:r>
+        <w:t xml:space="preserve">, 2023,</w:t>
+      </w:r>
+      <w:r>
+        <w:t xml:space="preserve"> </w:t>
+      </w:r>
+      <w:hyperlink r:id="rId212">
+        <w:r>
+          <w:rPr>
+            <w:rStyle w:val="Hyperlink"/>
+          </w:rPr>
+          <w:t xml:space="preserve">https://openreview.net/forum?id=WE_vluYUL-X</w:t>
+        </w:r>
+      </w:hyperlink>
+      <w:r>
+        <w:t xml:space="preserve">.</w:t>
+      </w:r>
+    </w:p>
+  </w:footnote>
+  <w:footnote w:id="213">
+    <w:p>
+      <w:pPr>
+        <w:pStyle w:val="FootnoteText"/>
+      </w:pPr>
+      <w:r>
+        <w:rPr>
+          <w:rStyle w:val="FootnoteReference"/>
+        </w:rPr>
+        <w:footnoteRef/>
+      </w:r>
+      <w:r>
+        <w:t xml:space="preserve"> </w:t>
+      </w:r>
+      <w:r>
+        <w:t xml:space="preserve">Joon Sung Park et al.,</w:t>
+      </w:r>
+      <w:r>
+        <w:t xml:space="preserve"> </w:t>
+      </w:r>
+      <w:r>
+        <w:t xml:space="preserve">“Generative Agents: Interactive Simulacra of Human Behavior,”</w:t>
+      </w:r>
+      <w:r>
+        <w:t xml:space="preserve"> </w:t>
+      </w:r>
+      <w:r>
+        <w:t xml:space="preserve">in</w:t>
+      </w:r>
+      <w:r>
+        <w:t xml:space="preserve"> </w:t>
+      </w:r>
+      <w:r>
+        <w:rPr>
+          <w:i/>
+          <w:iCs/>
+        </w:rPr>
+        <w:t xml:space="preserve">Proceedings of the 36th Annual ACM Symposium on User Interface Software and Technology</w:t>
+      </w:r>
+      <w:r>
+        <w:t xml:space="preserve">, 2023, 1–22,</w:t>
+      </w:r>
+      <w:r>
+        <w:t xml:space="preserve"> </w:t>
+      </w:r>
+      <w:hyperlink r:id="rId214">
+        <w:r>
+          <w:rPr>
+            <w:rStyle w:val="Hyperlink"/>
+          </w:rPr>
+          <w:t xml:space="preserve">https://doi.org/10.1145/3586183.3606763</w:t>
+        </w:r>
+      </w:hyperlink>
+      <w:r>
+        <w:t xml:space="preserve">.</w:t>
+      </w:r>
+    </w:p>
+  </w:footnote>
+  <w:footnote w:id="216">
+    <w:p>
+      <w:pPr>
+        <w:pStyle w:val="FootnoteText"/>
+      </w:pPr>
+      <w:r>
+        <w:rPr>
+          <w:rStyle w:val="FootnoteReference"/>
+        </w:rPr>
+        <w:footnoteRef/>
+      </w:r>
+      <w:r>
+        <w:t xml:space="preserve"> </w:t>
+      </w:r>
+      <w:r>
+        <w:t xml:space="preserve">Nelson F. Liu et al.,</w:t>
+      </w:r>
+      <w:r>
+        <w:t xml:space="preserve"> </w:t>
+      </w:r>
+      <w:r>
+        <w:t xml:space="preserve">“Lost in the Middle: How Language Models Use Long Contexts,”</w:t>
+      </w:r>
+      <w:r>
+        <w:t xml:space="preserve"> </w:t>
+      </w:r>
+      <w:r>
+        <w:rPr>
+          <w:i/>
+          <w:iCs/>
+        </w:rPr>
+        <w:t xml:space="preserve">Transactions of the Association for Computational Linguistics</w:t>
+      </w:r>
+      <w:r>
+        <w:t xml:space="preserve"> </w:t>
+      </w:r>
+      <w:r>
+        <w:t xml:space="preserve">12 (2024): 157–73,</w:t>
+      </w:r>
+      <w:r>
+        <w:t xml:space="preserve"> </w:t>
+      </w:r>
+      <w:hyperlink r:id="rId217">
+        <w:r>
+          <w:rPr>
+            <w:rStyle w:val="Hyperlink"/>
+          </w:rPr>
+          <w:t xml:space="preserve">https://doi.org/10.1162/tacl_a_00638</w:t>
+        </w:r>
+      </w:hyperlink>
+      <w:r>
+        <w:t xml:space="preserve">.</w:t>
+      </w:r>
+    </w:p>
+  </w:footnote>
+  <w:footnote w:id="229">
+    <w:p>
+      <w:pPr>
+        <w:pStyle w:val="FootnoteText"/>
+      </w:pPr>
+      <w:r>
+        <w:rPr>
+          <w:rStyle w:val="FootnoteReference"/>
+        </w:rPr>
+        <w:footnoteRef/>
+      </w:r>
+      <w:r>
+        <w:t xml:space="preserve"> </w:t>
+      </w:r>
+      <w:r>
+        <w:t xml:space="preserve">Fabrizio Gilardi, Meysam Alizadeh, and Maël Kubli,</w:t>
+      </w:r>
+      <w:r>
+        <w:t xml:space="preserve"> </w:t>
+      </w:r>
+      <w:r>
+        <w:t xml:space="preserve">“</w:t>
+      </w:r>
+      <w:r>
+        <w:t xml:space="preserve">ChatGPT</w:t>
+      </w:r>
+      <w:r>
+        <w:t xml:space="preserve"> </w:t>
+      </w:r>
+      <w:r>
+        <w:t xml:space="preserve">Outperforms Crowd Workers for Text-Annotation Tasks,”</w:t>
+      </w:r>
+      <w:r>
+        <w:t xml:space="preserve"> </w:t>
+      </w:r>
+      <w:r>
+        <w:rPr>
+          <w:i/>
+          <w:iCs/>
+        </w:rPr>
         <w:t xml:space="preserve">Proceedings of the National Academy of Sciences</w:t>
       </w:r>
       <w:r>
@@ -14417,7 +15483,7 @@
       <w:r>
         <w:t xml:space="preserve"> </w:t>
       </w:r>
-      <w:hyperlink r:id="rId220">
+      <w:hyperlink r:id="rId230">
         <w:r>
           <w:rPr>
             <w:rStyle w:val="Hyperlink"/>
@@ -14462,7 +15528,7 @@
       <w:r>
         <w:t xml:space="preserve"> </w:t>
       </w:r>
-      <w:hyperlink r:id="rId221">
+      <w:hyperlink r:id="rId231">
         <w:r>
           <w:rPr>
             <w:rStyle w:val="Hyperlink"/>
@@ -14498,7 +15564,7 @@
       <w:r>
         <w:t xml:space="preserve"> </w:t>
       </w:r>
-      <w:hyperlink r:id="rId222">
+      <w:hyperlink r:id="rId232">
         <w:r>
           <w:rPr>
             <w:rStyle w:val="Hyperlink"/>
@@ -14511,7 +15577,7 @@
       </w:r>
     </w:p>
   </w:footnote>
-  <w:footnote w:id="225">
+  <w:footnote w:id="235">
     <w:p>
       <w:pPr>
         <w:pStyle w:val="FootnoteText"/>
@@ -14553,7 +15619,7 @@
       <w:r>
         <w:t xml:space="preserve"> </w:t>
       </w:r>
-      <w:hyperlink r:id="rId226">
+      <w:hyperlink r:id="rId236">
         <w:r>
           <w:rPr>
             <w:rStyle w:val="Hyperlink"/>
@@ -14566,7 +15632,7 @@
       </w:r>
     </w:p>
   </w:footnote>
-  <w:footnote w:id="227">
+  <w:footnote w:id="237">
     <w:p>
       <w:pPr>
         <w:pStyle w:val="FootnoteText"/>
@@ -14608,7 +15674,7 @@
       <w:r>
         <w:t xml:space="preserve"> </w:t>
       </w:r>
-      <w:hyperlink r:id="rId228">
+      <w:hyperlink r:id="rId238">
         <w:r>
           <w:rPr>
             <w:rStyle w:val="Hyperlink"/>
@@ -14621,7 +15687,7 @@
       </w:r>
     </w:p>
   </w:footnote>
-  <w:footnote w:id="231">
+  <w:footnote w:id="241">
     <w:p>
       <w:pPr>
         <w:pStyle w:val="FootnoteText"/>
@@ -14678,7 +15744,7 @@
       <w:r>
         <w:t xml:space="preserve"> </w:t>
       </w:r>
-      <w:hyperlink r:id="rId232">
+      <w:hyperlink r:id="rId242">
         <w:r>
           <w:rPr>
             <w:rStyle w:val="Hyperlink"/>
@@ -14691,7 +15757,7 @@
       </w:r>
     </w:p>
   </w:footnote>
-  <w:footnote w:id="235">
+  <w:footnote w:id="245">
     <w:p>
       <w:pPr>
         <w:pStyle w:val="FootnoteText"/>
@@ -14733,7 +15799,7 @@
       <w:r>
         <w:t xml:space="preserve"> </w:t>
       </w:r>
-      <w:hyperlink r:id="rId236">
+      <w:hyperlink r:id="rId246">
         <w:r>
           <w:rPr>
             <w:rStyle w:val="Hyperlink"/>
@@ -14746,7 +15812,7 @@
       </w:r>
     </w:p>
   </w:footnote>
-  <w:footnote w:id="238">
+  <w:footnote w:id="248">
     <w:p>
       <w:pPr>
         <w:pStyle w:val="FootnoteText"/>
@@ -14800,7 +15866,7 @@
       <w:r>
         <w:t xml:space="preserve"> </w:t>
       </w:r>
-      <w:hyperlink r:id="rId239">
+      <w:hyperlink r:id="rId249">
         <w:r>
           <w:rPr>
             <w:rStyle w:val="Hyperlink"/>
@@ -14857,7 +15923,7 @@
       <w:r>
         <w:t xml:space="preserve"> </w:t>
       </w:r>
-      <w:hyperlink r:id="rId240">
+      <w:hyperlink r:id="rId250">
         <w:r>
           <w:rPr>
             <w:rStyle w:val="Hyperlink"/>
@@ -14870,7 +15936,7 @@
       </w:r>
     </w:p>
   </w:footnote>
-  <w:footnote w:id="241">
+  <w:footnote w:id="251">
     <w:p>
       <w:pPr>
         <w:pStyle w:val="FootnoteText"/>
@@ -14936,7 +16002,7 @@
       <w:r>
         <w:t xml:space="preserve"> </w:t>
       </w:r>
-      <w:hyperlink r:id="rId242">
+      <w:hyperlink r:id="rId252">
         <w:r>
           <w:rPr>
             <w:rStyle w:val="Hyperlink"/>
@@ -14949,7 +16015,7 @@
       </w:r>
     </w:p>
   </w:footnote>
-  <w:footnote w:id="252">
+  <w:footnote w:id="262">
     <w:p>
       <w:pPr>
         <w:pStyle w:val="FootnoteText"/>
@@ -14993,7 +16059,7 @@
       <w:r>
         <w:t xml:space="preserve"> </w:t>
       </w:r>
-      <w:hyperlink r:id="rId253">
+      <w:hyperlink r:id="rId263">
         <w:r>
           <w:rPr>
             <w:rStyle w:val="Hyperlink"/>

</xml_diff>

<commit_message>
feat(site): publish PKM and AI chapter
</commit_message>
<xml_diff>
--- a/field-guide/book/From-Question-to-Evidence.docx
+++ b/field-guide/book/From-Question-to-Evidence.docx
@@ -11415,22 +11415,2512 @@
     </w:p>
     <w:bookmarkEnd w:id="272"/>
     <w:bookmarkEnd w:id="273"/>
-    <w:bookmarkStart w:id="288" w:name="skills-and-agents-lab"/>
+    <w:bookmarkStart w:id="313" w:name="from-notes-to-research-infrastructure"/>
     <w:p>
       <w:pPr>
         <w:pStyle w:val="Heading1"/>
       </w:pPr>
       <w:r>
-        <w:t xml:space="preserve">21. Skills and Agents Lab</w:t>
-      </w:r>
-    </w:p>
-    <w:bookmarkStart w:id="277" w:name="method-in-the-book-procedure-in-the-lab"/>
+        <w:t xml:space="preserve">21. From Notes to Research Infrastructure</w:t>
+      </w:r>
+    </w:p>
+    <w:bookmarkStart w:id="280" w:name="a-library-begins-to-remember"/>
     <w:p>
       <w:pPr>
         <w:pStyle w:val="Heading2"/>
       </w:pPr>
       <w:r>
-        <w:t xml:space="preserve">21.1 Method in the Book, Procedure in the Lab</w:t>
+        <w:t xml:space="preserve">21.1 A Library Begins to Remember</w:t>
+      </w:r>
+    </w:p>
+    <w:p>
+      <w:pPr>
+        <w:pStyle w:val="FirstParagraph"/>
+      </w:pPr>
+      <w:r>
+        <w:t xml:space="preserve">At 9:20 on the morning of November 29, 2022, a cluster of items entered my</w:t>
+      </w:r>
+      <w:r>
+        <w:t xml:space="preserve"> </w:t>
+      </w:r>
+      <w:r>
+        <w:t xml:space="preserve">Readwise library. One promised “networked thought.” Another explained how smart</w:t>
+      </w:r>
+      <w:r>
+        <w:t xml:space="preserve"> </w:t>
+      </w:r>
+      <w:r>
+        <w:t xml:space="preserve">notes could turn reading into writing. Others addressed exports, associative</w:t>
+      </w:r>
+      <w:r>
+        <w:t xml:space="preserve"> </w:t>
+      </w:r>
+      <w:r>
+        <w:t xml:space="preserve">links, and the Zettelkasten. Their shared premise was simple: the researcher</w:t>
+      </w:r>
+      <w:r>
+        <w:t xml:space="preserve"> </w:t>
+      </w:r>
+      <w:r>
+        <w:t xml:space="preserve">needed an external memory that preserved ideas beyond the moment of reading.</w:t>
+      </w:r>
+      <w:r>
+        <w:rPr>
+          <w:rStyle w:val="FootnoteReference"/>
+        </w:rPr>
+        <w:footnoteReference w:id="274"/>
+      </w:r>
+    </w:p>
+    <w:p>
+      <w:pPr>
+        <w:pStyle w:val="BodyText"/>
+      </w:pPr>
+      <w:r>
+        <w:t xml:space="preserve">The tools changed. The underlying problem did not. A social scientist may spend</w:t>
+      </w:r>
+      <w:r>
+        <w:t xml:space="preserve"> </w:t>
+      </w:r>
+      <w:r>
+        <w:t xml:space="preserve">years gathering articles, archival records, interview transcripts, observations,</w:t>
+      </w:r>
+      <w:r>
+        <w:t xml:space="preserve"> </w:t>
+      </w:r>
+      <w:r>
+        <w:t xml:space="preserve">code, and partial arguments. The problem is not only how to store these materials.</w:t>
+      </w:r>
+      <w:r>
+        <w:t xml:space="preserve"> </w:t>
+      </w:r>
+      <w:r>
+        <w:t xml:space="preserve">It is how to recover the right piece at the right time, reconstruct why it</w:t>
+      </w:r>
+      <w:r>
+        <w:t xml:space="preserve"> </w:t>
+      </w:r>
+      <w:r>
+        <w:t xml:space="preserve">mattered, connect it to a changing question, and preserve the line from source to</w:t>
+      </w:r>
+      <w:r>
+        <w:t xml:space="preserve"> </w:t>
+      </w:r>
+      <w:r>
+        <w:t xml:space="preserve">claim.</w:t>
+      </w:r>
+    </w:p>
+    <w:p>
+      <w:pPr>
+        <w:pStyle w:val="BodyText"/>
+      </w:pPr>
+      <w:r>
+        <w:t xml:space="preserve">AI entered the same library within days. The early items treated it as a</w:t>
+      </w:r>
+      <w:r>
+        <w:t xml:space="preserve"> </w:t>
+      </w:r>
+      <w:r>
+        <w:t xml:space="preserve">knowledge-aware writing assistant and an unusually productive partner for idea</w:t>
+      </w:r>
+      <w:r>
+        <w:t xml:space="preserve"> </w:t>
+      </w:r>
+      <w:r>
+        <w:t xml:space="preserve">generation. The promise was speed and variation. The warning was already present:</w:t>
+      </w:r>
+      <w:r>
+        <w:t xml:space="preserve"> </w:t>
+      </w:r>
+      <w:r>
+        <w:t xml:space="preserve">an output could be inventive and wrong at the same time.</w:t>
+      </w:r>
+      <w:r>
+        <w:rPr>
+          <w:rStyle w:val="FootnoteReference"/>
+        </w:rPr>
+        <w:footnoteReference w:id="277"/>
+      </w:r>
+    </w:p>
+    <w:p>
+      <w:pPr>
+        <w:pStyle w:val="BodyText"/>
+      </w:pPr>
+      <w:r>
+        <w:t xml:space="preserve">I argue that PKM and AI solve different research problems. Personal knowledge</w:t>
+      </w:r>
+      <w:r>
+        <w:t xml:space="preserve"> </w:t>
+      </w:r>
+      <w:r>
+        <w:t xml:space="preserve">management supplies persistent context, provenance, and continuity. AI reduces the</w:t>
+      </w:r>
+      <w:r>
+        <w:t xml:space="preserve"> </w:t>
+      </w:r>
+      <w:r>
+        <w:t xml:space="preserve">cost of searching, comparing, transforming, and testing that context. Each remains</w:t>
+      </w:r>
+      <w:r>
+        <w:t xml:space="preserve"> </w:t>
+      </w:r>
+      <w:r>
+        <w:t xml:space="preserve">incomplete without the other. PKM without computation can become an orderly</w:t>
+      </w:r>
+      <w:r>
+        <w:t xml:space="preserve"> </w:t>
+      </w:r>
+      <w:r>
+        <w:t xml:space="preserve">archive that rarely produces an argument. AI without a governed knowledge base</w:t>
+      </w:r>
+      <w:r>
+        <w:t xml:space="preserve"> </w:t>
+      </w:r>
+      <w:r>
+        <w:t xml:space="preserve">can produce fluent answers that have no stable relation to the research record.</w:t>
+      </w:r>
+    </w:p>
+    <w:p>
+      <w:pPr>
+        <w:pStyle w:val="BodyText"/>
+      </w:pPr>
+      <w:r>
+        <w:t xml:space="preserve">Their integration creates something more useful than a better note-taking system</w:t>
+      </w:r>
+      <w:r>
+        <w:t xml:space="preserve"> </w:t>
+      </w:r>
+      <w:r>
+        <w:t xml:space="preserve">or a more informed chatbot. It creates research infrastructure. The infrastructure</w:t>
+      </w:r>
+      <w:r>
+        <w:t xml:space="preserve"> </w:t>
+      </w:r>
+      <w:r>
+        <w:t xml:space="preserve">remembers what the researcher has read. It records what the researcher decided. It</w:t>
+      </w:r>
+      <w:r>
+        <w:t xml:space="preserve"> </w:t>
+      </w:r>
+      <w:r>
+        <w:t xml:space="preserve">lets machines perform bounded work across those records. It also preserves the</w:t>
+      </w:r>
+      <w:r>
+        <w:t xml:space="preserve"> </w:t>
+      </w:r>
+      <w:r>
+        <w:t xml:space="preserve">human gates that separate a candidate from evidence and evidence from a claim.</w:t>
+      </w:r>
+    </w:p>
+    <w:p>
+      <w:pPr>
+        <w:pStyle w:val="BodyText"/>
+      </w:pPr>
+      <w:r>
+        <w:t xml:space="preserve">This chapter develops that argument from an audit of my Readwise library. On July</w:t>
+      </w:r>
+      <w:r>
+        <w:t xml:space="preserve"> </w:t>
+      </w:r>
+      <w:r>
+        <w:t xml:space="preserve">27, 2026, the library contained 567 entries tagged</w:t>
+      </w:r>
+      <w:r>
+        <w:t xml:space="preserve"> </w:t>
+      </w:r>
+      <w:r>
+        <w:rPr>
+          <w:rStyle w:val="VerbatimChar"/>
+        </w:rPr>
+        <w:t xml:space="preserve">📄Academic Article</w:t>
+      </w:r>
+      <w:r>
+        <w:t xml:space="preserve">, 499 tagged</w:t>
+      </w:r>
+      <w:r>
+        <w:t xml:space="preserve"> </w:t>
+      </w:r>
+      <w:r>
+        <w:rPr>
+          <w:rStyle w:val="VerbatimChar"/>
+        </w:rPr>
+        <w:t xml:space="preserve">🗃️PKM</w:t>
+      </w:r>
+      <w:r>
+        <w:t xml:space="preserve">, and 3,196 tagged</w:t>
+      </w:r>
+      <w:r>
+        <w:t xml:space="preserve"> </w:t>
+      </w:r>
+      <w:r>
+        <w:rPr>
+          <w:rStyle w:val="VerbatimChar"/>
+        </w:rPr>
+        <w:t xml:space="preserve">🤖AI</w:t>
+      </w:r>
+      <w:r>
+        <w:t xml:space="preserve">. These labels overlap, and the AI category contains</w:t>
+      </w:r>
+      <w:r>
+        <w:t xml:space="preserve"> </w:t>
+      </w:r>
+      <w:r>
+        <w:t xml:space="preserve">news, product announcements, social-media threads, and duplicate records as well</w:t>
+      </w:r>
+      <w:r>
+        <w:t xml:space="preserve"> </w:t>
+      </w:r>
+      <w:r>
+        <w:t xml:space="preserve">as scholarly material. The counts therefore describe attention, not evidence. I</w:t>
+      </w:r>
+      <w:r>
+        <w:t xml:space="preserve"> </w:t>
+      </w:r>
+      <w:r>
+        <w:t xml:space="preserve">use the complete PKM set, the connector-accessible academic and AI samples, their</w:t>
+      </w:r>
+      <w:r>
+        <w:t xml:space="preserve"> </w:t>
+      </w:r>
+      <w:r>
+        <w:t xml:space="preserve">overlaps, and sixteen inspected records to reconstruct the movement from capture</w:t>
+      </w:r>
+      <w:r>
+        <w:t xml:space="preserve"> </w:t>
+      </w:r>
+      <w:r>
+        <w:t xml:space="preserve">to research infrastructure.</w:t>
+      </w:r>
+      <w:r>
+        <w:rPr>
+          <w:rStyle w:val="FootnoteReference"/>
+        </w:rPr>
+        <w:footnoteReference w:id="279"/>
+      </w:r>
+    </w:p>
+    <w:bookmarkEnd w:id="280"/>
+    <w:bookmarkStart w:id="283" w:name="from-capture-to-connection"/>
+    <w:p>
+      <w:pPr>
+        <w:pStyle w:val="Heading2"/>
+      </w:pPr>
+      <w:r>
+        <w:t xml:space="preserve">21.2 From Capture to Connection</w:t>
+      </w:r>
+    </w:p>
+    <w:p>
+      <w:pPr>
+        <w:pStyle w:val="FirstParagraph"/>
+      </w:pPr>
+      <w:r>
+        <w:t xml:space="preserve">The first generation of PKM tools treated forgetting as the central constraint.</w:t>
+      </w:r>
+      <w:r>
+        <w:t xml:space="preserve"> </w:t>
+      </w:r>
+      <w:r>
+        <w:t xml:space="preserve">Researchers read more than they could remember, saved more than they could</w:t>
+      </w:r>
+      <w:r>
+        <w:t xml:space="preserve"> </w:t>
+      </w:r>
+      <w:r>
+        <w:t xml:space="preserve">retrieve, and divided related ideas among folders created at different moments.</w:t>
+      </w:r>
+      <w:r>
+        <w:t xml:space="preserve"> </w:t>
+      </w:r>
+      <w:r>
+        <w:t xml:space="preserve">The proposed remedy was to externalize memory. Notes would become smaller,</w:t>
+      </w:r>
+      <w:r>
+        <w:t xml:space="preserve"> </w:t>
+      </w:r>
+      <w:r>
+        <w:t xml:space="preserve">searchable, and linked. Daily writing would reduce the cost of capture. Backlinks</w:t>
+      </w:r>
+      <w:r>
+        <w:t xml:space="preserve"> </w:t>
+      </w:r>
+      <w:r>
+        <w:t xml:space="preserve">would allow an idea recorded for one purpose to reappear in another.</w:t>
+      </w:r>
+    </w:p>
+    <w:p>
+      <w:pPr>
+        <w:pStyle w:val="BodyText"/>
+      </w:pPr>
+      <w:r>
+        <w:t xml:space="preserve">This was a major improvement over a hierarchy of project folders. A folder asks</w:t>
+      </w:r>
+      <w:r>
+        <w:t xml:space="preserve"> </w:t>
+      </w:r>
+      <w:r>
+        <w:t xml:space="preserve">where a note belongs. A network asks what the note is related to. That difference</w:t>
+      </w:r>
+      <w:r>
+        <w:t xml:space="preserve"> </w:t>
+      </w:r>
+      <w:r>
+        <w:t xml:space="preserve">matters in social research because the same source can perform several jobs. An</w:t>
+      </w:r>
+      <w:r>
+        <w:t xml:space="preserve"> </w:t>
+      </w:r>
+      <w:r>
+        <w:t xml:space="preserve">interview may provide evidence about an event, reveal an actor’s vocabulary, expose</w:t>
+      </w:r>
+      <w:r>
+        <w:t xml:space="preserve"> </w:t>
+      </w:r>
+      <w:r>
+        <w:t xml:space="preserve">a retrospective justification, and suggest a new comparison. A single folder</w:t>
+      </w:r>
+      <w:r>
+        <w:t xml:space="preserve"> </w:t>
+      </w:r>
+      <w:r>
+        <w:t xml:space="preserve">cannot express all four relations.</w:t>
+      </w:r>
+    </w:p>
+    <w:p>
+      <w:pPr>
+        <w:pStyle w:val="BodyText"/>
+      </w:pPr>
+      <w:r>
+        <w:t xml:space="preserve">The early library also connected note-making to writing. The point was not to</w:t>
+      </w:r>
+      <w:r>
+        <w:t xml:space="preserve"> </w:t>
+      </w:r>
+      <w:r>
+        <w:t xml:space="preserve">collect quotations. It was to leave one’s future self a usable intellectual</w:t>
+      </w:r>
+      <w:r>
+        <w:t xml:space="preserve"> </w:t>
+      </w:r>
+      <w:r>
+        <w:t xml:space="preserve">object: a claim, a question, a disagreement, a definition, or an unresolved</w:t>
+      </w:r>
+      <w:r>
+        <w:t xml:space="preserve"> </w:t>
+      </w:r>
+      <w:r>
+        <w:t xml:space="preserve">connection. One item from December 2022 defined PKM as a response to information</w:t>
+      </w:r>
+      <w:r>
+        <w:t xml:space="preserve"> </w:t>
+      </w:r>
+      <w:r>
+        <w:t xml:space="preserve">abundance and unreliable memory. Its stronger implication was that thinking had</w:t>
+      </w:r>
+      <w:r>
+        <w:t xml:space="preserve"> </w:t>
+      </w:r>
+      <w:r>
+        <w:t xml:space="preserve">to become visible outside the head before it could become cumulative.</w:t>
+      </w:r>
+      <w:r>
+        <w:rPr>
+          <w:rStyle w:val="FootnoteReference"/>
+        </w:rPr>
+        <w:footnoteReference w:id="281"/>
+      </w:r>
+    </w:p>
+    <w:p>
+      <w:pPr>
+        <w:pStyle w:val="BodyText"/>
+      </w:pPr>
+      <w:r>
+        <w:t xml:space="preserve">For academic work, this first phase contributed four capacities. It preserved</w:t>
+      </w:r>
+      <w:r>
+        <w:t xml:space="preserve"> </w:t>
+      </w:r>
+      <w:r>
+        <w:t xml:space="preserve">memory across semesters and projects. It let concepts travel between literatures.</w:t>
+      </w:r>
+      <w:r>
+        <w:t xml:space="preserve"> </w:t>
+      </w:r>
+      <w:r>
+        <w:t xml:space="preserve">It separated source material from the researcher’s interpretation. It made</w:t>
+      </w:r>
+      <w:r>
+        <w:t xml:space="preserve"> </w:t>
+      </w:r>
+      <w:r>
+        <w:t xml:space="preserve">intellectual development observable through dated notes and links.</w:t>
+      </w:r>
+    </w:p>
+    <w:p>
+      <w:pPr>
+        <w:pStyle w:val="BodyText"/>
+      </w:pPr>
+      <w:r>
+        <w:t xml:space="preserve">These capacities support more than productivity. They support reflexivity. A</w:t>
+      </w:r>
+      <w:r>
+        <w:t xml:space="preserve"> </w:t>
+      </w:r>
+      <w:r>
+        <w:t xml:space="preserve">qualitative researcher can return to an early memo and see which explanation once</w:t>
+      </w:r>
+      <w:r>
+        <w:t xml:space="preserve"> </w:t>
+      </w:r>
+      <w:r>
+        <w:t xml:space="preserve">seemed plausible, which case disrupted it, and when the coding scheme changed. A</w:t>
+      </w:r>
+      <w:r>
+        <w:t xml:space="preserve"> </w:t>
+      </w:r>
+      <w:r>
+        <w:t xml:space="preserve">historical researcher can distinguish a contemporaneous reading from an</w:t>
+      </w:r>
+      <w:r>
+        <w:t xml:space="preserve"> </w:t>
+      </w:r>
+      <w:r>
+        <w:t xml:space="preserve">interpretation formed after later evidence appeared. A collaborative team can</w:t>
+      </w:r>
+      <w:r>
+        <w:t xml:space="preserve"> </w:t>
+      </w:r>
+      <w:r>
+        <w:t xml:space="preserve">trace a concept to the person, source, and decision that introduced it.</w:t>
+      </w:r>
+    </w:p>
+    <w:p>
+      <w:pPr>
+        <w:pStyle w:val="BodyText"/>
+      </w:pPr>
+      <w:r>
+        <w:t xml:space="preserve">But connection did not solve selection. A graph could display thousands of notes</w:t>
+      </w:r>
+      <w:r>
+        <w:t xml:space="preserve"> </w:t>
+      </w:r>
+      <w:r>
+        <w:t xml:space="preserve">without explaining which ones bore on a claim. A search could find every mention</w:t>
+      </w:r>
+      <w:r>
+        <w:t xml:space="preserve"> </w:t>
+      </w:r>
+      <w:r>
+        <w:t xml:space="preserve">of “violence” without distinguishing an event report from a theoretical</w:t>
+      </w:r>
+      <w:r>
+        <w:t xml:space="preserve"> </w:t>
+      </w:r>
+      <w:r>
+        <w:t xml:space="preserve">definition. PKM made the research memory durable. It did not yet make that memory</w:t>
+      </w:r>
+      <w:r>
+        <w:t xml:space="preserve"> </w:t>
+      </w:r>
+      <w:r>
+        <w:t xml:space="preserve">easy to interrogate.</w:t>
+      </w:r>
+    </w:p>
+    <w:bookmarkEnd w:id="283"/>
+    <w:bookmarkStart w:id="290" w:name="when-ai-entered-the-notebook"/>
+    <w:p>
+      <w:pPr>
+        <w:pStyle w:val="Heading2"/>
+      </w:pPr>
+      <w:r>
+        <w:t xml:space="preserve">21.3 When AI Entered the Notebook</w:t>
+      </w:r>
+    </w:p>
+    <w:p>
+      <w:pPr>
+        <w:pStyle w:val="FirstParagraph"/>
+      </w:pPr>
+      <w:r>
+        <w:t xml:space="preserve">The next phase reduced the cost of transforming source material. OCR converted</w:t>
+      </w:r>
+      <w:r>
+        <w:t xml:space="preserve"> </w:t>
+      </w:r>
+      <w:r>
+        <w:t xml:space="preserve">scanned pages into text. Speech recognition converted interviews and lectures into</w:t>
+      </w:r>
+      <w:r>
+        <w:t xml:space="preserve"> </w:t>
+      </w:r>
+      <w:r>
+        <w:t xml:space="preserve">transcripts. Translation brought sources in additional languages into a shared</w:t>
+      </w:r>
+      <w:r>
+        <w:t xml:space="preserve"> </w:t>
+      </w:r>
+      <w:r>
+        <w:t xml:space="preserve">workspace. Summarization produced initial descriptions. Semantic search retrieved</w:t>
+      </w:r>
+      <w:r>
+        <w:t xml:space="preserve"> </w:t>
+      </w:r>
+      <w:r>
+        <w:t xml:space="preserve">passages that did not share the researcher’s exact vocabulary.</w:t>
+      </w:r>
+    </w:p>
+    <w:p>
+      <w:pPr>
+        <w:pStyle w:val="BodyText"/>
+      </w:pPr>
+      <w:r>
+        <w:t xml:space="preserve">The library recorded both the gain and the danger. In December 2023, an item</w:t>
+      </w:r>
+      <w:r>
+        <w:t xml:space="preserve"> </w:t>
+      </w:r>
+      <w:r>
+        <w:t xml:space="preserve">described using a multimodal model to transcribe a handwritten journal. The system</w:t>
+      </w:r>
+      <w:r>
+        <w:t xml:space="preserve"> </w:t>
+      </w:r>
+      <w:r>
+        <w:t xml:space="preserve">outperformed conventional text recognition because it used context to infer unclear</w:t>
+      </w:r>
+      <w:r>
+        <w:t xml:space="preserve"> </w:t>
+      </w:r>
+      <w:r>
+        <w:t xml:space="preserve">words. It also changed the date from 20 to 28. Context rescued words whose meaning</w:t>
+      </w:r>
+      <w:r>
+        <w:t xml:space="preserve"> </w:t>
+      </w:r>
+      <w:r>
+        <w:t xml:space="preserve">could be inferred. Context corrupted a number that could not.</w:t>
+      </w:r>
+      <w:r>
+        <w:rPr>
+          <w:rStyle w:val="FootnoteReference"/>
+        </w:rPr>
+        <w:footnoteReference w:id="284"/>
+      </w:r>
+    </w:p>
+    <w:p>
+      <w:pPr>
+        <w:pStyle w:val="BodyText"/>
+      </w:pPr>
+      <w:r>
+        <w:t xml:space="preserve">This is the central methodological problem of AI-assisted transformation. The same</w:t>
+      </w:r>
+      <w:r>
+        <w:t xml:space="preserve"> </w:t>
+      </w:r>
+      <w:r>
+        <w:t xml:space="preserve">capacity that repairs incomplete text can invent plausible detail. A model may</w:t>
+      </w:r>
+      <w:r>
+        <w:t xml:space="preserve"> </w:t>
+      </w:r>
+      <w:r>
+        <w:t xml:space="preserve">standardize an institutional name correctly in ninety-nine records and silently</w:t>
+      </w:r>
+      <w:r>
+        <w:t xml:space="preserve"> </w:t>
+      </w:r>
+      <w:r>
+        <w:t xml:space="preserve">merge two different organizations in the hundredth. It may translate a political</w:t>
+      </w:r>
+      <w:r>
+        <w:t xml:space="preserve"> </w:t>
+      </w:r>
+      <w:r>
+        <w:t xml:space="preserve">term fluently while erasing the ambiguity that made the term analytically</w:t>
+      </w:r>
+      <w:r>
+        <w:t xml:space="preserve"> </w:t>
+      </w:r>
+      <w:r>
+        <w:t xml:space="preserve">important. It may summarize an interview and omit the hesitation that changes how</w:t>
+      </w:r>
+      <w:r>
+        <w:t xml:space="preserve"> </w:t>
+      </w:r>
+      <w:r>
+        <w:t xml:space="preserve">the answer should be read.</w:t>
+      </w:r>
+    </w:p>
+    <w:p>
+      <w:pPr>
+        <w:pStyle w:val="BodyText"/>
+      </w:pPr>
+      <w:r>
+        <w:t xml:space="preserve">The solution is not to reject transformation. It is to preserve the original, the</w:t>
+      </w:r>
+      <w:r>
+        <w:t xml:space="preserve"> </w:t>
+      </w:r>
+      <w:r>
+        <w:t xml:space="preserve">transformed object, the procedure, and the verification status as separate</w:t>
+      </w:r>
+      <w:r>
+        <w:t xml:space="preserve"> </w:t>
+      </w:r>
+      <w:r>
+        <w:t xml:space="preserve">artifacts. The scan remains the source. The OCR text remains a derivative. A</w:t>
+      </w:r>
+      <w:r>
+        <w:t xml:space="preserve"> </w:t>
+      </w:r>
+      <w:r>
+        <w:t xml:space="preserve">correction log records changes. A human validates fields whose error would alter</w:t>
+      </w:r>
+      <w:r>
+        <w:t xml:space="preserve"> </w:t>
+      </w:r>
+      <w:r>
+        <w:t xml:space="preserve">the analysis.</w:t>
+      </w:r>
+    </w:p>
+    <w:p>
+      <w:pPr>
+        <w:pStyle w:val="BodyText"/>
+      </w:pPr>
+      <w:r>
+        <w:t xml:space="preserve">The same period changed scholarly reading. Entries in the library moved from</w:t>
+      </w:r>
+      <w:r>
+        <w:t xml:space="preserve"> </w:t>
+      </w:r>
+      <w:r>
+        <w:t xml:space="preserve">global search and backlinks toward semantic readers, citation maps, paper</w:t>
+      </w:r>
+      <w:r>
+        <w:t xml:space="preserve"> </w:t>
+      </w:r>
+      <w:r>
+        <w:t xml:space="preserve">explainers, and interfaces that connected articles to videos and related work.</w:t>
+      </w:r>
+      <w:r>
+        <w:t xml:space="preserve"> </w:t>
+      </w:r>
+      <w:r>
+        <w:t xml:space="preserve">The PDF remained the publication object, but it no longer had to remain the</w:t>
+      </w:r>
+      <w:r>
+        <w:t xml:space="preserve"> </w:t>
+      </w:r>
+      <w:r>
+        <w:t xml:space="preserve">research interface.</w:t>
+      </w:r>
+      <w:r>
+        <w:rPr>
+          <w:rStyle w:val="FootnoteReference"/>
+        </w:rPr>
+        <w:footnoteReference w:id="286"/>
+      </w:r>
+    </w:p>
+    <w:p>
+      <w:pPr>
+        <w:pStyle w:val="BodyText"/>
+      </w:pPr>
+      <w:r>
+        <w:t xml:space="preserve">For social scientists, this shift expanded access to evidence whose form had once</w:t>
+      </w:r>
+      <w:r>
+        <w:t xml:space="preserve"> </w:t>
+      </w:r>
+      <w:r>
+        <w:t xml:space="preserve">made it prohibitively expensive. A researcher can now search a large newspaper</w:t>
+      </w:r>
+      <w:r>
+        <w:t xml:space="preserve"> </w:t>
+      </w:r>
+      <w:r>
+        <w:t xml:space="preserve">archive, transcribe oral histories, extract tables from reports, compare</w:t>
+      </w:r>
+      <w:r>
+        <w:t xml:space="preserve"> </w:t>
+      </w:r>
+      <w:r>
+        <w:t xml:space="preserve">terminology across languages, and locate names in thousands of pages. A recent</w:t>
+      </w:r>
+      <w:r>
+        <w:t xml:space="preserve"> </w:t>
+      </w:r>
+      <w:r>
+        <w:t xml:space="preserve">library entry describing the digitization of nearly twenty million historical</w:t>
+      </w:r>
+      <w:r>
+        <w:t xml:space="preserve"> </w:t>
+      </w:r>
+      <w:r>
+        <w:t xml:space="preserve">census images shows the scale of this change. It also shows why the work remains a</w:t>
+      </w:r>
+      <w:r>
+        <w:t xml:space="preserve"> </w:t>
+      </w:r>
+      <w:r>
+        <w:t xml:space="preserve">research design problem: models, prompts, schemas, validation samples, and error</w:t>
+      </w:r>
+      <w:r>
+        <w:t xml:space="preserve"> </w:t>
+      </w:r>
+      <w:r>
+        <w:t xml:space="preserve">rates shape the resulting data.</w:t>
+      </w:r>
+      <w:r>
+        <w:rPr>
+          <w:rStyle w:val="FootnoteReference"/>
+        </w:rPr>
+        <w:footnoteReference w:id="288"/>
+      </w:r>
+    </w:p>
+    <w:p>
+      <w:pPr>
+        <w:pStyle w:val="BodyText"/>
+      </w:pPr>
+      <w:r>
+        <w:t xml:space="preserve">AI made more material computable. It did not make all computed material evidence.</w:t>
+      </w:r>
+    </w:p>
+    <w:bookmarkEnd w:id="290"/>
+    <w:bookmarkStart w:id="295" w:name="from-retrieval-to-workflow"/>
+    <w:p>
+      <w:pPr>
+        <w:pStyle w:val="Heading2"/>
+      </w:pPr>
+      <w:r>
+        <w:t xml:space="preserve">21.4 From Retrieval to Workflow</w:t>
+      </w:r>
+    </w:p>
+    <w:p>
+      <w:pPr>
+        <w:pStyle w:val="FirstParagraph"/>
+      </w:pPr>
+      <w:r>
+        <w:t xml:space="preserve">By 2025, the library’s focus had shifted from individual features to academic</w:t>
+      </w:r>
+      <w:r>
+        <w:t xml:space="preserve"> </w:t>
+      </w:r>
+      <w:r>
+        <w:t xml:space="preserve">workflows. One entry paired a citation manager with a local Markdown vault. The</w:t>
+      </w:r>
+      <w:r>
+        <w:t xml:space="preserve"> </w:t>
+      </w:r>
+      <w:r>
+        <w:t xml:space="preserve">citation manager held bibliographic authority and source files. The vault held</w:t>
+      </w:r>
+      <w:r>
+        <w:t xml:space="preserve"> </w:t>
+      </w:r>
+      <w:r>
+        <w:t xml:space="preserve">reading notes, concepts, project memos, and draft arguments. The value came from</w:t>
+      </w:r>
+      <w:r>
+        <w:t xml:space="preserve"> </w:t>
+      </w:r>
+      <w:r>
+        <w:t xml:space="preserve">the division of labor, not from forcing one application to perform every</w:t>
+      </w:r>
+      <w:r>
+        <w:t xml:space="preserve"> </w:t>
+      </w:r>
+      <w:r>
+        <w:t xml:space="preserve">function.</w:t>
+      </w:r>
+      <w:r>
+        <w:rPr>
+          <w:rStyle w:val="FootnoteReference"/>
+        </w:rPr>
+        <w:footnoteReference w:id="291"/>
+      </w:r>
+    </w:p>
+    <w:p>
+      <w:pPr>
+        <w:pStyle w:val="BodyText"/>
+      </w:pPr>
+      <w:r>
+        <w:t xml:space="preserve">Another entry placed an AI agent inside a structured note environment and asked it</w:t>
+      </w:r>
+      <w:r>
+        <w:t xml:space="preserve"> </w:t>
+      </w:r>
+      <w:r>
+        <w:t xml:space="preserve">to find weaknesses in arguments drawn from writing, meetings, and journals. This</w:t>
+      </w:r>
+      <w:r>
+        <w:t xml:space="preserve"> </w:t>
+      </w:r>
+      <w:r>
+        <w:t xml:space="preserve">was a different relationship between researcher and machine. The model no longer</w:t>
+      </w:r>
+      <w:r>
+        <w:t xml:space="preserve"> </w:t>
+      </w:r>
+      <w:r>
+        <w:t xml:space="preserve">responded only to a prompt. It operated over a body of prior material and returned</w:t>
+      </w:r>
+      <w:r>
+        <w:t xml:space="preserve"> </w:t>
+      </w:r>
+      <w:r>
+        <w:t xml:space="preserve">an analytical artifact for inspection.</w:t>
+      </w:r>
+      <w:r>
+        <w:rPr>
+          <w:rStyle w:val="FootnoteReference"/>
+        </w:rPr>
+        <w:footnoteReference w:id="293"/>
+      </w:r>
+    </w:p>
+    <w:p>
+      <w:pPr>
+        <w:pStyle w:val="BodyText"/>
+      </w:pPr>
+      <w:r>
+        <w:t xml:space="preserve">The change can be stated in three sentences. First, PKM externalized memory. Next,</w:t>
+      </w:r>
+      <w:r>
+        <w:t xml:space="preserve"> </w:t>
+      </w:r>
+      <w:r>
+        <w:t xml:space="preserve">AI made that memory searchable and transformable. Then workflows connected</w:t>
+      </w:r>
+      <w:r>
+        <w:t xml:space="preserve"> </w:t>
+      </w:r>
+      <w:r>
+        <w:t xml:space="preserve">repeated operations to named inputs, outputs, and checks.</w:t>
+      </w:r>
+    </w:p>
+    <w:p>
+      <w:pPr>
+        <w:pStyle w:val="BodyText"/>
+      </w:pPr>
+      <w:r>
+        <w:t xml:space="preserve">This is where the integration becomes valuable for academic research. A prompt is</w:t>
+      </w:r>
+      <w:r>
+        <w:t xml:space="preserve"> </w:t>
+      </w:r>
+      <w:r>
+        <w:t xml:space="preserve">disposable. A workflow can be inspected, repeated, compared, and revised. A prompt</w:t>
+      </w:r>
+      <w:r>
+        <w:t xml:space="preserve"> </w:t>
+      </w:r>
+      <w:r>
+        <w:t xml:space="preserve">asks for sources. A workflow receives a review protocol, maps vocabulary, searches</w:t>
+      </w:r>
+      <w:r>
+        <w:t xml:space="preserve"> </w:t>
+      </w:r>
+      <w:r>
+        <w:t xml:space="preserve">approved databases, records every query, stages candidates, resolves identities,</w:t>
+      </w:r>
+      <w:r>
+        <w:t xml:space="preserve"> </w:t>
+      </w:r>
+      <w:r>
+        <w:t xml:space="preserve">tests coverage, and stops before final inclusion. A prompt asks for themes. A</w:t>
+      </w:r>
+      <w:r>
+        <w:t xml:space="preserve"> </w:t>
+      </w:r>
+      <w:r>
+        <w:t xml:space="preserve">workflow preserves the transcript, coding instructions, proposed codes, rejected</w:t>
+      </w:r>
+      <w:r>
+        <w:t xml:space="preserve"> </w:t>
+      </w:r>
+      <w:r>
+        <w:t xml:space="preserve">codes, uncertainty, and researcher approval.</w:t>
+      </w:r>
+    </w:p>
+    <w:p>
+      <w:pPr>
+        <w:pStyle w:val="BodyText"/>
+      </w:pPr>
+      <w:r>
+        <w:t xml:space="preserve">The distinction also changes how researchers evaluate AI. The unit of analysis is</w:t>
+      </w:r>
+      <w:r>
+        <w:t xml:space="preserve"> </w:t>
+      </w:r>
+      <w:r>
+        <w:t xml:space="preserve">not the model alone. It is the system consisting of the model, context, tools,</w:t>
+      </w:r>
+      <w:r>
+        <w:t xml:space="preserve"> </w:t>
+      </w:r>
+      <w:r>
+        <w:t xml:space="preserve">permissions, stopping rule, output schema, verifier, and human gate. A weaker model</w:t>
+      </w:r>
+      <w:r>
+        <w:t xml:space="preserve"> </w:t>
+      </w:r>
+      <w:r>
+        <w:t xml:space="preserve">inside a well-specified workflow may produce more trustworthy research artifacts</w:t>
+      </w:r>
+      <w:r>
+        <w:t xml:space="preserve"> </w:t>
+      </w:r>
+      <w:r>
+        <w:t xml:space="preserve">than a stronger model inside an unconstrained conversation.</w:t>
+      </w:r>
+    </w:p>
+    <w:bookmarkEnd w:id="295"/>
+    <w:bookmarkStart w:id="304" w:name="persistent-context-and-the-agentic-turn"/>
+    <w:p>
+      <w:pPr>
+        <w:pStyle w:val="Heading2"/>
+      </w:pPr>
+      <w:r>
+        <w:t xml:space="preserve">21.5 Persistent Context and the Agentic Turn</w:t>
+      </w:r>
+    </w:p>
+    <w:p>
+      <w:pPr>
+        <w:pStyle w:val="FirstParagraph"/>
+      </w:pPr>
+      <w:r>
+        <w:t xml:space="preserve">The 2026 PKM records in the library differ sharply from the early collection. Among</w:t>
+      </w:r>
+      <w:r>
+        <w:t xml:space="preserve"> </w:t>
+      </w:r>
+      <w:r>
+        <w:t xml:space="preserve">the 79 PKM entries saved that year, 48 also carry the AI tag, 56 refer to Obsidian,</w:t>
+      </w:r>
+      <w:r>
+        <w:t xml:space="preserve"> </w:t>
+      </w:r>
+      <w:r>
+        <w:t xml:space="preserve">and 14 concern agents. The object of interest is no longer the isolated note. It is</w:t>
+      </w:r>
+      <w:r>
+        <w:t xml:space="preserve"> </w:t>
+      </w:r>
+      <w:r>
+        <w:t xml:space="preserve">the relationship between a durable, local knowledge base and an agent that can act</w:t>
+      </w:r>
+      <w:r>
+        <w:t xml:space="preserve"> </w:t>
+      </w:r>
+      <w:r>
+        <w:t xml:space="preserve">across it.</w:t>
+      </w:r>
+    </w:p>
+    <w:p>
+      <w:pPr>
+        <w:pStyle w:val="BodyText"/>
+      </w:pPr>
+      <w:r>
+        <w:t xml:space="preserve">Several records describe the vault as a permanent memory layer. A project file</w:t>
+      </w:r>
+      <w:r>
+        <w:t xml:space="preserve"> </w:t>
+      </w:r>
+      <w:r>
+        <w:t xml:space="preserve">states the question, scope, standards, active decisions, and prohibited actions.</w:t>
+      </w:r>
+      <w:r>
+        <w:t xml:space="preserve"> </w:t>
+      </w:r>
+      <w:r>
+        <w:t xml:space="preserve">Markdown notes preserve the source record. An agent reads the smallest set of</w:t>
+      </w:r>
+      <w:r>
+        <w:t xml:space="preserve"> </w:t>
+      </w:r>
+      <w:r>
+        <w:t xml:space="preserve">files required for a task. Repeated procedures become skills. Scheduled workflows</w:t>
+      </w:r>
+      <w:r>
+        <w:t xml:space="preserve"> </w:t>
+      </w:r>
+      <w:r>
+        <w:t xml:space="preserve">process an inbox, prepare a briefing, identify connections, or stage a research</w:t>
+      </w:r>
+      <w:r>
+        <w:t xml:space="preserve"> </w:t>
+      </w:r>
+      <w:r>
+        <w:t xml:space="preserve">memo.</w:t>
+      </w:r>
+      <w:r>
+        <w:rPr>
+          <w:rStyle w:val="FootnoteReference"/>
+        </w:rPr>
+        <w:footnoteReference w:id="296"/>
+      </w:r>
+    </w:p>
+    <w:p>
+      <w:pPr>
+        <w:pStyle w:val="BodyText"/>
+      </w:pPr>
+      <w:r>
+        <w:t xml:space="preserve">One of the strongest entries in this group proposes a continuous system in which</w:t>
+      </w:r>
+      <w:r>
+        <w:t xml:space="preserve"> </w:t>
+      </w:r>
+      <w:r>
+        <w:t xml:space="preserve">Readwise supplies captured material, Obsidian preserves it, an AI layer reasons</w:t>
+      </w:r>
+      <w:r>
+        <w:t xml:space="preserve"> </w:t>
+      </w:r>
+      <w:r>
+        <w:t xml:space="preserve">across it, and an automation layer moves artifacts between stages. My note on that</w:t>
+      </w:r>
+      <w:r>
+        <w:t xml:space="preserve"> </w:t>
+      </w:r>
+      <w:r>
+        <w:t xml:space="preserve">item identified the deeper claim: knowledge gains value over time when the cost of</w:t>
+      </w:r>
+      <w:r>
+        <w:t xml:space="preserve"> </w:t>
+      </w:r>
+      <w:r>
+        <w:t xml:space="preserve">maintenance falls and new work can repeatedly encounter old material.</w:t>
+      </w:r>
+      <w:r>
+        <w:rPr>
+          <w:rStyle w:val="FootnoteReference"/>
+        </w:rPr>
+        <w:footnoteReference w:id="298"/>
+      </w:r>
+    </w:p>
+    <w:p>
+      <w:pPr>
+        <w:pStyle w:val="BodyText"/>
+      </w:pPr>
+      <w:r>
+        <w:t xml:space="preserve">The attractive phrase is “a second brain that thinks back.” The phrase is useful,</w:t>
+      </w:r>
+      <w:r>
+        <w:t xml:space="preserve"> </w:t>
+      </w:r>
+      <w:r>
+        <w:t xml:space="preserve">but it can mislead. A vault does not become reliable because an agent can read it.</w:t>
+      </w:r>
+      <w:r>
+        <w:t xml:space="preserve"> </w:t>
+      </w:r>
+      <w:r>
+        <w:t xml:space="preserve">Old notes may contain errors. Duplicates may look like corroboration. A summary may</w:t>
+      </w:r>
+      <w:r>
+        <w:t xml:space="preserve"> </w:t>
+      </w:r>
+      <w:r>
+        <w:t xml:space="preserve">have lost the source’s qualification. A private record may be outside the agent’s</w:t>
+      </w:r>
+      <w:r>
+        <w:t xml:space="preserve"> </w:t>
+      </w:r>
+      <w:r>
+        <w:t xml:space="preserve">authorized scope. Persistent context amplifies whatever the system contains.</w:t>
+      </w:r>
+    </w:p>
+    <w:p>
+      <w:pPr>
+        <w:pStyle w:val="BodyText"/>
+      </w:pPr>
+      <w:r>
+        <w:t xml:space="preserve">The operative design therefore requires three components. The first is a</w:t>
+      </w:r>
+      <w:r>
+        <w:t xml:space="preserve"> </w:t>
+      </w:r>
+      <w:r>
+        <w:t xml:space="preserve">specification that defines acceptable work before execution. The second is a</w:t>
+      </w:r>
+      <w:r>
+        <w:t xml:space="preserve"> </w:t>
+      </w:r>
+      <w:r>
+        <w:t xml:space="preserve">knowledge base that supplies bounded context and authoritative artifacts. The</w:t>
+      </w:r>
+      <w:r>
+        <w:t xml:space="preserve"> </w:t>
+      </w:r>
+      <w:r>
+        <w:t xml:space="preserve">third is a verifier that tests the output against the specification. A recent</w:t>
+      </w:r>
+      <w:r>
+        <w:t xml:space="preserve"> </w:t>
+      </w:r>
+      <w:r>
+        <w:t xml:space="preserve">library item formulated this pattern as “spec, verifier, knowledge base.” It also</w:t>
+      </w:r>
+      <w:r>
+        <w:t xml:space="preserve"> </w:t>
+      </w:r>
+      <w:r>
+        <w:t xml:space="preserve">recorded a decisive warning: a verifier measures only what it was designed to</w:t>
+      </w:r>
+      <w:r>
+        <w:t xml:space="preserve"> </w:t>
+      </w:r>
+      <w:r>
+        <w:t xml:space="preserve">measure.</w:t>
+      </w:r>
+      <w:r>
+        <w:rPr>
+          <w:rStyle w:val="FootnoteReference"/>
+        </w:rPr>
+        <w:footnoteReference w:id="300"/>
+      </w:r>
+    </w:p>
+    <w:p>
+      <w:pPr>
+        <w:pStyle w:val="BodyText"/>
+      </w:pPr>
+      <w:r>
+        <w:t xml:space="preserve">This pattern now appears in more ambitious claims about AI scientists. One saved</w:t>
+      </w:r>
+      <w:r>
+        <w:t xml:space="preserve"> </w:t>
+      </w:r>
+      <w:r>
+        <w:t xml:space="preserve">item distinguishes retrieval, search within a fixed schema, and discovery that</w:t>
+      </w:r>
+      <w:r>
+        <w:t xml:space="preserve"> </w:t>
+      </w:r>
+      <w:r>
+        <w:t xml:space="preserve">changes the schema itself. Its proposal remains provisional for the social</w:t>
+      </w:r>
+      <w:r>
+        <w:t xml:space="preserve"> </w:t>
+      </w:r>
+      <w:r>
+        <w:t xml:space="preserve">sciences, but the distinction is productive. Retrieval finds a known object.</w:t>
+      </w:r>
+      <w:r>
+        <w:t xml:space="preserve"> </w:t>
+      </w:r>
+      <w:r>
+        <w:t xml:space="preserve">Search explores a defined space. Discovery proposes that the space was defined</w:t>
+      </w:r>
+      <w:r>
+        <w:t xml:space="preserve"> </w:t>
+      </w:r>
+      <w:r>
+        <w:t xml:space="preserve">incorrectly. Only the third requires the researcher to reconsider the concepts,</w:t>
+      </w:r>
+      <w:r>
+        <w:t xml:space="preserve"> </w:t>
+      </w:r>
+      <w:r>
+        <w:t xml:space="preserve">boundaries, or variables that organized the project.</w:t>
+      </w:r>
+      <w:r>
+        <w:rPr>
+          <w:rStyle w:val="FootnoteReference"/>
+        </w:rPr>
+        <w:footnoteReference w:id="302"/>
+      </w:r>
+    </w:p>
+    <w:p>
+      <w:pPr>
+        <w:pStyle w:val="BodyText"/>
+      </w:pPr>
+      <w:r>
+        <w:t xml:space="preserve">AI may propose such a revision. It may not ratify it.</w:t>
+      </w:r>
+    </w:p>
+    <w:bookmarkEnd w:id="304"/>
+    <w:bookmarkStart w:id="307" w:name="what-pkm-contributes-to-social-science"/>
+    <w:p>
+      <w:pPr>
+        <w:pStyle w:val="Heading2"/>
+      </w:pPr>
+      <w:r>
+        <w:t xml:space="preserve">21.6 What PKM Contributes to Social Science</w:t>
+      </w:r>
+    </w:p>
+    <w:p>
+      <w:pPr>
+        <w:pStyle w:val="FirstParagraph"/>
+      </w:pPr>
+      <w:r>
+        <w:t xml:space="preserve">Personal knowledge management contributes temporal depth. Social-science projects</w:t>
+      </w:r>
+      <w:r>
+        <w:t xml:space="preserve"> </w:t>
+      </w:r>
+      <w:r>
+        <w:t xml:space="preserve">often outlast software, funding cycles, and individual bursts of attention. A</w:t>
+      </w:r>
+      <w:r>
+        <w:t xml:space="preserve"> </w:t>
+      </w:r>
+      <w:r>
+        <w:t xml:space="preserve">durable note records not only a result but the state of the inquiry when the result</w:t>
+      </w:r>
+      <w:r>
+        <w:t xml:space="preserve"> </w:t>
+      </w:r>
+      <w:r>
+        <w:t xml:space="preserve">appeared. This matters when a concept changes meaning or when later events make an</w:t>
+      </w:r>
+      <w:r>
+        <w:t xml:space="preserve"> </w:t>
+      </w:r>
+      <w:r>
+        <w:t xml:space="preserve">earlier interpretation look inevitable.</w:t>
+      </w:r>
+    </w:p>
+    <w:p>
+      <w:pPr>
+        <w:pStyle w:val="BodyText"/>
+      </w:pPr>
+      <w:r>
+        <w:t xml:space="preserve">PKM contributes conceptual continuity. Political and social concepts travel under</w:t>
+      </w:r>
+      <w:r>
+        <w:t xml:space="preserve"> </w:t>
+      </w:r>
+      <w:r>
+        <w:t xml:space="preserve">different names across disciplines, countries, institutions, and periods. Linked</w:t>
+      </w:r>
+      <w:r>
+        <w:t xml:space="preserve"> </w:t>
+      </w:r>
+      <w:r>
+        <w:t xml:space="preserve">notes can connect an indigenous term, an archival label, a theoretical category,</w:t>
+      </w:r>
+      <w:r>
+        <w:t xml:space="preserve"> </w:t>
+      </w:r>
+      <w:r>
+        <w:t xml:space="preserve">and a coding variable without pretending they are identical.</w:t>
+      </w:r>
+    </w:p>
+    <w:p>
+      <w:pPr>
+        <w:pStyle w:val="BodyText"/>
+      </w:pPr>
+      <w:r>
+        <w:t xml:space="preserve">PKM contributes provenance. A useful research note identifies its source, locator,</w:t>
+      </w:r>
+      <w:r>
+        <w:t xml:space="preserve"> </w:t>
+      </w:r>
+      <w:r>
+        <w:t xml:space="preserve">date of capture, transformation history, and relation to the project. The note does</w:t>
+      </w:r>
+      <w:r>
+        <w:t xml:space="preserve"> </w:t>
+      </w:r>
+      <w:r>
+        <w:t xml:space="preserve">not replace the source. It points back to it.</w:t>
+      </w:r>
+    </w:p>
+    <w:p>
+      <w:pPr>
+        <w:pStyle w:val="BodyText"/>
+      </w:pPr>
+      <w:r>
+        <w:t xml:space="preserve">PKM contributes negative evidence. Researchers usually save what supports an</w:t>
+      </w:r>
+      <w:r>
+        <w:t xml:space="preserve"> </w:t>
+      </w:r>
+      <w:r>
+        <w:t xml:space="preserve">argument. A governed system can also preserve failed searches, rejected</w:t>
+      </w:r>
+      <w:r>
+        <w:t xml:space="preserve"> </w:t>
+      </w:r>
+      <w:r>
+        <w:t xml:space="preserve">explanations, excluded cases, unresolved contradictions, and missing records. This</w:t>
+      </w:r>
+      <w:r>
+        <w:t xml:space="preserve"> </w:t>
+      </w:r>
+      <w:r>
+        <w:t xml:space="preserve">negative evidence protects against repeating work and against rewriting the</w:t>
+      </w:r>
+      <w:r>
+        <w:t xml:space="preserve"> </w:t>
+      </w:r>
+      <w:r>
+        <w:t xml:space="preserve">research history after the conclusion becomes clear.</w:t>
+      </w:r>
+    </w:p>
+    <w:p>
+      <w:pPr>
+        <w:pStyle w:val="BodyText"/>
+      </w:pPr>
+      <w:r>
+        <w:t xml:space="preserve">The same principle applies at institutional scale. A retrospective account of a</w:t>
+      </w:r>
+      <w:r>
+        <w:t xml:space="preserve"> </w:t>
+      </w:r>
+      <w:r>
+        <w:t xml:space="preserve">long-running conflict-research program attributes its achievements not to data</w:t>
+      </w:r>
+      <w:r>
+        <w:t xml:space="preserve"> </w:t>
+      </w:r>
+      <w:r>
+        <w:t xml:space="preserve">volume alone but to the combination of social-scientific method, practitioner</w:t>
+      </w:r>
+      <w:r>
+        <w:t xml:space="preserve"> </w:t>
+      </w:r>
+      <w:r>
+        <w:t xml:space="preserve">knowledge, flexible support, and contextual interpretation. Data became useful</w:t>
+      </w:r>
+      <w:r>
+        <w:t xml:space="preserve"> </w:t>
+      </w:r>
+      <w:r>
+        <w:t xml:space="preserve">because an institutional memory connected collection to the circumstances that</w:t>
+      </w:r>
+      <w:r>
+        <w:t xml:space="preserve"> </w:t>
+      </w:r>
+      <w:r>
+        <w:t xml:space="preserve">gave the records meaning.</w:t>
+      </w:r>
+      <w:r>
+        <w:rPr>
+          <w:rStyle w:val="FootnoteReference"/>
+        </w:rPr>
+        <w:footnoteReference w:id="305"/>
+      </w:r>
+    </w:p>
+    <w:p>
+      <w:pPr>
+        <w:pStyle w:val="BodyText"/>
+      </w:pPr>
+      <w:r>
+        <w:t xml:space="preserve">PKM contributes cumulative comparison. A case memo can share fields with other</w:t>
+      </w:r>
+      <w:r>
+        <w:t xml:space="preserve"> </w:t>
+      </w:r>
+      <w:r>
+        <w:t xml:space="preserve">case memos while retaining material that does not fit the common schema. This</w:t>
+      </w:r>
+      <w:r>
+        <w:t xml:space="preserve"> </w:t>
+      </w:r>
+      <w:r>
+        <w:t xml:space="preserve">combination is important in qualitative and comparative work. Structure supports</w:t>
+      </w:r>
+      <w:r>
+        <w:t xml:space="preserve"> </w:t>
+      </w:r>
+      <w:r>
+        <w:t xml:space="preserve">comparison. Free text preserves surprise.</w:t>
+      </w:r>
+    </w:p>
+    <w:p>
+      <w:pPr>
+        <w:pStyle w:val="BodyText"/>
+      </w:pPr>
+      <w:r>
+        <w:t xml:space="preserve">Finally, PKM contributes ownership and durability when it relies on open,</w:t>
+      </w:r>
+      <w:r>
+        <w:t xml:space="preserve"> </w:t>
+      </w:r>
+      <w:r>
+        <w:t xml:space="preserve">inspectable formats. Plain-text notes can survive the application that created</w:t>
+      </w:r>
+      <w:r>
+        <w:t xml:space="preserve"> </w:t>
+      </w:r>
+      <w:r>
+        <w:t xml:space="preserve">them. They can be versioned, searched, diffed, backed up, and read by both humans</w:t>
+      </w:r>
+      <w:r>
+        <w:t xml:space="preserve"> </w:t>
+      </w:r>
+      <w:r>
+        <w:t xml:space="preserve">and machines. This is not a preference for one note application. It is a</w:t>
+      </w:r>
+      <w:r>
+        <w:t xml:space="preserve"> </w:t>
+      </w:r>
+      <w:r>
+        <w:t xml:space="preserve">preservation decision.</w:t>
+      </w:r>
+    </w:p>
+    <w:bookmarkEnd w:id="307"/>
+    <w:bookmarkStart w:id="308" w:name="what-ai-contributes"/>
+    <w:p>
+      <w:pPr>
+        <w:pStyle w:val="Heading2"/>
+      </w:pPr>
+      <w:r>
+        <w:t xml:space="preserve">21.7 What AI Contributes</w:t>
+      </w:r>
+    </w:p>
+    <w:p>
+      <w:pPr>
+        <w:pStyle w:val="FirstParagraph"/>
+      </w:pPr>
+      <w:r>
+        <w:t xml:space="preserve">AI contributes scale. It can prepare candidate records from more documents than</w:t>
+      </w:r>
+      <w:r>
+        <w:t xml:space="preserve"> </w:t>
+      </w:r>
+      <w:r>
+        <w:t xml:space="preserve">one researcher can read line by line. It can locate names, dates, events,</w:t>
+      </w:r>
+      <w:r>
+        <w:t xml:space="preserve"> </w:t>
+      </w:r>
+      <w:r>
+        <w:t xml:space="preserve">institutions, quotations, and relations across a large corpus. Candidate is the</w:t>
+      </w:r>
+      <w:r>
+        <w:t xml:space="preserve"> </w:t>
+      </w:r>
+      <w:r>
+        <w:t xml:space="preserve">operative word. Extraction creates material for validation.</w:t>
+      </w:r>
+    </w:p>
+    <w:p>
+      <w:pPr>
+        <w:pStyle w:val="BodyText"/>
+      </w:pPr>
+      <w:r>
+        <w:t xml:space="preserve">AI contributes flexible retrieval. Keyword search depends on shared vocabulary.</w:t>
+      </w:r>
+      <w:r>
+        <w:t xml:space="preserve"> </w:t>
+      </w:r>
+      <w:r>
+        <w:t xml:space="preserve">Language models can suggest synonyms, historical terms, translations, rival</w:t>
+      </w:r>
+      <w:r>
+        <w:t xml:space="preserve"> </w:t>
+      </w:r>
+      <w:r>
+        <w:t xml:space="preserve">concepts, and proxy measures. This capacity can prevent a false gap produced by a</w:t>
+      </w:r>
+      <w:r>
+        <w:t xml:space="preserve"> </w:t>
+      </w:r>
+      <w:r>
+        <w:t xml:space="preserve">poor query. It can also drift beyond the review’s scope, which is why vocabulary</w:t>
+      </w:r>
+      <w:r>
+        <w:t xml:space="preserve"> </w:t>
+      </w:r>
+      <w:r>
+        <w:t xml:space="preserve">expansion must remain logged and reviewable.</w:t>
+      </w:r>
+    </w:p>
+    <w:p>
+      <w:pPr>
+        <w:pStyle w:val="BodyText"/>
+      </w:pPr>
+      <w:r>
+        <w:t xml:space="preserve">AI contributes comparison. A model can apply the same questions to a set of</w:t>
+      </w:r>
+      <w:r>
+        <w:t xml:space="preserve"> </w:t>
+      </w:r>
+      <w:r>
+        <w:t xml:space="preserve">documents, identify points of agreement and conflict, and prepare a matrix that a</w:t>
+      </w:r>
+      <w:r>
+        <w:t xml:space="preserve"> </w:t>
+      </w:r>
+      <w:r>
+        <w:t xml:space="preserve">researcher can inspect. It can ask which source supports a date, which cases</w:t>
+      </w:r>
+      <w:r>
+        <w:t xml:space="preserve"> </w:t>
+      </w:r>
+      <w:r>
+        <w:t xml:space="preserve">violate an emerging pattern, or which paragraphs depend on one unverified claim.</w:t>
+      </w:r>
+    </w:p>
+    <w:p>
+      <w:pPr>
+        <w:pStyle w:val="BodyText"/>
+      </w:pPr>
+      <w:r>
+        <w:t xml:space="preserve">AI contributes transformation. OCR, transcription, translation, classification,</w:t>
+      </w:r>
+      <w:r>
+        <w:t xml:space="preserve"> </w:t>
+      </w:r>
+      <w:r>
+        <w:t xml:space="preserve">entity resolution, and structured extraction can move evidence among forms. The</w:t>
+      </w:r>
+      <w:r>
+        <w:t xml:space="preserve"> </w:t>
+      </w:r>
+      <w:r>
+        <w:t xml:space="preserve">result becomes methodologically useful only when the transformation retains a link</w:t>
+      </w:r>
+      <w:r>
+        <w:t xml:space="preserve"> </w:t>
+      </w:r>
+      <w:r>
+        <w:t xml:space="preserve">to the original.</w:t>
+      </w:r>
+    </w:p>
+    <w:p>
+      <w:pPr>
+        <w:pStyle w:val="BodyText"/>
+      </w:pPr>
+      <w:r>
+        <w:t xml:space="preserve">AI contributes iteration. It can rerun a procedure after the codebook changes,</w:t>
+      </w:r>
+      <w:r>
+        <w:t xml:space="preserve"> </w:t>
+      </w:r>
+      <w:r>
+        <w:t xml:space="preserve">compare versions, and report which records changed. This makes dynamic coding</w:t>
+      </w:r>
+      <w:r>
+        <w:t xml:space="preserve"> </w:t>
+      </w:r>
+      <w:r>
+        <w:t xml:space="preserve">possible without hiding the consequences of revision.</w:t>
+      </w:r>
+    </w:p>
+    <w:p>
+      <w:pPr>
+        <w:pStyle w:val="BodyText"/>
+      </w:pPr>
+      <w:r>
+        <w:t xml:space="preserve">AI also contributes disciplined opposition when instructed to do so. It can search</w:t>
+      </w:r>
+      <w:r>
+        <w:t xml:space="preserve"> </w:t>
+      </w:r>
+      <w:r>
+        <w:t xml:space="preserve">for disconfirming evidence, propose rival mechanisms, detect scope changes, and ask</w:t>
+      </w:r>
+      <w:r>
+        <w:t xml:space="preserve"> </w:t>
+      </w:r>
+      <w:r>
+        <w:t xml:space="preserve">which observation would distinguish two explanations. It cannot decide the</w:t>
+      </w:r>
+      <w:r>
+        <w:t xml:space="preserve"> </w:t>
+      </w:r>
+      <w:r>
+        <w:t xml:space="preserve">substantive importance of those findings. But it can make it harder for a</w:t>
+      </w:r>
+      <w:r>
+        <w:t xml:space="preserve"> </w:t>
+      </w:r>
+      <w:r>
+        <w:t xml:space="preserve">researcher to avoid them.</w:t>
+      </w:r>
+    </w:p>
+    <w:bookmarkEnd w:id="308"/>
+    <w:bookmarkStart w:id="309" w:name="the-pkm-ai-research-loop"/>
+    <w:p>
+      <w:pPr>
+        <w:pStyle w:val="Heading2"/>
+      </w:pPr>
+      <w:r>
+        <w:t xml:space="preserve">21.8 The PKM-AI Research Loop</w:t>
+      </w:r>
+    </w:p>
+    <w:p>
+      <w:pPr>
+        <w:pStyle w:val="FirstParagraph"/>
+      </w:pPr>
+      <w:r>
+        <w:t xml:space="preserve">The integrated system works when every stage produces an artifact and every</w:t>
+      </w:r>
+      <w:r>
+        <w:t xml:space="preserve"> </w:t>
+      </w:r>
+      <w:r>
+        <w:t xml:space="preserve">consequential transition includes a human gate. The following PKM-AI research loop</w:t>
+      </w:r>
+      <w:r>
+        <w:t xml:space="preserve"> </w:t>
+      </w:r>
+      <w:r>
+        <w:t xml:space="preserve">can support a literature review, archival project, interview study, event</w:t>
+      </w:r>
+      <w:r>
+        <w:t xml:space="preserve"> </w:t>
+      </w:r>
+      <w:r>
+        <w:t xml:space="preserve">database, or comparative case analysis.</w:t>
+      </w:r>
+    </w:p>
+    <w:tbl>
+      <w:tblPr>
+        <w:tblStyle w:val="Table"/>
+        <w:tblW w:type="pct" w:w="5000"/>
+        <w:tblLayout w:type="fixed"/>
+        <w:tblLook w:firstRow="1" w:lastRow="0" w:firstColumn="0" w:lastColumn="0" w:noHBand="0" w:noVBand="0" w:val="0020"/>
+      </w:tblPr>
+      <w:tblGrid>
+        <w:gridCol w:w="1980"/>
+        <w:gridCol w:w="1980"/>
+        <w:gridCol w:w="1980"/>
+        <w:gridCol w:w="1980"/>
+      </w:tblGrid>
+      <w:tr>
+        <w:trPr>
+          <w:tblHeader w:val="on"/>
+        </w:trPr>
+        <w:tc>
+          <w:tcPr/>
+          <w:p>
+            <w:pPr>
+              <w:pStyle w:val="Compact"/>
+            </w:pPr>
+            <w:r>
+              <w:t xml:space="preserve">Stage</w:t>
+            </w:r>
+          </w:p>
+        </w:tc>
+        <w:tc>
+          <w:tcPr/>
+          <w:p>
+            <w:pPr>
+              <w:pStyle w:val="Compact"/>
+            </w:pPr>
+            <w:r>
+              <w:t xml:space="preserve">Durable artifact</w:t>
+            </w:r>
+          </w:p>
+        </w:tc>
+        <w:tc>
+          <w:tcPr/>
+          <w:p>
+            <w:pPr>
+              <w:pStyle w:val="Compact"/>
+            </w:pPr>
+            <w:r>
+              <w:t xml:space="preserve">Permitted AI work</w:t>
+            </w:r>
+          </w:p>
+        </w:tc>
+        <w:tc>
+          <w:tcPr/>
+          <w:p>
+            <w:pPr>
+              <w:pStyle w:val="Compact"/>
+            </w:pPr>
+            <w:r>
+              <w:t xml:space="preserve">Human gate</w:t>
+            </w:r>
+          </w:p>
+        </w:tc>
+      </w:tr>
+      <w:tr>
+        <w:tc>
+          <w:tcPr/>
+          <w:p>
+            <w:pPr>
+              <w:pStyle w:val="Compact"/>
+            </w:pPr>
+            <w:r>
+              <w:t xml:space="preserve">Bound</w:t>
+            </w:r>
+          </w:p>
+        </w:tc>
+        <w:tc>
+          <w:tcPr/>
+          <w:p>
+            <w:pPr>
+              <w:pStyle w:val="Compact"/>
+            </w:pPr>
+            <w:r>
+              <w:t xml:space="preserve">Versioned project-context packet</w:t>
+            </w:r>
+          </w:p>
+        </w:tc>
+        <w:tc>
+          <w:tcPr/>
+          <w:p>
+            <w:pPr>
+              <w:pStyle w:val="Compact"/>
+            </w:pPr>
+            <w:r>
+              <w:t xml:space="preserve">Test ambiguity; propose missing terms and boundaries</w:t>
+            </w:r>
+          </w:p>
+        </w:tc>
+        <w:tc>
+          <w:tcPr/>
+          <w:p>
+            <w:pPr>
+              <w:pStyle w:val="Compact"/>
+            </w:pPr>
+            <w:r>
+              <w:t xml:space="preserve">Approve the question, scope, ethics, and stopping rule</w:t>
+            </w:r>
+          </w:p>
+        </w:tc>
+      </w:tr>
+      <w:tr>
+        <w:tc>
+          <w:tcPr/>
+          <w:p>
+            <w:pPr>
+              <w:pStyle w:val="Compact"/>
+            </w:pPr>
+            <w:r>
+              <w:t xml:space="preserve">Capture</w:t>
+            </w:r>
+          </w:p>
+        </w:tc>
+        <w:tc>
+          <w:tcPr/>
+          <w:p>
+            <w:pPr>
+              <w:pStyle w:val="Compact"/>
+            </w:pPr>
+            <w:r>
+              <w:t xml:space="preserve">Source note with stable identity and locator</w:t>
+            </w:r>
+          </w:p>
+        </w:tc>
+        <w:tc>
+          <w:tcPr/>
+          <w:p>
+            <w:pPr>
+              <w:pStyle w:val="Compact"/>
+            </w:pPr>
+            <w:r>
+              <w:t xml:space="preserve">Import metadata; transcribe or OCR into a derivative file</w:t>
+            </w:r>
+          </w:p>
+        </w:tc>
+        <w:tc>
+          <w:tcPr/>
+          <w:p>
+            <w:pPr>
+              <w:pStyle w:val="Compact"/>
+            </w:pPr>
+            <w:r>
+              <w:t xml:space="preserve">Confirm rights, identity, and source-derivative relation</w:t>
+            </w:r>
+          </w:p>
+        </w:tc>
+      </w:tr>
+      <w:tr>
+        <w:tc>
+          <w:tcPr/>
+          <w:p>
+            <w:pPr>
+              <w:pStyle w:val="Compact"/>
+            </w:pPr>
+            <w:r>
+              <w:t xml:space="preserve">Distill</w:t>
+            </w:r>
+          </w:p>
+        </w:tc>
+        <w:tc>
+          <w:tcPr/>
+          <w:p>
+            <w:pPr>
+              <w:pStyle w:val="Compact"/>
+            </w:pPr>
+            <w:r>
+              <w:t xml:space="preserve">Claim, evidence, question, and uncertainty notes</w:t>
+            </w:r>
+          </w:p>
+        </w:tc>
+        <w:tc>
+          <w:tcPr/>
+          <w:p>
+            <w:pPr>
+              <w:pStyle w:val="Compact"/>
+            </w:pPr>
+            <w:r>
+              <w:t xml:space="preserve">Propose summaries, entities, claims, and contradictions</w:t>
+            </w:r>
+          </w:p>
+        </w:tc>
+        <w:tc>
+          <w:tcPr/>
+          <w:p>
+            <w:pPr>
+              <w:pStyle w:val="Compact"/>
+            </w:pPr>
+            <w:r>
+              <w:t xml:space="preserve">Compare each consequential claim with the source</w:t>
+            </w:r>
+          </w:p>
+        </w:tc>
+      </w:tr>
+      <w:tr>
+        <w:tc>
+          <w:tcPr/>
+          <w:p>
+            <w:pPr>
+              <w:pStyle w:val="Compact"/>
+            </w:pPr>
+            <w:r>
+              <w:t xml:space="preserve">Connect</w:t>
+            </w:r>
+          </w:p>
+        </w:tc>
+        <w:tc>
+          <w:tcPr/>
+          <w:p>
+            <w:pPr>
+              <w:pStyle w:val="Compact"/>
+            </w:pPr>
+            <w:r>
+              <w:t xml:space="preserve">Concept map and evidence map</w:t>
+            </w:r>
+          </w:p>
+        </w:tc>
+        <w:tc>
+          <w:tcPr/>
+          <w:p>
+            <w:pPr>
+              <w:pStyle w:val="Compact"/>
+            </w:pPr>
+            <w:r>
+              <w:t xml:space="preserve">Suggest links, aliases, rival concepts, and missing source families</w:t>
+            </w:r>
+          </w:p>
+        </w:tc>
+        <w:tc>
+          <w:tcPr/>
+          <w:p>
+            <w:pPr>
+              <w:pStyle w:val="Compact"/>
+            </w:pPr>
+            <w:r>
+              <w:t xml:space="preserve">Accept relations and reject false equivalence</w:t>
+            </w:r>
+          </w:p>
+        </w:tc>
+      </w:tr>
+      <w:tr>
+        <w:tc>
+          <w:tcPr/>
+          <w:p>
+            <w:pPr>
+              <w:pStyle w:val="Compact"/>
+            </w:pPr>
+            <w:r>
+              <w:t xml:space="preserve">Compute</w:t>
+            </w:r>
+          </w:p>
+        </w:tc>
+        <w:tc>
+          <w:tcPr/>
+          <w:p>
+            <w:pPr>
+              <w:pStyle w:val="Compact"/>
+            </w:pPr>
+            <w:r>
+              <w:t xml:space="preserve">Candidate register, query log, or coding table</w:t>
+            </w:r>
+          </w:p>
+        </w:tc>
+        <w:tc>
+          <w:tcPr/>
+          <w:p>
+            <w:pPr>
+              <w:pStyle w:val="Compact"/>
+            </w:pPr>
+            <w:r>
+              <w:t xml:space="preserve">Search, classify, compare, extract, and propose new variables</w:t>
+            </w:r>
+          </w:p>
+        </w:tc>
+        <w:tc>
+          <w:tcPr/>
+          <w:p>
+            <w:pPr>
+              <w:pStyle w:val="Compact"/>
+            </w:pPr>
+            <w:r>
+              <w:t xml:space="preserve">Approve inclusion, exclusions, codebook changes, and promotions</w:t>
+            </w:r>
+          </w:p>
+        </w:tc>
+      </w:tr>
+      <w:tr>
+        <w:tc>
+          <w:tcPr/>
+          <w:p>
+            <w:pPr>
+              <w:pStyle w:val="Compact"/>
+            </w:pPr>
+            <w:r>
+              <w:t xml:space="preserve">Verify</w:t>
+            </w:r>
+          </w:p>
+        </w:tc>
+        <w:tc>
+          <w:tcPr/>
+          <w:p>
+            <w:pPr>
+              <w:pStyle w:val="Compact"/>
+            </w:pPr>
+            <w:r>
+              <w:t xml:space="preserve">Validation sample, discrepancy log, and coverage memo</w:t>
+            </w:r>
+          </w:p>
+        </w:tc>
+        <w:tc>
+          <w:tcPr/>
+          <w:p>
+            <w:pPr>
+              <w:pStyle w:val="Compact"/>
+            </w:pPr>
+            <w:r>
+              <w:t xml:space="preserve">Run schema checks, known-item tests, consistency checks, and adversarial review</w:t>
+            </w:r>
+          </w:p>
+        </w:tc>
+        <w:tc>
+          <w:tcPr/>
+          <w:p>
+            <w:pPr>
+              <w:pStyle w:val="Compact"/>
+            </w:pPr>
+            <w:r>
+              <w:t xml:space="preserve">Judge adequacy, residual error, and whether to stop</w:t>
+            </w:r>
+          </w:p>
+        </w:tc>
+      </w:tr>
+      <w:tr>
+        <w:tc>
+          <w:tcPr/>
+          <w:p>
+            <w:pPr>
+              <w:pStyle w:val="Compact"/>
+            </w:pPr>
+            <w:r>
+              <w:t xml:space="preserve">Express</w:t>
+            </w:r>
+          </w:p>
+        </w:tc>
+        <w:tc>
+          <w:tcPr/>
+          <w:p>
+            <w:pPr>
+              <w:pStyle w:val="Compact"/>
+            </w:pPr>
+            <w:r>
+              <w:t xml:space="preserve">Versioned manuscript, dataset, appendix, or public release</w:t>
+            </w:r>
+          </w:p>
+        </w:tc>
+        <w:tc>
+          <w:tcPr/>
+          <w:p>
+            <w:pPr>
+              <w:pStyle w:val="Compact"/>
+            </w:pPr>
+            <w:r>
+              <w:t xml:space="preserve">Draft from approved artifacts; generate alternative explanations and formats</w:t>
+            </w:r>
+          </w:p>
+        </w:tc>
+        <w:tc>
+          <w:tcPr/>
+          <w:p>
+            <w:pPr>
+              <w:pStyle w:val="Compact"/>
+            </w:pPr>
+            <w:r>
+              <w:t xml:space="preserve">Take responsibility for claims, citations, interpretation, and release</w:t>
+            </w:r>
+          </w:p>
+        </w:tc>
+      </w:tr>
+    </w:tbl>
+    <w:p>
+      <w:pPr>
+        <w:pStyle w:val="BodyText"/>
+      </w:pPr>
+      <w:r>
+        <w:t xml:space="preserve">The loop is recursive. A contradiction found during writing may change the concept</w:t>
+      </w:r>
+      <w:r>
+        <w:t xml:space="preserve"> </w:t>
+      </w:r>
+      <w:r>
+        <w:t xml:space="preserve">map. A new archival term may change the search protocol. A validation failure may</w:t>
+      </w:r>
+      <w:r>
+        <w:t xml:space="preserve"> </w:t>
+      </w:r>
+      <w:r>
+        <w:t xml:space="preserve">require a new codebook version. The system should permit revision while preserving</w:t>
+      </w:r>
+      <w:r>
+        <w:t xml:space="preserve"> </w:t>
+      </w:r>
+      <w:r>
+        <w:t xml:space="preserve">the prior state.</w:t>
+      </w:r>
+    </w:p>
+    <w:p>
+      <w:pPr>
+        <w:pStyle w:val="BodyText"/>
+      </w:pPr>
+      <w:r>
+        <w:t xml:space="preserve">Consider a researcher building an event database from daily newspapers. The PKM</w:t>
+      </w:r>
+      <w:r>
+        <w:t xml:space="preserve"> </w:t>
+      </w:r>
+      <w:r>
+        <w:t xml:space="preserve">layer holds the research question, source inventory, codebook versions, decisions,</w:t>
+      </w:r>
+      <w:r>
+        <w:t xml:space="preserve"> </w:t>
+      </w:r>
+      <w:r>
+        <w:t xml:space="preserve">and notes about access or political context. The AI layer scans permitted</w:t>
+      </w:r>
+      <w:r>
+        <w:t xml:space="preserve"> </w:t>
+      </w:r>
+      <w:r>
+        <w:t xml:space="preserve">newspapers, stages event candidates, extracts dates and actors, proposes additional</w:t>
+      </w:r>
+      <w:r>
+        <w:t xml:space="preserve"> </w:t>
+      </w:r>
+      <w:r>
+        <w:t xml:space="preserve">variables, and identifies possible duplicates. The researcher validates a sample,</w:t>
+      </w:r>
+      <w:r>
+        <w:t xml:space="preserve"> </w:t>
+      </w:r>
+      <w:r>
+        <w:t xml:space="preserve">resolves ambiguous events, approves codebook changes, and records why a candidate</w:t>
+      </w:r>
+      <w:r>
+        <w:t xml:space="preserve"> </w:t>
+      </w:r>
+      <w:r>
+        <w:t xml:space="preserve">entered or left the verified corpus.</w:t>
+      </w:r>
+    </w:p>
+    <w:p>
+      <w:pPr>
+        <w:pStyle w:val="BodyText"/>
+      </w:pPr>
+      <w:r>
+        <w:t xml:space="preserve">The result is not merely a larger dataset. It is a dataset with a memory.</w:t>
+      </w:r>
+    </w:p>
+    <w:bookmarkEnd w:id="309"/>
+    <w:bookmarkStart w:id="310" w:name="an-operative-chapter-exercise"/>
+    <w:p>
+      <w:pPr>
+        <w:pStyle w:val="Heading2"/>
+      </w:pPr>
+      <w:r>
+        <w:t xml:space="preserve">21.9 An Operative Chapter Exercise</w:t>
+      </w:r>
+    </w:p>
+    <w:p>
+      <w:pPr>
+        <w:pStyle w:val="FirstParagraph"/>
+      </w:pPr>
+      <w:r>
+        <w:t xml:space="preserve">This chapter can be tested on one active research question. Begin with no more than</w:t>
+      </w:r>
+      <w:r>
+        <w:t xml:space="preserve"> </w:t>
+      </w:r>
+      <w:r>
+        <w:t xml:space="preserve">twenty source notes. Write a one-page context packet containing the question,</w:t>
+      </w:r>
+      <w:r>
+        <w:t xml:space="preserve"> </w:t>
+      </w:r>
+      <w:r>
+        <w:t xml:space="preserve">population, period, concepts, source boundaries, ethics, current artifact</w:t>
+      </w:r>
+      <w:r>
+        <w:t xml:space="preserve"> </w:t>
+      </w:r>
+      <w:r>
+        <w:t xml:space="preserve">versions, and decision authority. Select five known items that any adequate search</w:t>
+      </w:r>
+      <w:r>
+        <w:t xml:space="preserve"> </w:t>
+      </w:r>
+      <w:r>
+        <w:t xml:space="preserve">must recover.</w:t>
+      </w:r>
+    </w:p>
+    <w:p>
+      <w:pPr>
+        <w:pStyle w:val="BodyText"/>
+      </w:pPr>
+      <w:r>
+        <w:t xml:space="preserve">Ask an AI system to map the vocabulary and stage a candidate register. Require a</w:t>
+      </w:r>
+      <w:r>
+        <w:t xml:space="preserve"> </w:t>
+      </w:r>
+      <w:r>
+        <w:t xml:space="preserve">stable source identifier, discovery route, bibliographic status, relevance</w:t>
+      </w:r>
+      <w:r>
+        <w:t xml:space="preserve"> </w:t>
+      </w:r>
+      <w:r>
+        <w:t xml:space="preserve">rationale, uncertainty, and verification status for every row. Do not permit a</w:t>
+      </w:r>
+      <w:r>
+        <w:t xml:space="preserve"> </w:t>
+      </w:r>
+      <w:r>
+        <w:t xml:space="preserve">final inclusion field.</w:t>
+      </w:r>
+    </w:p>
+    <w:p>
+      <w:pPr>
+        <w:pStyle w:val="BodyText"/>
+      </w:pPr>
+      <w:r>
+        <w:t xml:space="preserve">Inspect the result in three passes. First, check identity and provenance. Second,</w:t>
+      </w:r>
+      <w:r>
+        <w:t xml:space="preserve"> </w:t>
+      </w:r>
+      <w:r>
+        <w:t xml:space="preserve">look for missing terms, false equivalences, and scope drift. Third, examine what</w:t>
+      </w:r>
+      <w:r>
+        <w:t xml:space="preserve"> </w:t>
+      </w:r>
+      <w:r>
+        <w:t xml:space="preserve">the system failed to recover. Record every correction in an audit log and rerun</w:t>
+      </w:r>
+      <w:r>
+        <w:t xml:space="preserve"> </w:t>
+      </w:r>
+      <w:r>
+        <w:t xml:space="preserve">the same task with the revised context packet.</w:t>
+      </w:r>
+    </w:p>
+    <w:p>
+      <w:pPr>
+        <w:pStyle w:val="BodyText"/>
+      </w:pPr>
+      <w:r>
+        <w:t xml:space="preserve">The exercise succeeds if the second run becomes easier to inspect and if the</w:t>
+      </w:r>
+      <w:r>
+        <w:t xml:space="preserve"> </w:t>
+      </w:r>
+      <w:r>
+        <w:t xml:space="preserve">record explains why it changed. It does not succeed because the prose sounds</w:t>
+      </w:r>
+      <w:r>
+        <w:t xml:space="preserve"> </w:t>
+      </w:r>
+      <w:r>
+        <w:t xml:space="preserve">better or because the model returns more candidates.</w:t>
+      </w:r>
+    </w:p>
+    <w:p>
+      <w:pPr>
+        <w:pStyle w:val="BodyText"/>
+      </w:pPr>
+      <w:r>
+        <w:t xml:space="preserve">The downloadable</w:t>
+      </w:r>
+      <w:r>
+        <w:t xml:space="preserve"> </w:t>
+      </w:r>
+      <w:hyperlink r:id="rId227">
+        <w:r>
+          <w:rPr>
+            <w:rStyle w:val="Hyperlink"/>
+          </w:rPr>
+          <w:t xml:space="preserve">Skills and Agents Lab</w:t>
+        </w:r>
+      </w:hyperlink>
+      <w:r>
+        <w:t xml:space="preserve"> </w:t>
+      </w:r>
+      <w:r>
+        <w:t xml:space="preserve">provides a</w:t>
+      </w:r>
+      <w:r>
+        <w:t xml:space="preserve"> </w:t>
+      </w:r>
+      <w:r>
+        <w:t xml:space="preserve">literature-discovery skill, bounded scout agent, project-context template, three</w:t>
+      </w:r>
+      <w:r>
+        <w:t xml:space="preserve"> </w:t>
+      </w:r>
+      <w:r>
+        <w:t xml:space="preserve">synthetic benchmarks, and a failure report for this exercise.</w:t>
+      </w:r>
+    </w:p>
+    <w:bookmarkEnd w:id="310"/>
+    <w:bookmarkStart w:id="311" w:name="what-ai-must-not-do"/>
+    <w:p>
+      <w:pPr>
+        <w:pStyle w:val="Heading2"/>
+      </w:pPr>
+      <w:r>
+        <w:t xml:space="preserve">21.10 What AI Must Not Do</w:t>
+      </w:r>
+    </w:p>
+    <w:p>
+      <w:pPr>
+        <w:pStyle w:val="FirstParagraph"/>
+      </w:pPr>
+      <w:r>
+        <w:t xml:space="preserve">AI must not convert a retrieval failure into a claim that no literature exists. It</w:t>
+      </w:r>
+      <w:r>
+        <w:t xml:space="preserve"> </w:t>
+      </w:r>
+      <w:r>
+        <w:t xml:space="preserve">must not treat repeated records as independent corroboration. It must not overwrite</w:t>
+      </w:r>
+      <w:r>
+        <w:t xml:space="preserve"> </w:t>
+      </w:r>
+      <w:r>
+        <w:t xml:space="preserve">the canonical note, codebook, or corpus without a versioned proposal. It must not</w:t>
+      </w:r>
+      <w:r>
+        <w:t xml:space="preserve"> </w:t>
+      </w:r>
+      <w:r>
+        <w:t xml:space="preserve">use restricted or personal material merely because that material is technically</w:t>
+      </w:r>
+      <w:r>
+        <w:t xml:space="preserve"> </w:t>
+      </w:r>
+      <w:r>
+        <w:t xml:space="preserve">accessible. It must not hide uncertainty behind a completed field.</w:t>
+      </w:r>
+    </w:p>
+    <w:p>
+      <w:pPr>
+        <w:pStyle w:val="BodyText"/>
+      </w:pPr>
+      <w:r>
+        <w:t xml:space="preserve">AI must not collapse source, derivative, note, and claim into one object. It must</w:t>
+      </w:r>
+      <w:r>
+        <w:t xml:space="preserve"> </w:t>
+      </w:r>
+      <w:r>
+        <w:t xml:space="preserve">not turn a retrospective interview into a contemporaneous record. It must not</w:t>
+      </w:r>
+      <w:r>
+        <w:t xml:space="preserve"> </w:t>
+      </w:r>
+      <w:r>
+        <w:t xml:space="preserve">translate a disputed concept into a stable English equivalent without preserving</w:t>
+      </w:r>
+      <w:r>
+        <w:t xml:space="preserve"> </w:t>
+      </w:r>
+      <w:r>
+        <w:t xml:space="preserve">the original. It must not infer causal direction from narrative order alone.</w:t>
+      </w:r>
+    </w:p>
+    <w:p>
+      <w:pPr>
+        <w:pStyle w:val="BodyText"/>
+      </w:pPr>
+      <w:r>
+        <w:t xml:space="preserve">Most of all, AI must not become the unnamed author of consequential research</w:t>
+      </w:r>
+      <w:r>
+        <w:t xml:space="preserve"> </w:t>
+      </w:r>
+      <w:r>
+        <w:t xml:space="preserve">decisions. A final inclusion, exclusion, codebook revision, causal judgment, or</w:t>
+      </w:r>
+      <w:r>
+        <w:t xml:space="preserve"> </w:t>
+      </w:r>
+      <w:r>
+        <w:t xml:space="preserve">public claim requires a responsible researcher. The system may prepare the</w:t>
+      </w:r>
+      <w:r>
+        <w:t xml:space="preserve"> </w:t>
+      </w:r>
+      <w:r>
+        <w:t xml:space="preserve">decision. It may preserve the reasons. It may expose inconsistency. The researcher</w:t>
+      </w:r>
+      <w:r>
+        <w:t xml:space="preserve"> </w:t>
+      </w:r>
+      <w:r>
+        <w:t xml:space="preserve">still decides.</w:t>
+      </w:r>
+    </w:p>
+    <w:bookmarkEnd w:id="311"/>
+    <w:bookmarkStart w:id="312" w:name="the-research-system-that-remembers"/>
+    <w:p>
+      <w:pPr>
+        <w:pStyle w:val="Heading2"/>
+      </w:pPr>
+      <w:r>
+        <w:t xml:space="preserve">21.11 The Research System That Remembers</w:t>
+      </w:r>
+    </w:p>
+    <w:p>
+      <w:pPr>
+        <w:pStyle w:val="FirstParagraph"/>
+      </w:pPr>
+      <w:r>
+        <w:t xml:space="preserve">The evolution recorded in my library begins with a familiar anxiety: too much to</w:t>
+      </w:r>
+      <w:r>
+        <w:t xml:space="preserve"> </w:t>
+      </w:r>
+      <w:r>
+        <w:t xml:space="preserve">read, too much to remember, and too many tools. It ends, for now, with a different</w:t>
+      </w:r>
+      <w:r>
+        <w:t xml:space="preserve"> </w:t>
+      </w:r>
+      <w:r>
+        <w:t xml:space="preserve">question. How should a researcher govern a system that can read and act across</w:t>
+      </w:r>
+      <w:r>
+        <w:t xml:space="preserve"> </w:t>
+      </w:r>
+      <w:r>
+        <w:t xml:space="preserve">years of accumulated intellectual work?</w:t>
+      </w:r>
+    </w:p>
+    <w:p>
+      <w:pPr>
+        <w:pStyle w:val="BodyText"/>
+      </w:pPr>
+      <w:r>
+        <w:t xml:space="preserve">The answer is not a fully autonomous scholar. It is a partnership built from</w:t>
+      </w:r>
+      <w:r>
+        <w:t xml:space="preserve"> </w:t>
+      </w:r>
+      <w:r>
+        <w:t xml:space="preserve">asymmetry. PKM remembers slowly and precisely. AI processes quickly and</w:t>
+      </w:r>
+      <w:r>
+        <w:t xml:space="preserve"> </w:t>
+      </w:r>
+      <w:r>
+        <w:t xml:space="preserve">probabilistically. PKM preserves the path. AI explores possible paths. PKM holds</w:t>
+      </w:r>
+      <w:r>
+        <w:t xml:space="preserve"> </w:t>
+      </w:r>
+      <w:r>
+        <w:t xml:space="preserve">the source record. AI prepares transformations and comparisons. Human judgment</w:t>
+      </w:r>
+      <w:r>
+        <w:t xml:space="preserve"> </w:t>
+      </w:r>
+      <w:r>
+        <w:t xml:space="preserve">defines the question, interprets the evidence, and accepts responsibility for the</w:t>
+      </w:r>
+      <w:r>
+        <w:t xml:space="preserve"> </w:t>
+      </w:r>
+      <w:r>
+        <w:t xml:space="preserve">claim.</w:t>
+      </w:r>
+    </w:p>
+    <w:p>
+      <w:pPr>
+        <w:pStyle w:val="BodyText"/>
+      </w:pPr>
+      <w:r>
+        <w:t xml:space="preserve">This integration pushes social research forward by changing the feasible scale of</w:t>
+      </w:r>
+      <w:r>
+        <w:t xml:space="preserve"> </w:t>
+      </w:r>
+      <w:r>
+        <w:t xml:space="preserve">careful work. It lets one researcher inspect more archives, follow more conceptual</w:t>
+      </w:r>
+      <w:r>
+        <w:t xml:space="preserve"> </w:t>
+      </w:r>
+      <w:r>
+        <w:t xml:space="preserve">variants, compare more cases, and rerun more coding decisions. But the gain comes</w:t>
+      </w:r>
+      <w:r>
+        <w:t xml:space="preserve"> </w:t>
+      </w:r>
+      <w:r>
+        <w:t xml:space="preserve">from governed iteration, not automation alone.</w:t>
+      </w:r>
+    </w:p>
+    <w:p>
+      <w:pPr>
+        <w:pStyle w:val="BodyText"/>
+      </w:pPr>
+      <w:r>
+        <w:t xml:space="preserve">The durable principle is simple. Build a knowledge base that another person can</w:t>
+      </w:r>
+      <w:r>
+        <w:t xml:space="preserve"> </w:t>
+      </w:r>
+      <w:r>
+        <w:t xml:space="preserve">inspect. Give AI a bounded task within that base. Require it to return an artifact,</w:t>
+      </w:r>
+      <w:r>
+        <w:t xml:space="preserve"> </w:t>
+      </w:r>
+      <w:r>
+        <w:t xml:space="preserve">not an answer. Verify the artifact against the source and the specification. Then</w:t>
+      </w:r>
+      <w:r>
+        <w:t xml:space="preserve"> </w:t>
+      </w:r>
+      <w:r>
+        <w:t xml:space="preserve">write the next version without erasing the last.</w:t>
+      </w:r>
+    </w:p>
+    <w:bookmarkEnd w:id="312"/>
+    <w:bookmarkEnd w:id="313"/>
+    <w:bookmarkStart w:id="328" w:name="skills-and-agents-lab"/>
+    <w:p>
+      <w:pPr>
+        <w:pStyle w:val="Heading1"/>
+      </w:pPr>
+      <w:r>
+        <w:t xml:space="preserve">22. Skills and Agents Lab</w:t>
+      </w:r>
+    </w:p>
+    <w:bookmarkStart w:id="317" w:name="method-in-the-book-procedure-in-the-lab"/>
+    <w:p>
+      <w:pPr>
+        <w:pStyle w:val="Heading2"/>
+      </w:pPr>
+      <w:r>
+        <w:t xml:space="preserve">22.1 Method in the Book, Procedure in the Lab</w:t>
       </w:r>
     </w:p>
     <w:p>
@@ -11505,7 +13995,7 @@
       <w:pPr>
         <w:pStyle w:val="BodyText"/>
       </w:pPr>
-      <w:hyperlink r:id="rId274">
+      <w:hyperlink r:id="rId314">
         <w:r>
           <w:rPr>
             <w:rStyle w:val="Hyperlink"/>
@@ -11516,7 +14006,7 @@
       <w:r>
         <w:t xml:space="preserve"> </w:t>
       </w:r>
-      <w:hyperlink r:id="rId275">
+      <w:hyperlink r:id="rId315">
         <w:r>
           <w:rPr>
             <w:rStyle w:val="Hyperlink"/>
@@ -11527,7 +14017,7 @@
       <w:r>
         <w:t xml:space="preserve"> </w:t>
       </w:r>
-      <w:hyperlink r:id="rId276">
+      <w:hyperlink r:id="rId316">
         <w:r>
           <w:rPr>
             <w:rStyle w:val="Hyperlink"/>
@@ -11536,23 +14026,23 @@
         </w:r>
       </w:hyperlink>
     </w:p>
-    <w:bookmarkEnd w:id="277"/>
-    <w:bookmarkStart w:id="281" w:name="what-the-release-contains"/>
+    <w:bookmarkEnd w:id="317"/>
+    <w:bookmarkStart w:id="321" w:name="what-the-release-contains"/>
     <w:p>
       <w:pPr>
         <w:pStyle w:val="Heading2"/>
       </w:pPr>
       <w:r>
-        <w:t xml:space="preserve">21.2 What the Release Contains</w:t>
-      </w:r>
-    </w:p>
-    <w:bookmarkStart w:id="278" w:name="literature-discovery-skill"/>
+        <w:t xml:space="preserve">22.2 What the Release Contains</w:t>
+      </w:r>
+    </w:p>
+    <w:bookmarkStart w:id="318" w:name="literature-discovery-skill"/>
     <w:p>
       <w:pPr>
         <w:pStyle w:val="Heading3"/>
       </w:pPr>
       <w:r>
-        <w:t xml:space="preserve">21.2.1 Literature-discovery skill</w:t>
+        <w:t xml:space="preserve">22.2.1 Literature-discovery skill</w:t>
       </w:r>
     </w:p>
     <w:p>
@@ -11651,14 +14141,14 @@
         <w:t xml:space="preserve">verification fields and do not contain final-eligibility fields.</w:t>
       </w:r>
     </w:p>
-    <w:bookmarkEnd w:id="278"/>
-    <w:bookmarkStart w:id="279" w:name="bounded-literature-scout-agent"/>
+    <w:bookmarkEnd w:id="318"/>
+    <w:bookmarkStart w:id="319" w:name="bounded-literature-scout-agent"/>
     <w:p>
       <w:pPr>
         <w:pStyle w:val="Heading3"/>
       </w:pPr>
       <w:r>
-        <w:t xml:space="preserve">21.2.2 Bounded literature-scout agent</w:t>
+        <w:t xml:space="preserve">22.2.2 Bounded literature-scout agent</w:t>
       </w:r>
     </w:p>
     <w:p>
@@ -11701,14 +14191,14 @@
         <w:t xml:space="preserve">agent executes one work order in a fresh context. The researcher controls the gates.</w:t>
       </w:r>
     </w:p>
-    <w:bookmarkEnd w:id="279"/>
-    <w:bookmarkStart w:id="280" w:name="project-context-packet"/>
+    <w:bookmarkEnd w:id="319"/>
+    <w:bookmarkStart w:id="320" w:name="project-context-packet"/>
     <w:p>
       <w:pPr>
         <w:pStyle w:val="Heading3"/>
       </w:pPr>
       <w:r>
-        <w:t xml:space="preserve">21.2.3 Project-context packet</w:t>
+        <w:t xml:space="preserve">22.2.3 Project-context packet</w:t>
       </w:r>
     </w:p>
     <w:p>
@@ -11835,15 +14325,15 @@
         <w:t xml:space="preserve">not contain an entire project archive.</w:t>
       </w:r>
     </w:p>
-    <w:bookmarkEnd w:id="280"/>
-    <w:bookmarkEnd w:id="281"/>
-    <w:bookmarkStart w:id="282" w:name="three-synthetic-benchmarks"/>
+    <w:bookmarkEnd w:id="320"/>
+    <w:bookmarkEnd w:id="321"/>
+    <w:bookmarkStart w:id="322" w:name="three-synthetic-benchmarks"/>
     <w:p>
       <w:pPr>
         <w:pStyle w:val="Heading2"/>
       </w:pPr>
       <w:r>
-        <w:t xml:space="preserve">21.3 Three Synthetic Benchmarks</w:t>
+        <w:t xml:space="preserve">22.3 Three Synthetic Benchmarks</w:t>
       </w:r>
     </w:p>
     <w:p>
@@ -12042,14 +14532,14 @@
         <w:t xml:space="preserve">independently prepared corpus.</w:t>
       </w:r>
     </w:p>
-    <w:bookmarkEnd w:id="282"/>
-    <w:bookmarkStart w:id="283" w:name="what-the-ai-got-wrong"/>
+    <w:bookmarkEnd w:id="322"/>
+    <w:bookmarkStart w:id="323" w:name="what-the-ai-got-wrong"/>
     <w:p>
       <w:pPr>
         <w:pStyle w:val="Heading2"/>
       </w:pPr>
       <w:r>
-        <w:t xml:space="preserve">21.4 What the AI Got Wrong</w:t>
+        <w:t xml:space="preserve">22.4 What the AI Got Wrong</w:t>
       </w:r>
     </w:p>
     <w:p>
@@ -12146,14 +14636,14 @@
         <w:t xml:space="preserve">not established.</w:t>
       </w:r>
     </w:p>
-    <w:bookmarkEnd w:id="283"/>
-    <w:bookmarkStart w:id="284" w:name="use-and-inspect-the-package"/>
+    <w:bookmarkEnd w:id="323"/>
+    <w:bookmarkStart w:id="324" w:name="use-and-inspect-the-package"/>
     <w:p>
       <w:pPr>
         <w:pStyle w:val="Heading2"/>
       </w:pPr>
       <w:r>
-        <w:t xml:space="preserve">21.5 Use and Inspect the Package</w:t>
+        <w:t xml:space="preserve">22.5 Use and Inspect the Package</w:t>
       </w:r>
     </w:p>
     <w:p>
@@ -12324,14 +14814,14 @@
         <w:t xml:space="preserve">keep all outputs in staging until a named researcher approves them.</w:t>
       </w:r>
     </w:p>
-    <w:bookmarkEnd w:id="284"/>
-    <w:bookmarkStart w:id="287" w:name="feedback-and-revision"/>
+    <w:bookmarkEnd w:id="324"/>
+    <w:bookmarkStart w:id="327" w:name="feedback-and-revision"/>
     <w:p>
       <w:pPr>
         <w:pStyle w:val="Heading2"/>
       </w:pPr>
       <w:r>
-        <w:t xml:space="preserve">21.6 Feedback and Revision</w:t>
+        <w:t xml:space="preserve">22.6 Feedback and Revision</w:t>
       </w:r>
     </w:p>
     <w:p>
@@ -12358,7 +14848,7 @@
       <w:pPr>
         <w:pStyle w:val="BodyText"/>
       </w:pPr>
-      <w:hyperlink r:id="rId285">
+      <w:hyperlink r:id="rId325">
         <w:r>
           <w:rPr>
             <w:rStyle w:val="Hyperlink"/>
@@ -12369,7 +14859,7 @@
       <w:r>
         <w:t xml:space="preserve"> </w:t>
       </w:r>
-      <w:hyperlink r:id="rId286">
+      <w:hyperlink r:id="rId326">
         <w:r>
           <w:rPr>
             <w:rStyle w:val="Hyperlink"/>
@@ -12404,24 +14894,24 @@
         <w:t xml:space="preserve">the changelog and a numbered release.</w:t>
       </w:r>
     </w:p>
-    <w:bookmarkEnd w:id="287"/>
-    <w:bookmarkEnd w:id="288"/>
-    <w:bookmarkStart w:id="293" w:name="building-the-full-field-guide"/>
+    <w:bookmarkEnd w:id="327"/>
+    <w:bookmarkEnd w:id="328"/>
+    <w:bookmarkStart w:id="333" w:name="building-the-full-field-guide"/>
     <w:p>
       <w:pPr>
         <w:pStyle w:val="Heading1"/>
       </w:pPr>
       <w:r>
-        <w:t xml:space="preserve">22. Building the Full Field Guide</w:t>
-      </w:r>
-    </w:p>
-    <w:bookmarkStart w:id="289" w:name="what-the-current-modules-establish"/>
+        <w:t xml:space="preserve">23. Building the Full Field Guide</w:t>
+      </w:r>
+    </w:p>
+    <w:bookmarkStart w:id="329" w:name="what-the-current-modules-establish"/>
     <w:p>
       <w:pPr>
         <w:pStyle w:val="Heading2"/>
       </w:pPr>
       <w:r>
-        <w:t xml:space="preserve">22.1 What the Current Modules Establish</w:t>
+        <w:t xml:space="preserve">23.1 What the Current Modules Establish</w:t>
       </w:r>
     </w:p>
     <w:p>
@@ -12733,14 +15223,14 @@
         <w:t xml:space="preserve">The modules also reveal what remains outside the draft. They do not collect an interview, preserve a website, prepare a full archival corpus, or write the final empirical analysis. The synthesis chapter extends the literature workflow into open, living, and quantitative reviews. The bridge chapter on event databases introduces document extraction, dynamic coding, validation, and explicit causal updating. Each still requires fuller treatment across source types and analytical traditions.</w:t>
       </w:r>
     </w:p>
-    <w:bookmarkEnd w:id="289"/>
-    <w:bookmarkStart w:id="290" w:name="the-full-field-guide"/>
+    <w:bookmarkEnd w:id="329"/>
+    <w:bookmarkStart w:id="330" w:name="the-full-field-guide"/>
     <w:p>
       <w:pPr>
         <w:pStyle w:val="Heading2"/>
       </w:pPr>
       <w:r>
-        <w:t xml:space="preserve">22.2 The Full Field Guide</w:t>
+        <w:t xml:space="preserve">23.2 The Full Field Guide</w:t>
       </w:r>
     </w:p>
     <w:p>
@@ -12775,14 +15265,14 @@
         <w:t xml:space="preserve">A communication module will cover manuscripts, presentations, public data, visual explanation, repositories, and long-term access. Sharing is not the final act after research. Decisions made during collection determine what can later be verified, reused, or protected.</w:t>
       </w:r>
     </w:p>
-    <w:bookmarkEnd w:id="290"/>
-    <w:bookmarkStart w:id="291" w:name="a-hebrew-edition"/>
+    <w:bookmarkEnd w:id="330"/>
+    <w:bookmarkStart w:id="331" w:name="a-hebrew-edition"/>
     <w:p>
       <w:pPr>
         <w:pStyle w:val="Heading2"/>
       </w:pPr>
       <w:r>
-        <w:t xml:space="preserve">22.3 A Hebrew Edition</w:t>
+        <w:t xml:space="preserve">23.3 A Hebrew Edition</w:t>
       </w:r>
     </w:p>
     <w:p>
@@ -12793,14 +15283,14 @@
         <w:t xml:space="preserve">English remains the canonical language during the pilot. A Hebrew edition should follow after the content model and navigation stabilize. Translation will require more than sentence substitution. Search terms, institutional examples, interfaces, and right-to-left design must be adapted. Stable page identifiers will keep the two editions connected without forcing them to change at the same pace.</w:t>
       </w:r>
     </w:p>
-    <w:bookmarkEnd w:id="291"/>
-    <w:bookmarkStart w:id="292" w:name="an-invitation"/>
+    <w:bookmarkEnd w:id="331"/>
+    <w:bookmarkStart w:id="332" w:name="an-invitation"/>
     <w:p>
       <w:pPr>
         <w:pStyle w:val="Heading2"/>
       </w:pPr>
       <w:r>
-        <w:t xml:space="preserve">22.4 An Invitation</w:t>
+        <w:t xml:space="preserve">23.4 An Invitation</w:t>
       </w:r>
     </w:p>
     <w:p>
@@ -12827,19 +15317,19 @@
         <w:t xml:space="preserve">The old project began with abundance. The revived project begins with limits, artifacts, and reviewable decisions. This is progress.</w:t>
       </w:r>
     </w:p>
-    <w:bookmarkEnd w:id="292"/>
-    <w:bookmarkEnd w:id="293"/>
-    <w:bookmarkStart w:id="334" w:name="references"/>
+    <w:bookmarkEnd w:id="332"/>
+    <w:bookmarkEnd w:id="333"/>
+    <w:bookmarkStart w:id="374" w:name="references"/>
     <w:p>
       <w:pPr>
         <w:pStyle w:val="Heading1"/>
       </w:pPr>
       <w:r>
-        <w:t xml:space="preserve">23. References</w:t>
-      </w:r>
-    </w:p>
-    <w:bookmarkStart w:id="333" w:name="refs"/>
-    <w:bookmarkStart w:id="294" w:name="ref-autio2024genai"/>
+        <w:t xml:space="preserve">24. References</w:t>
+      </w:r>
+    </w:p>
+    <w:bookmarkStart w:id="373" w:name="refs"/>
+    <w:bookmarkStart w:id="334" w:name="ref-autio2024genai"/>
     <w:p>
       <w:pPr>
         <w:pStyle w:val="Bibliography"/>
@@ -12877,8 +15367,8 @@
         <w:t xml:space="preserve">.</w:t>
       </w:r>
     </w:p>
-    <w:bookmarkEnd w:id="294"/>
-    <w:bookmarkStart w:id="295" w:name="ref-beelen2023bias"/>
+    <w:bookmarkEnd w:id="334"/>
+    <w:bookmarkStart w:id="335" w:name="ref-beelen2023bias"/>
     <w:p>
       <w:pPr>
         <w:pStyle w:val="Bibliography"/>
@@ -12923,8 +15413,8 @@
         <w:t xml:space="preserve">.</w:t>
       </w:r>
     </w:p>
-    <w:bookmarkEnd w:id="295"/>
-    <w:bookmarkStart w:id="296" w:name="ref-blaizot2022ai"/>
+    <w:bookmarkEnd w:id="335"/>
+    <w:bookmarkStart w:id="336" w:name="ref-blaizot2022ai"/>
     <w:p>
       <w:pPr>
         <w:pStyle w:val="Bibliography"/>
@@ -12969,8 +15459,8 @@
         <w:t xml:space="preserve">.</w:t>
       </w:r>
     </w:p>
-    <w:bookmarkEnd w:id="296"/>
-    <w:bookmarkStart w:id="297" w:name="ref-booth2016systematic"/>
+    <w:bookmarkEnd w:id="336"/>
+    <w:bookmarkStart w:id="337" w:name="ref-booth2016systematic"/>
     <w:p>
       <w:pPr>
         <w:pStyle w:val="Bibliography"/>
@@ -12992,8 +15482,8 @@
         <w:t xml:space="preserve">. 2nd ed. London: SAGE Publications, 2016.</w:t>
       </w:r>
     </w:p>
-    <w:bookmarkEnd w:id="297"/>
-    <w:bookmarkStart w:id="298" w:name="ref-brandt2025measurement"/>
+    <w:bookmarkEnd w:id="337"/>
+    <w:bookmarkStart w:id="338" w:name="ref-brandt2025measurement"/>
     <w:p>
       <w:pPr>
         <w:pStyle w:val="Bibliography"/>
@@ -13038,8 +15528,8 @@
         <w:t xml:space="preserve">.</w:t>
       </w:r>
     </w:p>
-    <w:bookmarkEnd w:id="298"/>
-    <w:bookmarkStart w:id="299" w:name="ref-braun2021quality"/>
+    <w:bookmarkEnd w:id="338"/>
+    <w:bookmarkStart w:id="339" w:name="ref-braun2021quality"/>
     <w:p>
       <w:pPr>
         <w:pStyle w:val="Bibliography"/>
@@ -13084,8 +15574,8 @@
         <w:t xml:space="preserve">.</w:t>
       </w:r>
     </w:p>
-    <w:bookmarkEnd w:id="299"/>
-    <w:bookmarkStart w:id="300" w:name="ref-cai2023montecarlo"/>
+    <w:bookmarkEnd w:id="339"/>
+    <w:bookmarkStart w:id="340" w:name="ref-cai2023montecarlo"/>
     <w:p>
       <w:pPr>
         <w:pStyle w:val="Bibliography"/>
@@ -13145,8 +15635,8 @@
         <w:t xml:space="preserve">.</w:t>
       </w:r>
     </w:p>
-    <w:bookmarkEnd w:id="300"/>
-    <w:bookmarkStart w:id="301" w:name="ref-elliott2017living"/>
+    <w:bookmarkEnd w:id="340"/>
+    <w:bookmarkStart w:id="341" w:name="ref-elliott2017living"/>
     <w:p>
       <w:pPr>
         <w:pStyle w:val="Bibliography"/>
@@ -13191,8 +15681,8 @@
         <w:t xml:space="preserve">.</w:t>
       </w:r>
     </w:p>
-    <w:bookmarkEnd w:id="301"/>
-    <w:bookmarkStart w:id="302" w:name="ref-enders2011domestic"/>
+    <w:bookmarkEnd w:id="341"/>
+    <w:bookmarkStart w:id="342" w:name="ref-enders2011domestic"/>
     <w:p>
       <w:pPr>
         <w:pStyle w:val="Bibliography"/>
@@ -13237,8 +15727,8 @@
         <w:t xml:space="preserve">.</w:t>
       </w:r>
     </w:p>
-    <w:bookmarkEnd w:id="302"/>
-    <w:bookmarkStart w:id="303" w:name="ref-fairfield2017bayesian"/>
+    <w:bookmarkEnd w:id="342"/>
+    <w:bookmarkStart w:id="343" w:name="ref-fairfield2017bayesian"/>
     <w:p>
       <w:pPr>
         <w:pStyle w:val="Bibliography"/>
@@ -13295,8 +15785,8 @@
         <w:t xml:space="preserve">.</w:t>
       </w:r>
     </w:p>
-    <w:bookmarkEnd w:id="303"/>
-    <w:bookmarkStart w:id="304" w:name="ref-gerring2012methodology"/>
+    <w:bookmarkEnd w:id="343"/>
+    <w:bookmarkStart w:id="344" w:name="ref-gerring2012methodology"/>
     <w:p>
       <w:pPr>
         <w:pStyle w:val="Bibliography"/>
@@ -13318,8 +15808,8 @@
         <w:t xml:space="preserve">. 2nd ed. Cambridge: Cambridge University Press, 2012.</w:t>
       </w:r>
     </w:p>
-    <w:bookmarkEnd w:id="304"/>
-    <w:bookmarkStart w:id="305" w:name="ref-gilardi2023chatgpt"/>
+    <w:bookmarkEnd w:id="344"/>
+    <w:bookmarkStart w:id="345" w:name="ref-gilardi2023chatgpt"/>
     <w:p>
       <w:pPr>
         <w:pStyle w:val="Bibliography"/>
@@ -13373,8 +15863,8 @@
         <w:t xml:space="preserve">.</w:t>
       </w:r>
     </w:p>
-    <w:bookmarkEnd w:id="305"/>
-    <w:bookmarkStart w:id="306" w:name="ref-grant2009typology"/>
+    <w:bookmarkEnd w:id="345"/>
+    <w:bookmarkStart w:id="346" w:name="ref-grant2009typology"/>
     <w:p>
       <w:pPr>
         <w:pStyle w:val="Bibliography"/>
@@ -13429,8 +15919,8 @@
         <w:t xml:space="preserve">.</w:t>
       </w:r>
     </w:p>
-    <w:bookmarkEnd w:id="306"/>
-    <w:bookmarkStart w:id="307" w:name="ref-greenhalgh2005search"/>
+    <w:bookmarkEnd w:id="346"/>
+    <w:bookmarkStart w:id="347" w:name="ref-greenhalgh2005search"/>
     <w:p>
       <w:pPr>
         <w:pStyle w:val="Bibliography"/>
@@ -13475,8 +15965,8 @@
         <w:t xml:space="preserve">.</w:t>
       </w:r>
     </w:p>
-    <w:bookmarkEnd w:id="307"/>
-    <w:bookmarkStart w:id="308" w:name="ref-hedges2010robust"/>
+    <w:bookmarkEnd w:id="347"/>
+    <w:bookmarkStart w:id="348" w:name="ref-hedges2010robust"/>
     <w:p>
       <w:pPr>
         <w:pStyle w:val="Bibliography"/>
@@ -13521,8 +16011,8 @@
         <w:t xml:space="preserve">.</w:t>
       </w:r>
     </w:p>
-    <w:bookmarkEnd w:id="308"/>
-    <w:bookmarkStart w:id="309" w:name="ref-irsova2024meta"/>
+    <w:bookmarkEnd w:id="348"/>
+    <w:bookmarkStart w:id="349" w:name="ref-irsova2024meta"/>
     <w:p>
       <w:pPr>
         <w:pStyle w:val="Bibliography"/>
@@ -13567,8 +16057,8 @@
         <w:t xml:space="preserve">.</w:t>
       </w:r>
     </w:p>
-    <w:bookmarkEnd w:id="309"/>
-    <w:bookmarkStart w:id="310" w:name="ref-lebo2013provo"/>
+    <w:bookmarkEnd w:id="349"/>
+    <w:bookmarkStart w:id="350" w:name="ref-lebo2013provo"/>
     <w:p>
       <w:pPr>
         <w:pStyle w:val="Bibliography"/>
@@ -13621,8 +16111,8 @@
         <w:t xml:space="preserve">.</w:t>
       </w:r>
     </w:p>
-    <w:bookmarkEnd w:id="310"/>
-    <w:bookmarkStart w:id="311" w:name="ref-littell2018classification"/>
+    <w:bookmarkEnd w:id="350"/>
+    <w:bookmarkStart w:id="351" w:name="ref-littell2018classification"/>
     <w:p>
       <w:pPr>
         <w:pStyle w:val="Bibliography"/>
@@ -13667,8 +16157,8 @@
         <w:t xml:space="preserve">.</w:t>
       </w:r>
     </w:p>
-    <w:bookmarkEnd w:id="311"/>
-    <w:bookmarkStart w:id="312" w:name="ref-liu2024lost"/>
+    <w:bookmarkEnd w:id="351"/>
+    <w:bookmarkStart w:id="352" w:name="ref-liu2024lost"/>
     <w:p>
       <w:pPr>
         <w:pStyle w:val="Bibliography"/>
@@ -13713,8 +16203,8 @@
         <w:t xml:space="preserve">.</w:t>
       </w:r>
     </w:p>
-    <w:bookmarkEnd w:id="312"/>
-    <w:bookmarkStart w:id="313" w:name="ref-malterud2016information"/>
+    <w:bookmarkEnd w:id="352"/>
+    <w:bookmarkStart w:id="353" w:name="ref-malterud2016information"/>
     <w:p>
       <w:pPr>
         <w:pStyle w:val="Bibliography"/>
@@ -13759,8 +16249,8 @@
         <w:t xml:space="preserve">.</w:t>
       </w:r>
     </w:p>
-    <w:bookmarkEnd w:id="313"/>
-    <w:bookmarkStart w:id="314" w:name="ref-marshall2019automation"/>
+    <w:bookmarkEnd w:id="353"/>
+    <w:bookmarkStart w:id="354" w:name="ref-marshall2019automation"/>
     <w:p>
       <w:pPr>
         <w:pStyle w:val="Bibliography"/>
@@ -13805,8 +16295,8 @@
         <w:t xml:space="preserve">.</w:t>
       </w:r>
     </w:p>
-    <w:bookmarkEnd w:id="314"/>
-    <w:bookmarkStart w:id="315" w:name="ref-moreau2022open"/>
+    <w:bookmarkEnd w:id="354"/>
+    <w:bookmarkStart w:id="355" w:name="ref-moreau2022open"/>
     <w:p>
       <w:pPr>
         <w:pStyle w:val="Bibliography"/>
@@ -13851,8 +16341,8 @@
         <w:t xml:space="preserve">.</w:t>
       </w:r>
     </w:p>
-    <w:bookmarkEnd w:id="315"/>
-    <w:bookmarkStart w:id="316" w:name="ref-start2024codebook"/>
+    <w:bookmarkEnd w:id="355"/>
+    <w:bookmarkStart w:id="356" w:name="ref-start2024codebook"/>
     <w:p>
       <w:pPr>
         <w:pStyle w:val="Bibliography"/>
@@ -13887,8 +16377,8 @@
         <w:t xml:space="preserve">.</w:t>
       </w:r>
     </w:p>
-    <w:bookmarkEnd w:id="316"/>
-    <w:bookmarkStart w:id="317" w:name="ref-page2021prisma"/>
+    <w:bookmarkEnd w:id="356"/>
+    <w:bookmarkStart w:id="357" w:name="ref-page2021prisma"/>
     <w:p>
       <w:pPr>
         <w:pStyle w:val="Bibliography"/>
@@ -13933,8 +16423,8 @@
         <w:t xml:space="preserve">.</w:t>
       </w:r>
     </w:p>
-    <w:bookmarkEnd w:id="317"/>
-    <w:bookmarkStart w:id="318" w:name="ref-pangakis2023annotation"/>
+    <w:bookmarkEnd w:id="357"/>
+    <w:bookmarkStart w:id="358" w:name="ref-pangakis2023annotation"/>
     <w:p>
       <w:pPr>
         <w:pStyle w:val="Bibliography"/>
@@ -13988,8 +16478,8 @@
         <w:t xml:space="preserve">.</w:t>
       </w:r>
     </w:p>
-    <w:bookmarkEnd w:id="318"/>
-    <w:bookmarkStart w:id="319" w:name="ref-park2023generative"/>
+    <w:bookmarkEnd w:id="358"/>
+    <w:bookmarkStart w:id="359" w:name="ref-park2023generative"/>
     <w:p>
       <w:pPr>
         <w:pStyle w:val="Bibliography"/>
@@ -14037,8 +16527,8 @@
         <w:t xml:space="preserve">.</w:t>
       </w:r>
     </w:p>
-    <w:bookmarkEnd w:id="319"/>
-    <w:bookmarkStart w:id="320" w:name="ref-pigott2020meta"/>
+    <w:bookmarkEnd w:id="359"/>
+    <w:bookmarkStart w:id="360" w:name="ref-pigott2020meta"/>
     <w:p>
       <w:pPr>
         <w:pStyle w:val="Bibliography"/>
@@ -14083,8 +16573,8 @@
         <w:t xml:space="preserve">.</w:t>
       </w:r>
     </w:p>
-    <w:bookmarkEnd w:id="320"/>
-    <w:bookmarkStart w:id="321" w:name="ref-polanin2020transparency"/>
+    <w:bookmarkEnd w:id="360"/>
+    <w:bookmarkStart w:id="361" w:name="ref-polanin2020transparency"/>
     <w:p>
       <w:pPr>
         <w:pStyle w:val="Bibliography"/>
@@ -14129,8 +16619,8 @@
         <w:t xml:space="preserve">.</w:t>
       </w:r>
     </w:p>
-    <w:bookmarkEnd w:id="321"/>
-    <w:bookmarkStart w:id="322" w:name="ref-rethlefsen2021prismas"/>
+    <w:bookmarkEnd w:id="361"/>
+    <w:bookmarkStart w:id="362" w:name="ref-rethlefsen2021prismas"/>
     <w:p>
       <w:pPr>
         <w:pStyle w:val="Bibliography"/>
@@ -14175,8 +16665,8 @@
         <w:t xml:space="preserve">.</w:t>
       </w:r>
     </w:p>
-    <w:bookmarkEnd w:id="322"/>
-    <w:bookmarkStart w:id="323" w:name="ref-roberts2021mediacloud"/>
+    <w:bookmarkEnd w:id="362"/>
+    <w:bookmarkStart w:id="363" w:name="ref-roberts2021mediacloud"/>
     <w:p>
       <w:pPr>
         <w:pStyle w:val="Bibliography"/>
@@ -14221,8 +16711,8 @@
         <w:t xml:space="preserve">.</w:t>
       </w:r>
     </w:p>
-    <w:bookmarkEnd w:id="323"/>
-    <w:bookmarkStart w:id="324" w:name="ref-saunders2018saturation"/>
+    <w:bookmarkEnd w:id="363"/>
+    <w:bookmarkStart w:id="364" w:name="ref-saunders2018saturation"/>
     <w:p>
       <w:pPr>
         <w:pStyle w:val="Bibliography"/>
@@ -14267,8 +16757,8 @@
         <w:t xml:space="preserve">.</w:t>
       </w:r>
     </w:p>
-    <w:bookmarkEnd w:id="324"/>
-    <w:bookmarkStart w:id="325" w:name="ref-snyder2019literature"/>
+    <w:bookmarkEnd w:id="364"/>
+    <w:bookmarkStart w:id="365" w:name="ref-snyder2019literature"/>
     <w:p>
       <w:pPr>
         <w:pStyle w:val="Bibliography"/>
@@ -14313,8 +16803,8 @@
         <w:t xml:space="preserve">.</w:t>
       </w:r>
     </w:p>
-    <w:bookmarkEnd w:id="325"/>
-    <w:bookmarkStart w:id="326" w:name="ref-sousa2026ai"/>
+    <w:bookmarkEnd w:id="365"/>
+    <w:bookmarkStart w:id="366" w:name="ref-sousa2026ai"/>
     <w:p>
       <w:pPr>
         <w:pStyle w:val="Bibliography"/>
@@ -14359,8 +16849,8 @@
         <w:t xml:space="preserve">.</w:t>
       </w:r>
     </w:p>
-    <w:bookmarkEnd w:id="326"/>
-    <w:bookmarkStart w:id="327" w:name="ref-uttley2026meta"/>
+    <w:bookmarkEnd w:id="366"/>
+    <w:bookmarkStart w:id="367" w:name="ref-uttley2026meta"/>
     <w:p>
       <w:pPr>
         <w:pStyle w:val="Bibliography"/>
@@ -14405,8 +16895,8 @@
         <w:t xml:space="preserve">.</w:t>
       </w:r>
     </w:p>
-    <w:bookmarkEnd w:id="327"/>
-    <w:bookmarkStart w:id="328" w:name="ref-wohlin2014snowballing"/>
+    <w:bookmarkEnd w:id="367"/>
+    <w:bookmarkStart w:id="368" w:name="ref-wohlin2014snowballing"/>
     <w:p>
       <w:pPr>
         <w:pStyle w:val="Bibliography"/>
@@ -14454,8 +16944,8 @@
         <w:t xml:space="preserve">.</w:t>
       </w:r>
     </w:p>
-    <w:bookmarkEnd w:id="328"/>
-    <w:bookmarkStart w:id="329" w:name="ref-xiong2024uncertainty"/>
+    <w:bookmarkEnd w:id="368"/>
+    <w:bookmarkStart w:id="369" w:name="ref-xiong2024uncertainty"/>
     <w:p>
       <w:pPr>
         <w:pStyle w:val="Bibliography"/>
@@ -14524,8 +17014,8 @@
         <w:t xml:space="preserve">.</w:t>
       </w:r>
     </w:p>
-    <w:bookmarkEnd w:id="329"/>
-    <w:bookmarkStart w:id="330" w:name="ref-yao2023react"/>
+    <w:bookmarkEnd w:id="369"/>
+    <w:bookmarkStart w:id="370" w:name="ref-yao2023react"/>
     <w:p>
       <w:pPr>
         <w:pStyle w:val="Bibliography"/>
@@ -14579,8 +17069,8 @@
         <w:t xml:space="preserve">.</w:t>
       </w:r>
     </w:p>
-    <w:bookmarkEnd w:id="330"/>
-    <w:bookmarkStart w:id="331" w:name="ref-zaks2021updating"/>
+    <w:bookmarkEnd w:id="370"/>
+    <w:bookmarkStart w:id="371" w:name="ref-zaks2021updating"/>
     <w:p>
       <w:pPr>
         <w:pStyle w:val="Bibliography"/>
@@ -14646,8 +17136,8 @@
         <w:t xml:space="preserve">.</w:t>
       </w:r>
     </w:p>
-    <w:bookmarkEnd w:id="331"/>
-    <w:bookmarkStart w:id="332" w:name="ref-ziems2024transform"/>
+    <w:bookmarkEnd w:id="371"/>
+    <w:bookmarkStart w:id="372" w:name="ref-ziems2024transform"/>
     <w:p>
       <w:pPr>
         <w:pStyle w:val="Bibliography"/>
@@ -14692,9 +17182,9 @@
         <w:t xml:space="preserve">.</w:t>
       </w:r>
     </w:p>
-    <w:bookmarkEnd w:id="332"/>
-    <w:bookmarkEnd w:id="333"/>
-    <w:bookmarkEnd w:id="334"/>
+    <w:bookmarkEnd w:id="372"/>
+    <w:bookmarkEnd w:id="373"/>
+    <w:bookmarkEnd w:id="374"/>
     <w:sectPr>
       <w:footnotePr>
         <w:numRestart w:val="eachSect"/>
@@ -17102,6 +19592,516 @@
       </w:hyperlink>
       <w:r>
         <w:t xml:space="preserve">.</w:t>
+      </w:r>
+    </w:p>
+  </w:footnote>
+  <w:footnote w:id="274">
+    <w:p>
+      <w:pPr>
+        <w:pStyle w:val="FootnoteText"/>
+      </w:pPr>
+      <w:r>
+        <w:rPr>
+          <w:rStyle w:val="FootnoteReference"/>
+        </w:rPr>
+        <w:footnoteRef/>
+      </w:r>
+      <w:r>
+        <w:t xml:space="preserve"> </w:t>
+      </w:r>
+      <w:r>
+        <w:t xml:space="preserve">Roam Research, “A Note-Taking Tool for Networked Thought,” accessed July 27, 2026,</w:t>
+      </w:r>
+      <w:r>
+        <w:t xml:space="preserve"> </w:t>
+      </w:r>
+      <w:hyperlink r:id="rId275">
+        <w:r>
+          <w:rPr>
+            <w:rStyle w:val="Hyperlink"/>
+          </w:rPr>
+          <w:t xml:space="preserve">https://roamresearch.com</w:t>
+        </w:r>
+      </w:hyperlink>
+      <w:r>
+        <w:t xml:space="preserve">; Tiago Forte, “How To Take Smart Notes: 10 Principles to Revolutionize Your Note-Taking and Writing,” February 4, 2020,</w:t>
+      </w:r>
+      <w:r>
+        <w:t xml:space="preserve"> </w:t>
+      </w:r>
+      <w:hyperlink r:id="rId276">
+        <w:r>
+          <w:rPr>
+            <w:rStyle w:val="Hyperlink"/>
+          </w:rPr>
+          <w:t xml:space="preserve">https://fortelabs.co/blog/how-to-take-smart-notes/</w:t>
+        </w:r>
+      </w:hyperlink>
+      <w:r>
+        <w:t xml:space="preserve">.</w:t>
+      </w:r>
+    </w:p>
+  </w:footnote>
+  <w:footnote w:id="277">
+    <w:p>
+      <w:pPr>
+        <w:pStyle w:val="FootnoteText"/>
+      </w:pPr>
+      <w:r>
+        <w:rPr>
+          <w:rStyle w:val="FootnoteReference"/>
+        </w:rPr>
+        <w:footnoteRef/>
+      </w:r>
+      <w:r>
+        <w:t xml:space="preserve"> </w:t>
+      </w:r>
+      <w:r>
+        <w:t xml:space="preserve">Mem, “Introducing the World’s First Knowledge-Aware AI Assistant,” December 8, 2022, saved as a forwarded email in Readwise Reader; Ethan Mollick, “How to Use AI to Generate Ideas,” December 3, 2022,</w:t>
+      </w:r>
+      <w:r>
+        <w:t xml:space="preserve"> </w:t>
+      </w:r>
+      <w:hyperlink r:id="rId278">
+        <w:r>
+          <w:rPr>
+            <w:rStyle w:val="Hyperlink"/>
+          </w:rPr>
+          <w:t xml:space="preserve">https://oneusefulthing.substack.com/p/how-to-use-ai-to-generate-ideas</w:t>
+        </w:r>
+      </w:hyperlink>
+      <w:r>
+        <w:t xml:space="preserve">.</w:t>
+      </w:r>
+    </w:p>
+  </w:footnote>
+  <w:footnote w:id="279">
+    <w:p>
+      <w:pPr>
+        <w:pStyle w:val="FootnoteText"/>
+      </w:pPr>
+      <w:r>
+        <w:rPr>
+          <w:rStyle w:val="FootnoteReference"/>
+        </w:rPr>
+        <w:footnoteRef/>
+      </w:r>
+      <w:r>
+        <w:t xml:space="preserve"> </w:t>
+      </w:r>
+      <w:r>
+        <w:t xml:space="preserve">Readwise Reader library audit conducted July 27, 2026. Reader reported 567 records tagged</w:t>
+      </w:r>
+      <w:r>
+        <w:t xml:space="preserve"> </w:t>
+      </w:r>
+      <w:r>
+        <w:rPr>
+          <w:rStyle w:val="VerbatimChar"/>
+        </w:rPr>
+        <w:t xml:space="preserve">📄Academic Article</w:t>
+      </w:r>
+      <w:r>
+        <w:t xml:space="preserve">, 499 tagged</w:t>
+      </w:r>
+      <w:r>
+        <w:t xml:space="preserve"> </w:t>
+      </w:r>
+      <w:r>
+        <w:rPr>
+          <w:rStyle w:val="VerbatimChar"/>
+        </w:rPr>
+        <w:t xml:space="preserve">🗃️PKM</w:t>
+      </w:r>
+      <w:r>
+        <w:t xml:space="preserve">, and 3,196 tagged</w:t>
+      </w:r>
+      <w:r>
+        <w:t xml:space="preserve"> </w:t>
+      </w:r>
+      <w:r>
+        <w:rPr>
+          <w:rStyle w:val="VerbatimChar"/>
+        </w:rPr>
+        <w:t xml:space="preserve">🤖AI</w:t>
+      </w:r>
+      <w:r>
+        <w:t xml:space="preserve">. Detailed metadata retrieval returned all 499 PKM records and connector-limited samples of 500 academic and 500 AI records. The audit treated tags as organizational labels rather than quality judgments, inspected sixteen representative full-text records, and made no changes to the library. See</w:t>
+      </w:r>
+      <w:r>
+        <w:t xml:space="preserve"> </w:t>
+      </w:r>
+      <w:r>
+        <w:rPr>
+          <w:rStyle w:val="VerbatimChar"/>
+        </w:rPr>
+        <w:t xml:space="preserve">editorial/readwise-pkm-ai-source-register.md</w:t>
+      </w:r>
+      <w:r>
+        <w:t xml:space="preserve">.</w:t>
+      </w:r>
+    </w:p>
+  </w:footnote>
+  <w:footnote w:id="281">
+    <w:p>
+      <w:pPr>
+        <w:pStyle w:val="FootnoteText"/>
+      </w:pPr>
+      <w:r>
+        <w:rPr>
+          <w:rStyle w:val="FootnoteReference"/>
+        </w:rPr>
+        <w:footnoteRef/>
+      </w:r>
+      <w:r>
+        <w:t xml:space="preserve"> </w:t>
+      </w:r>
+      <w:r>
+        <w:t xml:space="preserve">Sébastien Dubois, “What Is Personal Knowledge Management (PKM)?,” December 16, 2022,</w:t>
+      </w:r>
+      <w:r>
+        <w:t xml:space="preserve"> </w:t>
+      </w:r>
+      <w:hyperlink r:id="rId282">
+        <w:r>
+          <w:rPr>
+            <w:rStyle w:val="Hyperlink"/>
+          </w:rPr>
+          <w:t xml:space="preserve">https://pkmjournal.com/why-is-personal-knowledge-management-pkm-useful-5f23405c2a2f</w:t>
+        </w:r>
+      </w:hyperlink>
+      <w:r>
+        <w:t xml:space="preserve">.</w:t>
+      </w:r>
+    </w:p>
+  </w:footnote>
+  <w:footnote w:id="284">
+    <w:p>
+      <w:pPr>
+        <w:pStyle w:val="FootnoteText"/>
+      </w:pPr>
+      <w:r>
+        <w:rPr>
+          <w:rStyle w:val="FootnoteReference"/>
+        </w:rPr>
+        <w:footnoteRef/>
+      </w:r>
+      <w:r>
+        <w:t xml:space="preserve"> </w:t>
+      </w:r>
+      <w:r>
+        <w:t xml:space="preserve">Tiago Forte, “Great Use Case for ChatGPT Vision: Transcribing Handwritten Journal Entries,” December 11, 2023,</w:t>
+      </w:r>
+      <w:r>
+        <w:t xml:space="preserve"> </w:t>
+      </w:r>
+      <w:hyperlink r:id="rId285">
+        <w:r>
+          <w:rPr>
+            <w:rStyle w:val="Hyperlink"/>
+          </w:rPr>
+          <w:t xml:space="preserve">https://x.com/fortelabs/status/1734284384537333813</w:t>
+        </w:r>
+      </w:hyperlink>
+      <w:r>
+        <w:t xml:space="preserve">.</w:t>
+      </w:r>
+    </w:p>
+  </w:footnote>
+  <w:footnote w:id="286">
+    <w:p>
+      <w:pPr>
+        <w:pStyle w:val="FootnoteText"/>
+      </w:pPr>
+      <w:r>
+        <w:rPr>
+          <w:rStyle w:val="FootnoteReference"/>
+        </w:rPr>
+        <w:footnoteRef/>
+      </w:r>
+      <w:r>
+        <w:t xml:space="preserve"> </w:t>
+      </w:r>
+      <w:r>
+        <w:t xml:space="preserve">Andy Stapleton, “Is This the End of Traditional Academic Papers? See What Every Researcher Needs to Know!,” video, December 6, 2023,</w:t>
+      </w:r>
+      <w:r>
+        <w:t xml:space="preserve"> </w:t>
+      </w:r>
+      <w:hyperlink r:id="rId287">
+        <w:r>
+          <w:rPr>
+            <w:rStyle w:val="Hyperlink"/>
+          </w:rPr>
+          <w:t xml:space="preserve">https://www.youtube.com/watch?v=kQp7EbxHcKA</w:t>
+        </w:r>
+      </w:hyperlink>
+      <w:r>
+        <w:t xml:space="preserve">.</w:t>
+      </w:r>
+    </w:p>
+  </w:footnote>
+  <w:footnote w:id="288">
+    <w:p>
+      <w:pPr>
+        <w:pStyle w:val="FootnoteText"/>
+      </w:pPr>
+      <w:r>
+        <w:rPr>
+          <w:rStyle w:val="FootnoteReference"/>
+        </w:rPr>
+        <w:footnoteRef/>
+      </w:r>
+      <w:r>
+        <w:t xml:space="preserve"> </w:t>
+      </w:r>
+      <w:r>
+        <w:t xml:space="preserve">Noah Dasanaike, “What I’ve Learned From Digitizing 20 Million Historical Documents,” February 4, 2026,</w:t>
+      </w:r>
+      <w:r>
+        <w:t xml:space="preserve"> </w:t>
+      </w:r>
+      <w:hyperlink r:id="rId289">
+        <w:r>
+          <w:rPr>
+            <w:rStyle w:val="Hyperlink"/>
+          </w:rPr>
+          <w:t xml:space="preserve">https://noahdasanaike.github.io/posts/digitizing-census.html</w:t>
+        </w:r>
+      </w:hyperlink>
+      <w:r>
+        <w:t xml:space="preserve">.</w:t>
+      </w:r>
+    </w:p>
+  </w:footnote>
+  <w:footnote w:id="291">
+    <w:p>
+      <w:pPr>
+        <w:pStyle w:val="FootnoteText"/>
+      </w:pPr>
+      <w:r>
+        <w:rPr>
+          <w:rStyle w:val="FootnoteReference"/>
+        </w:rPr>
+        <w:footnoteRef/>
+      </w:r>
+      <w:r>
+        <w:t xml:space="preserve"> </w:t>
+      </w:r>
+      <w:r>
+        <w:t xml:space="preserve">Len_dde, “My Academic Workflow with Obsidian and Zotero,” April 5, 2025,</w:t>
+      </w:r>
+      <w:r>
+        <w:t xml:space="preserve"> </w:t>
+      </w:r>
+      <w:hyperlink r:id="rId292">
+        <w:r>
+          <w:rPr>
+            <w:rStyle w:val="Hyperlink"/>
+          </w:rPr>
+          <w:t xml:space="preserve">https://medium.com/%40lennart.dde/my-academic-workflow-with-obsidian-and-zotero-53ac44ebdc28</w:t>
+        </w:r>
+      </w:hyperlink>
+      <w:r>
+        <w:t xml:space="preserve">.</w:t>
+      </w:r>
+    </w:p>
+  </w:footnote>
+  <w:footnote w:id="293">
+    <w:p>
+      <w:pPr>
+        <w:pStyle w:val="FootnoteText"/>
+      </w:pPr>
+      <w:r>
+        <w:rPr>
+          <w:rStyle w:val="FootnoteReference"/>
+        </w:rPr>
+        <w:footnoteRef/>
+      </w:r>
+      <w:r>
+        <w:t xml:space="preserve"> </w:t>
+      </w:r>
+      <w:r>
+        <w:t xml:space="preserve">Andrew Altshuler, “The Argument Analyst Tana Template Is Out,” March 7, 2025,</w:t>
+      </w:r>
+      <w:r>
+        <w:t xml:space="preserve"> </w:t>
+      </w:r>
+      <w:hyperlink r:id="rId294">
+        <w:r>
+          <w:rPr>
+            <w:rStyle w:val="Hyperlink"/>
+          </w:rPr>
+          <w:t xml:space="preserve">https://x.com/1eo/status/1898034427579531367/</w:t>
+        </w:r>
+      </w:hyperlink>
+      <w:r>
+        <w:t xml:space="preserve">.</w:t>
+      </w:r>
+    </w:p>
+  </w:footnote>
+  <w:footnote w:id="296">
+    <w:p>
+      <w:pPr>
+        <w:pStyle w:val="FootnoteText"/>
+      </w:pPr>
+      <w:r>
+        <w:rPr>
+          <w:rStyle w:val="FootnoteReference"/>
+        </w:rPr>
+        <w:footnoteRef/>
+      </w:r>
+      <w:r>
+        <w:t xml:space="preserve"> </w:t>
+      </w:r>
+      <w:r>
+        <w:t xml:space="preserve">CyrilXBT, “Most People Use Obsidian as a Note-Taking App,” May 5, 2026,</w:t>
+      </w:r>
+      <w:r>
+        <w:t xml:space="preserve"> </w:t>
+      </w:r>
+      <w:hyperlink r:id="rId297">
+        <w:r>
+          <w:rPr>
+            <w:rStyle w:val="Hyperlink"/>
+          </w:rPr>
+          <w:t xml:space="preserve">https://x.com/cyrilXBT/status/2051589237880009026/</w:t>
+        </w:r>
+      </w:hyperlink>
+      <w:r>
+        <w:t xml:space="preserve">. The library note marks this item as a redundant, shorter version of a longer guide; the chapter uses it only to document the persistent-context argument.</w:t>
+      </w:r>
+    </w:p>
+  </w:footnote>
+  <w:footnote w:id="298">
+    <w:p>
+      <w:pPr>
+        <w:pStyle w:val="FootnoteText"/>
+      </w:pPr>
+      <w:r>
+        <w:rPr>
+          <w:rStyle w:val="FootnoteReference"/>
+        </w:rPr>
+        <w:footnoteRef/>
+      </w:r>
+      <w:r>
+        <w:t xml:space="preserve"> </w:t>
+      </w:r>
+      <w:r>
+        <w:t xml:space="preserve">CyrilXBT, “Obsidian Plus Vellum: A Second Brain That Never Stops,” May 27, 2026,</w:t>
+      </w:r>
+      <w:r>
+        <w:t xml:space="preserve"> </w:t>
+      </w:r>
+      <w:hyperlink r:id="rId299">
+        <w:r>
+          <w:rPr>
+            <w:rStyle w:val="Hyperlink"/>
+          </w:rPr>
+          <w:t xml:space="preserve">https://x.com/cyrilxbt/status/2059486502401569047/</w:t>
+        </w:r>
+      </w:hyperlink>
+      <w:r>
+        <w:t xml:space="preserve">.</w:t>
+      </w:r>
+    </w:p>
+  </w:footnote>
+  <w:footnote w:id="300">
+    <w:p>
+      <w:pPr>
+        <w:pStyle w:val="FootnoteText"/>
+      </w:pPr>
+      <w:r>
+        <w:rPr>
+          <w:rStyle w:val="FootnoteReference"/>
+        </w:rPr>
+        <w:footnoteRef/>
+      </w:r>
+      <w:r>
+        <w:t xml:space="preserve"> </w:t>
+      </w:r>
+      <w:r>
+        <w:t xml:space="preserve">“Karpaty’s Second Brain,” shared Claude conversation saved July 18, 2026,</w:t>
+      </w:r>
+      <w:r>
+        <w:t xml:space="preserve"> </w:t>
+      </w:r>
+      <w:hyperlink r:id="rId301">
+        <w:r>
+          <w:rPr>
+            <w:rStyle w:val="Hyperlink"/>
+          </w:rPr>
+          <w:t xml:space="preserve">https://claude.ai/share/9263ec7c-827e-48da-8ddf-65375205f96b</w:t>
+        </w:r>
+      </w:hyperlink>
+      <w:r>
+        <w:t xml:space="preserve">. This is a derivative conversation about a video, not an independently verified account of the original presentation.</w:t>
+      </w:r>
+    </w:p>
+  </w:footnote>
+  <w:footnote w:id="302">
+    <w:p>
+      <w:pPr>
+        <w:pStyle w:val="FootnoteText"/>
+      </w:pPr>
+      <w:r>
+        <w:rPr>
+          <w:rStyle w:val="FootnoteReference"/>
+        </w:rPr>
+        <w:footnoteRef/>
+      </w:r>
+      <w:r>
+        <w:t xml:space="preserve"> </w:t>
+      </w:r>
+      <w:r>
+        <w:t xml:space="preserve">Markus J. Buehler, “We’ve Made a Breakthrough in Self-Evolving AI Scientists,” June 5, 2026,</w:t>
+      </w:r>
+      <w:r>
+        <w:t xml:space="preserve"> </w:t>
+      </w:r>
+      <w:hyperlink r:id="rId303">
+        <w:r>
+          <w:rPr>
+            <w:rStyle w:val="Hyperlink"/>
+          </w:rPr>
+          <w:t xml:space="preserve">https://x.com/profbuehlermit/status/2062865983459475830/</w:t>
+        </w:r>
+      </w:hyperlink>
+      <w:r>
+        <w:t xml:space="preserve">. The saved item cites F. Y. Wang and M. J. Buehler, “Self-Revising Discovery Systems for Science: A Categorical Framework for Agentic Artificial Intelligence,” arXiv:2606.01444 (2026). The claim requires verification against the paper before scholarly citation.</w:t>
+      </w:r>
+    </w:p>
+  </w:footnote>
+  <w:footnote w:id="305">
+    <w:p>
+      <w:pPr>
+        <w:pStyle w:val="FootnoteText"/>
+      </w:pPr>
+      <w:r>
+        <w:rPr>
+          <w:rStyle w:val="FootnoteReference"/>
+        </w:rPr>
+        <w:footnoteRef/>
+      </w:r>
+      <w:r>
+        <w:t xml:space="preserve"> </w:t>
+      </w:r>
+      <w:r>
+        <w:t xml:space="preserve">Eli Berman and Jacob N. Shapiro, “Big Data Seeks Context, for Long-Term Relationship: Reflections on the Empirical Studies of Conflict Project (ESOC),” August 17, 2023,</w:t>
+      </w:r>
+      <w:r>
+        <w:t xml:space="preserve"> </w:t>
+      </w:r>
+      <w:hyperlink r:id="rId306">
+        <w:r>
+          <w:rPr>
+            <w:rStyle w:val="Hyperlink"/>
+          </w:rPr>
+          <w:t xml:space="preserve">https://www.stimson.org/2023/reflections-on-the-empirical-studies-of-conflict-project-esoc/</w:t>
+        </w:r>
+      </w:hyperlink>
+      <w:r>
+        <w:t xml:space="preserve">. The byline and date were verified against the publisher page; the record has not yet been checked against Zotero.</w:t>
       </w:r>
     </w:p>
   </w:footnote>

</xml_diff>